<commit_message>
Agrego los casos de uso extendidos del módulo de ventas
</commit_message>
<xml_diff>
--- a/docs/diseno/INVENTRA_Analisis_Diseno_UML.docx
+++ b/docs/diseno/INVENTRA_Analisis_Diseno_UML.docx
@@ -1331,6 +1331,41 @@
       <w:r>
         <w:fldChar w:fldCharType="begin" w:dirty="true"/>
         <w:instrText xml:space="preserve">PAGEREF bm44</w:instrText>
+        <w:fldChar w:fldCharType="end"/>
+      </w:r>
+    </w:p>
+    <w:p>
+      <w:pPr>
+        <w:tabs>
+          <w:tab w:val="right" w:pos="9200" w:leader="dot"/>
+        </w:tabs>
+        <w:spacing w:after="40" w:line="252"/>
+        <w:ind w:left="360"/>
+      </w:pPr>
+      <w:hyperlink w:history="1" w:anchor="bm45">
+        <w:r>
+          <w:rPr>
+            <w:rFonts w:ascii="Arial" w:cs="Arial" w:eastAsia="Arial" w:hAnsi="Arial"/>
+            <w:b w:val="false"/>
+            <w:bCs w:val="false"/>
+            <w:color w:val="1F3864"/>
+            <w:sz w:val="20"/>
+            <w:szCs w:val="20"/>
+          </w:rPr>
+          <w:t xml:space="preserve">9.4 Módulo VEN — Ventas (punto de venta)</w:t>
+        </w:r>
+      </w:hyperlink>
+      <w:r>
+        <w:rPr>
+          <w:rFonts w:ascii="Arial" w:cs="Arial" w:eastAsia="Arial" w:hAnsi="Arial"/>
+          <w:sz w:val="20"/>
+          <w:szCs w:val="20"/>
+        </w:rPr>
+        <w:t xml:space="preserve">	</w:t>
+      </w:r>
+      <w:r>
+        <w:fldChar w:fldCharType="begin" w:dirty="true"/>
+        <w:instrText xml:space="preserve">PAGEREF bm45</w:instrText>
         <w:fldChar w:fldCharType="end"/>
       </w:r>
     </w:p>
@@ -22892,6 +22927,3815 @@
         <w:spacing w:after="140"/>
       </w:pPr>
     </w:p>
+    <w:p>
+      <w:pPr>
+        <w:pStyle w:val="Heading2"/>
+        <w:spacing w:after="80" w:before="150"/>
+      </w:pPr>
+      <w:bookmarkStart w:name="bm45" w:id="45"/>
+      <w:r>
+        <w:rPr>
+          <w:rFonts w:ascii="Arial" w:cs="Arial" w:eastAsia="Arial" w:hAnsi="Arial"/>
+          <w:b/>
+          <w:bCs/>
+          <w:color w:val="2E5496"/>
+          <w:sz w:val="23"/>
+          <w:szCs w:val="23"/>
+        </w:rPr>
+        <w:t xml:space="preserve">9.4 Módulo VEN — Ventas (punto de venta)</w:t>
+      </w:r>
+      <w:bookmarkEnd w:id="45"/>
+    </w:p>
+    <w:tbl>
+      <w:tblPr>
+        <w:tblW w:type="dxa" w:w="9360"/>
+        <w:tblBorders>
+          <w:top w:val="single" w:color="9CA3AF" w:sz="6"/>
+          <w:left w:val="single" w:color="9CA3AF" w:sz="6"/>
+          <w:bottom w:val="single" w:color="9CA3AF" w:sz="6"/>
+          <w:right w:val="single" w:color="9CA3AF" w:sz="6"/>
+          <w:insideH w:val="single" w:color="9CA3AF" w:sz="6"/>
+          <w:insideV w:val="single" w:color="9CA3AF" w:sz="6"/>
+        </w:tblBorders>
+        <w:tblLayout w:type="fixed"/>
+      </w:tblPr>
+      <w:tblGrid>
+        <w:gridCol w:w="2300"/>
+        <w:gridCol w:w="7060"/>
+      </w:tblGrid>
+      <w:tr>
+        <w:tc>
+          <w:tcPr>
+            <w:tcW w:type="dxa" w:w="9360"/>
+            <w:gridSpan w:val="2"/>
+            <w:shd w:fill="1F3864" w:val="clear"/>
+            <w:tcMar>
+              <w:top w:type="dxa" w:w="40"/>
+              <w:left w:type="dxa" w:w="70"/>
+              <w:bottom w:type="dxa" w:w="40"/>
+              <w:right w:type="dxa" w:w="70"/>
+            </w:tcMar>
+          </w:tcPr>
+          <w:p>
+            <w:pPr>
+              <w:spacing w:after="18" w:line="236"/>
+            </w:pPr>
+            <w:r>
+              <w:rPr>
+                <w:rFonts w:ascii="Arial" w:cs="Arial" w:eastAsia="Arial" w:hAnsi="Arial"/>
+                <w:b/>
+                <w:bCs/>
+                <w:color w:val="FFFFFF"/>
+                <w:sz w:val="19"/>
+                <w:szCs w:val="19"/>
+              </w:rPr>
+              <w:t xml:space="preserve">CU-VEN-01 — Registrar venta</w:t>
+            </w:r>
+          </w:p>
+        </w:tc>
+      </w:tr>
+      <w:tr>
+        <w:tc>
+          <w:tcPr>
+            <w:tcW w:type="dxa" w:w="2300"/>
+            <w:shd w:fill="EAF0F8" w:val="clear"/>
+            <w:tcMar>
+              <w:top w:type="dxa" w:w="40"/>
+              <w:left w:type="dxa" w:w="70"/>
+              <w:bottom w:type="dxa" w:w="40"/>
+              <w:right w:type="dxa" w:w="70"/>
+            </w:tcMar>
+          </w:tcPr>
+          <w:p>
+            <w:pPr>
+              <w:spacing w:after="18" w:line="236"/>
+            </w:pPr>
+            <w:r>
+              <w:rPr>
+                <w:rFonts w:ascii="Arial" w:cs="Arial" w:eastAsia="Arial" w:hAnsi="Arial"/>
+                <w:b/>
+                <w:bCs/>
+                <w:sz w:val="19"/>
+                <w:szCs w:val="19"/>
+              </w:rPr>
+              <w:t xml:space="preserve">Actor(es)</w:t>
+            </w:r>
+          </w:p>
+        </w:tc>
+        <w:tc>
+          <w:tcPr>
+            <w:tcW w:type="dxa" w:w="7060"/>
+            <w:tcMar>
+              <w:top w:type="dxa" w:w="40"/>
+              <w:left w:type="dxa" w:w="70"/>
+              <w:bottom w:type="dxa" w:w="40"/>
+              <w:right w:type="dxa" w:w="70"/>
+            </w:tcMar>
+          </w:tcPr>
+          <w:p>
+            <w:pPr>
+              <w:spacing w:after="18" w:line="236"/>
+            </w:pPr>
+            <w:r>
+              <w:rPr>
+                <w:rFonts w:ascii="Arial" w:cs="Arial" w:eastAsia="Arial" w:hAnsi="Arial"/>
+                <w:sz w:val="19"/>
+                <w:szCs w:val="19"/>
+              </w:rPr>
+              <w:t xml:space="preserve">Vendedor</w:t>
+            </w:r>
+          </w:p>
+        </w:tc>
+      </w:tr>
+      <w:tr>
+        <w:tc>
+          <w:tcPr>
+            <w:tcW w:type="dxa" w:w="2300"/>
+            <w:shd w:fill="EAF0F8" w:val="clear"/>
+            <w:tcMar>
+              <w:top w:type="dxa" w:w="40"/>
+              <w:left w:type="dxa" w:w="70"/>
+              <w:bottom w:type="dxa" w:w="40"/>
+              <w:right w:type="dxa" w:w="70"/>
+            </w:tcMar>
+          </w:tcPr>
+          <w:p>
+            <w:pPr>
+              <w:spacing w:after="18" w:line="236"/>
+            </w:pPr>
+            <w:r>
+              <w:rPr>
+                <w:rFonts w:ascii="Arial" w:cs="Arial" w:eastAsia="Arial" w:hAnsi="Arial"/>
+                <w:b/>
+                <w:bCs/>
+                <w:sz w:val="19"/>
+                <w:szCs w:val="19"/>
+              </w:rPr>
+              <w:t xml:space="preserve">Requisito</w:t>
+            </w:r>
+          </w:p>
+        </w:tc>
+        <w:tc>
+          <w:tcPr>
+            <w:tcW w:type="dxa" w:w="7060"/>
+            <w:tcMar>
+              <w:top w:type="dxa" w:w="40"/>
+              <w:left w:type="dxa" w:w="70"/>
+              <w:bottom w:type="dxa" w:w="40"/>
+              <w:right w:type="dxa" w:w="70"/>
+            </w:tcMar>
+          </w:tcPr>
+          <w:p>
+            <w:pPr>
+              <w:spacing w:after="18" w:line="236"/>
+            </w:pPr>
+            <w:r>
+              <w:rPr>
+                <w:rFonts w:ascii="Arial" w:cs="Arial" w:eastAsia="Arial" w:hAnsi="Arial"/>
+                <w:sz w:val="19"/>
+                <w:szCs w:val="19"/>
+              </w:rPr>
+              <w:t xml:space="preserve">RF-VEN-01</w:t>
+            </w:r>
+          </w:p>
+        </w:tc>
+      </w:tr>
+      <w:tr>
+        <w:tc>
+          <w:tcPr>
+            <w:tcW w:type="dxa" w:w="2300"/>
+            <w:shd w:fill="EAF0F8" w:val="clear"/>
+            <w:tcMar>
+              <w:top w:type="dxa" w:w="40"/>
+              <w:left w:type="dxa" w:w="70"/>
+              <w:bottom w:type="dxa" w:w="40"/>
+              <w:right w:type="dxa" w:w="70"/>
+            </w:tcMar>
+          </w:tcPr>
+          <w:p>
+            <w:pPr>
+              <w:spacing w:after="18" w:line="236"/>
+            </w:pPr>
+            <w:r>
+              <w:rPr>
+                <w:rFonts w:ascii="Arial" w:cs="Arial" w:eastAsia="Arial" w:hAnsi="Arial"/>
+                <w:b/>
+                <w:bCs/>
+                <w:sz w:val="19"/>
+                <w:szCs w:val="19"/>
+              </w:rPr>
+              <w:t xml:space="preserve">Descripción</w:t>
+            </w:r>
+          </w:p>
+        </w:tc>
+        <w:tc>
+          <w:tcPr>
+            <w:tcW w:type="dxa" w:w="7060"/>
+            <w:tcMar>
+              <w:top w:type="dxa" w:w="40"/>
+              <w:left w:type="dxa" w:w="70"/>
+              <w:bottom w:type="dxa" w:w="40"/>
+              <w:right w:type="dxa" w:w="70"/>
+            </w:tcMar>
+          </w:tcPr>
+          <w:p>
+            <w:pPr>
+              <w:spacing w:after="18" w:line="236"/>
+            </w:pPr>
+            <w:r>
+              <w:rPr>
+                <w:rFonts w:ascii="Arial" w:cs="Arial" w:eastAsia="Arial" w:hAnsi="Arial"/>
+                <w:sz w:val="19"/>
+                <w:szCs w:val="19"/>
+              </w:rPr>
+              <w:t xml:space="preserve">El vendedor registra una venta en el punto de venta, descontando el inventario por el método PEPS.</w:t>
+            </w:r>
+          </w:p>
+        </w:tc>
+      </w:tr>
+      <w:tr>
+        <w:tc>
+          <w:tcPr>
+            <w:tcW w:type="dxa" w:w="2300"/>
+            <w:shd w:fill="EAF0F8" w:val="clear"/>
+            <w:tcMar>
+              <w:top w:type="dxa" w:w="40"/>
+              <w:left w:type="dxa" w:w="70"/>
+              <w:bottom w:type="dxa" w:w="40"/>
+              <w:right w:type="dxa" w:w="70"/>
+            </w:tcMar>
+          </w:tcPr>
+          <w:p>
+            <w:pPr>
+              <w:spacing w:after="18" w:line="236"/>
+            </w:pPr>
+            <w:r>
+              <w:rPr>
+                <w:rFonts w:ascii="Arial" w:cs="Arial" w:eastAsia="Arial" w:hAnsi="Arial"/>
+                <w:b/>
+                <w:bCs/>
+                <w:sz w:val="19"/>
+                <w:szCs w:val="19"/>
+              </w:rPr>
+              <w:t xml:space="preserve">Precondiciones</w:t>
+            </w:r>
+          </w:p>
+        </w:tc>
+        <w:tc>
+          <w:tcPr>
+            <w:tcW w:type="dxa" w:w="7060"/>
+            <w:tcMar>
+              <w:top w:type="dxa" w:w="40"/>
+              <w:left w:type="dxa" w:w="70"/>
+              <w:bottom w:type="dxa" w:w="40"/>
+              <w:right w:type="dxa" w:w="70"/>
+            </w:tcMar>
+          </w:tcPr>
+          <w:p>
+            <w:pPr>
+              <w:spacing w:after="18" w:line="236"/>
+            </w:pPr>
+            <w:r>
+              <w:rPr>
+                <w:rFonts w:ascii="Arial" w:cs="Arial" w:eastAsia="Arial" w:hAnsi="Arial"/>
+                <w:sz w:val="19"/>
+                <w:szCs w:val="19"/>
+              </w:rPr>
+              <w:t xml:space="preserve">El vendedor está autenticado con la caja abierta y existen productos con existencias.</w:t>
+            </w:r>
+          </w:p>
+        </w:tc>
+      </w:tr>
+      <w:tr>
+        <w:tc>
+          <w:tcPr>
+            <w:tcW w:type="dxa" w:w="2300"/>
+            <w:shd w:fill="EAF0F8" w:val="clear"/>
+            <w:tcMar>
+              <w:top w:type="dxa" w:w="40"/>
+              <w:left w:type="dxa" w:w="70"/>
+              <w:bottom w:type="dxa" w:w="40"/>
+              <w:right w:type="dxa" w:w="70"/>
+            </w:tcMar>
+          </w:tcPr>
+          <w:p>
+            <w:pPr>
+              <w:spacing w:after="18" w:line="236"/>
+            </w:pPr>
+            <w:r>
+              <w:rPr>
+                <w:rFonts w:ascii="Arial" w:cs="Arial" w:eastAsia="Arial" w:hAnsi="Arial"/>
+                <w:b/>
+                <w:bCs/>
+                <w:sz w:val="19"/>
+                <w:szCs w:val="19"/>
+              </w:rPr>
+              <w:t xml:space="preserve">Flujo principal</w:t>
+            </w:r>
+          </w:p>
+        </w:tc>
+        <w:tc>
+          <w:tcPr>
+            <w:tcW w:type="dxa" w:w="7060"/>
+            <w:tcMar>
+              <w:top w:type="dxa" w:w="40"/>
+              <w:left w:type="dxa" w:w="70"/>
+              <w:bottom w:type="dxa" w:w="40"/>
+              <w:right w:type="dxa" w:w="70"/>
+            </w:tcMar>
+          </w:tcPr>
+          <w:p>
+            <w:pPr>
+              <w:spacing w:after="18" w:line="236"/>
+            </w:pPr>
+            <w:r>
+              <w:rPr>
+                <w:rFonts w:ascii="Arial" w:cs="Arial" w:eastAsia="Arial" w:hAnsi="Arial"/>
+                <w:sz w:val="19"/>
+                <w:szCs w:val="19"/>
+              </w:rPr>
+              <w:t xml:space="preserve">1. Agrega los productos a la venta (por búsqueda o código).</w:t>
+            </w:r>
+          </w:p>
+          <w:p>
+            <w:pPr>
+              <w:spacing w:after="18" w:line="236"/>
+            </w:pPr>
+            <w:r>
+              <w:rPr>
+                <w:rFonts w:ascii="Arial" w:cs="Arial" w:eastAsia="Arial" w:hAnsi="Arial"/>
+                <w:sz w:val="19"/>
+                <w:szCs w:val="19"/>
+              </w:rPr>
+              <w:t xml:space="preserve">2. El sistema verifica las existencias y calcula el total.</w:t>
+            </w:r>
+          </w:p>
+          <w:p>
+            <w:pPr>
+              <w:spacing w:after="18" w:line="236"/>
+            </w:pPr>
+            <w:r>
+              <w:rPr>
+                <w:rFonts w:ascii="Arial" w:cs="Arial" w:eastAsia="Arial" w:hAnsi="Arial"/>
+                <w:sz w:val="19"/>
+                <w:szCs w:val="19"/>
+              </w:rPr>
+              <w:t xml:space="preserve">3. El vendedor selecciona el medio de pago (CU-VEN-02).</w:t>
+            </w:r>
+          </w:p>
+          <w:p>
+            <w:pPr>
+              <w:spacing w:after="18" w:line="236"/>
+            </w:pPr>
+            <w:r>
+              <w:rPr>
+                <w:rFonts w:ascii="Arial" w:cs="Arial" w:eastAsia="Arial" w:hAnsi="Arial"/>
+                <w:sz w:val="19"/>
+                <w:szCs w:val="19"/>
+              </w:rPr>
+              <w:t xml:space="preserve">4. El sistema descuenta el inventario consumiendo los lotes más antiguos (PEPS) y registra el costo real.</w:t>
+            </w:r>
+          </w:p>
+          <w:p>
+            <w:pPr>
+              <w:spacing w:after="18" w:line="236"/>
+            </w:pPr>
+            <w:r>
+              <w:rPr>
+                <w:rFonts w:ascii="Arial" w:cs="Arial" w:eastAsia="Arial" w:hAnsi="Arial"/>
+                <w:sz w:val="19"/>
+                <w:szCs w:val="19"/>
+              </w:rPr>
+              <w:t xml:space="preserve">5. El sistema registra el movimiento de inventario en el kardex y genera el comprobante (CU-VEN-03).</w:t>
+            </w:r>
+          </w:p>
+          <w:p>
+            <w:pPr>
+              <w:spacing w:after="18" w:line="236"/>
+            </w:pPr>
+            <w:r>
+              <w:rPr>
+                <w:rFonts w:ascii="Arial" w:cs="Arial" w:eastAsia="Arial" w:hAnsi="Arial"/>
+                <w:sz w:val="19"/>
+                <w:szCs w:val="19"/>
+              </w:rPr>
+              <w:t xml:space="preserve">6. El sistema registra el movimiento en la caja.</w:t>
+            </w:r>
+          </w:p>
+        </w:tc>
+      </w:tr>
+      <w:tr>
+        <w:tc>
+          <w:tcPr>
+            <w:tcW w:type="dxa" w:w="2300"/>
+            <w:shd w:fill="EAF0F8" w:val="clear"/>
+            <w:tcMar>
+              <w:top w:type="dxa" w:w="40"/>
+              <w:left w:type="dxa" w:w="70"/>
+              <w:bottom w:type="dxa" w:w="40"/>
+              <w:right w:type="dxa" w:w="70"/>
+            </w:tcMar>
+          </w:tcPr>
+          <w:p>
+            <w:pPr>
+              <w:spacing w:after="18" w:line="236"/>
+            </w:pPr>
+            <w:r>
+              <w:rPr>
+                <w:rFonts w:ascii="Arial" w:cs="Arial" w:eastAsia="Arial" w:hAnsi="Arial"/>
+                <w:b/>
+                <w:bCs/>
+                <w:sz w:val="19"/>
+                <w:szCs w:val="19"/>
+              </w:rPr>
+              <w:t xml:space="preserve">Flujos alternativos</w:t>
+            </w:r>
+          </w:p>
+        </w:tc>
+        <w:tc>
+          <w:tcPr>
+            <w:tcW w:type="dxa" w:w="7060"/>
+            <w:tcMar>
+              <w:top w:type="dxa" w:w="40"/>
+              <w:left w:type="dxa" w:w="70"/>
+              <w:bottom w:type="dxa" w:w="40"/>
+              <w:right w:type="dxa" w:w="70"/>
+            </w:tcMar>
+          </w:tcPr>
+          <w:p>
+            <w:pPr>
+              <w:spacing w:after="18" w:line="236"/>
+            </w:pPr>
+            <w:r>
+              <w:rPr>
+                <w:rFonts w:ascii="Arial" w:cs="Arial" w:eastAsia="Arial" w:hAnsi="Arial"/>
+                <w:sz w:val="19"/>
+                <w:szCs w:val="19"/>
+              </w:rPr>
+              <w:t xml:space="preserve">2a. Aplicar un descuento a la venta (opcional).</w:t>
+            </w:r>
+          </w:p>
+          <w:p>
+            <w:pPr>
+              <w:spacing w:after="18" w:line="236"/>
+            </w:pPr>
+            <w:r>
+              <w:rPr>
+                <w:rFonts w:ascii="Arial" w:cs="Arial" w:eastAsia="Arial" w:hAnsi="Arial"/>
+                <w:sz w:val="19"/>
+                <w:szCs w:val="19"/>
+              </w:rPr>
+              <w:t xml:space="preserve">5a. Emitir factura electrónica (CU-FAC-02) si el cliente la solicita.</w:t>
+            </w:r>
+          </w:p>
+        </w:tc>
+      </w:tr>
+      <w:tr>
+        <w:tc>
+          <w:tcPr>
+            <w:tcW w:type="dxa" w:w="2300"/>
+            <w:shd w:fill="EAF0F8" w:val="clear"/>
+            <w:tcMar>
+              <w:top w:type="dxa" w:w="40"/>
+              <w:left w:type="dxa" w:w="70"/>
+              <w:bottom w:type="dxa" w:w="40"/>
+              <w:right w:type="dxa" w:w="70"/>
+            </w:tcMar>
+          </w:tcPr>
+          <w:p>
+            <w:pPr>
+              <w:spacing w:after="18" w:line="236"/>
+            </w:pPr>
+            <w:r>
+              <w:rPr>
+                <w:rFonts w:ascii="Arial" w:cs="Arial" w:eastAsia="Arial" w:hAnsi="Arial"/>
+                <w:b/>
+                <w:bCs/>
+                <w:sz w:val="19"/>
+                <w:szCs w:val="19"/>
+              </w:rPr>
+              <w:t xml:space="preserve">Excepciones</w:t>
+            </w:r>
+          </w:p>
+        </w:tc>
+        <w:tc>
+          <w:tcPr>
+            <w:tcW w:type="dxa" w:w="7060"/>
+            <w:tcMar>
+              <w:top w:type="dxa" w:w="40"/>
+              <w:left w:type="dxa" w:w="70"/>
+              <w:bottom w:type="dxa" w:w="40"/>
+              <w:right w:type="dxa" w:w="70"/>
+            </w:tcMar>
+          </w:tcPr>
+          <w:p>
+            <w:pPr>
+              <w:spacing w:after="18" w:line="236"/>
+            </w:pPr>
+            <w:r>
+              <w:rPr>
+                <w:rFonts w:ascii="Arial" w:cs="Arial" w:eastAsia="Arial" w:hAnsi="Arial"/>
+                <w:sz w:val="19"/>
+                <w:szCs w:val="19"/>
+              </w:rPr>
+              <w:t xml:space="preserve">2b. Existencias insuficientes para un producto: el sistema avisa y el vendedor ajusta la cantidad.</w:t>
+            </w:r>
+          </w:p>
+          <w:p>
+            <w:pPr>
+              <w:spacing w:after="18" w:line="236"/>
+            </w:pPr>
+            <w:r>
+              <w:rPr>
+                <w:rFonts w:ascii="Arial" w:cs="Arial" w:eastAsia="Arial" w:hAnsi="Arial"/>
+                <w:sz w:val="19"/>
+                <w:szCs w:val="19"/>
+              </w:rPr>
+              <w:t xml:space="preserve">3a. Pago con tarjeta rechazado por la pasarela: el sistema informa y solicita otro medio.</w:t>
+            </w:r>
+          </w:p>
+        </w:tc>
+      </w:tr>
+      <w:tr>
+        <w:tc>
+          <w:tcPr>
+            <w:tcW w:type="dxa" w:w="2300"/>
+            <w:shd w:fill="EAF0F8" w:val="clear"/>
+            <w:tcMar>
+              <w:top w:type="dxa" w:w="40"/>
+              <w:left w:type="dxa" w:w="70"/>
+              <w:bottom w:type="dxa" w:w="40"/>
+              <w:right w:type="dxa" w:w="70"/>
+            </w:tcMar>
+          </w:tcPr>
+          <w:p>
+            <w:pPr>
+              <w:spacing w:after="18" w:line="236"/>
+            </w:pPr>
+            <w:r>
+              <w:rPr>
+                <w:rFonts w:ascii="Arial" w:cs="Arial" w:eastAsia="Arial" w:hAnsi="Arial"/>
+                <w:b/>
+                <w:bCs/>
+                <w:sz w:val="19"/>
+                <w:szCs w:val="19"/>
+              </w:rPr>
+              <w:t xml:space="preserve">Reglas y validaciones</w:t>
+            </w:r>
+          </w:p>
+        </w:tc>
+        <w:tc>
+          <w:tcPr>
+            <w:tcW w:type="dxa" w:w="7060"/>
+            <w:tcMar>
+              <w:top w:type="dxa" w:w="40"/>
+              <w:left w:type="dxa" w:w="70"/>
+              <w:bottom w:type="dxa" w:w="40"/>
+              <w:right w:type="dxa" w:w="70"/>
+            </w:tcMar>
+          </w:tcPr>
+          <w:p>
+            <w:pPr>
+              <w:spacing w:after="18" w:line="236"/>
+            </w:pPr>
+            <w:r>
+              <w:rPr>
+                <w:rFonts w:ascii="Arial" w:cs="Arial" w:eastAsia="Arial" w:hAnsi="Arial"/>
+                <w:sz w:val="19"/>
+                <w:szCs w:val="19"/>
+              </w:rPr>
+              <w:t xml:space="preserve">La venta descuenta por PEPS y guarda el costo real del despacho; el precio de venta es independiente del costo; una venta registrada afecta las existencias y la caja.</w:t>
+            </w:r>
+          </w:p>
+        </w:tc>
+      </w:tr>
+      <w:tr>
+        <w:tc>
+          <w:tcPr>
+            <w:tcW w:type="dxa" w:w="2300"/>
+            <w:shd w:fill="EAF0F8" w:val="clear"/>
+            <w:tcMar>
+              <w:top w:type="dxa" w:w="40"/>
+              <w:left w:type="dxa" w:w="70"/>
+              <w:bottom w:type="dxa" w:w="40"/>
+              <w:right w:type="dxa" w:w="70"/>
+            </w:tcMar>
+          </w:tcPr>
+          <w:p>
+            <w:pPr>
+              <w:spacing w:after="18" w:line="236"/>
+            </w:pPr>
+            <w:r>
+              <w:rPr>
+                <w:rFonts w:ascii="Arial" w:cs="Arial" w:eastAsia="Arial" w:hAnsi="Arial"/>
+                <w:b/>
+                <w:bCs/>
+                <w:sz w:val="19"/>
+                <w:szCs w:val="19"/>
+              </w:rPr>
+              <w:t xml:space="preserve">Postcondiciones</w:t>
+            </w:r>
+          </w:p>
+        </w:tc>
+        <w:tc>
+          <w:tcPr>
+            <w:tcW w:type="dxa" w:w="7060"/>
+            <w:tcMar>
+              <w:top w:type="dxa" w:w="40"/>
+              <w:left w:type="dxa" w:w="70"/>
+              <w:bottom w:type="dxa" w:w="40"/>
+              <w:right w:type="dxa" w:w="70"/>
+            </w:tcMar>
+          </w:tcPr>
+          <w:p>
+            <w:pPr>
+              <w:spacing w:after="18" w:line="236"/>
+            </w:pPr>
+            <w:r>
+              <w:rPr>
+                <w:rFonts w:ascii="Arial" w:cs="Arial" w:eastAsia="Arial" w:hAnsi="Arial"/>
+                <w:sz w:val="19"/>
+                <w:szCs w:val="19"/>
+              </w:rPr>
+              <w:t xml:space="preserve">La venta queda registrada, con el inventario y la caja actualizados y el comprobante generado.</w:t>
+            </w:r>
+          </w:p>
+        </w:tc>
+      </w:tr>
+      <w:tr>
+        <w:tc>
+          <w:tcPr>
+            <w:tcW w:type="dxa" w:w="2300"/>
+            <w:shd w:fill="EAF0F8" w:val="clear"/>
+            <w:tcMar>
+              <w:top w:type="dxa" w:w="40"/>
+              <w:left w:type="dxa" w:w="70"/>
+              <w:bottom w:type="dxa" w:w="40"/>
+              <w:right w:type="dxa" w:w="70"/>
+            </w:tcMar>
+          </w:tcPr>
+          <w:p>
+            <w:pPr>
+              <w:spacing w:after="18" w:line="236"/>
+            </w:pPr>
+            <w:r>
+              <w:rPr>
+                <w:rFonts w:ascii="Arial" w:cs="Arial" w:eastAsia="Arial" w:hAnsi="Arial"/>
+                <w:b/>
+                <w:bCs/>
+                <w:sz w:val="19"/>
+                <w:szCs w:val="19"/>
+              </w:rPr>
+              <w:t xml:space="preserve">Prioridad</w:t>
+            </w:r>
+          </w:p>
+        </w:tc>
+        <w:tc>
+          <w:tcPr>
+            <w:tcW w:type="dxa" w:w="7060"/>
+            <w:tcMar>
+              <w:top w:type="dxa" w:w="40"/>
+              <w:left w:type="dxa" w:w="70"/>
+              <w:bottom w:type="dxa" w:w="40"/>
+              <w:right w:type="dxa" w:w="70"/>
+            </w:tcMar>
+          </w:tcPr>
+          <w:p>
+            <w:pPr>
+              <w:spacing w:after="18" w:line="236"/>
+            </w:pPr>
+            <w:r>
+              <w:rPr>
+                <w:rFonts w:ascii="Arial" w:cs="Arial" w:eastAsia="Arial" w:hAnsi="Arial"/>
+                <w:sz w:val="19"/>
+                <w:szCs w:val="19"/>
+              </w:rPr>
+              <w:t xml:space="preserve">Alta</w:t>
+            </w:r>
+          </w:p>
+        </w:tc>
+      </w:tr>
+    </w:tbl>
+    <w:p>
+      <w:pPr>
+        <w:spacing w:after="140"/>
+      </w:pPr>
+    </w:p>
+    <w:tbl>
+      <w:tblPr>
+        <w:tblW w:type="dxa" w:w="9360"/>
+        <w:tblBorders>
+          <w:top w:val="single" w:color="9CA3AF" w:sz="6"/>
+          <w:left w:val="single" w:color="9CA3AF" w:sz="6"/>
+          <w:bottom w:val="single" w:color="9CA3AF" w:sz="6"/>
+          <w:right w:val="single" w:color="9CA3AF" w:sz="6"/>
+          <w:insideH w:val="single" w:color="9CA3AF" w:sz="6"/>
+          <w:insideV w:val="single" w:color="9CA3AF" w:sz="6"/>
+        </w:tblBorders>
+        <w:tblLayout w:type="fixed"/>
+      </w:tblPr>
+      <w:tblGrid>
+        <w:gridCol w:w="2300"/>
+        <w:gridCol w:w="7060"/>
+      </w:tblGrid>
+      <w:tr>
+        <w:tc>
+          <w:tcPr>
+            <w:tcW w:type="dxa" w:w="9360"/>
+            <w:gridSpan w:val="2"/>
+            <w:shd w:fill="1F3864" w:val="clear"/>
+            <w:tcMar>
+              <w:top w:type="dxa" w:w="40"/>
+              <w:left w:type="dxa" w:w="70"/>
+              <w:bottom w:type="dxa" w:w="40"/>
+              <w:right w:type="dxa" w:w="70"/>
+            </w:tcMar>
+          </w:tcPr>
+          <w:p>
+            <w:pPr>
+              <w:spacing w:after="18" w:line="236"/>
+            </w:pPr>
+            <w:r>
+              <w:rPr>
+                <w:rFonts w:ascii="Arial" w:cs="Arial" w:eastAsia="Arial" w:hAnsi="Arial"/>
+                <w:b/>
+                <w:bCs/>
+                <w:color w:val="FFFFFF"/>
+                <w:sz w:val="19"/>
+                <w:szCs w:val="19"/>
+              </w:rPr>
+              <w:t xml:space="preserve">CU-VEN-02 — Seleccionar medio de pago</w:t>
+            </w:r>
+          </w:p>
+        </w:tc>
+      </w:tr>
+      <w:tr>
+        <w:tc>
+          <w:tcPr>
+            <w:tcW w:type="dxa" w:w="2300"/>
+            <w:shd w:fill="EAF0F8" w:val="clear"/>
+            <w:tcMar>
+              <w:top w:type="dxa" w:w="40"/>
+              <w:left w:type="dxa" w:w="70"/>
+              <w:bottom w:type="dxa" w:w="40"/>
+              <w:right w:type="dxa" w:w="70"/>
+            </w:tcMar>
+          </w:tcPr>
+          <w:p>
+            <w:pPr>
+              <w:spacing w:after="18" w:line="236"/>
+            </w:pPr>
+            <w:r>
+              <w:rPr>
+                <w:rFonts w:ascii="Arial" w:cs="Arial" w:eastAsia="Arial" w:hAnsi="Arial"/>
+                <w:b/>
+                <w:bCs/>
+                <w:sz w:val="19"/>
+                <w:szCs w:val="19"/>
+              </w:rPr>
+              <w:t xml:space="preserve">Actor(es)</w:t>
+            </w:r>
+          </w:p>
+        </w:tc>
+        <w:tc>
+          <w:tcPr>
+            <w:tcW w:type="dxa" w:w="7060"/>
+            <w:tcMar>
+              <w:top w:type="dxa" w:w="40"/>
+              <w:left w:type="dxa" w:w="70"/>
+              <w:bottom w:type="dxa" w:w="40"/>
+              <w:right w:type="dxa" w:w="70"/>
+            </w:tcMar>
+          </w:tcPr>
+          <w:p>
+            <w:pPr>
+              <w:spacing w:after="18" w:line="236"/>
+            </w:pPr>
+            <w:r>
+              <w:rPr>
+                <w:rFonts w:ascii="Arial" w:cs="Arial" w:eastAsia="Arial" w:hAnsi="Arial"/>
+                <w:sz w:val="19"/>
+                <w:szCs w:val="19"/>
+              </w:rPr>
+              <w:t xml:space="preserve">Vendedor; Pasarela de pagos</w:t>
+            </w:r>
+          </w:p>
+        </w:tc>
+      </w:tr>
+      <w:tr>
+        <w:tc>
+          <w:tcPr>
+            <w:tcW w:type="dxa" w:w="2300"/>
+            <w:shd w:fill="EAF0F8" w:val="clear"/>
+            <w:tcMar>
+              <w:top w:type="dxa" w:w="40"/>
+              <w:left w:type="dxa" w:w="70"/>
+              <w:bottom w:type="dxa" w:w="40"/>
+              <w:right w:type="dxa" w:w="70"/>
+            </w:tcMar>
+          </w:tcPr>
+          <w:p>
+            <w:pPr>
+              <w:spacing w:after="18" w:line="236"/>
+            </w:pPr>
+            <w:r>
+              <w:rPr>
+                <w:rFonts w:ascii="Arial" w:cs="Arial" w:eastAsia="Arial" w:hAnsi="Arial"/>
+                <w:b/>
+                <w:bCs/>
+                <w:sz w:val="19"/>
+                <w:szCs w:val="19"/>
+              </w:rPr>
+              <w:t xml:space="preserve">Requisito</w:t>
+            </w:r>
+          </w:p>
+        </w:tc>
+        <w:tc>
+          <w:tcPr>
+            <w:tcW w:type="dxa" w:w="7060"/>
+            <w:tcMar>
+              <w:top w:type="dxa" w:w="40"/>
+              <w:left w:type="dxa" w:w="70"/>
+              <w:bottom w:type="dxa" w:w="40"/>
+              <w:right w:type="dxa" w:w="70"/>
+            </w:tcMar>
+          </w:tcPr>
+          <w:p>
+            <w:pPr>
+              <w:spacing w:after="18" w:line="236"/>
+            </w:pPr>
+            <w:r>
+              <w:rPr>
+                <w:rFonts w:ascii="Arial" w:cs="Arial" w:eastAsia="Arial" w:hAnsi="Arial"/>
+                <w:sz w:val="19"/>
+                <w:szCs w:val="19"/>
+              </w:rPr>
+              <w:t xml:space="preserve">RF-VEN-02</w:t>
+            </w:r>
+          </w:p>
+        </w:tc>
+      </w:tr>
+      <w:tr>
+        <w:tc>
+          <w:tcPr>
+            <w:tcW w:type="dxa" w:w="2300"/>
+            <w:shd w:fill="EAF0F8" w:val="clear"/>
+            <w:tcMar>
+              <w:top w:type="dxa" w:w="40"/>
+              <w:left w:type="dxa" w:w="70"/>
+              <w:bottom w:type="dxa" w:w="40"/>
+              <w:right w:type="dxa" w:w="70"/>
+            </w:tcMar>
+          </w:tcPr>
+          <w:p>
+            <w:pPr>
+              <w:spacing w:after="18" w:line="236"/>
+            </w:pPr>
+            <w:r>
+              <w:rPr>
+                <w:rFonts w:ascii="Arial" w:cs="Arial" w:eastAsia="Arial" w:hAnsi="Arial"/>
+                <w:b/>
+                <w:bCs/>
+                <w:sz w:val="19"/>
+                <w:szCs w:val="19"/>
+              </w:rPr>
+              <w:t xml:space="preserve">Descripción</w:t>
+            </w:r>
+          </w:p>
+        </w:tc>
+        <w:tc>
+          <w:tcPr>
+            <w:tcW w:type="dxa" w:w="7060"/>
+            <w:tcMar>
+              <w:top w:type="dxa" w:w="40"/>
+              <w:left w:type="dxa" w:w="70"/>
+              <w:bottom w:type="dxa" w:w="40"/>
+              <w:right w:type="dxa" w:w="70"/>
+            </w:tcMar>
+          </w:tcPr>
+          <w:p>
+            <w:pPr>
+              <w:spacing w:after="18" w:line="236"/>
+            </w:pPr>
+            <w:r>
+              <w:rPr>
+                <w:rFonts w:ascii="Arial" w:cs="Arial" w:eastAsia="Arial" w:hAnsi="Arial"/>
+                <w:sz w:val="19"/>
+                <w:szCs w:val="19"/>
+              </w:rPr>
+              <w:t xml:space="preserve">El vendedor elige cómo se paga la venta (efectivo, tarjeta u otro).</w:t>
+            </w:r>
+          </w:p>
+        </w:tc>
+      </w:tr>
+      <w:tr>
+        <w:tc>
+          <w:tcPr>
+            <w:tcW w:type="dxa" w:w="2300"/>
+            <w:shd w:fill="EAF0F8" w:val="clear"/>
+            <w:tcMar>
+              <w:top w:type="dxa" w:w="40"/>
+              <w:left w:type="dxa" w:w="70"/>
+              <w:bottom w:type="dxa" w:w="40"/>
+              <w:right w:type="dxa" w:w="70"/>
+            </w:tcMar>
+          </w:tcPr>
+          <w:p>
+            <w:pPr>
+              <w:spacing w:after="18" w:line="236"/>
+            </w:pPr>
+            <w:r>
+              <w:rPr>
+                <w:rFonts w:ascii="Arial" w:cs="Arial" w:eastAsia="Arial" w:hAnsi="Arial"/>
+                <w:b/>
+                <w:bCs/>
+                <w:sz w:val="19"/>
+                <w:szCs w:val="19"/>
+              </w:rPr>
+              <w:t xml:space="preserve">Precondiciones</w:t>
+            </w:r>
+          </w:p>
+        </w:tc>
+        <w:tc>
+          <w:tcPr>
+            <w:tcW w:type="dxa" w:w="7060"/>
+            <w:tcMar>
+              <w:top w:type="dxa" w:w="40"/>
+              <w:left w:type="dxa" w:w="70"/>
+              <w:bottom w:type="dxa" w:w="40"/>
+              <w:right w:type="dxa" w:w="70"/>
+            </w:tcMar>
+          </w:tcPr>
+          <w:p>
+            <w:pPr>
+              <w:spacing w:after="18" w:line="236"/>
+            </w:pPr>
+            <w:r>
+              <w:rPr>
+                <w:rFonts w:ascii="Arial" w:cs="Arial" w:eastAsia="Arial" w:hAnsi="Arial"/>
+                <w:sz w:val="19"/>
+                <w:szCs w:val="19"/>
+              </w:rPr>
+              <w:t xml:space="preserve">Existe una venta en curso con su total calculado.</w:t>
+            </w:r>
+          </w:p>
+        </w:tc>
+      </w:tr>
+      <w:tr>
+        <w:tc>
+          <w:tcPr>
+            <w:tcW w:type="dxa" w:w="2300"/>
+            <w:shd w:fill="EAF0F8" w:val="clear"/>
+            <w:tcMar>
+              <w:top w:type="dxa" w:w="40"/>
+              <w:left w:type="dxa" w:w="70"/>
+              <w:bottom w:type="dxa" w:w="40"/>
+              <w:right w:type="dxa" w:w="70"/>
+            </w:tcMar>
+          </w:tcPr>
+          <w:p>
+            <w:pPr>
+              <w:spacing w:after="18" w:line="236"/>
+            </w:pPr>
+            <w:r>
+              <w:rPr>
+                <w:rFonts w:ascii="Arial" w:cs="Arial" w:eastAsia="Arial" w:hAnsi="Arial"/>
+                <w:b/>
+                <w:bCs/>
+                <w:sz w:val="19"/>
+                <w:szCs w:val="19"/>
+              </w:rPr>
+              <w:t xml:space="preserve">Flujo principal</w:t>
+            </w:r>
+          </w:p>
+        </w:tc>
+        <w:tc>
+          <w:tcPr>
+            <w:tcW w:type="dxa" w:w="7060"/>
+            <w:tcMar>
+              <w:top w:type="dxa" w:w="40"/>
+              <w:left w:type="dxa" w:w="70"/>
+              <w:bottom w:type="dxa" w:w="40"/>
+              <w:right w:type="dxa" w:w="70"/>
+            </w:tcMar>
+          </w:tcPr>
+          <w:p>
+            <w:pPr>
+              <w:spacing w:after="18" w:line="236"/>
+            </w:pPr>
+            <w:r>
+              <w:rPr>
+                <w:rFonts w:ascii="Arial" w:cs="Arial" w:eastAsia="Arial" w:hAnsi="Arial"/>
+                <w:sz w:val="19"/>
+                <w:szCs w:val="19"/>
+              </w:rPr>
+              <w:t xml:space="preserve">1. El vendedor selecciona el medio de pago.</w:t>
+            </w:r>
+          </w:p>
+          <w:p>
+            <w:pPr>
+              <w:spacing w:after="18" w:line="236"/>
+            </w:pPr>
+            <w:r>
+              <w:rPr>
+                <w:rFonts w:ascii="Arial" w:cs="Arial" w:eastAsia="Arial" w:hAnsi="Arial"/>
+                <w:sz w:val="19"/>
+                <w:szCs w:val="19"/>
+              </w:rPr>
+              <w:t xml:space="preserve">2. Si es efectivo, ingresa el monto recibido y el sistema calcula el cambio.</w:t>
+            </w:r>
+          </w:p>
+          <w:p>
+            <w:pPr>
+              <w:spacing w:after="18" w:line="236"/>
+            </w:pPr>
+            <w:r>
+              <w:rPr>
+                <w:rFonts w:ascii="Arial" w:cs="Arial" w:eastAsia="Arial" w:hAnsi="Arial"/>
+                <w:sz w:val="19"/>
+                <w:szCs w:val="19"/>
+              </w:rPr>
+              <w:t xml:space="preserve">3. Si es tarjeta, el sistema envía el cobro a la pasarela de pagos y espera la respuesta.</w:t>
+            </w:r>
+          </w:p>
+          <w:p>
+            <w:pPr>
+              <w:spacing w:after="18" w:line="236"/>
+            </w:pPr>
+            <w:r>
+              <w:rPr>
+                <w:rFonts w:ascii="Arial" w:cs="Arial" w:eastAsia="Arial" w:hAnsi="Arial"/>
+                <w:sz w:val="19"/>
+                <w:szCs w:val="19"/>
+              </w:rPr>
+              <w:t xml:space="preserve">4. El sistema registra el medio de pago en la venta.</w:t>
+            </w:r>
+          </w:p>
+        </w:tc>
+      </w:tr>
+      <w:tr>
+        <w:tc>
+          <w:tcPr>
+            <w:tcW w:type="dxa" w:w="2300"/>
+            <w:shd w:fill="EAF0F8" w:val="clear"/>
+            <w:tcMar>
+              <w:top w:type="dxa" w:w="40"/>
+              <w:left w:type="dxa" w:w="70"/>
+              <w:bottom w:type="dxa" w:w="40"/>
+              <w:right w:type="dxa" w:w="70"/>
+            </w:tcMar>
+          </w:tcPr>
+          <w:p>
+            <w:pPr>
+              <w:spacing w:after="18" w:line="236"/>
+            </w:pPr>
+            <w:r>
+              <w:rPr>
+                <w:rFonts w:ascii="Arial" w:cs="Arial" w:eastAsia="Arial" w:hAnsi="Arial"/>
+                <w:b/>
+                <w:bCs/>
+                <w:sz w:val="19"/>
+                <w:szCs w:val="19"/>
+              </w:rPr>
+              <w:t xml:space="preserve">Flujos alternativos</w:t>
+            </w:r>
+          </w:p>
+        </w:tc>
+        <w:tc>
+          <w:tcPr>
+            <w:tcW w:type="dxa" w:w="7060"/>
+            <w:tcMar>
+              <w:top w:type="dxa" w:w="40"/>
+              <w:left w:type="dxa" w:w="70"/>
+              <w:bottom w:type="dxa" w:w="40"/>
+              <w:right w:type="dxa" w:w="70"/>
+            </w:tcMar>
+          </w:tcPr>
+          <w:p>
+            <w:pPr>
+              <w:spacing w:after="18" w:line="236"/>
+            </w:pPr>
+            <w:r>
+              <w:rPr>
+                <w:rFonts w:ascii="Arial" w:cs="Arial" w:eastAsia="Arial" w:hAnsi="Arial"/>
+                <w:sz w:val="19"/>
+                <w:szCs w:val="19"/>
+              </w:rPr>
+              <w:t xml:space="preserve">1a. Pago mixto (una parte en efectivo y otra con tarjeta), si aplica.</w:t>
+            </w:r>
+          </w:p>
+        </w:tc>
+      </w:tr>
+      <w:tr>
+        <w:tc>
+          <w:tcPr>
+            <w:tcW w:type="dxa" w:w="2300"/>
+            <w:shd w:fill="EAF0F8" w:val="clear"/>
+            <w:tcMar>
+              <w:top w:type="dxa" w:w="40"/>
+              <w:left w:type="dxa" w:w="70"/>
+              <w:bottom w:type="dxa" w:w="40"/>
+              <w:right w:type="dxa" w:w="70"/>
+            </w:tcMar>
+          </w:tcPr>
+          <w:p>
+            <w:pPr>
+              <w:spacing w:after="18" w:line="236"/>
+            </w:pPr>
+            <w:r>
+              <w:rPr>
+                <w:rFonts w:ascii="Arial" w:cs="Arial" w:eastAsia="Arial" w:hAnsi="Arial"/>
+                <w:b/>
+                <w:bCs/>
+                <w:sz w:val="19"/>
+                <w:szCs w:val="19"/>
+              </w:rPr>
+              <w:t xml:space="preserve">Excepciones</w:t>
+            </w:r>
+          </w:p>
+        </w:tc>
+        <w:tc>
+          <w:tcPr>
+            <w:tcW w:type="dxa" w:w="7060"/>
+            <w:tcMar>
+              <w:top w:type="dxa" w:w="40"/>
+              <w:left w:type="dxa" w:w="70"/>
+              <w:bottom w:type="dxa" w:w="40"/>
+              <w:right w:type="dxa" w:w="70"/>
+            </w:tcMar>
+          </w:tcPr>
+          <w:p>
+            <w:pPr>
+              <w:spacing w:after="18" w:line="236"/>
+            </w:pPr>
+            <w:r>
+              <w:rPr>
+                <w:rFonts w:ascii="Arial" w:cs="Arial" w:eastAsia="Arial" w:hAnsi="Arial"/>
+                <w:sz w:val="19"/>
+                <w:szCs w:val="19"/>
+              </w:rPr>
+              <w:t xml:space="preserve">3a. Pago con tarjeta rechazado: el sistema informa y permite elegir otro medio.</w:t>
+            </w:r>
+          </w:p>
+        </w:tc>
+      </w:tr>
+      <w:tr>
+        <w:tc>
+          <w:tcPr>
+            <w:tcW w:type="dxa" w:w="2300"/>
+            <w:shd w:fill="EAF0F8" w:val="clear"/>
+            <w:tcMar>
+              <w:top w:type="dxa" w:w="40"/>
+              <w:left w:type="dxa" w:w="70"/>
+              <w:bottom w:type="dxa" w:w="40"/>
+              <w:right w:type="dxa" w:w="70"/>
+            </w:tcMar>
+          </w:tcPr>
+          <w:p>
+            <w:pPr>
+              <w:spacing w:after="18" w:line="236"/>
+            </w:pPr>
+            <w:r>
+              <w:rPr>
+                <w:rFonts w:ascii="Arial" w:cs="Arial" w:eastAsia="Arial" w:hAnsi="Arial"/>
+                <w:b/>
+                <w:bCs/>
+                <w:sz w:val="19"/>
+                <w:szCs w:val="19"/>
+              </w:rPr>
+              <w:t xml:space="preserve">Reglas y validaciones</w:t>
+            </w:r>
+          </w:p>
+        </w:tc>
+        <w:tc>
+          <w:tcPr>
+            <w:tcW w:type="dxa" w:w="7060"/>
+            <w:tcMar>
+              <w:top w:type="dxa" w:w="40"/>
+              <w:left w:type="dxa" w:w="70"/>
+              <w:bottom w:type="dxa" w:w="40"/>
+              <w:right w:type="dxa" w:w="70"/>
+            </w:tcMar>
+          </w:tcPr>
+          <w:p>
+            <w:pPr>
+              <w:spacing w:after="18" w:line="236"/>
+            </w:pPr>
+            <w:r>
+              <w:rPr>
+                <w:rFonts w:ascii="Arial" w:cs="Arial" w:eastAsia="Arial" w:hAnsi="Arial"/>
+                <w:sz w:val="19"/>
+                <w:szCs w:val="19"/>
+              </w:rPr>
+              <w:t xml:space="preserve">La pasarela opera en modo de pruebas (sandbox); el medio de pago queda asociado a la venta.</w:t>
+            </w:r>
+          </w:p>
+        </w:tc>
+      </w:tr>
+      <w:tr>
+        <w:tc>
+          <w:tcPr>
+            <w:tcW w:type="dxa" w:w="2300"/>
+            <w:shd w:fill="EAF0F8" w:val="clear"/>
+            <w:tcMar>
+              <w:top w:type="dxa" w:w="40"/>
+              <w:left w:type="dxa" w:w="70"/>
+              <w:bottom w:type="dxa" w:w="40"/>
+              <w:right w:type="dxa" w:w="70"/>
+            </w:tcMar>
+          </w:tcPr>
+          <w:p>
+            <w:pPr>
+              <w:spacing w:after="18" w:line="236"/>
+            </w:pPr>
+            <w:r>
+              <w:rPr>
+                <w:rFonts w:ascii="Arial" w:cs="Arial" w:eastAsia="Arial" w:hAnsi="Arial"/>
+                <w:b/>
+                <w:bCs/>
+                <w:sz w:val="19"/>
+                <w:szCs w:val="19"/>
+              </w:rPr>
+              <w:t xml:space="preserve">Postcondiciones</w:t>
+            </w:r>
+          </w:p>
+        </w:tc>
+        <w:tc>
+          <w:tcPr>
+            <w:tcW w:type="dxa" w:w="7060"/>
+            <w:tcMar>
+              <w:top w:type="dxa" w:w="40"/>
+              <w:left w:type="dxa" w:w="70"/>
+              <w:bottom w:type="dxa" w:w="40"/>
+              <w:right w:type="dxa" w:w="70"/>
+            </w:tcMar>
+          </w:tcPr>
+          <w:p>
+            <w:pPr>
+              <w:spacing w:after="18" w:line="236"/>
+            </w:pPr>
+            <w:r>
+              <w:rPr>
+                <w:rFonts w:ascii="Arial" w:cs="Arial" w:eastAsia="Arial" w:hAnsi="Arial"/>
+                <w:sz w:val="19"/>
+                <w:szCs w:val="19"/>
+              </w:rPr>
+              <w:t xml:space="preserve">La venta queda con su medio de pago confirmado.</w:t>
+            </w:r>
+          </w:p>
+        </w:tc>
+      </w:tr>
+      <w:tr>
+        <w:tc>
+          <w:tcPr>
+            <w:tcW w:type="dxa" w:w="2300"/>
+            <w:shd w:fill="EAF0F8" w:val="clear"/>
+            <w:tcMar>
+              <w:top w:type="dxa" w:w="40"/>
+              <w:left w:type="dxa" w:w="70"/>
+              <w:bottom w:type="dxa" w:w="40"/>
+              <w:right w:type="dxa" w:w="70"/>
+            </w:tcMar>
+          </w:tcPr>
+          <w:p>
+            <w:pPr>
+              <w:spacing w:after="18" w:line="236"/>
+            </w:pPr>
+            <w:r>
+              <w:rPr>
+                <w:rFonts w:ascii="Arial" w:cs="Arial" w:eastAsia="Arial" w:hAnsi="Arial"/>
+                <w:b/>
+                <w:bCs/>
+                <w:sz w:val="19"/>
+                <w:szCs w:val="19"/>
+              </w:rPr>
+              <w:t xml:space="preserve">Prioridad</w:t>
+            </w:r>
+          </w:p>
+        </w:tc>
+        <w:tc>
+          <w:tcPr>
+            <w:tcW w:type="dxa" w:w="7060"/>
+            <w:tcMar>
+              <w:top w:type="dxa" w:w="40"/>
+              <w:left w:type="dxa" w:w="70"/>
+              <w:bottom w:type="dxa" w:w="40"/>
+              <w:right w:type="dxa" w:w="70"/>
+            </w:tcMar>
+          </w:tcPr>
+          <w:p>
+            <w:pPr>
+              <w:spacing w:after="18" w:line="236"/>
+            </w:pPr>
+            <w:r>
+              <w:rPr>
+                <w:rFonts w:ascii="Arial" w:cs="Arial" w:eastAsia="Arial" w:hAnsi="Arial"/>
+                <w:sz w:val="19"/>
+                <w:szCs w:val="19"/>
+              </w:rPr>
+              <w:t xml:space="preserve">Alta</w:t>
+            </w:r>
+          </w:p>
+        </w:tc>
+      </w:tr>
+    </w:tbl>
+    <w:p>
+      <w:pPr>
+        <w:spacing w:after="140"/>
+      </w:pPr>
+    </w:p>
+    <w:tbl>
+      <w:tblPr>
+        <w:tblW w:type="dxa" w:w="9360"/>
+        <w:tblBorders>
+          <w:top w:val="single" w:color="9CA3AF" w:sz="6"/>
+          <w:left w:val="single" w:color="9CA3AF" w:sz="6"/>
+          <w:bottom w:val="single" w:color="9CA3AF" w:sz="6"/>
+          <w:right w:val="single" w:color="9CA3AF" w:sz="6"/>
+          <w:insideH w:val="single" w:color="9CA3AF" w:sz="6"/>
+          <w:insideV w:val="single" w:color="9CA3AF" w:sz="6"/>
+        </w:tblBorders>
+        <w:tblLayout w:type="fixed"/>
+      </w:tblPr>
+      <w:tblGrid>
+        <w:gridCol w:w="2300"/>
+        <w:gridCol w:w="7060"/>
+      </w:tblGrid>
+      <w:tr>
+        <w:tc>
+          <w:tcPr>
+            <w:tcW w:type="dxa" w:w="9360"/>
+            <w:gridSpan w:val="2"/>
+            <w:shd w:fill="1F3864" w:val="clear"/>
+            <w:tcMar>
+              <w:top w:type="dxa" w:w="40"/>
+              <w:left w:type="dxa" w:w="70"/>
+              <w:bottom w:type="dxa" w:w="40"/>
+              <w:right w:type="dxa" w:w="70"/>
+            </w:tcMar>
+          </w:tcPr>
+          <w:p>
+            <w:pPr>
+              <w:spacing w:after="18" w:line="236"/>
+            </w:pPr>
+            <w:r>
+              <w:rPr>
+                <w:rFonts w:ascii="Arial" w:cs="Arial" w:eastAsia="Arial" w:hAnsi="Arial"/>
+                <w:b/>
+                <w:bCs/>
+                <w:color w:val="FFFFFF"/>
+                <w:sz w:val="19"/>
+                <w:szCs w:val="19"/>
+              </w:rPr>
+              <w:t xml:space="preserve">CU-VEN-03 — Generar comprobante</w:t>
+            </w:r>
+          </w:p>
+        </w:tc>
+      </w:tr>
+      <w:tr>
+        <w:tc>
+          <w:tcPr>
+            <w:tcW w:type="dxa" w:w="2300"/>
+            <w:shd w:fill="EAF0F8" w:val="clear"/>
+            <w:tcMar>
+              <w:top w:type="dxa" w:w="40"/>
+              <w:left w:type="dxa" w:w="70"/>
+              <w:bottom w:type="dxa" w:w="40"/>
+              <w:right w:type="dxa" w:w="70"/>
+            </w:tcMar>
+          </w:tcPr>
+          <w:p>
+            <w:pPr>
+              <w:spacing w:after="18" w:line="236"/>
+            </w:pPr>
+            <w:r>
+              <w:rPr>
+                <w:rFonts w:ascii="Arial" w:cs="Arial" w:eastAsia="Arial" w:hAnsi="Arial"/>
+                <w:b/>
+                <w:bCs/>
+                <w:sz w:val="19"/>
+                <w:szCs w:val="19"/>
+              </w:rPr>
+              <w:t xml:space="preserve">Actor(es)</w:t>
+            </w:r>
+          </w:p>
+        </w:tc>
+        <w:tc>
+          <w:tcPr>
+            <w:tcW w:type="dxa" w:w="7060"/>
+            <w:tcMar>
+              <w:top w:type="dxa" w:w="40"/>
+              <w:left w:type="dxa" w:w="70"/>
+              <w:bottom w:type="dxa" w:w="40"/>
+              <w:right w:type="dxa" w:w="70"/>
+            </w:tcMar>
+          </w:tcPr>
+          <w:p>
+            <w:pPr>
+              <w:spacing w:after="18" w:line="236"/>
+            </w:pPr>
+            <w:r>
+              <w:rPr>
+                <w:rFonts w:ascii="Arial" w:cs="Arial" w:eastAsia="Arial" w:hAnsi="Arial"/>
+                <w:sz w:val="19"/>
+                <w:szCs w:val="19"/>
+              </w:rPr>
+              <w:t xml:space="preserve">Sistema</w:t>
+            </w:r>
+          </w:p>
+        </w:tc>
+      </w:tr>
+      <w:tr>
+        <w:tc>
+          <w:tcPr>
+            <w:tcW w:type="dxa" w:w="2300"/>
+            <w:shd w:fill="EAF0F8" w:val="clear"/>
+            <w:tcMar>
+              <w:top w:type="dxa" w:w="40"/>
+              <w:left w:type="dxa" w:w="70"/>
+              <w:bottom w:type="dxa" w:w="40"/>
+              <w:right w:type="dxa" w:w="70"/>
+            </w:tcMar>
+          </w:tcPr>
+          <w:p>
+            <w:pPr>
+              <w:spacing w:after="18" w:line="236"/>
+            </w:pPr>
+            <w:r>
+              <w:rPr>
+                <w:rFonts w:ascii="Arial" w:cs="Arial" w:eastAsia="Arial" w:hAnsi="Arial"/>
+                <w:b/>
+                <w:bCs/>
+                <w:sz w:val="19"/>
+                <w:szCs w:val="19"/>
+              </w:rPr>
+              <w:t xml:space="preserve">Requisito</w:t>
+            </w:r>
+          </w:p>
+        </w:tc>
+        <w:tc>
+          <w:tcPr>
+            <w:tcW w:type="dxa" w:w="7060"/>
+            <w:tcMar>
+              <w:top w:type="dxa" w:w="40"/>
+              <w:left w:type="dxa" w:w="70"/>
+              <w:bottom w:type="dxa" w:w="40"/>
+              <w:right w:type="dxa" w:w="70"/>
+            </w:tcMar>
+          </w:tcPr>
+          <w:p>
+            <w:pPr>
+              <w:spacing w:after="18" w:line="236"/>
+            </w:pPr>
+            <w:r>
+              <w:rPr>
+                <w:rFonts w:ascii="Arial" w:cs="Arial" w:eastAsia="Arial" w:hAnsi="Arial"/>
+                <w:sz w:val="19"/>
+                <w:szCs w:val="19"/>
+              </w:rPr>
+              <w:t xml:space="preserve">RF-VEN-03</w:t>
+            </w:r>
+          </w:p>
+        </w:tc>
+      </w:tr>
+      <w:tr>
+        <w:tc>
+          <w:tcPr>
+            <w:tcW w:type="dxa" w:w="2300"/>
+            <w:shd w:fill="EAF0F8" w:val="clear"/>
+            <w:tcMar>
+              <w:top w:type="dxa" w:w="40"/>
+              <w:left w:type="dxa" w:w="70"/>
+              <w:bottom w:type="dxa" w:w="40"/>
+              <w:right w:type="dxa" w:w="70"/>
+            </w:tcMar>
+          </w:tcPr>
+          <w:p>
+            <w:pPr>
+              <w:spacing w:after="18" w:line="236"/>
+            </w:pPr>
+            <w:r>
+              <w:rPr>
+                <w:rFonts w:ascii="Arial" w:cs="Arial" w:eastAsia="Arial" w:hAnsi="Arial"/>
+                <w:b/>
+                <w:bCs/>
+                <w:sz w:val="19"/>
+                <w:szCs w:val="19"/>
+              </w:rPr>
+              <w:t xml:space="preserve">Descripción</w:t>
+            </w:r>
+          </w:p>
+        </w:tc>
+        <w:tc>
+          <w:tcPr>
+            <w:tcW w:type="dxa" w:w="7060"/>
+            <w:tcMar>
+              <w:top w:type="dxa" w:w="40"/>
+              <w:left w:type="dxa" w:w="70"/>
+              <w:bottom w:type="dxa" w:w="40"/>
+              <w:right w:type="dxa" w:w="70"/>
+            </w:tcMar>
+          </w:tcPr>
+          <w:p>
+            <w:pPr>
+              <w:spacing w:after="18" w:line="236"/>
+            </w:pPr>
+            <w:r>
+              <w:rPr>
+                <w:rFonts w:ascii="Arial" w:cs="Arial" w:eastAsia="Arial" w:hAnsi="Arial"/>
+                <w:sz w:val="19"/>
+                <w:szCs w:val="19"/>
+              </w:rPr>
+              <w:t xml:space="preserve">El sistema genera el comprobante de la venta (tiquete o soporte).</w:t>
+            </w:r>
+          </w:p>
+        </w:tc>
+      </w:tr>
+      <w:tr>
+        <w:tc>
+          <w:tcPr>
+            <w:tcW w:type="dxa" w:w="2300"/>
+            <w:shd w:fill="EAF0F8" w:val="clear"/>
+            <w:tcMar>
+              <w:top w:type="dxa" w:w="40"/>
+              <w:left w:type="dxa" w:w="70"/>
+              <w:bottom w:type="dxa" w:w="40"/>
+              <w:right w:type="dxa" w:w="70"/>
+            </w:tcMar>
+          </w:tcPr>
+          <w:p>
+            <w:pPr>
+              <w:spacing w:after="18" w:line="236"/>
+            </w:pPr>
+            <w:r>
+              <w:rPr>
+                <w:rFonts w:ascii="Arial" w:cs="Arial" w:eastAsia="Arial" w:hAnsi="Arial"/>
+                <w:b/>
+                <w:bCs/>
+                <w:sz w:val="19"/>
+                <w:szCs w:val="19"/>
+              </w:rPr>
+              <w:t xml:space="preserve">Precondiciones</w:t>
+            </w:r>
+          </w:p>
+        </w:tc>
+        <w:tc>
+          <w:tcPr>
+            <w:tcW w:type="dxa" w:w="7060"/>
+            <w:tcMar>
+              <w:top w:type="dxa" w:w="40"/>
+              <w:left w:type="dxa" w:w="70"/>
+              <w:bottom w:type="dxa" w:w="40"/>
+              <w:right w:type="dxa" w:w="70"/>
+            </w:tcMar>
+          </w:tcPr>
+          <w:p>
+            <w:pPr>
+              <w:spacing w:after="18" w:line="236"/>
+            </w:pPr>
+            <w:r>
+              <w:rPr>
+                <w:rFonts w:ascii="Arial" w:cs="Arial" w:eastAsia="Arial" w:hAnsi="Arial"/>
+                <w:sz w:val="19"/>
+                <w:szCs w:val="19"/>
+              </w:rPr>
+              <w:t xml:space="preserve">La venta fue confirmada y pagada.</w:t>
+            </w:r>
+          </w:p>
+        </w:tc>
+      </w:tr>
+      <w:tr>
+        <w:tc>
+          <w:tcPr>
+            <w:tcW w:type="dxa" w:w="2300"/>
+            <w:shd w:fill="EAF0F8" w:val="clear"/>
+            <w:tcMar>
+              <w:top w:type="dxa" w:w="40"/>
+              <w:left w:type="dxa" w:w="70"/>
+              <w:bottom w:type="dxa" w:w="40"/>
+              <w:right w:type="dxa" w:w="70"/>
+            </w:tcMar>
+          </w:tcPr>
+          <w:p>
+            <w:pPr>
+              <w:spacing w:after="18" w:line="236"/>
+            </w:pPr>
+            <w:r>
+              <w:rPr>
+                <w:rFonts w:ascii="Arial" w:cs="Arial" w:eastAsia="Arial" w:hAnsi="Arial"/>
+                <w:b/>
+                <w:bCs/>
+                <w:sz w:val="19"/>
+                <w:szCs w:val="19"/>
+              </w:rPr>
+              <w:t xml:space="preserve">Flujo principal</w:t>
+            </w:r>
+          </w:p>
+        </w:tc>
+        <w:tc>
+          <w:tcPr>
+            <w:tcW w:type="dxa" w:w="7060"/>
+            <w:tcMar>
+              <w:top w:type="dxa" w:w="40"/>
+              <w:left w:type="dxa" w:w="70"/>
+              <w:bottom w:type="dxa" w:w="40"/>
+              <w:right w:type="dxa" w:w="70"/>
+            </w:tcMar>
+          </w:tcPr>
+          <w:p>
+            <w:pPr>
+              <w:spacing w:after="18" w:line="236"/>
+            </w:pPr>
+            <w:r>
+              <w:rPr>
+                <w:rFonts w:ascii="Arial" w:cs="Arial" w:eastAsia="Arial" w:hAnsi="Arial"/>
+                <w:sz w:val="19"/>
+                <w:szCs w:val="19"/>
+              </w:rPr>
+              <w:t xml:space="preserve">1. El sistema toma los datos de la venta (productos, totales, medio de pago y consecutivo).</w:t>
+            </w:r>
+          </w:p>
+          <w:p>
+            <w:pPr>
+              <w:spacing w:after="18" w:line="236"/>
+            </w:pPr>
+            <w:r>
+              <w:rPr>
+                <w:rFonts w:ascii="Arial" w:cs="Arial" w:eastAsia="Arial" w:hAnsi="Arial"/>
+                <w:sz w:val="19"/>
+                <w:szCs w:val="19"/>
+              </w:rPr>
+              <w:t xml:space="preserve">2. Genera el comprobante con su numeración consecutiva.</w:t>
+            </w:r>
+          </w:p>
+          <w:p>
+            <w:pPr>
+              <w:spacing w:after="18" w:line="236"/>
+            </w:pPr>
+            <w:r>
+              <w:rPr>
+                <w:rFonts w:ascii="Arial" w:cs="Arial" w:eastAsia="Arial" w:hAnsi="Arial"/>
+                <w:sz w:val="19"/>
+                <w:szCs w:val="19"/>
+              </w:rPr>
+              <w:t xml:space="preserve">3. Lo muestra para impresión o envío.</w:t>
+            </w:r>
+          </w:p>
+        </w:tc>
+      </w:tr>
+      <w:tr>
+        <w:tc>
+          <w:tcPr>
+            <w:tcW w:type="dxa" w:w="2300"/>
+            <w:shd w:fill="EAF0F8" w:val="clear"/>
+            <w:tcMar>
+              <w:top w:type="dxa" w:w="40"/>
+              <w:left w:type="dxa" w:w="70"/>
+              <w:bottom w:type="dxa" w:w="40"/>
+              <w:right w:type="dxa" w:w="70"/>
+            </w:tcMar>
+          </w:tcPr>
+          <w:p>
+            <w:pPr>
+              <w:spacing w:after="18" w:line="236"/>
+            </w:pPr>
+            <w:r>
+              <w:rPr>
+                <w:rFonts w:ascii="Arial" w:cs="Arial" w:eastAsia="Arial" w:hAnsi="Arial"/>
+                <w:b/>
+                <w:bCs/>
+                <w:sz w:val="19"/>
+                <w:szCs w:val="19"/>
+              </w:rPr>
+              <w:t xml:space="preserve">Flujos alternativos</w:t>
+            </w:r>
+          </w:p>
+        </w:tc>
+        <w:tc>
+          <w:tcPr>
+            <w:tcW w:type="dxa" w:w="7060"/>
+            <w:tcMar>
+              <w:top w:type="dxa" w:w="40"/>
+              <w:left w:type="dxa" w:w="70"/>
+              <w:bottom w:type="dxa" w:w="40"/>
+              <w:right w:type="dxa" w:w="70"/>
+            </w:tcMar>
+          </w:tcPr>
+          <w:p>
+            <w:pPr>
+              <w:spacing w:after="18" w:line="236"/>
+            </w:pPr>
+            <w:r>
+              <w:rPr>
+                <w:rFonts w:ascii="Arial" w:cs="Arial" w:eastAsia="Arial" w:hAnsi="Arial"/>
+                <w:sz w:val="19"/>
+                <w:szCs w:val="19"/>
+              </w:rPr>
+              <w:t xml:space="preserve">2a. Si se requiere factura electrónica, se emite mediante el módulo FAC (CU-FAC-02).</w:t>
+            </w:r>
+          </w:p>
+        </w:tc>
+      </w:tr>
+      <w:tr>
+        <w:tc>
+          <w:tcPr>
+            <w:tcW w:type="dxa" w:w="2300"/>
+            <w:shd w:fill="EAF0F8" w:val="clear"/>
+            <w:tcMar>
+              <w:top w:type="dxa" w:w="40"/>
+              <w:left w:type="dxa" w:w="70"/>
+              <w:bottom w:type="dxa" w:w="40"/>
+              <w:right w:type="dxa" w:w="70"/>
+            </w:tcMar>
+          </w:tcPr>
+          <w:p>
+            <w:pPr>
+              <w:spacing w:after="18" w:line="236"/>
+            </w:pPr>
+            <w:r>
+              <w:rPr>
+                <w:rFonts w:ascii="Arial" w:cs="Arial" w:eastAsia="Arial" w:hAnsi="Arial"/>
+                <w:b/>
+                <w:bCs/>
+                <w:sz w:val="19"/>
+                <w:szCs w:val="19"/>
+              </w:rPr>
+              <w:t xml:space="preserve">Excepciones</w:t>
+            </w:r>
+          </w:p>
+        </w:tc>
+        <w:tc>
+          <w:tcPr>
+            <w:tcW w:type="dxa" w:w="7060"/>
+            <w:tcMar>
+              <w:top w:type="dxa" w:w="40"/>
+              <w:left w:type="dxa" w:w="70"/>
+              <w:bottom w:type="dxa" w:w="40"/>
+              <w:right w:type="dxa" w:w="70"/>
+            </w:tcMar>
+          </w:tcPr>
+          <w:p>
+            <w:pPr>
+              <w:spacing w:after="18" w:line="236"/>
+            </w:pPr>
+            <w:r>
+              <w:rPr>
+                <w:rFonts w:ascii="Arial" w:cs="Arial" w:eastAsia="Arial" w:hAnsi="Arial"/>
+                <w:sz w:val="19"/>
+                <w:szCs w:val="19"/>
+              </w:rPr>
+              <w:t xml:space="preserve">*. Error de impresión: el comprobante queda guardado y puede reimprimirse.</w:t>
+            </w:r>
+          </w:p>
+        </w:tc>
+      </w:tr>
+      <w:tr>
+        <w:tc>
+          <w:tcPr>
+            <w:tcW w:type="dxa" w:w="2300"/>
+            <w:shd w:fill="EAF0F8" w:val="clear"/>
+            <w:tcMar>
+              <w:top w:type="dxa" w:w="40"/>
+              <w:left w:type="dxa" w:w="70"/>
+              <w:bottom w:type="dxa" w:w="40"/>
+              <w:right w:type="dxa" w:w="70"/>
+            </w:tcMar>
+          </w:tcPr>
+          <w:p>
+            <w:pPr>
+              <w:spacing w:after="18" w:line="236"/>
+            </w:pPr>
+            <w:r>
+              <w:rPr>
+                <w:rFonts w:ascii="Arial" w:cs="Arial" w:eastAsia="Arial" w:hAnsi="Arial"/>
+                <w:b/>
+                <w:bCs/>
+                <w:sz w:val="19"/>
+                <w:szCs w:val="19"/>
+              </w:rPr>
+              <w:t xml:space="preserve">Reglas y validaciones</w:t>
+            </w:r>
+          </w:p>
+        </w:tc>
+        <w:tc>
+          <w:tcPr>
+            <w:tcW w:type="dxa" w:w="7060"/>
+            <w:tcMar>
+              <w:top w:type="dxa" w:w="40"/>
+              <w:left w:type="dxa" w:w="70"/>
+              <w:bottom w:type="dxa" w:w="40"/>
+              <w:right w:type="dxa" w:w="70"/>
+            </w:tcMar>
+          </w:tcPr>
+          <w:p>
+            <w:pPr>
+              <w:spacing w:after="18" w:line="236"/>
+            </w:pPr>
+            <w:r>
+              <w:rPr>
+                <w:rFonts w:ascii="Arial" w:cs="Arial" w:eastAsia="Arial" w:hAnsi="Arial"/>
+                <w:sz w:val="19"/>
+                <w:szCs w:val="19"/>
+              </w:rPr>
+              <w:t xml:space="preserve">La numeración es consecutiva y única; el comprobante refleja los valores de la venta.</w:t>
+            </w:r>
+          </w:p>
+        </w:tc>
+      </w:tr>
+      <w:tr>
+        <w:tc>
+          <w:tcPr>
+            <w:tcW w:type="dxa" w:w="2300"/>
+            <w:shd w:fill="EAF0F8" w:val="clear"/>
+            <w:tcMar>
+              <w:top w:type="dxa" w:w="40"/>
+              <w:left w:type="dxa" w:w="70"/>
+              <w:bottom w:type="dxa" w:w="40"/>
+              <w:right w:type="dxa" w:w="70"/>
+            </w:tcMar>
+          </w:tcPr>
+          <w:p>
+            <w:pPr>
+              <w:spacing w:after="18" w:line="236"/>
+            </w:pPr>
+            <w:r>
+              <w:rPr>
+                <w:rFonts w:ascii="Arial" w:cs="Arial" w:eastAsia="Arial" w:hAnsi="Arial"/>
+                <w:b/>
+                <w:bCs/>
+                <w:sz w:val="19"/>
+                <w:szCs w:val="19"/>
+              </w:rPr>
+              <w:t xml:space="preserve">Postcondiciones</w:t>
+            </w:r>
+          </w:p>
+        </w:tc>
+        <w:tc>
+          <w:tcPr>
+            <w:tcW w:type="dxa" w:w="7060"/>
+            <w:tcMar>
+              <w:top w:type="dxa" w:w="40"/>
+              <w:left w:type="dxa" w:w="70"/>
+              <w:bottom w:type="dxa" w:w="40"/>
+              <w:right w:type="dxa" w:w="70"/>
+            </w:tcMar>
+          </w:tcPr>
+          <w:p>
+            <w:pPr>
+              <w:spacing w:after="18" w:line="236"/>
+            </w:pPr>
+            <w:r>
+              <w:rPr>
+                <w:rFonts w:ascii="Arial" w:cs="Arial" w:eastAsia="Arial" w:hAnsi="Arial"/>
+                <w:sz w:val="19"/>
+                <w:szCs w:val="19"/>
+              </w:rPr>
+              <w:t xml:space="preserve">El comprobante queda generado y disponible.</w:t>
+            </w:r>
+          </w:p>
+        </w:tc>
+      </w:tr>
+      <w:tr>
+        <w:tc>
+          <w:tcPr>
+            <w:tcW w:type="dxa" w:w="2300"/>
+            <w:shd w:fill="EAF0F8" w:val="clear"/>
+            <w:tcMar>
+              <w:top w:type="dxa" w:w="40"/>
+              <w:left w:type="dxa" w:w="70"/>
+              <w:bottom w:type="dxa" w:w="40"/>
+              <w:right w:type="dxa" w:w="70"/>
+            </w:tcMar>
+          </w:tcPr>
+          <w:p>
+            <w:pPr>
+              <w:spacing w:after="18" w:line="236"/>
+            </w:pPr>
+            <w:r>
+              <w:rPr>
+                <w:rFonts w:ascii="Arial" w:cs="Arial" w:eastAsia="Arial" w:hAnsi="Arial"/>
+                <w:b/>
+                <w:bCs/>
+                <w:sz w:val="19"/>
+                <w:szCs w:val="19"/>
+              </w:rPr>
+              <w:t xml:space="preserve">Prioridad</w:t>
+            </w:r>
+          </w:p>
+        </w:tc>
+        <w:tc>
+          <w:tcPr>
+            <w:tcW w:type="dxa" w:w="7060"/>
+            <w:tcMar>
+              <w:top w:type="dxa" w:w="40"/>
+              <w:left w:type="dxa" w:w="70"/>
+              <w:bottom w:type="dxa" w:w="40"/>
+              <w:right w:type="dxa" w:w="70"/>
+            </w:tcMar>
+          </w:tcPr>
+          <w:p>
+            <w:pPr>
+              <w:spacing w:after="18" w:line="236"/>
+            </w:pPr>
+            <w:r>
+              <w:rPr>
+                <w:rFonts w:ascii="Arial" w:cs="Arial" w:eastAsia="Arial" w:hAnsi="Arial"/>
+                <w:sz w:val="19"/>
+                <w:szCs w:val="19"/>
+              </w:rPr>
+              <w:t xml:space="preserve">Media</w:t>
+            </w:r>
+          </w:p>
+        </w:tc>
+      </w:tr>
+    </w:tbl>
+    <w:p>
+      <w:pPr>
+        <w:spacing w:after="140"/>
+      </w:pPr>
+    </w:p>
+    <w:tbl>
+      <w:tblPr>
+        <w:tblW w:type="dxa" w:w="9360"/>
+        <w:tblBorders>
+          <w:top w:val="single" w:color="9CA3AF" w:sz="6"/>
+          <w:left w:val="single" w:color="9CA3AF" w:sz="6"/>
+          <w:bottom w:val="single" w:color="9CA3AF" w:sz="6"/>
+          <w:right w:val="single" w:color="9CA3AF" w:sz="6"/>
+          <w:insideH w:val="single" w:color="9CA3AF" w:sz="6"/>
+          <w:insideV w:val="single" w:color="9CA3AF" w:sz="6"/>
+        </w:tblBorders>
+        <w:tblLayout w:type="fixed"/>
+      </w:tblPr>
+      <w:tblGrid>
+        <w:gridCol w:w="2300"/>
+        <w:gridCol w:w="7060"/>
+      </w:tblGrid>
+      <w:tr>
+        <w:tc>
+          <w:tcPr>
+            <w:tcW w:type="dxa" w:w="9360"/>
+            <w:gridSpan w:val="2"/>
+            <w:shd w:fill="1F3864" w:val="clear"/>
+            <w:tcMar>
+              <w:top w:type="dxa" w:w="40"/>
+              <w:left w:type="dxa" w:w="70"/>
+              <w:bottom w:type="dxa" w:w="40"/>
+              <w:right w:type="dxa" w:w="70"/>
+            </w:tcMar>
+          </w:tcPr>
+          <w:p>
+            <w:pPr>
+              <w:spacing w:after="18" w:line="236"/>
+            </w:pPr>
+            <w:r>
+              <w:rPr>
+                <w:rFonts w:ascii="Arial" w:cs="Arial" w:eastAsia="Arial" w:hAnsi="Arial"/>
+                <w:b/>
+                <w:bCs/>
+                <w:color w:val="FFFFFF"/>
+                <w:sz w:val="19"/>
+                <w:szCs w:val="19"/>
+              </w:rPr>
+              <w:t xml:space="preserve">CU-VEN-04 — Anular venta</w:t>
+            </w:r>
+          </w:p>
+        </w:tc>
+      </w:tr>
+      <w:tr>
+        <w:tc>
+          <w:tcPr>
+            <w:tcW w:type="dxa" w:w="2300"/>
+            <w:shd w:fill="EAF0F8" w:val="clear"/>
+            <w:tcMar>
+              <w:top w:type="dxa" w:w="40"/>
+              <w:left w:type="dxa" w:w="70"/>
+              <w:bottom w:type="dxa" w:w="40"/>
+              <w:right w:type="dxa" w:w="70"/>
+            </w:tcMar>
+          </w:tcPr>
+          <w:p>
+            <w:pPr>
+              <w:spacing w:after="18" w:line="236"/>
+            </w:pPr>
+            <w:r>
+              <w:rPr>
+                <w:rFonts w:ascii="Arial" w:cs="Arial" w:eastAsia="Arial" w:hAnsi="Arial"/>
+                <w:b/>
+                <w:bCs/>
+                <w:sz w:val="19"/>
+                <w:szCs w:val="19"/>
+              </w:rPr>
+              <w:t xml:space="preserve">Actor(es)</w:t>
+            </w:r>
+          </w:p>
+        </w:tc>
+        <w:tc>
+          <w:tcPr>
+            <w:tcW w:type="dxa" w:w="7060"/>
+            <w:tcMar>
+              <w:top w:type="dxa" w:w="40"/>
+              <w:left w:type="dxa" w:w="70"/>
+              <w:bottom w:type="dxa" w:w="40"/>
+              <w:right w:type="dxa" w:w="70"/>
+            </w:tcMar>
+          </w:tcPr>
+          <w:p>
+            <w:pPr>
+              <w:spacing w:after="18" w:line="236"/>
+            </w:pPr>
+            <w:r>
+              <w:rPr>
+                <w:rFonts w:ascii="Arial" w:cs="Arial" w:eastAsia="Arial" w:hAnsi="Arial"/>
+                <w:sz w:val="19"/>
+                <w:szCs w:val="19"/>
+              </w:rPr>
+              <w:t xml:space="preserve">Administrador</w:t>
+            </w:r>
+          </w:p>
+        </w:tc>
+      </w:tr>
+      <w:tr>
+        <w:tc>
+          <w:tcPr>
+            <w:tcW w:type="dxa" w:w="2300"/>
+            <w:shd w:fill="EAF0F8" w:val="clear"/>
+            <w:tcMar>
+              <w:top w:type="dxa" w:w="40"/>
+              <w:left w:type="dxa" w:w="70"/>
+              <w:bottom w:type="dxa" w:w="40"/>
+              <w:right w:type="dxa" w:w="70"/>
+            </w:tcMar>
+          </w:tcPr>
+          <w:p>
+            <w:pPr>
+              <w:spacing w:after="18" w:line="236"/>
+            </w:pPr>
+            <w:r>
+              <w:rPr>
+                <w:rFonts w:ascii="Arial" w:cs="Arial" w:eastAsia="Arial" w:hAnsi="Arial"/>
+                <w:b/>
+                <w:bCs/>
+                <w:sz w:val="19"/>
+                <w:szCs w:val="19"/>
+              </w:rPr>
+              <w:t xml:space="preserve">Requisito</w:t>
+            </w:r>
+          </w:p>
+        </w:tc>
+        <w:tc>
+          <w:tcPr>
+            <w:tcW w:type="dxa" w:w="7060"/>
+            <w:tcMar>
+              <w:top w:type="dxa" w:w="40"/>
+              <w:left w:type="dxa" w:w="70"/>
+              <w:bottom w:type="dxa" w:w="40"/>
+              <w:right w:type="dxa" w:w="70"/>
+            </w:tcMar>
+          </w:tcPr>
+          <w:p>
+            <w:pPr>
+              <w:spacing w:after="18" w:line="236"/>
+            </w:pPr>
+            <w:r>
+              <w:rPr>
+                <w:rFonts w:ascii="Arial" w:cs="Arial" w:eastAsia="Arial" w:hAnsi="Arial"/>
+                <w:sz w:val="19"/>
+                <w:szCs w:val="19"/>
+              </w:rPr>
+              <w:t xml:space="preserve">RF-VEN-04</w:t>
+            </w:r>
+          </w:p>
+        </w:tc>
+      </w:tr>
+      <w:tr>
+        <w:tc>
+          <w:tcPr>
+            <w:tcW w:type="dxa" w:w="2300"/>
+            <w:shd w:fill="EAF0F8" w:val="clear"/>
+            <w:tcMar>
+              <w:top w:type="dxa" w:w="40"/>
+              <w:left w:type="dxa" w:w="70"/>
+              <w:bottom w:type="dxa" w:w="40"/>
+              <w:right w:type="dxa" w:w="70"/>
+            </w:tcMar>
+          </w:tcPr>
+          <w:p>
+            <w:pPr>
+              <w:spacing w:after="18" w:line="236"/>
+            </w:pPr>
+            <w:r>
+              <w:rPr>
+                <w:rFonts w:ascii="Arial" w:cs="Arial" w:eastAsia="Arial" w:hAnsi="Arial"/>
+                <w:b/>
+                <w:bCs/>
+                <w:sz w:val="19"/>
+                <w:szCs w:val="19"/>
+              </w:rPr>
+              <w:t xml:space="preserve">Descripción</w:t>
+            </w:r>
+          </w:p>
+        </w:tc>
+        <w:tc>
+          <w:tcPr>
+            <w:tcW w:type="dxa" w:w="7060"/>
+            <w:tcMar>
+              <w:top w:type="dxa" w:w="40"/>
+              <w:left w:type="dxa" w:w="70"/>
+              <w:bottom w:type="dxa" w:w="40"/>
+              <w:right w:type="dxa" w:w="70"/>
+            </w:tcMar>
+          </w:tcPr>
+          <w:p>
+            <w:pPr>
+              <w:spacing w:after="18" w:line="236"/>
+            </w:pPr>
+            <w:r>
+              <w:rPr>
+                <w:rFonts w:ascii="Arial" w:cs="Arial" w:eastAsia="Arial" w:hAnsi="Arial"/>
+                <w:sz w:val="19"/>
+                <w:szCs w:val="19"/>
+              </w:rPr>
+              <w:t xml:space="preserve">El administrador anula una venta registrada y revierte sus efectos en el inventario y la caja.</w:t>
+            </w:r>
+          </w:p>
+        </w:tc>
+      </w:tr>
+      <w:tr>
+        <w:tc>
+          <w:tcPr>
+            <w:tcW w:type="dxa" w:w="2300"/>
+            <w:shd w:fill="EAF0F8" w:val="clear"/>
+            <w:tcMar>
+              <w:top w:type="dxa" w:w="40"/>
+              <w:left w:type="dxa" w:w="70"/>
+              <w:bottom w:type="dxa" w:w="40"/>
+              <w:right w:type="dxa" w:w="70"/>
+            </w:tcMar>
+          </w:tcPr>
+          <w:p>
+            <w:pPr>
+              <w:spacing w:after="18" w:line="236"/>
+            </w:pPr>
+            <w:r>
+              <w:rPr>
+                <w:rFonts w:ascii="Arial" w:cs="Arial" w:eastAsia="Arial" w:hAnsi="Arial"/>
+                <w:b/>
+                <w:bCs/>
+                <w:sz w:val="19"/>
+                <w:szCs w:val="19"/>
+              </w:rPr>
+              <w:t xml:space="preserve">Precondiciones</w:t>
+            </w:r>
+          </w:p>
+        </w:tc>
+        <w:tc>
+          <w:tcPr>
+            <w:tcW w:type="dxa" w:w="7060"/>
+            <w:tcMar>
+              <w:top w:type="dxa" w:w="40"/>
+              <w:left w:type="dxa" w:w="70"/>
+              <w:bottom w:type="dxa" w:w="40"/>
+              <w:right w:type="dxa" w:w="70"/>
+            </w:tcMar>
+          </w:tcPr>
+          <w:p>
+            <w:pPr>
+              <w:spacing w:after="18" w:line="236"/>
+            </w:pPr>
+            <w:r>
+              <w:rPr>
+                <w:rFonts w:ascii="Arial" w:cs="Arial" w:eastAsia="Arial" w:hAnsi="Arial"/>
+                <w:sz w:val="19"/>
+                <w:szCs w:val="19"/>
+              </w:rPr>
+              <w:t xml:space="preserve">Existe una venta en estado registrada y dentro de la política de anulación.</w:t>
+            </w:r>
+          </w:p>
+        </w:tc>
+      </w:tr>
+      <w:tr>
+        <w:tc>
+          <w:tcPr>
+            <w:tcW w:type="dxa" w:w="2300"/>
+            <w:shd w:fill="EAF0F8" w:val="clear"/>
+            <w:tcMar>
+              <w:top w:type="dxa" w:w="40"/>
+              <w:left w:type="dxa" w:w="70"/>
+              <w:bottom w:type="dxa" w:w="40"/>
+              <w:right w:type="dxa" w:w="70"/>
+            </w:tcMar>
+          </w:tcPr>
+          <w:p>
+            <w:pPr>
+              <w:spacing w:after="18" w:line="236"/>
+            </w:pPr>
+            <w:r>
+              <w:rPr>
+                <w:rFonts w:ascii="Arial" w:cs="Arial" w:eastAsia="Arial" w:hAnsi="Arial"/>
+                <w:b/>
+                <w:bCs/>
+                <w:sz w:val="19"/>
+                <w:szCs w:val="19"/>
+              </w:rPr>
+              <w:t xml:space="preserve">Flujo principal</w:t>
+            </w:r>
+          </w:p>
+        </w:tc>
+        <w:tc>
+          <w:tcPr>
+            <w:tcW w:type="dxa" w:w="7060"/>
+            <w:tcMar>
+              <w:top w:type="dxa" w:w="40"/>
+              <w:left w:type="dxa" w:w="70"/>
+              <w:bottom w:type="dxa" w:w="40"/>
+              <w:right w:type="dxa" w:w="70"/>
+            </w:tcMar>
+          </w:tcPr>
+          <w:p>
+            <w:pPr>
+              <w:spacing w:after="18" w:line="236"/>
+            </w:pPr>
+            <w:r>
+              <w:rPr>
+                <w:rFonts w:ascii="Arial" w:cs="Arial" w:eastAsia="Arial" w:hAnsi="Arial"/>
+                <w:sz w:val="19"/>
+                <w:szCs w:val="19"/>
+              </w:rPr>
+              <w:t xml:space="preserve">1. Selecciona la venta y elige «Anular».</w:t>
+            </w:r>
+          </w:p>
+          <w:p>
+            <w:pPr>
+              <w:spacing w:after="18" w:line="236"/>
+            </w:pPr>
+            <w:r>
+              <w:rPr>
+                <w:rFonts w:ascii="Arial" w:cs="Arial" w:eastAsia="Arial" w:hAnsi="Arial"/>
+                <w:sz w:val="19"/>
+                <w:szCs w:val="19"/>
+              </w:rPr>
+              <w:t xml:space="preserve">2. El sistema solicita confirmación y motivo.</w:t>
+            </w:r>
+          </w:p>
+          <w:p>
+            <w:pPr>
+              <w:spacing w:after="18" w:line="236"/>
+            </w:pPr>
+            <w:r>
+              <w:rPr>
+                <w:rFonts w:ascii="Arial" w:cs="Arial" w:eastAsia="Arial" w:hAnsi="Arial"/>
+                <w:sz w:val="19"/>
+                <w:szCs w:val="19"/>
+              </w:rPr>
+              <w:t xml:space="preserve">3. El sistema repone las cantidades a los lotes consumidos (revierte PEPS).</w:t>
+            </w:r>
+          </w:p>
+          <w:p>
+            <w:pPr>
+              <w:spacing w:after="18" w:line="236"/>
+            </w:pPr>
+            <w:r>
+              <w:rPr>
+                <w:rFonts w:ascii="Arial" w:cs="Arial" w:eastAsia="Arial" w:hAnsi="Arial"/>
+                <w:sz w:val="19"/>
+                <w:szCs w:val="19"/>
+              </w:rPr>
+              <w:t xml:space="preserve">4. Registra el movimiento de reverso en el kardex y marca la venta como anulada.</w:t>
+            </w:r>
+          </w:p>
+          <w:p>
+            <w:pPr>
+              <w:spacing w:after="18" w:line="236"/>
+            </w:pPr>
+            <w:r>
+              <w:rPr>
+                <w:rFonts w:ascii="Arial" w:cs="Arial" w:eastAsia="Arial" w:hAnsi="Arial"/>
+                <w:sz w:val="19"/>
+                <w:szCs w:val="19"/>
+              </w:rPr>
+              <w:t xml:space="preserve">5. Registra el ajuste correspondiente en la caja.</w:t>
+            </w:r>
+          </w:p>
+        </w:tc>
+      </w:tr>
+      <w:tr>
+        <w:tc>
+          <w:tcPr>
+            <w:tcW w:type="dxa" w:w="2300"/>
+            <w:shd w:fill="EAF0F8" w:val="clear"/>
+            <w:tcMar>
+              <w:top w:type="dxa" w:w="40"/>
+              <w:left w:type="dxa" w:w="70"/>
+              <w:bottom w:type="dxa" w:w="40"/>
+              <w:right w:type="dxa" w:w="70"/>
+            </w:tcMar>
+          </w:tcPr>
+          <w:p>
+            <w:pPr>
+              <w:spacing w:after="18" w:line="236"/>
+            </w:pPr>
+            <w:r>
+              <w:rPr>
+                <w:rFonts w:ascii="Arial" w:cs="Arial" w:eastAsia="Arial" w:hAnsi="Arial"/>
+                <w:b/>
+                <w:bCs/>
+                <w:sz w:val="19"/>
+                <w:szCs w:val="19"/>
+              </w:rPr>
+              <w:t xml:space="preserve">Flujos alternativos</w:t>
+            </w:r>
+          </w:p>
+        </w:tc>
+        <w:tc>
+          <w:tcPr>
+            <w:tcW w:type="dxa" w:w="7060"/>
+            <w:tcMar>
+              <w:top w:type="dxa" w:w="40"/>
+              <w:left w:type="dxa" w:w="70"/>
+              <w:bottom w:type="dxa" w:w="40"/>
+              <w:right w:type="dxa" w:w="70"/>
+            </w:tcMar>
+          </w:tcPr>
+          <w:p>
+            <w:pPr>
+              <w:spacing w:after="18" w:line="236"/>
+            </w:pPr>
+            <w:r>
+              <w:rPr>
+                <w:rFonts w:ascii="Arial" w:cs="Arial" w:eastAsia="Arial" w:hAnsi="Arial"/>
+                <w:sz w:val="19"/>
+                <w:szCs w:val="19"/>
+              </w:rPr>
+              <w:t xml:space="preserve">4a. Si la venta tenía factura electrónica, se emite una nota crédito (CU-FAC-04).</w:t>
+            </w:r>
+          </w:p>
+        </w:tc>
+      </w:tr>
+      <w:tr>
+        <w:tc>
+          <w:tcPr>
+            <w:tcW w:type="dxa" w:w="2300"/>
+            <w:shd w:fill="EAF0F8" w:val="clear"/>
+            <w:tcMar>
+              <w:top w:type="dxa" w:w="40"/>
+              <w:left w:type="dxa" w:w="70"/>
+              <w:bottom w:type="dxa" w:w="40"/>
+              <w:right w:type="dxa" w:w="70"/>
+            </w:tcMar>
+          </w:tcPr>
+          <w:p>
+            <w:pPr>
+              <w:spacing w:after="18" w:line="236"/>
+            </w:pPr>
+            <w:r>
+              <w:rPr>
+                <w:rFonts w:ascii="Arial" w:cs="Arial" w:eastAsia="Arial" w:hAnsi="Arial"/>
+                <w:b/>
+                <w:bCs/>
+                <w:sz w:val="19"/>
+                <w:szCs w:val="19"/>
+              </w:rPr>
+              <w:t xml:space="preserve">Excepciones</w:t>
+            </w:r>
+          </w:p>
+        </w:tc>
+        <w:tc>
+          <w:tcPr>
+            <w:tcW w:type="dxa" w:w="7060"/>
+            <w:tcMar>
+              <w:top w:type="dxa" w:w="40"/>
+              <w:left w:type="dxa" w:w="70"/>
+              <w:bottom w:type="dxa" w:w="40"/>
+              <w:right w:type="dxa" w:w="70"/>
+            </w:tcMar>
+          </w:tcPr>
+          <w:p>
+            <w:pPr>
+              <w:spacing w:after="18" w:line="236"/>
+            </w:pPr>
+            <w:r>
+              <w:rPr>
+                <w:rFonts w:ascii="Arial" w:cs="Arial" w:eastAsia="Arial" w:hAnsi="Arial"/>
+                <w:sz w:val="19"/>
+                <w:szCs w:val="19"/>
+              </w:rPr>
+              <w:t xml:space="preserve">1a. Venta no anulable (fuera de política o ya anulada): el sistema lo impide e informa.</w:t>
+            </w:r>
+          </w:p>
+        </w:tc>
+      </w:tr>
+      <w:tr>
+        <w:tc>
+          <w:tcPr>
+            <w:tcW w:type="dxa" w:w="2300"/>
+            <w:shd w:fill="EAF0F8" w:val="clear"/>
+            <w:tcMar>
+              <w:top w:type="dxa" w:w="40"/>
+              <w:left w:type="dxa" w:w="70"/>
+              <w:bottom w:type="dxa" w:w="40"/>
+              <w:right w:type="dxa" w:w="70"/>
+            </w:tcMar>
+          </w:tcPr>
+          <w:p>
+            <w:pPr>
+              <w:spacing w:after="18" w:line="236"/>
+            </w:pPr>
+            <w:r>
+              <w:rPr>
+                <w:rFonts w:ascii="Arial" w:cs="Arial" w:eastAsia="Arial" w:hAnsi="Arial"/>
+                <w:b/>
+                <w:bCs/>
+                <w:sz w:val="19"/>
+                <w:szCs w:val="19"/>
+              </w:rPr>
+              <w:t xml:space="preserve">Reglas y validaciones</w:t>
+            </w:r>
+          </w:p>
+        </w:tc>
+        <w:tc>
+          <w:tcPr>
+            <w:tcW w:type="dxa" w:w="7060"/>
+            <w:tcMar>
+              <w:top w:type="dxa" w:w="40"/>
+              <w:left w:type="dxa" w:w="70"/>
+              <w:bottom w:type="dxa" w:w="40"/>
+              <w:right w:type="dxa" w:w="70"/>
+            </w:tcMar>
+          </w:tcPr>
+          <w:p>
+            <w:pPr>
+              <w:spacing w:after="18" w:line="236"/>
+            </w:pPr>
+            <w:r>
+              <w:rPr>
+                <w:rFonts w:ascii="Arial" w:cs="Arial" w:eastAsia="Arial" w:hAnsi="Arial"/>
+                <w:sz w:val="19"/>
+                <w:szCs w:val="19"/>
+              </w:rPr>
+              <w:t xml:space="preserve">La anulación no borra la venta (queda marcada como anulada) para conservar la trazabilidad; revierte el inventario y la caja de forma consistente.</w:t>
+            </w:r>
+          </w:p>
+        </w:tc>
+      </w:tr>
+      <w:tr>
+        <w:tc>
+          <w:tcPr>
+            <w:tcW w:type="dxa" w:w="2300"/>
+            <w:shd w:fill="EAF0F8" w:val="clear"/>
+            <w:tcMar>
+              <w:top w:type="dxa" w:w="40"/>
+              <w:left w:type="dxa" w:w="70"/>
+              <w:bottom w:type="dxa" w:w="40"/>
+              <w:right w:type="dxa" w:w="70"/>
+            </w:tcMar>
+          </w:tcPr>
+          <w:p>
+            <w:pPr>
+              <w:spacing w:after="18" w:line="236"/>
+            </w:pPr>
+            <w:r>
+              <w:rPr>
+                <w:rFonts w:ascii="Arial" w:cs="Arial" w:eastAsia="Arial" w:hAnsi="Arial"/>
+                <w:b/>
+                <w:bCs/>
+                <w:sz w:val="19"/>
+                <w:szCs w:val="19"/>
+              </w:rPr>
+              <w:t xml:space="preserve">Postcondiciones</w:t>
+            </w:r>
+          </w:p>
+        </w:tc>
+        <w:tc>
+          <w:tcPr>
+            <w:tcW w:type="dxa" w:w="7060"/>
+            <w:tcMar>
+              <w:top w:type="dxa" w:w="40"/>
+              <w:left w:type="dxa" w:w="70"/>
+              <w:bottom w:type="dxa" w:w="40"/>
+              <w:right w:type="dxa" w:w="70"/>
+            </w:tcMar>
+          </w:tcPr>
+          <w:p>
+            <w:pPr>
+              <w:spacing w:after="18" w:line="236"/>
+            </w:pPr>
+            <w:r>
+              <w:rPr>
+                <w:rFonts w:ascii="Arial" w:cs="Arial" w:eastAsia="Arial" w:hAnsi="Arial"/>
+                <w:sz w:val="19"/>
+                <w:szCs w:val="19"/>
+              </w:rPr>
+              <w:t xml:space="preserve">La venta queda anulada y sus efectos en inventario y caja revertidos.</w:t>
+            </w:r>
+          </w:p>
+        </w:tc>
+      </w:tr>
+      <w:tr>
+        <w:tc>
+          <w:tcPr>
+            <w:tcW w:type="dxa" w:w="2300"/>
+            <w:shd w:fill="EAF0F8" w:val="clear"/>
+            <w:tcMar>
+              <w:top w:type="dxa" w:w="40"/>
+              <w:left w:type="dxa" w:w="70"/>
+              <w:bottom w:type="dxa" w:w="40"/>
+              <w:right w:type="dxa" w:w="70"/>
+            </w:tcMar>
+          </w:tcPr>
+          <w:p>
+            <w:pPr>
+              <w:spacing w:after="18" w:line="236"/>
+            </w:pPr>
+            <w:r>
+              <w:rPr>
+                <w:rFonts w:ascii="Arial" w:cs="Arial" w:eastAsia="Arial" w:hAnsi="Arial"/>
+                <w:b/>
+                <w:bCs/>
+                <w:sz w:val="19"/>
+                <w:szCs w:val="19"/>
+              </w:rPr>
+              <w:t xml:space="preserve">Prioridad</w:t>
+            </w:r>
+          </w:p>
+        </w:tc>
+        <w:tc>
+          <w:tcPr>
+            <w:tcW w:type="dxa" w:w="7060"/>
+            <w:tcMar>
+              <w:top w:type="dxa" w:w="40"/>
+              <w:left w:type="dxa" w:w="70"/>
+              <w:bottom w:type="dxa" w:w="40"/>
+              <w:right w:type="dxa" w:w="70"/>
+            </w:tcMar>
+          </w:tcPr>
+          <w:p>
+            <w:pPr>
+              <w:spacing w:after="18" w:line="236"/>
+            </w:pPr>
+            <w:r>
+              <w:rPr>
+                <w:rFonts w:ascii="Arial" w:cs="Arial" w:eastAsia="Arial" w:hAnsi="Arial"/>
+                <w:sz w:val="19"/>
+                <w:szCs w:val="19"/>
+              </w:rPr>
+              <w:t xml:space="preserve">Media</w:t>
+            </w:r>
+          </w:p>
+        </w:tc>
+      </w:tr>
+    </w:tbl>
+    <w:p>
+      <w:pPr>
+        <w:spacing w:after="140"/>
+      </w:pPr>
+    </w:p>
+    <w:tbl>
+      <w:tblPr>
+        <w:tblW w:type="dxa" w:w="9360"/>
+        <w:tblBorders>
+          <w:top w:val="single" w:color="9CA3AF" w:sz="6"/>
+          <w:left w:val="single" w:color="9CA3AF" w:sz="6"/>
+          <w:bottom w:val="single" w:color="9CA3AF" w:sz="6"/>
+          <w:right w:val="single" w:color="9CA3AF" w:sz="6"/>
+          <w:insideH w:val="single" w:color="9CA3AF" w:sz="6"/>
+          <w:insideV w:val="single" w:color="9CA3AF" w:sz="6"/>
+        </w:tblBorders>
+        <w:tblLayout w:type="fixed"/>
+      </w:tblPr>
+      <w:tblGrid>
+        <w:gridCol w:w="2300"/>
+        <w:gridCol w:w="7060"/>
+      </w:tblGrid>
+      <w:tr>
+        <w:tc>
+          <w:tcPr>
+            <w:tcW w:type="dxa" w:w="9360"/>
+            <w:gridSpan w:val="2"/>
+            <w:shd w:fill="1F3864" w:val="clear"/>
+            <w:tcMar>
+              <w:top w:type="dxa" w:w="40"/>
+              <w:left w:type="dxa" w:w="70"/>
+              <w:bottom w:type="dxa" w:w="40"/>
+              <w:right w:type="dxa" w:w="70"/>
+            </w:tcMar>
+          </w:tcPr>
+          <w:p>
+            <w:pPr>
+              <w:spacing w:after="18" w:line="236"/>
+            </w:pPr>
+            <w:r>
+              <w:rPr>
+                <w:rFonts w:ascii="Arial" w:cs="Arial" w:eastAsia="Arial" w:hAnsi="Arial"/>
+                <w:b/>
+                <w:bCs/>
+                <w:color w:val="FFFFFF"/>
+                <w:sz w:val="19"/>
+                <w:szCs w:val="19"/>
+              </w:rPr>
+              <w:t xml:space="preserve">CU-VEN-05 — Consultar historial de ventas</w:t>
+            </w:r>
+          </w:p>
+        </w:tc>
+      </w:tr>
+      <w:tr>
+        <w:tc>
+          <w:tcPr>
+            <w:tcW w:type="dxa" w:w="2300"/>
+            <w:shd w:fill="EAF0F8" w:val="clear"/>
+            <w:tcMar>
+              <w:top w:type="dxa" w:w="40"/>
+              <w:left w:type="dxa" w:w="70"/>
+              <w:bottom w:type="dxa" w:w="40"/>
+              <w:right w:type="dxa" w:w="70"/>
+            </w:tcMar>
+          </w:tcPr>
+          <w:p>
+            <w:pPr>
+              <w:spacing w:after="18" w:line="236"/>
+            </w:pPr>
+            <w:r>
+              <w:rPr>
+                <w:rFonts w:ascii="Arial" w:cs="Arial" w:eastAsia="Arial" w:hAnsi="Arial"/>
+                <w:b/>
+                <w:bCs/>
+                <w:sz w:val="19"/>
+                <w:szCs w:val="19"/>
+              </w:rPr>
+              <w:t xml:space="preserve">Actor(es)</w:t>
+            </w:r>
+          </w:p>
+        </w:tc>
+        <w:tc>
+          <w:tcPr>
+            <w:tcW w:type="dxa" w:w="7060"/>
+            <w:tcMar>
+              <w:top w:type="dxa" w:w="40"/>
+              <w:left w:type="dxa" w:w="70"/>
+              <w:bottom w:type="dxa" w:w="40"/>
+              <w:right w:type="dxa" w:w="70"/>
+            </w:tcMar>
+          </w:tcPr>
+          <w:p>
+            <w:pPr>
+              <w:spacing w:after="18" w:line="236"/>
+            </w:pPr>
+            <w:r>
+              <w:rPr>
+                <w:rFonts w:ascii="Arial" w:cs="Arial" w:eastAsia="Arial" w:hAnsi="Arial"/>
+                <w:sz w:val="19"/>
+                <w:szCs w:val="19"/>
+              </w:rPr>
+              <w:t xml:space="preserve">Administrador</w:t>
+            </w:r>
+          </w:p>
+        </w:tc>
+      </w:tr>
+      <w:tr>
+        <w:tc>
+          <w:tcPr>
+            <w:tcW w:type="dxa" w:w="2300"/>
+            <w:shd w:fill="EAF0F8" w:val="clear"/>
+            <w:tcMar>
+              <w:top w:type="dxa" w:w="40"/>
+              <w:left w:type="dxa" w:w="70"/>
+              <w:bottom w:type="dxa" w:w="40"/>
+              <w:right w:type="dxa" w:w="70"/>
+            </w:tcMar>
+          </w:tcPr>
+          <w:p>
+            <w:pPr>
+              <w:spacing w:after="18" w:line="236"/>
+            </w:pPr>
+            <w:r>
+              <w:rPr>
+                <w:rFonts w:ascii="Arial" w:cs="Arial" w:eastAsia="Arial" w:hAnsi="Arial"/>
+                <w:b/>
+                <w:bCs/>
+                <w:sz w:val="19"/>
+                <w:szCs w:val="19"/>
+              </w:rPr>
+              <w:t xml:space="preserve">Requisito</w:t>
+            </w:r>
+          </w:p>
+        </w:tc>
+        <w:tc>
+          <w:tcPr>
+            <w:tcW w:type="dxa" w:w="7060"/>
+            <w:tcMar>
+              <w:top w:type="dxa" w:w="40"/>
+              <w:left w:type="dxa" w:w="70"/>
+              <w:bottom w:type="dxa" w:w="40"/>
+              <w:right w:type="dxa" w:w="70"/>
+            </w:tcMar>
+          </w:tcPr>
+          <w:p>
+            <w:pPr>
+              <w:spacing w:after="18" w:line="236"/>
+            </w:pPr>
+            <w:r>
+              <w:rPr>
+                <w:rFonts w:ascii="Arial" w:cs="Arial" w:eastAsia="Arial" w:hAnsi="Arial"/>
+                <w:sz w:val="19"/>
+                <w:szCs w:val="19"/>
+              </w:rPr>
+              <w:t xml:space="preserve">RF-VEN-05</w:t>
+            </w:r>
+          </w:p>
+        </w:tc>
+      </w:tr>
+      <w:tr>
+        <w:tc>
+          <w:tcPr>
+            <w:tcW w:type="dxa" w:w="2300"/>
+            <w:shd w:fill="EAF0F8" w:val="clear"/>
+            <w:tcMar>
+              <w:top w:type="dxa" w:w="40"/>
+              <w:left w:type="dxa" w:w="70"/>
+              <w:bottom w:type="dxa" w:w="40"/>
+              <w:right w:type="dxa" w:w="70"/>
+            </w:tcMar>
+          </w:tcPr>
+          <w:p>
+            <w:pPr>
+              <w:spacing w:after="18" w:line="236"/>
+            </w:pPr>
+            <w:r>
+              <w:rPr>
+                <w:rFonts w:ascii="Arial" w:cs="Arial" w:eastAsia="Arial" w:hAnsi="Arial"/>
+                <w:b/>
+                <w:bCs/>
+                <w:sz w:val="19"/>
+                <w:szCs w:val="19"/>
+              </w:rPr>
+              <w:t xml:space="preserve">Descripción</w:t>
+            </w:r>
+          </w:p>
+        </w:tc>
+        <w:tc>
+          <w:tcPr>
+            <w:tcW w:type="dxa" w:w="7060"/>
+            <w:tcMar>
+              <w:top w:type="dxa" w:w="40"/>
+              <w:left w:type="dxa" w:w="70"/>
+              <w:bottom w:type="dxa" w:w="40"/>
+              <w:right w:type="dxa" w:w="70"/>
+            </w:tcMar>
+          </w:tcPr>
+          <w:p>
+            <w:pPr>
+              <w:spacing w:after="18" w:line="236"/>
+            </w:pPr>
+            <w:r>
+              <w:rPr>
+                <w:rFonts w:ascii="Arial" w:cs="Arial" w:eastAsia="Arial" w:hAnsi="Arial"/>
+                <w:sz w:val="19"/>
+                <w:szCs w:val="19"/>
+              </w:rPr>
+              <w:t xml:space="preserve">El administrador consulta las ventas realizadas con sus detalles.</w:t>
+            </w:r>
+          </w:p>
+        </w:tc>
+      </w:tr>
+      <w:tr>
+        <w:tc>
+          <w:tcPr>
+            <w:tcW w:type="dxa" w:w="2300"/>
+            <w:shd w:fill="EAF0F8" w:val="clear"/>
+            <w:tcMar>
+              <w:top w:type="dxa" w:w="40"/>
+              <w:left w:type="dxa" w:w="70"/>
+              <w:bottom w:type="dxa" w:w="40"/>
+              <w:right w:type="dxa" w:w="70"/>
+            </w:tcMar>
+          </w:tcPr>
+          <w:p>
+            <w:pPr>
+              <w:spacing w:after="18" w:line="236"/>
+            </w:pPr>
+            <w:r>
+              <w:rPr>
+                <w:rFonts w:ascii="Arial" w:cs="Arial" w:eastAsia="Arial" w:hAnsi="Arial"/>
+                <w:b/>
+                <w:bCs/>
+                <w:sz w:val="19"/>
+                <w:szCs w:val="19"/>
+              </w:rPr>
+              <w:t xml:space="preserve">Precondiciones</w:t>
+            </w:r>
+          </w:p>
+        </w:tc>
+        <w:tc>
+          <w:tcPr>
+            <w:tcW w:type="dxa" w:w="7060"/>
+            <w:tcMar>
+              <w:top w:type="dxa" w:w="40"/>
+              <w:left w:type="dxa" w:w="70"/>
+              <w:bottom w:type="dxa" w:w="40"/>
+              <w:right w:type="dxa" w:w="70"/>
+            </w:tcMar>
+          </w:tcPr>
+          <w:p>
+            <w:pPr>
+              <w:spacing w:after="18" w:line="236"/>
+            </w:pPr>
+            <w:r>
+              <w:rPr>
+                <w:rFonts w:ascii="Arial" w:cs="Arial" w:eastAsia="Arial" w:hAnsi="Arial"/>
+                <w:sz w:val="19"/>
+                <w:szCs w:val="19"/>
+              </w:rPr>
+              <w:t xml:space="preserve">El administrador está autenticado.</w:t>
+            </w:r>
+          </w:p>
+        </w:tc>
+      </w:tr>
+      <w:tr>
+        <w:tc>
+          <w:tcPr>
+            <w:tcW w:type="dxa" w:w="2300"/>
+            <w:shd w:fill="EAF0F8" w:val="clear"/>
+            <w:tcMar>
+              <w:top w:type="dxa" w:w="40"/>
+              <w:left w:type="dxa" w:w="70"/>
+              <w:bottom w:type="dxa" w:w="40"/>
+              <w:right w:type="dxa" w:w="70"/>
+            </w:tcMar>
+          </w:tcPr>
+          <w:p>
+            <w:pPr>
+              <w:spacing w:after="18" w:line="236"/>
+            </w:pPr>
+            <w:r>
+              <w:rPr>
+                <w:rFonts w:ascii="Arial" w:cs="Arial" w:eastAsia="Arial" w:hAnsi="Arial"/>
+                <w:b/>
+                <w:bCs/>
+                <w:sz w:val="19"/>
+                <w:szCs w:val="19"/>
+              </w:rPr>
+              <w:t xml:space="preserve">Flujo principal</w:t>
+            </w:r>
+          </w:p>
+        </w:tc>
+        <w:tc>
+          <w:tcPr>
+            <w:tcW w:type="dxa" w:w="7060"/>
+            <w:tcMar>
+              <w:top w:type="dxa" w:w="40"/>
+              <w:left w:type="dxa" w:w="70"/>
+              <w:bottom w:type="dxa" w:w="40"/>
+              <w:right w:type="dxa" w:w="70"/>
+            </w:tcMar>
+          </w:tcPr>
+          <w:p>
+            <w:pPr>
+              <w:spacing w:after="18" w:line="236"/>
+            </w:pPr>
+            <w:r>
+              <w:rPr>
+                <w:rFonts w:ascii="Arial" w:cs="Arial" w:eastAsia="Arial" w:hAnsi="Arial"/>
+                <w:sz w:val="19"/>
+                <w:szCs w:val="19"/>
+              </w:rPr>
+              <w:t xml:space="preserve">1. Abre el historial de ventas.</w:t>
+            </w:r>
+          </w:p>
+          <w:p>
+            <w:pPr>
+              <w:spacing w:after="18" w:line="236"/>
+            </w:pPr>
+            <w:r>
+              <w:rPr>
+                <w:rFonts w:ascii="Arial" w:cs="Arial" w:eastAsia="Arial" w:hAnsi="Arial"/>
+                <w:sz w:val="19"/>
+                <w:szCs w:val="19"/>
+              </w:rPr>
+              <w:t xml:space="preserve">2. El sistema muestra las ventas con fecha, total, vendedor y estado.</w:t>
+            </w:r>
+          </w:p>
+          <w:p>
+            <w:pPr>
+              <w:spacing w:after="18" w:line="236"/>
+            </w:pPr>
+            <w:r>
+              <w:rPr>
+                <w:rFonts w:ascii="Arial" w:cs="Arial" w:eastAsia="Arial" w:hAnsi="Arial"/>
+                <w:sz w:val="19"/>
+                <w:szCs w:val="19"/>
+              </w:rPr>
+              <w:t xml:space="preserve">3. El administrador filtra por fecha, vendedor o estado y consulta el detalle.</w:t>
+            </w:r>
+          </w:p>
+        </w:tc>
+      </w:tr>
+      <w:tr>
+        <w:tc>
+          <w:tcPr>
+            <w:tcW w:type="dxa" w:w="2300"/>
+            <w:shd w:fill="EAF0F8" w:val="clear"/>
+            <w:tcMar>
+              <w:top w:type="dxa" w:w="40"/>
+              <w:left w:type="dxa" w:w="70"/>
+              <w:bottom w:type="dxa" w:w="40"/>
+              <w:right w:type="dxa" w:w="70"/>
+            </w:tcMar>
+          </w:tcPr>
+          <w:p>
+            <w:pPr>
+              <w:spacing w:after="18" w:line="236"/>
+            </w:pPr>
+            <w:r>
+              <w:rPr>
+                <w:rFonts w:ascii="Arial" w:cs="Arial" w:eastAsia="Arial" w:hAnsi="Arial"/>
+                <w:b/>
+                <w:bCs/>
+                <w:sz w:val="19"/>
+                <w:szCs w:val="19"/>
+              </w:rPr>
+              <w:t xml:space="preserve">Flujos alternativos</w:t>
+            </w:r>
+          </w:p>
+        </w:tc>
+        <w:tc>
+          <w:tcPr>
+            <w:tcW w:type="dxa" w:w="7060"/>
+            <w:tcMar>
+              <w:top w:type="dxa" w:w="40"/>
+              <w:left w:type="dxa" w:w="70"/>
+              <w:bottom w:type="dxa" w:w="40"/>
+              <w:right w:type="dxa" w:w="70"/>
+            </w:tcMar>
+          </w:tcPr>
+          <w:p>
+            <w:pPr>
+              <w:spacing w:after="18" w:line="236"/>
+            </w:pPr>
+            <w:r>
+              <w:rPr>
+                <w:rFonts w:ascii="Arial" w:cs="Arial" w:eastAsia="Arial" w:hAnsi="Arial"/>
+                <w:sz w:val="19"/>
+                <w:szCs w:val="19"/>
+              </w:rPr>
+              <w:t xml:space="preserve">2a. Exportar el historial desde el módulo de reportes.</w:t>
+            </w:r>
+          </w:p>
+        </w:tc>
+      </w:tr>
+      <w:tr>
+        <w:tc>
+          <w:tcPr>
+            <w:tcW w:type="dxa" w:w="2300"/>
+            <w:shd w:fill="EAF0F8" w:val="clear"/>
+            <w:tcMar>
+              <w:top w:type="dxa" w:w="40"/>
+              <w:left w:type="dxa" w:w="70"/>
+              <w:bottom w:type="dxa" w:w="40"/>
+              <w:right w:type="dxa" w:w="70"/>
+            </w:tcMar>
+          </w:tcPr>
+          <w:p>
+            <w:pPr>
+              <w:spacing w:after="18" w:line="236"/>
+            </w:pPr>
+            <w:r>
+              <w:rPr>
+                <w:rFonts w:ascii="Arial" w:cs="Arial" w:eastAsia="Arial" w:hAnsi="Arial"/>
+                <w:b/>
+                <w:bCs/>
+                <w:sz w:val="19"/>
+                <w:szCs w:val="19"/>
+              </w:rPr>
+              <w:t xml:space="preserve">Excepciones</w:t>
+            </w:r>
+          </w:p>
+        </w:tc>
+        <w:tc>
+          <w:tcPr>
+            <w:tcW w:type="dxa" w:w="7060"/>
+            <w:tcMar>
+              <w:top w:type="dxa" w:w="40"/>
+              <w:left w:type="dxa" w:w="70"/>
+              <w:bottom w:type="dxa" w:w="40"/>
+              <w:right w:type="dxa" w:w="70"/>
+            </w:tcMar>
+          </w:tcPr>
+          <w:p>
+            <w:pPr>
+              <w:spacing w:after="18" w:line="236"/>
+            </w:pPr>
+            <w:r>
+              <w:rPr>
+                <w:rFonts w:ascii="Arial" w:cs="Arial" w:eastAsia="Arial" w:hAnsi="Arial"/>
+                <w:sz w:val="19"/>
+                <w:szCs w:val="19"/>
+              </w:rPr>
+              <w:t xml:space="preserve">*. Sin ventas para el filtro elegido: el sistema muestra el listado vacío.</w:t>
+            </w:r>
+          </w:p>
+        </w:tc>
+      </w:tr>
+      <w:tr>
+        <w:tc>
+          <w:tcPr>
+            <w:tcW w:type="dxa" w:w="2300"/>
+            <w:shd w:fill="EAF0F8" w:val="clear"/>
+            <w:tcMar>
+              <w:top w:type="dxa" w:w="40"/>
+              <w:left w:type="dxa" w:w="70"/>
+              <w:bottom w:type="dxa" w:w="40"/>
+              <w:right w:type="dxa" w:w="70"/>
+            </w:tcMar>
+          </w:tcPr>
+          <w:p>
+            <w:pPr>
+              <w:spacing w:after="18" w:line="236"/>
+            </w:pPr>
+            <w:r>
+              <w:rPr>
+                <w:rFonts w:ascii="Arial" w:cs="Arial" w:eastAsia="Arial" w:hAnsi="Arial"/>
+                <w:b/>
+                <w:bCs/>
+                <w:sz w:val="19"/>
+                <w:szCs w:val="19"/>
+              </w:rPr>
+              <w:t xml:space="preserve">Reglas y validaciones</w:t>
+            </w:r>
+          </w:p>
+        </w:tc>
+        <w:tc>
+          <w:tcPr>
+            <w:tcW w:type="dxa" w:w="7060"/>
+            <w:tcMar>
+              <w:top w:type="dxa" w:w="40"/>
+              <w:left w:type="dxa" w:w="70"/>
+              <w:bottom w:type="dxa" w:w="40"/>
+              <w:right w:type="dxa" w:w="70"/>
+            </w:tcMar>
+          </w:tcPr>
+          <w:p>
+            <w:pPr>
+              <w:spacing w:after="18" w:line="236"/>
+            </w:pPr>
+            <w:r>
+              <w:rPr>
+                <w:rFonts w:ascii="Arial" w:cs="Arial" w:eastAsia="Arial" w:hAnsi="Arial"/>
+                <w:sz w:val="19"/>
+                <w:szCs w:val="19"/>
+              </w:rPr>
+              <w:t xml:space="preserve">Se consultan tanto las ventas registradas como las anuladas; el vendedor solo ve sus propias ventas del turno, según sus permisos.</w:t>
+            </w:r>
+          </w:p>
+        </w:tc>
+      </w:tr>
+      <w:tr>
+        <w:tc>
+          <w:tcPr>
+            <w:tcW w:type="dxa" w:w="2300"/>
+            <w:shd w:fill="EAF0F8" w:val="clear"/>
+            <w:tcMar>
+              <w:top w:type="dxa" w:w="40"/>
+              <w:left w:type="dxa" w:w="70"/>
+              <w:bottom w:type="dxa" w:w="40"/>
+              <w:right w:type="dxa" w:w="70"/>
+            </w:tcMar>
+          </w:tcPr>
+          <w:p>
+            <w:pPr>
+              <w:spacing w:after="18" w:line="236"/>
+            </w:pPr>
+            <w:r>
+              <w:rPr>
+                <w:rFonts w:ascii="Arial" w:cs="Arial" w:eastAsia="Arial" w:hAnsi="Arial"/>
+                <w:b/>
+                <w:bCs/>
+                <w:sz w:val="19"/>
+                <w:szCs w:val="19"/>
+              </w:rPr>
+              <w:t xml:space="preserve">Postcondiciones</w:t>
+            </w:r>
+          </w:p>
+        </w:tc>
+        <w:tc>
+          <w:tcPr>
+            <w:tcW w:type="dxa" w:w="7060"/>
+            <w:tcMar>
+              <w:top w:type="dxa" w:w="40"/>
+              <w:left w:type="dxa" w:w="70"/>
+              <w:bottom w:type="dxa" w:w="40"/>
+              <w:right w:type="dxa" w:w="70"/>
+            </w:tcMar>
+          </w:tcPr>
+          <w:p>
+            <w:pPr>
+              <w:spacing w:after="18" w:line="236"/>
+            </w:pPr>
+            <w:r>
+              <w:rPr>
+                <w:rFonts w:ascii="Arial" w:cs="Arial" w:eastAsia="Arial" w:hAnsi="Arial"/>
+                <w:sz w:val="19"/>
+                <w:szCs w:val="19"/>
+              </w:rPr>
+              <w:t xml:space="preserve">El administrador visualiza la información solicitada.</w:t>
+            </w:r>
+          </w:p>
+        </w:tc>
+      </w:tr>
+      <w:tr>
+        <w:tc>
+          <w:tcPr>
+            <w:tcW w:type="dxa" w:w="2300"/>
+            <w:shd w:fill="EAF0F8" w:val="clear"/>
+            <w:tcMar>
+              <w:top w:type="dxa" w:w="40"/>
+              <w:left w:type="dxa" w:w="70"/>
+              <w:bottom w:type="dxa" w:w="40"/>
+              <w:right w:type="dxa" w:w="70"/>
+            </w:tcMar>
+          </w:tcPr>
+          <w:p>
+            <w:pPr>
+              <w:spacing w:after="18" w:line="236"/>
+            </w:pPr>
+            <w:r>
+              <w:rPr>
+                <w:rFonts w:ascii="Arial" w:cs="Arial" w:eastAsia="Arial" w:hAnsi="Arial"/>
+                <w:b/>
+                <w:bCs/>
+                <w:sz w:val="19"/>
+                <w:szCs w:val="19"/>
+              </w:rPr>
+              <w:t xml:space="preserve">Prioridad</w:t>
+            </w:r>
+          </w:p>
+        </w:tc>
+        <w:tc>
+          <w:tcPr>
+            <w:tcW w:type="dxa" w:w="7060"/>
+            <w:tcMar>
+              <w:top w:type="dxa" w:w="40"/>
+              <w:left w:type="dxa" w:w="70"/>
+              <w:bottom w:type="dxa" w:w="40"/>
+              <w:right w:type="dxa" w:w="70"/>
+            </w:tcMar>
+          </w:tcPr>
+          <w:p>
+            <w:pPr>
+              <w:spacing w:after="18" w:line="236"/>
+            </w:pPr>
+            <w:r>
+              <w:rPr>
+                <w:rFonts w:ascii="Arial" w:cs="Arial" w:eastAsia="Arial" w:hAnsi="Arial"/>
+                <w:sz w:val="19"/>
+                <w:szCs w:val="19"/>
+              </w:rPr>
+              <w:t xml:space="preserve">Media</w:t>
+            </w:r>
+          </w:p>
+        </w:tc>
+      </w:tr>
+    </w:tbl>
+    <w:p>
+      <w:pPr>
+        <w:spacing w:after="140"/>
+      </w:pPr>
+    </w:p>
+    <w:tbl>
+      <w:tblPr>
+        <w:tblW w:type="dxa" w:w="9360"/>
+        <w:tblBorders>
+          <w:top w:val="single" w:color="9CA3AF" w:sz="6"/>
+          <w:left w:val="single" w:color="9CA3AF" w:sz="6"/>
+          <w:bottom w:val="single" w:color="9CA3AF" w:sz="6"/>
+          <w:right w:val="single" w:color="9CA3AF" w:sz="6"/>
+          <w:insideH w:val="single" w:color="9CA3AF" w:sz="6"/>
+          <w:insideV w:val="single" w:color="9CA3AF" w:sz="6"/>
+        </w:tblBorders>
+        <w:tblLayout w:type="fixed"/>
+      </w:tblPr>
+      <w:tblGrid>
+        <w:gridCol w:w="2300"/>
+        <w:gridCol w:w="7060"/>
+      </w:tblGrid>
+      <w:tr>
+        <w:tc>
+          <w:tcPr>
+            <w:tcW w:type="dxa" w:w="9360"/>
+            <w:gridSpan w:val="2"/>
+            <w:shd w:fill="1F3864" w:val="clear"/>
+            <w:tcMar>
+              <w:top w:type="dxa" w:w="40"/>
+              <w:left w:type="dxa" w:w="70"/>
+              <w:bottom w:type="dxa" w:w="40"/>
+              <w:right w:type="dxa" w:w="70"/>
+            </w:tcMar>
+          </w:tcPr>
+          <w:p>
+            <w:pPr>
+              <w:spacing w:after="18" w:line="236"/>
+            </w:pPr>
+            <w:r>
+              <w:rPr>
+                <w:rFonts w:ascii="Arial" w:cs="Arial" w:eastAsia="Arial" w:hAnsi="Arial"/>
+                <w:b/>
+                <w:bCs/>
+                <w:color w:val="FFFFFF"/>
+                <w:sz w:val="19"/>
+                <w:szCs w:val="19"/>
+              </w:rPr>
+              <w:t xml:space="preserve">CU-VEN-06 — Cierre de caja</w:t>
+            </w:r>
+          </w:p>
+        </w:tc>
+      </w:tr>
+      <w:tr>
+        <w:tc>
+          <w:tcPr>
+            <w:tcW w:type="dxa" w:w="2300"/>
+            <w:shd w:fill="EAF0F8" w:val="clear"/>
+            <w:tcMar>
+              <w:top w:type="dxa" w:w="40"/>
+              <w:left w:type="dxa" w:w="70"/>
+              <w:bottom w:type="dxa" w:w="40"/>
+              <w:right w:type="dxa" w:w="70"/>
+            </w:tcMar>
+          </w:tcPr>
+          <w:p>
+            <w:pPr>
+              <w:spacing w:after="18" w:line="236"/>
+            </w:pPr>
+            <w:r>
+              <w:rPr>
+                <w:rFonts w:ascii="Arial" w:cs="Arial" w:eastAsia="Arial" w:hAnsi="Arial"/>
+                <w:b/>
+                <w:bCs/>
+                <w:sz w:val="19"/>
+                <w:szCs w:val="19"/>
+              </w:rPr>
+              <w:t xml:space="preserve">Actor(es)</w:t>
+            </w:r>
+          </w:p>
+        </w:tc>
+        <w:tc>
+          <w:tcPr>
+            <w:tcW w:type="dxa" w:w="7060"/>
+            <w:tcMar>
+              <w:top w:type="dxa" w:w="40"/>
+              <w:left w:type="dxa" w:w="70"/>
+              <w:bottom w:type="dxa" w:w="40"/>
+              <w:right w:type="dxa" w:w="70"/>
+            </w:tcMar>
+          </w:tcPr>
+          <w:p>
+            <w:pPr>
+              <w:spacing w:after="18" w:line="236"/>
+            </w:pPr>
+            <w:r>
+              <w:rPr>
+                <w:rFonts w:ascii="Arial" w:cs="Arial" w:eastAsia="Arial" w:hAnsi="Arial"/>
+                <w:sz w:val="19"/>
+                <w:szCs w:val="19"/>
+              </w:rPr>
+              <w:t xml:space="preserve">Vendedor</w:t>
+            </w:r>
+          </w:p>
+        </w:tc>
+      </w:tr>
+      <w:tr>
+        <w:tc>
+          <w:tcPr>
+            <w:tcW w:type="dxa" w:w="2300"/>
+            <w:shd w:fill="EAF0F8" w:val="clear"/>
+            <w:tcMar>
+              <w:top w:type="dxa" w:w="40"/>
+              <w:left w:type="dxa" w:w="70"/>
+              <w:bottom w:type="dxa" w:w="40"/>
+              <w:right w:type="dxa" w:w="70"/>
+            </w:tcMar>
+          </w:tcPr>
+          <w:p>
+            <w:pPr>
+              <w:spacing w:after="18" w:line="236"/>
+            </w:pPr>
+            <w:r>
+              <w:rPr>
+                <w:rFonts w:ascii="Arial" w:cs="Arial" w:eastAsia="Arial" w:hAnsi="Arial"/>
+                <w:b/>
+                <w:bCs/>
+                <w:sz w:val="19"/>
+                <w:szCs w:val="19"/>
+              </w:rPr>
+              <w:t xml:space="preserve">Requisito</w:t>
+            </w:r>
+          </w:p>
+        </w:tc>
+        <w:tc>
+          <w:tcPr>
+            <w:tcW w:type="dxa" w:w="7060"/>
+            <w:tcMar>
+              <w:top w:type="dxa" w:w="40"/>
+              <w:left w:type="dxa" w:w="70"/>
+              <w:bottom w:type="dxa" w:w="40"/>
+              <w:right w:type="dxa" w:w="70"/>
+            </w:tcMar>
+          </w:tcPr>
+          <w:p>
+            <w:pPr>
+              <w:spacing w:after="18" w:line="236"/>
+            </w:pPr>
+            <w:r>
+              <w:rPr>
+                <w:rFonts w:ascii="Arial" w:cs="Arial" w:eastAsia="Arial" w:hAnsi="Arial"/>
+                <w:sz w:val="19"/>
+                <w:szCs w:val="19"/>
+              </w:rPr>
+              <w:t xml:space="preserve">RF-VEN-06</w:t>
+            </w:r>
+          </w:p>
+        </w:tc>
+      </w:tr>
+      <w:tr>
+        <w:tc>
+          <w:tcPr>
+            <w:tcW w:type="dxa" w:w="2300"/>
+            <w:shd w:fill="EAF0F8" w:val="clear"/>
+            <w:tcMar>
+              <w:top w:type="dxa" w:w="40"/>
+              <w:left w:type="dxa" w:w="70"/>
+              <w:bottom w:type="dxa" w:w="40"/>
+              <w:right w:type="dxa" w:w="70"/>
+            </w:tcMar>
+          </w:tcPr>
+          <w:p>
+            <w:pPr>
+              <w:spacing w:after="18" w:line="236"/>
+            </w:pPr>
+            <w:r>
+              <w:rPr>
+                <w:rFonts w:ascii="Arial" w:cs="Arial" w:eastAsia="Arial" w:hAnsi="Arial"/>
+                <w:b/>
+                <w:bCs/>
+                <w:sz w:val="19"/>
+                <w:szCs w:val="19"/>
+              </w:rPr>
+              <w:t xml:space="preserve">Descripción</w:t>
+            </w:r>
+          </w:p>
+        </w:tc>
+        <w:tc>
+          <w:tcPr>
+            <w:tcW w:type="dxa" w:w="7060"/>
+            <w:tcMar>
+              <w:top w:type="dxa" w:w="40"/>
+              <w:left w:type="dxa" w:w="70"/>
+              <w:bottom w:type="dxa" w:w="40"/>
+              <w:right w:type="dxa" w:w="70"/>
+            </w:tcMar>
+          </w:tcPr>
+          <w:p>
+            <w:pPr>
+              <w:spacing w:after="18" w:line="236"/>
+            </w:pPr>
+            <w:r>
+              <w:rPr>
+                <w:rFonts w:ascii="Arial" w:cs="Arial" w:eastAsia="Arial" w:hAnsi="Arial"/>
+                <w:sz w:val="19"/>
+                <w:szCs w:val="19"/>
+              </w:rPr>
+              <w:t xml:space="preserve">El vendedor cierra la caja del turno cuadrando el efectivo con las ventas.</w:t>
+            </w:r>
+          </w:p>
+        </w:tc>
+      </w:tr>
+      <w:tr>
+        <w:tc>
+          <w:tcPr>
+            <w:tcW w:type="dxa" w:w="2300"/>
+            <w:shd w:fill="EAF0F8" w:val="clear"/>
+            <w:tcMar>
+              <w:top w:type="dxa" w:w="40"/>
+              <w:left w:type="dxa" w:w="70"/>
+              <w:bottom w:type="dxa" w:w="40"/>
+              <w:right w:type="dxa" w:w="70"/>
+            </w:tcMar>
+          </w:tcPr>
+          <w:p>
+            <w:pPr>
+              <w:spacing w:after="18" w:line="236"/>
+            </w:pPr>
+            <w:r>
+              <w:rPr>
+                <w:rFonts w:ascii="Arial" w:cs="Arial" w:eastAsia="Arial" w:hAnsi="Arial"/>
+                <w:b/>
+                <w:bCs/>
+                <w:sz w:val="19"/>
+                <w:szCs w:val="19"/>
+              </w:rPr>
+              <w:t xml:space="preserve">Precondiciones</w:t>
+            </w:r>
+          </w:p>
+        </w:tc>
+        <w:tc>
+          <w:tcPr>
+            <w:tcW w:type="dxa" w:w="7060"/>
+            <w:tcMar>
+              <w:top w:type="dxa" w:w="40"/>
+              <w:left w:type="dxa" w:w="70"/>
+              <w:bottom w:type="dxa" w:w="40"/>
+              <w:right w:type="dxa" w:w="70"/>
+            </w:tcMar>
+          </w:tcPr>
+          <w:p>
+            <w:pPr>
+              <w:spacing w:after="18" w:line="236"/>
+            </w:pPr>
+            <w:r>
+              <w:rPr>
+                <w:rFonts w:ascii="Arial" w:cs="Arial" w:eastAsia="Arial" w:hAnsi="Arial"/>
+                <w:sz w:val="19"/>
+                <w:szCs w:val="19"/>
+              </w:rPr>
+              <w:t xml:space="preserve">Existe una caja abierta con ventas del turno.</w:t>
+            </w:r>
+          </w:p>
+        </w:tc>
+      </w:tr>
+      <w:tr>
+        <w:tc>
+          <w:tcPr>
+            <w:tcW w:type="dxa" w:w="2300"/>
+            <w:shd w:fill="EAF0F8" w:val="clear"/>
+            <w:tcMar>
+              <w:top w:type="dxa" w:w="40"/>
+              <w:left w:type="dxa" w:w="70"/>
+              <w:bottom w:type="dxa" w:w="40"/>
+              <w:right w:type="dxa" w:w="70"/>
+            </w:tcMar>
+          </w:tcPr>
+          <w:p>
+            <w:pPr>
+              <w:spacing w:after="18" w:line="236"/>
+            </w:pPr>
+            <w:r>
+              <w:rPr>
+                <w:rFonts w:ascii="Arial" w:cs="Arial" w:eastAsia="Arial" w:hAnsi="Arial"/>
+                <w:b/>
+                <w:bCs/>
+                <w:sz w:val="19"/>
+                <w:szCs w:val="19"/>
+              </w:rPr>
+              <w:t xml:space="preserve">Flujo principal</w:t>
+            </w:r>
+          </w:p>
+        </w:tc>
+        <w:tc>
+          <w:tcPr>
+            <w:tcW w:type="dxa" w:w="7060"/>
+            <w:tcMar>
+              <w:top w:type="dxa" w:w="40"/>
+              <w:left w:type="dxa" w:w="70"/>
+              <w:bottom w:type="dxa" w:w="40"/>
+              <w:right w:type="dxa" w:w="70"/>
+            </w:tcMar>
+          </w:tcPr>
+          <w:p>
+            <w:pPr>
+              <w:spacing w:after="18" w:line="236"/>
+            </w:pPr>
+            <w:r>
+              <w:rPr>
+                <w:rFonts w:ascii="Arial" w:cs="Arial" w:eastAsia="Arial" w:hAnsi="Arial"/>
+                <w:sz w:val="19"/>
+                <w:szCs w:val="19"/>
+              </w:rPr>
+              <w:t xml:space="preserve">1. El vendedor elige «Cerrar caja».</w:t>
+            </w:r>
+          </w:p>
+          <w:p>
+            <w:pPr>
+              <w:spacing w:after="18" w:line="236"/>
+            </w:pPr>
+            <w:r>
+              <w:rPr>
+                <w:rFonts w:ascii="Arial" w:cs="Arial" w:eastAsia="Arial" w:hAnsi="Arial"/>
+                <w:sz w:val="19"/>
+                <w:szCs w:val="19"/>
+              </w:rPr>
+              <w:t xml:space="preserve">2. El sistema muestra el total esperado (ventas en efectivo del turno).</w:t>
+            </w:r>
+          </w:p>
+          <w:p>
+            <w:pPr>
+              <w:spacing w:after="18" w:line="236"/>
+            </w:pPr>
+            <w:r>
+              <w:rPr>
+                <w:rFonts w:ascii="Arial" w:cs="Arial" w:eastAsia="Arial" w:hAnsi="Arial"/>
+                <w:sz w:val="19"/>
+                <w:szCs w:val="19"/>
+              </w:rPr>
+              <w:t xml:space="preserve">3. El vendedor ingresa el efectivo contado.</w:t>
+            </w:r>
+          </w:p>
+          <w:p>
+            <w:pPr>
+              <w:spacing w:after="18" w:line="236"/>
+            </w:pPr>
+            <w:r>
+              <w:rPr>
+                <w:rFonts w:ascii="Arial" w:cs="Arial" w:eastAsia="Arial" w:hAnsi="Arial"/>
+                <w:sz w:val="19"/>
+                <w:szCs w:val="19"/>
+              </w:rPr>
+              <w:t xml:space="preserve">4. El sistema compara y calcula la diferencia.</w:t>
+            </w:r>
+          </w:p>
+          <w:p>
+            <w:pPr>
+              <w:spacing w:after="18" w:line="236"/>
+            </w:pPr>
+            <w:r>
+              <w:rPr>
+                <w:rFonts w:ascii="Arial" w:cs="Arial" w:eastAsia="Arial" w:hAnsi="Arial"/>
+                <w:sz w:val="19"/>
+                <w:szCs w:val="19"/>
+              </w:rPr>
+              <w:t xml:space="preserve">5. El sistema registra el cierre con sus totales.</w:t>
+            </w:r>
+          </w:p>
+        </w:tc>
+      </w:tr>
+      <w:tr>
+        <w:tc>
+          <w:tcPr>
+            <w:tcW w:type="dxa" w:w="2300"/>
+            <w:shd w:fill="EAF0F8" w:val="clear"/>
+            <w:tcMar>
+              <w:top w:type="dxa" w:w="40"/>
+              <w:left w:type="dxa" w:w="70"/>
+              <w:bottom w:type="dxa" w:w="40"/>
+              <w:right w:type="dxa" w:w="70"/>
+            </w:tcMar>
+          </w:tcPr>
+          <w:p>
+            <w:pPr>
+              <w:spacing w:after="18" w:line="236"/>
+            </w:pPr>
+            <w:r>
+              <w:rPr>
+                <w:rFonts w:ascii="Arial" w:cs="Arial" w:eastAsia="Arial" w:hAnsi="Arial"/>
+                <w:b/>
+                <w:bCs/>
+                <w:sz w:val="19"/>
+                <w:szCs w:val="19"/>
+              </w:rPr>
+              <w:t xml:space="preserve">Flujos alternativos</w:t>
+            </w:r>
+          </w:p>
+        </w:tc>
+        <w:tc>
+          <w:tcPr>
+            <w:tcW w:type="dxa" w:w="7060"/>
+            <w:tcMar>
+              <w:top w:type="dxa" w:w="40"/>
+              <w:left w:type="dxa" w:w="70"/>
+              <w:bottom w:type="dxa" w:w="40"/>
+              <w:right w:type="dxa" w:w="70"/>
+            </w:tcMar>
+          </w:tcPr>
+          <w:p>
+            <w:pPr>
+              <w:spacing w:after="18" w:line="236"/>
+            </w:pPr>
+            <w:r>
+              <w:rPr>
+                <w:rFonts w:ascii="Arial" w:cs="Arial" w:eastAsia="Arial" w:hAnsi="Arial"/>
+                <w:sz w:val="19"/>
+                <w:szCs w:val="19"/>
+              </w:rPr>
+              <w:t xml:space="preserve">—</w:t>
+            </w:r>
+          </w:p>
+        </w:tc>
+      </w:tr>
+      <w:tr>
+        <w:tc>
+          <w:tcPr>
+            <w:tcW w:type="dxa" w:w="2300"/>
+            <w:shd w:fill="EAF0F8" w:val="clear"/>
+            <w:tcMar>
+              <w:top w:type="dxa" w:w="40"/>
+              <w:left w:type="dxa" w:w="70"/>
+              <w:bottom w:type="dxa" w:w="40"/>
+              <w:right w:type="dxa" w:w="70"/>
+            </w:tcMar>
+          </w:tcPr>
+          <w:p>
+            <w:pPr>
+              <w:spacing w:after="18" w:line="236"/>
+            </w:pPr>
+            <w:r>
+              <w:rPr>
+                <w:rFonts w:ascii="Arial" w:cs="Arial" w:eastAsia="Arial" w:hAnsi="Arial"/>
+                <w:b/>
+                <w:bCs/>
+                <w:sz w:val="19"/>
+                <w:szCs w:val="19"/>
+              </w:rPr>
+              <w:t xml:space="preserve">Excepciones</w:t>
+            </w:r>
+          </w:p>
+        </w:tc>
+        <w:tc>
+          <w:tcPr>
+            <w:tcW w:type="dxa" w:w="7060"/>
+            <w:tcMar>
+              <w:top w:type="dxa" w:w="40"/>
+              <w:left w:type="dxa" w:w="70"/>
+              <w:bottom w:type="dxa" w:w="40"/>
+              <w:right w:type="dxa" w:w="70"/>
+            </w:tcMar>
+          </w:tcPr>
+          <w:p>
+            <w:pPr>
+              <w:spacing w:after="18" w:line="236"/>
+            </w:pPr>
+            <w:r>
+              <w:rPr>
+                <w:rFonts w:ascii="Arial" w:cs="Arial" w:eastAsia="Arial" w:hAnsi="Arial"/>
+                <w:sz w:val="19"/>
+                <w:szCs w:val="19"/>
+              </w:rPr>
+              <w:t xml:space="preserve">4a. Diferencia (sobrante o faltante): el sistema la registra y solicita una observación.</w:t>
+            </w:r>
+          </w:p>
+        </w:tc>
+      </w:tr>
+      <w:tr>
+        <w:tc>
+          <w:tcPr>
+            <w:tcW w:type="dxa" w:w="2300"/>
+            <w:shd w:fill="EAF0F8" w:val="clear"/>
+            <w:tcMar>
+              <w:top w:type="dxa" w:w="40"/>
+              <w:left w:type="dxa" w:w="70"/>
+              <w:bottom w:type="dxa" w:w="40"/>
+              <w:right w:type="dxa" w:w="70"/>
+            </w:tcMar>
+          </w:tcPr>
+          <w:p>
+            <w:pPr>
+              <w:spacing w:after="18" w:line="236"/>
+            </w:pPr>
+            <w:r>
+              <w:rPr>
+                <w:rFonts w:ascii="Arial" w:cs="Arial" w:eastAsia="Arial" w:hAnsi="Arial"/>
+                <w:b/>
+                <w:bCs/>
+                <w:sz w:val="19"/>
+                <w:szCs w:val="19"/>
+              </w:rPr>
+              <w:t xml:space="preserve">Reglas y validaciones</w:t>
+            </w:r>
+          </w:p>
+        </w:tc>
+        <w:tc>
+          <w:tcPr>
+            <w:tcW w:type="dxa" w:w="7060"/>
+            <w:tcMar>
+              <w:top w:type="dxa" w:w="40"/>
+              <w:left w:type="dxa" w:w="70"/>
+              <w:bottom w:type="dxa" w:w="40"/>
+              <w:right w:type="dxa" w:w="70"/>
+            </w:tcMar>
+          </w:tcPr>
+          <w:p>
+            <w:pPr>
+              <w:spacing w:after="18" w:line="236"/>
+            </w:pPr>
+            <w:r>
+              <w:rPr>
+                <w:rFonts w:ascii="Arial" w:cs="Arial" w:eastAsia="Arial" w:hAnsi="Arial"/>
+                <w:sz w:val="19"/>
+                <w:szCs w:val="19"/>
+              </w:rPr>
+              <w:t xml:space="preserve">El cierre deja constancia del efectivo esperado, el contado y la diferencia; una vez cerrada, la caja requiere una nueva apertura para seguir vendiendo.</w:t>
+            </w:r>
+          </w:p>
+        </w:tc>
+      </w:tr>
+      <w:tr>
+        <w:tc>
+          <w:tcPr>
+            <w:tcW w:type="dxa" w:w="2300"/>
+            <w:shd w:fill="EAF0F8" w:val="clear"/>
+            <w:tcMar>
+              <w:top w:type="dxa" w:w="40"/>
+              <w:left w:type="dxa" w:w="70"/>
+              <w:bottom w:type="dxa" w:w="40"/>
+              <w:right w:type="dxa" w:w="70"/>
+            </w:tcMar>
+          </w:tcPr>
+          <w:p>
+            <w:pPr>
+              <w:spacing w:after="18" w:line="236"/>
+            </w:pPr>
+            <w:r>
+              <w:rPr>
+                <w:rFonts w:ascii="Arial" w:cs="Arial" w:eastAsia="Arial" w:hAnsi="Arial"/>
+                <w:b/>
+                <w:bCs/>
+                <w:sz w:val="19"/>
+                <w:szCs w:val="19"/>
+              </w:rPr>
+              <w:t xml:space="preserve">Postcondiciones</w:t>
+            </w:r>
+          </w:p>
+        </w:tc>
+        <w:tc>
+          <w:tcPr>
+            <w:tcW w:type="dxa" w:w="7060"/>
+            <w:tcMar>
+              <w:top w:type="dxa" w:w="40"/>
+              <w:left w:type="dxa" w:w="70"/>
+              <w:bottom w:type="dxa" w:w="40"/>
+              <w:right w:type="dxa" w:w="70"/>
+            </w:tcMar>
+          </w:tcPr>
+          <w:p>
+            <w:pPr>
+              <w:spacing w:after="18" w:line="236"/>
+            </w:pPr>
+            <w:r>
+              <w:rPr>
+                <w:rFonts w:ascii="Arial" w:cs="Arial" w:eastAsia="Arial" w:hAnsi="Arial"/>
+                <w:sz w:val="19"/>
+                <w:szCs w:val="19"/>
+              </w:rPr>
+              <w:t xml:space="preserve">La caja queda cerrada con su cuadre registrado.</w:t>
+            </w:r>
+          </w:p>
+        </w:tc>
+      </w:tr>
+      <w:tr>
+        <w:tc>
+          <w:tcPr>
+            <w:tcW w:type="dxa" w:w="2300"/>
+            <w:shd w:fill="EAF0F8" w:val="clear"/>
+            <w:tcMar>
+              <w:top w:type="dxa" w:w="40"/>
+              <w:left w:type="dxa" w:w="70"/>
+              <w:bottom w:type="dxa" w:w="40"/>
+              <w:right w:type="dxa" w:w="70"/>
+            </w:tcMar>
+          </w:tcPr>
+          <w:p>
+            <w:pPr>
+              <w:spacing w:after="18" w:line="236"/>
+            </w:pPr>
+            <w:r>
+              <w:rPr>
+                <w:rFonts w:ascii="Arial" w:cs="Arial" w:eastAsia="Arial" w:hAnsi="Arial"/>
+                <w:b/>
+                <w:bCs/>
+                <w:sz w:val="19"/>
+                <w:szCs w:val="19"/>
+              </w:rPr>
+              <w:t xml:space="preserve">Prioridad</w:t>
+            </w:r>
+          </w:p>
+        </w:tc>
+        <w:tc>
+          <w:tcPr>
+            <w:tcW w:type="dxa" w:w="7060"/>
+            <w:tcMar>
+              <w:top w:type="dxa" w:w="40"/>
+              <w:left w:type="dxa" w:w="70"/>
+              <w:bottom w:type="dxa" w:w="40"/>
+              <w:right w:type="dxa" w:w="70"/>
+            </w:tcMar>
+          </w:tcPr>
+          <w:p>
+            <w:pPr>
+              <w:spacing w:after="18" w:line="236"/>
+            </w:pPr>
+            <w:r>
+              <w:rPr>
+                <w:rFonts w:ascii="Arial" w:cs="Arial" w:eastAsia="Arial" w:hAnsi="Arial"/>
+                <w:sz w:val="19"/>
+                <w:szCs w:val="19"/>
+              </w:rPr>
+              <w:t xml:space="preserve">Media</w:t>
+            </w:r>
+          </w:p>
+        </w:tc>
+      </w:tr>
+    </w:tbl>
+    <w:p>
+      <w:pPr>
+        <w:spacing w:after="140"/>
+      </w:pPr>
+    </w:p>
     <w:sectPr>
       <w:footerReference w:type="default" r:id="rId7"/>
       <w:pgSz w:w="12240" w:h="15840" w:orient="portrait"/>

</xml_diff>

<commit_message>
Agrego los casos de uso extendidos del módulo de reportes
</commit_message>
<xml_diff>
--- a/docs/diseno/INVENTRA_Analisis_Diseno_UML.docx
+++ b/docs/diseno/INVENTRA_Analisis_Diseno_UML.docx
@@ -1366,6 +1366,41 @@
       <w:r>
         <w:fldChar w:fldCharType="begin" w:dirty="true"/>
         <w:instrText xml:space="preserve">PAGEREF bm45</w:instrText>
+        <w:fldChar w:fldCharType="end"/>
+      </w:r>
+    </w:p>
+    <w:p>
+      <w:pPr>
+        <w:tabs>
+          <w:tab w:val="right" w:pos="9200" w:leader="dot"/>
+        </w:tabs>
+        <w:spacing w:after="40" w:line="252"/>
+        <w:ind w:left="360"/>
+      </w:pPr>
+      <w:hyperlink w:history="1" w:anchor="bm46">
+        <w:r>
+          <w:rPr>
+            <w:rFonts w:ascii="Arial" w:cs="Arial" w:eastAsia="Arial" w:hAnsi="Arial"/>
+            <w:b w:val="false"/>
+            <w:bCs w:val="false"/>
+            <w:color w:val="1F3864"/>
+            <w:sz w:val="20"/>
+            <w:szCs w:val="20"/>
+          </w:rPr>
+          <w:t xml:space="preserve">9.5 Módulo REP — Reportes</w:t>
+        </w:r>
+      </w:hyperlink>
+      <w:r>
+        <w:rPr>
+          <w:rFonts w:ascii="Arial" w:cs="Arial" w:eastAsia="Arial" w:hAnsi="Arial"/>
+          <w:sz w:val="20"/>
+          <w:szCs w:val="20"/>
+        </w:rPr>
+        <w:t xml:space="preserve">	</w:t>
+      </w:r>
+      <w:r>
+        <w:fldChar w:fldCharType="begin" w:dirty="true"/>
+        <w:instrText xml:space="preserve">PAGEREF bm46</w:instrText>
         <w:fldChar w:fldCharType="end"/>
       </w:r>
     </w:p>
@@ -26736,6 +26771,3698 @@
         <w:spacing w:after="140"/>
       </w:pPr>
     </w:p>
+    <w:p>
+      <w:pPr>
+        <w:pStyle w:val="Heading2"/>
+        <w:spacing w:after="80" w:before="150"/>
+      </w:pPr>
+      <w:bookmarkStart w:name="bm46" w:id="46"/>
+      <w:r>
+        <w:rPr>
+          <w:rFonts w:ascii="Arial" w:cs="Arial" w:eastAsia="Arial" w:hAnsi="Arial"/>
+          <w:b/>
+          <w:bCs/>
+          <w:color w:val="2E5496"/>
+          <w:sz w:val="23"/>
+          <w:szCs w:val="23"/>
+        </w:rPr>
+        <w:t xml:space="preserve">9.5 Módulo REP — Reportes</w:t>
+      </w:r>
+      <w:bookmarkEnd w:id="46"/>
+    </w:p>
+    <w:tbl>
+      <w:tblPr>
+        <w:tblW w:type="dxa" w:w="9360"/>
+        <w:tblBorders>
+          <w:top w:val="single" w:color="9CA3AF" w:sz="6"/>
+          <w:left w:val="single" w:color="9CA3AF" w:sz="6"/>
+          <w:bottom w:val="single" w:color="9CA3AF" w:sz="6"/>
+          <w:right w:val="single" w:color="9CA3AF" w:sz="6"/>
+          <w:insideH w:val="single" w:color="9CA3AF" w:sz="6"/>
+          <w:insideV w:val="single" w:color="9CA3AF" w:sz="6"/>
+        </w:tblBorders>
+        <w:tblLayout w:type="fixed"/>
+      </w:tblPr>
+      <w:tblGrid>
+        <w:gridCol w:w="2300"/>
+        <w:gridCol w:w="7060"/>
+      </w:tblGrid>
+      <w:tr>
+        <w:tc>
+          <w:tcPr>
+            <w:tcW w:type="dxa" w:w="9360"/>
+            <w:gridSpan w:val="2"/>
+            <w:shd w:fill="1F3864" w:val="clear"/>
+            <w:tcMar>
+              <w:top w:type="dxa" w:w="40"/>
+              <w:left w:type="dxa" w:w="70"/>
+              <w:bottom w:type="dxa" w:w="40"/>
+              <w:right w:type="dxa" w:w="70"/>
+            </w:tcMar>
+          </w:tcPr>
+          <w:p>
+            <w:pPr>
+              <w:spacing w:after="18" w:line="236"/>
+            </w:pPr>
+            <w:r>
+              <w:rPr>
+                <w:rFonts w:ascii="Arial" w:cs="Arial" w:eastAsia="Arial" w:hAnsi="Arial"/>
+                <w:b/>
+                <w:bCs/>
+                <w:color w:val="FFFFFF"/>
+                <w:sz w:val="19"/>
+                <w:szCs w:val="19"/>
+              </w:rPr>
+              <w:t xml:space="preserve">CU-REP-01 — Reporte de ventas por período</w:t>
+            </w:r>
+          </w:p>
+        </w:tc>
+      </w:tr>
+      <w:tr>
+        <w:tc>
+          <w:tcPr>
+            <w:tcW w:type="dxa" w:w="2300"/>
+            <w:shd w:fill="EAF0F8" w:val="clear"/>
+            <w:tcMar>
+              <w:top w:type="dxa" w:w="40"/>
+              <w:left w:type="dxa" w:w="70"/>
+              <w:bottom w:type="dxa" w:w="40"/>
+              <w:right w:type="dxa" w:w="70"/>
+            </w:tcMar>
+          </w:tcPr>
+          <w:p>
+            <w:pPr>
+              <w:spacing w:after="18" w:line="236"/>
+            </w:pPr>
+            <w:r>
+              <w:rPr>
+                <w:rFonts w:ascii="Arial" w:cs="Arial" w:eastAsia="Arial" w:hAnsi="Arial"/>
+                <w:b/>
+                <w:bCs/>
+                <w:sz w:val="19"/>
+                <w:szCs w:val="19"/>
+              </w:rPr>
+              <w:t xml:space="preserve">Actor(es)</w:t>
+            </w:r>
+          </w:p>
+        </w:tc>
+        <w:tc>
+          <w:tcPr>
+            <w:tcW w:type="dxa" w:w="7060"/>
+            <w:tcMar>
+              <w:top w:type="dxa" w:w="40"/>
+              <w:left w:type="dxa" w:w="70"/>
+              <w:bottom w:type="dxa" w:w="40"/>
+              <w:right w:type="dxa" w:w="70"/>
+            </w:tcMar>
+          </w:tcPr>
+          <w:p>
+            <w:pPr>
+              <w:spacing w:after="18" w:line="236"/>
+            </w:pPr>
+            <w:r>
+              <w:rPr>
+                <w:rFonts w:ascii="Arial" w:cs="Arial" w:eastAsia="Arial" w:hAnsi="Arial"/>
+                <w:sz w:val="19"/>
+                <w:szCs w:val="19"/>
+              </w:rPr>
+              <w:t xml:space="preserve">Administrador</w:t>
+            </w:r>
+          </w:p>
+        </w:tc>
+      </w:tr>
+      <w:tr>
+        <w:tc>
+          <w:tcPr>
+            <w:tcW w:type="dxa" w:w="2300"/>
+            <w:shd w:fill="EAF0F8" w:val="clear"/>
+            <w:tcMar>
+              <w:top w:type="dxa" w:w="40"/>
+              <w:left w:type="dxa" w:w="70"/>
+              <w:bottom w:type="dxa" w:w="40"/>
+              <w:right w:type="dxa" w:w="70"/>
+            </w:tcMar>
+          </w:tcPr>
+          <w:p>
+            <w:pPr>
+              <w:spacing w:after="18" w:line="236"/>
+            </w:pPr>
+            <w:r>
+              <w:rPr>
+                <w:rFonts w:ascii="Arial" w:cs="Arial" w:eastAsia="Arial" w:hAnsi="Arial"/>
+                <w:b/>
+                <w:bCs/>
+                <w:sz w:val="19"/>
+                <w:szCs w:val="19"/>
+              </w:rPr>
+              <w:t xml:space="preserve">Requisito</w:t>
+            </w:r>
+          </w:p>
+        </w:tc>
+        <w:tc>
+          <w:tcPr>
+            <w:tcW w:type="dxa" w:w="7060"/>
+            <w:tcMar>
+              <w:top w:type="dxa" w:w="40"/>
+              <w:left w:type="dxa" w:w="70"/>
+              <w:bottom w:type="dxa" w:w="40"/>
+              <w:right w:type="dxa" w:w="70"/>
+            </w:tcMar>
+          </w:tcPr>
+          <w:p>
+            <w:pPr>
+              <w:spacing w:after="18" w:line="236"/>
+            </w:pPr>
+            <w:r>
+              <w:rPr>
+                <w:rFonts w:ascii="Arial" w:cs="Arial" w:eastAsia="Arial" w:hAnsi="Arial"/>
+                <w:sz w:val="19"/>
+                <w:szCs w:val="19"/>
+              </w:rPr>
+              <w:t xml:space="preserve">RF-REP-01</w:t>
+            </w:r>
+          </w:p>
+        </w:tc>
+      </w:tr>
+      <w:tr>
+        <w:tc>
+          <w:tcPr>
+            <w:tcW w:type="dxa" w:w="2300"/>
+            <w:shd w:fill="EAF0F8" w:val="clear"/>
+            <w:tcMar>
+              <w:top w:type="dxa" w:w="40"/>
+              <w:left w:type="dxa" w:w="70"/>
+              <w:bottom w:type="dxa" w:w="40"/>
+              <w:right w:type="dxa" w:w="70"/>
+            </w:tcMar>
+          </w:tcPr>
+          <w:p>
+            <w:pPr>
+              <w:spacing w:after="18" w:line="236"/>
+            </w:pPr>
+            <w:r>
+              <w:rPr>
+                <w:rFonts w:ascii="Arial" w:cs="Arial" w:eastAsia="Arial" w:hAnsi="Arial"/>
+                <w:b/>
+                <w:bCs/>
+                <w:sz w:val="19"/>
+                <w:szCs w:val="19"/>
+              </w:rPr>
+              <w:t xml:space="preserve">Descripción</w:t>
+            </w:r>
+          </w:p>
+        </w:tc>
+        <w:tc>
+          <w:tcPr>
+            <w:tcW w:type="dxa" w:w="7060"/>
+            <w:tcMar>
+              <w:top w:type="dxa" w:w="40"/>
+              <w:left w:type="dxa" w:w="70"/>
+              <w:bottom w:type="dxa" w:w="40"/>
+              <w:right w:type="dxa" w:w="70"/>
+            </w:tcMar>
+          </w:tcPr>
+          <w:p>
+            <w:pPr>
+              <w:spacing w:after="18" w:line="236"/>
+            </w:pPr>
+            <w:r>
+              <w:rPr>
+                <w:rFonts w:ascii="Arial" w:cs="Arial" w:eastAsia="Arial" w:hAnsi="Arial"/>
+                <w:sz w:val="19"/>
+                <w:szCs w:val="19"/>
+              </w:rPr>
+              <w:t xml:space="preserve">El administrador genera un reporte de las ventas en un rango de fechas.</w:t>
+            </w:r>
+          </w:p>
+        </w:tc>
+      </w:tr>
+      <w:tr>
+        <w:tc>
+          <w:tcPr>
+            <w:tcW w:type="dxa" w:w="2300"/>
+            <w:shd w:fill="EAF0F8" w:val="clear"/>
+            <w:tcMar>
+              <w:top w:type="dxa" w:w="40"/>
+              <w:left w:type="dxa" w:w="70"/>
+              <w:bottom w:type="dxa" w:w="40"/>
+              <w:right w:type="dxa" w:w="70"/>
+            </w:tcMar>
+          </w:tcPr>
+          <w:p>
+            <w:pPr>
+              <w:spacing w:after="18" w:line="236"/>
+            </w:pPr>
+            <w:r>
+              <w:rPr>
+                <w:rFonts w:ascii="Arial" w:cs="Arial" w:eastAsia="Arial" w:hAnsi="Arial"/>
+                <w:b/>
+                <w:bCs/>
+                <w:sz w:val="19"/>
+                <w:szCs w:val="19"/>
+              </w:rPr>
+              <w:t xml:space="preserve">Precondiciones</w:t>
+            </w:r>
+          </w:p>
+        </w:tc>
+        <w:tc>
+          <w:tcPr>
+            <w:tcW w:type="dxa" w:w="7060"/>
+            <w:tcMar>
+              <w:top w:type="dxa" w:w="40"/>
+              <w:left w:type="dxa" w:w="70"/>
+              <w:bottom w:type="dxa" w:w="40"/>
+              <w:right w:type="dxa" w:w="70"/>
+            </w:tcMar>
+          </w:tcPr>
+          <w:p>
+            <w:pPr>
+              <w:spacing w:after="18" w:line="236"/>
+            </w:pPr>
+            <w:r>
+              <w:rPr>
+                <w:rFonts w:ascii="Arial" w:cs="Arial" w:eastAsia="Arial" w:hAnsi="Arial"/>
+                <w:sz w:val="19"/>
+                <w:szCs w:val="19"/>
+              </w:rPr>
+              <w:t xml:space="preserve">El administrador está autenticado y existen ventas registradas.</w:t>
+            </w:r>
+          </w:p>
+        </w:tc>
+      </w:tr>
+      <w:tr>
+        <w:tc>
+          <w:tcPr>
+            <w:tcW w:type="dxa" w:w="2300"/>
+            <w:shd w:fill="EAF0F8" w:val="clear"/>
+            <w:tcMar>
+              <w:top w:type="dxa" w:w="40"/>
+              <w:left w:type="dxa" w:w="70"/>
+              <w:bottom w:type="dxa" w:w="40"/>
+              <w:right w:type="dxa" w:w="70"/>
+            </w:tcMar>
+          </w:tcPr>
+          <w:p>
+            <w:pPr>
+              <w:spacing w:after="18" w:line="236"/>
+            </w:pPr>
+            <w:r>
+              <w:rPr>
+                <w:rFonts w:ascii="Arial" w:cs="Arial" w:eastAsia="Arial" w:hAnsi="Arial"/>
+                <w:b/>
+                <w:bCs/>
+                <w:sz w:val="19"/>
+                <w:szCs w:val="19"/>
+              </w:rPr>
+              <w:t xml:space="preserve">Flujo principal</w:t>
+            </w:r>
+          </w:p>
+        </w:tc>
+        <w:tc>
+          <w:tcPr>
+            <w:tcW w:type="dxa" w:w="7060"/>
+            <w:tcMar>
+              <w:top w:type="dxa" w:w="40"/>
+              <w:left w:type="dxa" w:w="70"/>
+              <w:bottom w:type="dxa" w:w="40"/>
+              <w:right w:type="dxa" w:w="70"/>
+            </w:tcMar>
+          </w:tcPr>
+          <w:p>
+            <w:pPr>
+              <w:spacing w:after="18" w:line="236"/>
+            </w:pPr>
+            <w:r>
+              <w:rPr>
+                <w:rFonts w:ascii="Arial" w:cs="Arial" w:eastAsia="Arial" w:hAnsi="Arial"/>
+                <w:sz w:val="19"/>
+                <w:szCs w:val="19"/>
+              </w:rPr>
+              <w:t xml:space="preserve">1. Elige «Reporte de ventas» y define el rango de fechas y los filtros (sede, vendedor).</w:t>
+            </w:r>
+          </w:p>
+          <w:p>
+            <w:pPr>
+              <w:spacing w:after="18" w:line="236"/>
+            </w:pPr>
+            <w:r>
+              <w:rPr>
+                <w:rFonts w:ascii="Arial" w:cs="Arial" w:eastAsia="Arial" w:hAnsi="Arial"/>
+                <w:sz w:val="19"/>
+                <w:szCs w:val="19"/>
+              </w:rPr>
+              <w:t xml:space="preserve">2. El sistema consulta las ventas del período.</w:t>
+            </w:r>
+          </w:p>
+          <w:p>
+            <w:pPr>
+              <w:spacing w:after="18" w:line="236"/>
+            </w:pPr>
+            <w:r>
+              <w:rPr>
+                <w:rFonts w:ascii="Arial" w:cs="Arial" w:eastAsia="Arial" w:hAnsi="Arial"/>
+                <w:sz w:val="19"/>
+                <w:szCs w:val="19"/>
+              </w:rPr>
+              <w:t xml:space="preserve">3. El sistema muestra el reporte con los totales por día, medio de pago y vendedor.</w:t>
+            </w:r>
+          </w:p>
+        </w:tc>
+      </w:tr>
+      <w:tr>
+        <w:tc>
+          <w:tcPr>
+            <w:tcW w:type="dxa" w:w="2300"/>
+            <w:shd w:fill="EAF0F8" w:val="clear"/>
+            <w:tcMar>
+              <w:top w:type="dxa" w:w="40"/>
+              <w:left w:type="dxa" w:w="70"/>
+              <w:bottom w:type="dxa" w:w="40"/>
+              <w:right w:type="dxa" w:w="70"/>
+            </w:tcMar>
+          </w:tcPr>
+          <w:p>
+            <w:pPr>
+              <w:spacing w:after="18" w:line="236"/>
+            </w:pPr>
+            <w:r>
+              <w:rPr>
+                <w:rFonts w:ascii="Arial" w:cs="Arial" w:eastAsia="Arial" w:hAnsi="Arial"/>
+                <w:b/>
+                <w:bCs/>
+                <w:sz w:val="19"/>
+                <w:szCs w:val="19"/>
+              </w:rPr>
+              <w:t xml:space="preserve">Flujos alternativos</w:t>
+            </w:r>
+          </w:p>
+        </w:tc>
+        <w:tc>
+          <w:tcPr>
+            <w:tcW w:type="dxa" w:w="7060"/>
+            <w:tcMar>
+              <w:top w:type="dxa" w:w="40"/>
+              <w:left w:type="dxa" w:w="70"/>
+              <w:bottom w:type="dxa" w:w="40"/>
+              <w:right w:type="dxa" w:w="70"/>
+            </w:tcMar>
+          </w:tcPr>
+          <w:p>
+            <w:pPr>
+              <w:spacing w:after="18" w:line="236"/>
+            </w:pPr>
+            <w:r>
+              <w:rPr>
+                <w:rFonts w:ascii="Arial" w:cs="Arial" w:eastAsia="Arial" w:hAnsi="Arial"/>
+                <w:sz w:val="19"/>
+                <w:szCs w:val="19"/>
+              </w:rPr>
+              <w:t xml:space="preserve">3a. Exportar el reporte (CU-REP-06).</w:t>
+            </w:r>
+          </w:p>
+        </w:tc>
+      </w:tr>
+      <w:tr>
+        <w:tc>
+          <w:tcPr>
+            <w:tcW w:type="dxa" w:w="2300"/>
+            <w:shd w:fill="EAF0F8" w:val="clear"/>
+            <w:tcMar>
+              <w:top w:type="dxa" w:w="40"/>
+              <w:left w:type="dxa" w:w="70"/>
+              <w:bottom w:type="dxa" w:w="40"/>
+              <w:right w:type="dxa" w:w="70"/>
+            </w:tcMar>
+          </w:tcPr>
+          <w:p>
+            <w:pPr>
+              <w:spacing w:after="18" w:line="236"/>
+            </w:pPr>
+            <w:r>
+              <w:rPr>
+                <w:rFonts w:ascii="Arial" w:cs="Arial" w:eastAsia="Arial" w:hAnsi="Arial"/>
+                <w:b/>
+                <w:bCs/>
+                <w:sz w:val="19"/>
+                <w:szCs w:val="19"/>
+              </w:rPr>
+              <w:t xml:space="preserve">Excepciones</w:t>
+            </w:r>
+          </w:p>
+        </w:tc>
+        <w:tc>
+          <w:tcPr>
+            <w:tcW w:type="dxa" w:w="7060"/>
+            <w:tcMar>
+              <w:top w:type="dxa" w:w="40"/>
+              <w:left w:type="dxa" w:w="70"/>
+              <w:bottom w:type="dxa" w:w="40"/>
+              <w:right w:type="dxa" w:w="70"/>
+            </w:tcMar>
+          </w:tcPr>
+          <w:p>
+            <w:pPr>
+              <w:spacing w:after="18" w:line="236"/>
+            </w:pPr>
+            <w:r>
+              <w:rPr>
+                <w:rFonts w:ascii="Arial" w:cs="Arial" w:eastAsia="Arial" w:hAnsi="Arial"/>
+                <w:sz w:val="19"/>
+                <w:szCs w:val="19"/>
+              </w:rPr>
+              <w:t xml:space="preserve">*. Sin ventas en el período: el sistema muestra el reporte vacío.</w:t>
+            </w:r>
+          </w:p>
+        </w:tc>
+      </w:tr>
+      <w:tr>
+        <w:tc>
+          <w:tcPr>
+            <w:tcW w:type="dxa" w:w="2300"/>
+            <w:shd w:fill="EAF0F8" w:val="clear"/>
+            <w:tcMar>
+              <w:top w:type="dxa" w:w="40"/>
+              <w:left w:type="dxa" w:w="70"/>
+              <w:bottom w:type="dxa" w:w="40"/>
+              <w:right w:type="dxa" w:w="70"/>
+            </w:tcMar>
+          </w:tcPr>
+          <w:p>
+            <w:pPr>
+              <w:spacing w:after="18" w:line="236"/>
+            </w:pPr>
+            <w:r>
+              <w:rPr>
+                <w:rFonts w:ascii="Arial" w:cs="Arial" w:eastAsia="Arial" w:hAnsi="Arial"/>
+                <w:b/>
+                <w:bCs/>
+                <w:sz w:val="19"/>
+                <w:szCs w:val="19"/>
+              </w:rPr>
+              <w:t xml:space="preserve">Reglas y validaciones</w:t>
+            </w:r>
+          </w:p>
+        </w:tc>
+        <w:tc>
+          <w:tcPr>
+            <w:tcW w:type="dxa" w:w="7060"/>
+            <w:tcMar>
+              <w:top w:type="dxa" w:w="40"/>
+              <w:left w:type="dxa" w:w="70"/>
+              <w:bottom w:type="dxa" w:w="40"/>
+              <w:right w:type="dxa" w:w="70"/>
+            </w:tcMar>
+          </w:tcPr>
+          <w:p>
+            <w:pPr>
+              <w:spacing w:after="18" w:line="236"/>
+            </w:pPr>
+            <w:r>
+              <w:rPr>
+                <w:rFonts w:ascii="Arial" w:cs="Arial" w:eastAsia="Arial" w:hAnsi="Arial"/>
+                <w:sz w:val="19"/>
+                <w:szCs w:val="19"/>
+              </w:rPr>
+              <w:t xml:space="preserve">Considera las ventas registradas y distingue las anuladas; los totales cuadran con la caja.</w:t>
+            </w:r>
+          </w:p>
+        </w:tc>
+      </w:tr>
+      <w:tr>
+        <w:tc>
+          <w:tcPr>
+            <w:tcW w:type="dxa" w:w="2300"/>
+            <w:shd w:fill="EAF0F8" w:val="clear"/>
+            <w:tcMar>
+              <w:top w:type="dxa" w:w="40"/>
+              <w:left w:type="dxa" w:w="70"/>
+              <w:bottom w:type="dxa" w:w="40"/>
+              <w:right w:type="dxa" w:w="70"/>
+            </w:tcMar>
+          </w:tcPr>
+          <w:p>
+            <w:pPr>
+              <w:spacing w:after="18" w:line="236"/>
+            </w:pPr>
+            <w:r>
+              <w:rPr>
+                <w:rFonts w:ascii="Arial" w:cs="Arial" w:eastAsia="Arial" w:hAnsi="Arial"/>
+                <w:b/>
+                <w:bCs/>
+                <w:sz w:val="19"/>
+                <w:szCs w:val="19"/>
+              </w:rPr>
+              <w:t xml:space="preserve">Postcondiciones</w:t>
+            </w:r>
+          </w:p>
+        </w:tc>
+        <w:tc>
+          <w:tcPr>
+            <w:tcW w:type="dxa" w:w="7060"/>
+            <w:tcMar>
+              <w:top w:type="dxa" w:w="40"/>
+              <w:left w:type="dxa" w:w="70"/>
+              <w:bottom w:type="dxa" w:w="40"/>
+              <w:right w:type="dxa" w:w="70"/>
+            </w:tcMar>
+          </w:tcPr>
+          <w:p>
+            <w:pPr>
+              <w:spacing w:after="18" w:line="236"/>
+            </w:pPr>
+            <w:r>
+              <w:rPr>
+                <w:rFonts w:ascii="Arial" w:cs="Arial" w:eastAsia="Arial" w:hAnsi="Arial"/>
+                <w:sz w:val="19"/>
+                <w:szCs w:val="19"/>
+              </w:rPr>
+              <w:t xml:space="preserve">El administrador visualiza las ventas del período.</w:t>
+            </w:r>
+          </w:p>
+        </w:tc>
+      </w:tr>
+      <w:tr>
+        <w:tc>
+          <w:tcPr>
+            <w:tcW w:type="dxa" w:w="2300"/>
+            <w:shd w:fill="EAF0F8" w:val="clear"/>
+            <w:tcMar>
+              <w:top w:type="dxa" w:w="40"/>
+              <w:left w:type="dxa" w:w="70"/>
+              <w:bottom w:type="dxa" w:w="40"/>
+              <w:right w:type="dxa" w:w="70"/>
+            </w:tcMar>
+          </w:tcPr>
+          <w:p>
+            <w:pPr>
+              <w:spacing w:after="18" w:line="236"/>
+            </w:pPr>
+            <w:r>
+              <w:rPr>
+                <w:rFonts w:ascii="Arial" w:cs="Arial" w:eastAsia="Arial" w:hAnsi="Arial"/>
+                <w:b/>
+                <w:bCs/>
+                <w:sz w:val="19"/>
+                <w:szCs w:val="19"/>
+              </w:rPr>
+              <w:t xml:space="preserve">Prioridad</w:t>
+            </w:r>
+          </w:p>
+        </w:tc>
+        <w:tc>
+          <w:tcPr>
+            <w:tcW w:type="dxa" w:w="7060"/>
+            <w:tcMar>
+              <w:top w:type="dxa" w:w="40"/>
+              <w:left w:type="dxa" w:w="70"/>
+              <w:bottom w:type="dxa" w:w="40"/>
+              <w:right w:type="dxa" w:w="70"/>
+            </w:tcMar>
+          </w:tcPr>
+          <w:p>
+            <w:pPr>
+              <w:spacing w:after="18" w:line="236"/>
+            </w:pPr>
+            <w:r>
+              <w:rPr>
+                <w:rFonts w:ascii="Arial" w:cs="Arial" w:eastAsia="Arial" w:hAnsi="Arial"/>
+                <w:sz w:val="19"/>
+                <w:szCs w:val="19"/>
+              </w:rPr>
+              <w:t xml:space="preserve">Alta</w:t>
+            </w:r>
+          </w:p>
+        </w:tc>
+      </w:tr>
+    </w:tbl>
+    <w:p>
+      <w:pPr>
+        <w:spacing w:after="140"/>
+      </w:pPr>
+    </w:p>
+    <w:tbl>
+      <w:tblPr>
+        <w:tblW w:type="dxa" w:w="9360"/>
+        <w:tblBorders>
+          <w:top w:val="single" w:color="9CA3AF" w:sz="6"/>
+          <w:left w:val="single" w:color="9CA3AF" w:sz="6"/>
+          <w:bottom w:val="single" w:color="9CA3AF" w:sz="6"/>
+          <w:right w:val="single" w:color="9CA3AF" w:sz="6"/>
+          <w:insideH w:val="single" w:color="9CA3AF" w:sz="6"/>
+          <w:insideV w:val="single" w:color="9CA3AF" w:sz="6"/>
+        </w:tblBorders>
+        <w:tblLayout w:type="fixed"/>
+      </w:tblPr>
+      <w:tblGrid>
+        <w:gridCol w:w="2300"/>
+        <w:gridCol w:w="7060"/>
+      </w:tblGrid>
+      <w:tr>
+        <w:tc>
+          <w:tcPr>
+            <w:tcW w:type="dxa" w:w="9360"/>
+            <w:gridSpan w:val="2"/>
+            <w:shd w:fill="1F3864" w:val="clear"/>
+            <w:tcMar>
+              <w:top w:type="dxa" w:w="40"/>
+              <w:left w:type="dxa" w:w="70"/>
+              <w:bottom w:type="dxa" w:w="40"/>
+              <w:right w:type="dxa" w:w="70"/>
+            </w:tcMar>
+          </w:tcPr>
+          <w:p>
+            <w:pPr>
+              <w:spacing w:after="18" w:line="236"/>
+            </w:pPr>
+            <w:r>
+              <w:rPr>
+                <w:rFonts w:ascii="Arial" w:cs="Arial" w:eastAsia="Arial" w:hAnsi="Arial"/>
+                <w:b/>
+                <w:bCs/>
+                <w:color w:val="FFFFFF"/>
+                <w:sz w:val="19"/>
+                <w:szCs w:val="19"/>
+              </w:rPr>
+              <w:t xml:space="preserve">CU-REP-02 — Reporte de inventario valorizado</w:t>
+            </w:r>
+          </w:p>
+        </w:tc>
+      </w:tr>
+      <w:tr>
+        <w:tc>
+          <w:tcPr>
+            <w:tcW w:type="dxa" w:w="2300"/>
+            <w:shd w:fill="EAF0F8" w:val="clear"/>
+            <w:tcMar>
+              <w:top w:type="dxa" w:w="40"/>
+              <w:left w:type="dxa" w:w="70"/>
+              <w:bottom w:type="dxa" w:w="40"/>
+              <w:right w:type="dxa" w:w="70"/>
+            </w:tcMar>
+          </w:tcPr>
+          <w:p>
+            <w:pPr>
+              <w:spacing w:after="18" w:line="236"/>
+            </w:pPr>
+            <w:r>
+              <w:rPr>
+                <w:rFonts w:ascii="Arial" w:cs="Arial" w:eastAsia="Arial" w:hAnsi="Arial"/>
+                <w:b/>
+                <w:bCs/>
+                <w:sz w:val="19"/>
+                <w:szCs w:val="19"/>
+              </w:rPr>
+              <w:t xml:space="preserve">Actor(es)</w:t>
+            </w:r>
+          </w:p>
+        </w:tc>
+        <w:tc>
+          <w:tcPr>
+            <w:tcW w:type="dxa" w:w="7060"/>
+            <w:tcMar>
+              <w:top w:type="dxa" w:w="40"/>
+              <w:left w:type="dxa" w:w="70"/>
+              <w:bottom w:type="dxa" w:w="40"/>
+              <w:right w:type="dxa" w:w="70"/>
+            </w:tcMar>
+          </w:tcPr>
+          <w:p>
+            <w:pPr>
+              <w:spacing w:after="18" w:line="236"/>
+            </w:pPr>
+            <w:r>
+              <w:rPr>
+                <w:rFonts w:ascii="Arial" w:cs="Arial" w:eastAsia="Arial" w:hAnsi="Arial"/>
+                <w:sz w:val="19"/>
+                <w:szCs w:val="19"/>
+              </w:rPr>
+              <w:t xml:space="preserve">Administrador</w:t>
+            </w:r>
+          </w:p>
+        </w:tc>
+      </w:tr>
+      <w:tr>
+        <w:tc>
+          <w:tcPr>
+            <w:tcW w:type="dxa" w:w="2300"/>
+            <w:shd w:fill="EAF0F8" w:val="clear"/>
+            <w:tcMar>
+              <w:top w:type="dxa" w:w="40"/>
+              <w:left w:type="dxa" w:w="70"/>
+              <w:bottom w:type="dxa" w:w="40"/>
+              <w:right w:type="dxa" w:w="70"/>
+            </w:tcMar>
+          </w:tcPr>
+          <w:p>
+            <w:pPr>
+              <w:spacing w:after="18" w:line="236"/>
+            </w:pPr>
+            <w:r>
+              <w:rPr>
+                <w:rFonts w:ascii="Arial" w:cs="Arial" w:eastAsia="Arial" w:hAnsi="Arial"/>
+                <w:b/>
+                <w:bCs/>
+                <w:sz w:val="19"/>
+                <w:szCs w:val="19"/>
+              </w:rPr>
+              <w:t xml:space="preserve">Requisito</w:t>
+            </w:r>
+          </w:p>
+        </w:tc>
+        <w:tc>
+          <w:tcPr>
+            <w:tcW w:type="dxa" w:w="7060"/>
+            <w:tcMar>
+              <w:top w:type="dxa" w:w="40"/>
+              <w:left w:type="dxa" w:w="70"/>
+              <w:bottom w:type="dxa" w:w="40"/>
+              <w:right w:type="dxa" w:w="70"/>
+            </w:tcMar>
+          </w:tcPr>
+          <w:p>
+            <w:pPr>
+              <w:spacing w:after="18" w:line="236"/>
+            </w:pPr>
+            <w:r>
+              <w:rPr>
+                <w:rFonts w:ascii="Arial" w:cs="Arial" w:eastAsia="Arial" w:hAnsi="Arial"/>
+                <w:sz w:val="19"/>
+                <w:szCs w:val="19"/>
+              </w:rPr>
+              <w:t xml:space="preserve">RF-REP-02</w:t>
+            </w:r>
+          </w:p>
+        </w:tc>
+      </w:tr>
+      <w:tr>
+        <w:tc>
+          <w:tcPr>
+            <w:tcW w:type="dxa" w:w="2300"/>
+            <w:shd w:fill="EAF0F8" w:val="clear"/>
+            <w:tcMar>
+              <w:top w:type="dxa" w:w="40"/>
+              <w:left w:type="dxa" w:w="70"/>
+              <w:bottom w:type="dxa" w:w="40"/>
+              <w:right w:type="dxa" w:w="70"/>
+            </w:tcMar>
+          </w:tcPr>
+          <w:p>
+            <w:pPr>
+              <w:spacing w:after="18" w:line="236"/>
+            </w:pPr>
+            <w:r>
+              <w:rPr>
+                <w:rFonts w:ascii="Arial" w:cs="Arial" w:eastAsia="Arial" w:hAnsi="Arial"/>
+                <w:b/>
+                <w:bCs/>
+                <w:sz w:val="19"/>
+                <w:szCs w:val="19"/>
+              </w:rPr>
+              <w:t xml:space="preserve">Descripción</w:t>
+            </w:r>
+          </w:p>
+        </w:tc>
+        <w:tc>
+          <w:tcPr>
+            <w:tcW w:type="dxa" w:w="7060"/>
+            <w:tcMar>
+              <w:top w:type="dxa" w:w="40"/>
+              <w:left w:type="dxa" w:w="70"/>
+              <w:bottom w:type="dxa" w:w="40"/>
+              <w:right w:type="dxa" w:w="70"/>
+            </w:tcMar>
+          </w:tcPr>
+          <w:p>
+            <w:pPr>
+              <w:spacing w:after="18" w:line="236"/>
+            </w:pPr>
+            <w:r>
+              <w:rPr>
+                <w:rFonts w:ascii="Arial" w:cs="Arial" w:eastAsia="Arial" w:hAnsi="Arial"/>
+                <w:sz w:val="19"/>
+                <w:szCs w:val="19"/>
+              </w:rPr>
+              <w:t xml:space="preserve">El administrador consulta el valor del inventario por producto y total, según PEPS.</w:t>
+            </w:r>
+          </w:p>
+        </w:tc>
+      </w:tr>
+      <w:tr>
+        <w:tc>
+          <w:tcPr>
+            <w:tcW w:type="dxa" w:w="2300"/>
+            <w:shd w:fill="EAF0F8" w:val="clear"/>
+            <w:tcMar>
+              <w:top w:type="dxa" w:w="40"/>
+              <w:left w:type="dxa" w:w="70"/>
+              <w:bottom w:type="dxa" w:w="40"/>
+              <w:right w:type="dxa" w:w="70"/>
+            </w:tcMar>
+          </w:tcPr>
+          <w:p>
+            <w:pPr>
+              <w:spacing w:after="18" w:line="236"/>
+            </w:pPr>
+            <w:r>
+              <w:rPr>
+                <w:rFonts w:ascii="Arial" w:cs="Arial" w:eastAsia="Arial" w:hAnsi="Arial"/>
+                <w:b/>
+                <w:bCs/>
+                <w:sz w:val="19"/>
+                <w:szCs w:val="19"/>
+              </w:rPr>
+              <w:t xml:space="preserve">Precondiciones</w:t>
+            </w:r>
+          </w:p>
+        </w:tc>
+        <w:tc>
+          <w:tcPr>
+            <w:tcW w:type="dxa" w:w="7060"/>
+            <w:tcMar>
+              <w:top w:type="dxa" w:w="40"/>
+              <w:left w:type="dxa" w:w="70"/>
+              <w:bottom w:type="dxa" w:w="40"/>
+              <w:right w:type="dxa" w:w="70"/>
+            </w:tcMar>
+          </w:tcPr>
+          <w:p>
+            <w:pPr>
+              <w:spacing w:after="18" w:line="236"/>
+            </w:pPr>
+            <w:r>
+              <w:rPr>
+                <w:rFonts w:ascii="Arial" w:cs="Arial" w:eastAsia="Arial" w:hAnsi="Arial"/>
+                <w:sz w:val="19"/>
+                <w:szCs w:val="19"/>
+              </w:rPr>
+              <w:t xml:space="preserve">Existen lotes con saldo.</w:t>
+            </w:r>
+          </w:p>
+        </w:tc>
+      </w:tr>
+      <w:tr>
+        <w:tc>
+          <w:tcPr>
+            <w:tcW w:type="dxa" w:w="2300"/>
+            <w:shd w:fill="EAF0F8" w:val="clear"/>
+            <w:tcMar>
+              <w:top w:type="dxa" w:w="40"/>
+              <w:left w:type="dxa" w:w="70"/>
+              <w:bottom w:type="dxa" w:w="40"/>
+              <w:right w:type="dxa" w:w="70"/>
+            </w:tcMar>
+          </w:tcPr>
+          <w:p>
+            <w:pPr>
+              <w:spacing w:after="18" w:line="236"/>
+            </w:pPr>
+            <w:r>
+              <w:rPr>
+                <w:rFonts w:ascii="Arial" w:cs="Arial" w:eastAsia="Arial" w:hAnsi="Arial"/>
+                <w:b/>
+                <w:bCs/>
+                <w:sz w:val="19"/>
+                <w:szCs w:val="19"/>
+              </w:rPr>
+              <w:t xml:space="preserve">Flujo principal</w:t>
+            </w:r>
+          </w:p>
+        </w:tc>
+        <w:tc>
+          <w:tcPr>
+            <w:tcW w:type="dxa" w:w="7060"/>
+            <w:tcMar>
+              <w:top w:type="dxa" w:w="40"/>
+              <w:left w:type="dxa" w:w="70"/>
+              <w:bottom w:type="dxa" w:w="40"/>
+              <w:right w:type="dxa" w:w="70"/>
+            </w:tcMar>
+          </w:tcPr>
+          <w:p>
+            <w:pPr>
+              <w:spacing w:after="18" w:line="236"/>
+            </w:pPr>
+            <w:r>
+              <w:rPr>
+                <w:rFonts w:ascii="Arial" w:cs="Arial" w:eastAsia="Arial" w:hAnsi="Arial"/>
+                <w:sz w:val="19"/>
+                <w:szCs w:val="19"/>
+              </w:rPr>
+              <w:t xml:space="preserve">1. Elige «Inventario valorizado» y la fecha de corte.</w:t>
+            </w:r>
+          </w:p>
+          <w:p>
+            <w:pPr>
+              <w:spacing w:after="18" w:line="236"/>
+            </w:pPr>
+            <w:r>
+              <w:rPr>
+                <w:rFonts w:ascii="Arial" w:cs="Arial" w:eastAsia="Arial" w:hAnsi="Arial"/>
+                <w:sz w:val="19"/>
+                <w:szCs w:val="19"/>
+              </w:rPr>
+              <w:t xml:space="preserve">2. El sistema toma los saldos de los lotes con su costo por PEPS (apoyado en CU-INV-10).</w:t>
+            </w:r>
+          </w:p>
+          <w:p>
+            <w:pPr>
+              <w:spacing w:after="18" w:line="236"/>
+            </w:pPr>
+            <w:r>
+              <w:rPr>
+                <w:rFonts w:ascii="Arial" w:cs="Arial" w:eastAsia="Arial" w:hAnsi="Arial"/>
+                <w:sz w:val="19"/>
+                <w:szCs w:val="19"/>
+              </w:rPr>
+              <w:t xml:space="preserve">3. Muestra el valor por producto y el valor total.</w:t>
+            </w:r>
+          </w:p>
+        </w:tc>
+      </w:tr>
+      <w:tr>
+        <w:tc>
+          <w:tcPr>
+            <w:tcW w:type="dxa" w:w="2300"/>
+            <w:shd w:fill="EAF0F8" w:val="clear"/>
+            <w:tcMar>
+              <w:top w:type="dxa" w:w="40"/>
+              <w:left w:type="dxa" w:w="70"/>
+              <w:bottom w:type="dxa" w:w="40"/>
+              <w:right w:type="dxa" w:w="70"/>
+            </w:tcMar>
+          </w:tcPr>
+          <w:p>
+            <w:pPr>
+              <w:spacing w:after="18" w:line="236"/>
+            </w:pPr>
+            <w:r>
+              <w:rPr>
+                <w:rFonts w:ascii="Arial" w:cs="Arial" w:eastAsia="Arial" w:hAnsi="Arial"/>
+                <w:b/>
+                <w:bCs/>
+                <w:sz w:val="19"/>
+                <w:szCs w:val="19"/>
+              </w:rPr>
+              <w:t xml:space="preserve">Flujos alternativos</w:t>
+            </w:r>
+          </w:p>
+        </w:tc>
+        <w:tc>
+          <w:tcPr>
+            <w:tcW w:type="dxa" w:w="7060"/>
+            <w:tcMar>
+              <w:top w:type="dxa" w:w="40"/>
+              <w:left w:type="dxa" w:w="70"/>
+              <w:bottom w:type="dxa" w:w="40"/>
+              <w:right w:type="dxa" w:w="70"/>
+            </w:tcMar>
+          </w:tcPr>
+          <w:p>
+            <w:pPr>
+              <w:spacing w:after="18" w:line="236"/>
+            </w:pPr>
+            <w:r>
+              <w:rPr>
+                <w:rFonts w:ascii="Arial" w:cs="Arial" w:eastAsia="Arial" w:hAnsi="Arial"/>
+                <w:sz w:val="19"/>
+                <w:szCs w:val="19"/>
+              </w:rPr>
+              <w:t xml:space="preserve">3a. Exportar el reporte (CU-REP-06).</w:t>
+            </w:r>
+          </w:p>
+        </w:tc>
+      </w:tr>
+      <w:tr>
+        <w:tc>
+          <w:tcPr>
+            <w:tcW w:type="dxa" w:w="2300"/>
+            <w:shd w:fill="EAF0F8" w:val="clear"/>
+            <w:tcMar>
+              <w:top w:type="dxa" w:w="40"/>
+              <w:left w:type="dxa" w:w="70"/>
+              <w:bottom w:type="dxa" w:w="40"/>
+              <w:right w:type="dxa" w:w="70"/>
+            </w:tcMar>
+          </w:tcPr>
+          <w:p>
+            <w:pPr>
+              <w:spacing w:after="18" w:line="236"/>
+            </w:pPr>
+            <w:r>
+              <w:rPr>
+                <w:rFonts w:ascii="Arial" w:cs="Arial" w:eastAsia="Arial" w:hAnsi="Arial"/>
+                <w:b/>
+                <w:bCs/>
+                <w:sz w:val="19"/>
+                <w:szCs w:val="19"/>
+              </w:rPr>
+              <w:t xml:space="preserve">Excepciones</w:t>
+            </w:r>
+          </w:p>
+        </w:tc>
+        <w:tc>
+          <w:tcPr>
+            <w:tcW w:type="dxa" w:w="7060"/>
+            <w:tcMar>
+              <w:top w:type="dxa" w:w="40"/>
+              <w:left w:type="dxa" w:w="70"/>
+              <w:bottom w:type="dxa" w:w="40"/>
+              <w:right w:type="dxa" w:w="70"/>
+            </w:tcMar>
+          </w:tcPr>
+          <w:p>
+            <w:pPr>
+              <w:spacing w:after="18" w:line="236"/>
+            </w:pPr>
+            <w:r>
+              <w:rPr>
+                <w:rFonts w:ascii="Arial" w:cs="Arial" w:eastAsia="Arial" w:hAnsi="Arial"/>
+                <w:sz w:val="19"/>
+                <w:szCs w:val="19"/>
+              </w:rPr>
+              <w:t xml:space="preserve">*. Sin existencias: el valor es cero.</w:t>
+            </w:r>
+          </w:p>
+        </w:tc>
+      </w:tr>
+      <w:tr>
+        <w:tc>
+          <w:tcPr>
+            <w:tcW w:type="dxa" w:w="2300"/>
+            <w:shd w:fill="EAF0F8" w:val="clear"/>
+            <w:tcMar>
+              <w:top w:type="dxa" w:w="40"/>
+              <w:left w:type="dxa" w:w="70"/>
+              <w:bottom w:type="dxa" w:w="40"/>
+              <w:right w:type="dxa" w:w="70"/>
+            </w:tcMar>
+          </w:tcPr>
+          <w:p>
+            <w:pPr>
+              <w:spacing w:after="18" w:line="236"/>
+            </w:pPr>
+            <w:r>
+              <w:rPr>
+                <w:rFonts w:ascii="Arial" w:cs="Arial" w:eastAsia="Arial" w:hAnsi="Arial"/>
+                <w:b/>
+                <w:bCs/>
+                <w:sz w:val="19"/>
+                <w:szCs w:val="19"/>
+              </w:rPr>
+              <w:t xml:space="preserve">Reglas y validaciones</w:t>
+            </w:r>
+          </w:p>
+        </w:tc>
+        <w:tc>
+          <w:tcPr>
+            <w:tcW w:type="dxa" w:w="7060"/>
+            <w:tcMar>
+              <w:top w:type="dxa" w:w="40"/>
+              <w:left w:type="dxa" w:w="70"/>
+              <w:bottom w:type="dxa" w:w="40"/>
+              <w:right w:type="dxa" w:w="70"/>
+            </w:tcMar>
+          </w:tcPr>
+          <w:p>
+            <w:pPr>
+              <w:spacing w:after="18" w:line="236"/>
+            </w:pPr>
+            <w:r>
+              <w:rPr>
+                <w:rFonts w:ascii="Arial" w:cs="Arial" w:eastAsia="Arial" w:hAnsi="Arial"/>
+                <w:sz w:val="19"/>
+                <w:szCs w:val="19"/>
+              </w:rPr>
+              <w:t xml:space="preserve">Usa el costo real de los lotes, no el precio de venta.</w:t>
+            </w:r>
+          </w:p>
+        </w:tc>
+      </w:tr>
+      <w:tr>
+        <w:tc>
+          <w:tcPr>
+            <w:tcW w:type="dxa" w:w="2300"/>
+            <w:shd w:fill="EAF0F8" w:val="clear"/>
+            <w:tcMar>
+              <w:top w:type="dxa" w:w="40"/>
+              <w:left w:type="dxa" w:w="70"/>
+              <w:bottom w:type="dxa" w:w="40"/>
+              <w:right w:type="dxa" w:w="70"/>
+            </w:tcMar>
+          </w:tcPr>
+          <w:p>
+            <w:pPr>
+              <w:spacing w:after="18" w:line="236"/>
+            </w:pPr>
+            <w:r>
+              <w:rPr>
+                <w:rFonts w:ascii="Arial" w:cs="Arial" w:eastAsia="Arial" w:hAnsi="Arial"/>
+                <w:b/>
+                <w:bCs/>
+                <w:sz w:val="19"/>
+                <w:szCs w:val="19"/>
+              </w:rPr>
+              <w:t xml:space="preserve">Postcondiciones</w:t>
+            </w:r>
+          </w:p>
+        </w:tc>
+        <w:tc>
+          <w:tcPr>
+            <w:tcW w:type="dxa" w:w="7060"/>
+            <w:tcMar>
+              <w:top w:type="dxa" w:w="40"/>
+              <w:left w:type="dxa" w:w="70"/>
+              <w:bottom w:type="dxa" w:w="40"/>
+              <w:right w:type="dxa" w:w="70"/>
+            </w:tcMar>
+          </w:tcPr>
+          <w:p>
+            <w:pPr>
+              <w:spacing w:after="18" w:line="236"/>
+            </w:pPr>
+            <w:r>
+              <w:rPr>
+                <w:rFonts w:ascii="Arial" w:cs="Arial" w:eastAsia="Arial" w:hAnsi="Arial"/>
+                <w:sz w:val="19"/>
+                <w:szCs w:val="19"/>
+              </w:rPr>
+              <w:t xml:space="preserve">El administrador visualiza el inventario valorizado.</w:t>
+            </w:r>
+          </w:p>
+        </w:tc>
+      </w:tr>
+      <w:tr>
+        <w:tc>
+          <w:tcPr>
+            <w:tcW w:type="dxa" w:w="2300"/>
+            <w:shd w:fill="EAF0F8" w:val="clear"/>
+            <w:tcMar>
+              <w:top w:type="dxa" w:w="40"/>
+              <w:left w:type="dxa" w:w="70"/>
+              <w:bottom w:type="dxa" w:w="40"/>
+              <w:right w:type="dxa" w:w="70"/>
+            </w:tcMar>
+          </w:tcPr>
+          <w:p>
+            <w:pPr>
+              <w:spacing w:after="18" w:line="236"/>
+            </w:pPr>
+            <w:r>
+              <w:rPr>
+                <w:rFonts w:ascii="Arial" w:cs="Arial" w:eastAsia="Arial" w:hAnsi="Arial"/>
+                <w:b/>
+                <w:bCs/>
+                <w:sz w:val="19"/>
+                <w:szCs w:val="19"/>
+              </w:rPr>
+              <w:t xml:space="preserve">Prioridad</w:t>
+            </w:r>
+          </w:p>
+        </w:tc>
+        <w:tc>
+          <w:tcPr>
+            <w:tcW w:type="dxa" w:w="7060"/>
+            <w:tcMar>
+              <w:top w:type="dxa" w:w="40"/>
+              <w:left w:type="dxa" w:w="70"/>
+              <w:bottom w:type="dxa" w:w="40"/>
+              <w:right w:type="dxa" w:w="70"/>
+            </w:tcMar>
+          </w:tcPr>
+          <w:p>
+            <w:pPr>
+              <w:spacing w:after="18" w:line="236"/>
+            </w:pPr>
+            <w:r>
+              <w:rPr>
+                <w:rFonts w:ascii="Arial" w:cs="Arial" w:eastAsia="Arial" w:hAnsi="Arial"/>
+                <w:sz w:val="19"/>
+                <w:szCs w:val="19"/>
+              </w:rPr>
+              <w:t xml:space="preserve">Media</w:t>
+            </w:r>
+          </w:p>
+        </w:tc>
+      </w:tr>
+    </w:tbl>
+    <w:p>
+      <w:pPr>
+        <w:spacing w:after="140"/>
+      </w:pPr>
+    </w:p>
+    <w:tbl>
+      <w:tblPr>
+        <w:tblW w:type="dxa" w:w="9360"/>
+        <w:tblBorders>
+          <w:top w:val="single" w:color="9CA3AF" w:sz="6"/>
+          <w:left w:val="single" w:color="9CA3AF" w:sz="6"/>
+          <w:bottom w:val="single" w:color="9CA3AF" w:sz="6"/>
+          <w:right w:val="single" w:color="9CA3AF" w:sz="6"/>
+          <w:insideH w:val="single" w:color="9CA3AF" w:sz="6"/>
+          <w:insideV w:val="single" w:color="9CA3AF" w:sz="6"/>
+        </w:tblBorders>
+        <w:tblLayout w:type="fixed"/>
+      </w:tblPr>
+      <w:tblGrid>
+        <w:gridCol w:w="2300"/>
+        <w:gridCol w:w="7060"/>
+      </w:tblGrid>
+      <w:tr>
+        <w:tc>
+          <w:tcPr>
+            <w:tcW w:type="dxa" w:w="9360"/>
+            <w:gridSpan w:val="2"/>
+            <w:shd w:fill="1F3864" w:val="clear"/>
+            <w:tcMar>
+              <w:top w:type="dxa" w:w="40"/>
+              <w:left w:type="dxa" w:w="70"/>
+              <w:bottom w:type="dxa" w:w="40"/>
+              <w:right w:type="dxa" w:w="70"/>
+            </w:tcMar>
+          </w:tcPr>
+          <w:p>
+            <w:pPr>
+              <w:spacing w:after="18" w:line="236"/>
+            </w:pPr>
+            <w:r>
+              <w:rPr>
+                <w:rFonts w:ascii="Arial" w:cs="Arial" w:eastAsia="Arial" w:hAnsi="Arial"/>
+                <w:b/>
+                <w:bCs/>
+                <w:color w:val="FFFFFF"/>
+                <w:sz w:val="19"/>
+                <w:szCs w:val="19"/>
+              </w:rPr>
+              <w:t xml:space="preserve">CU-REP-03 — Reporte de más vendidos</w:t>
+            </w:r>
+          </w:p>
+        </w:tc>
+      </w:tr>
+      <w:tr>
+        <w:tc>
+          <w:tcPr>
+            <w:tcW w:type="dxa" w:w="2300"/>
+            <w:shd w:fill="EAF0F8" w:val="clear"/>
+            <w:tcMar>
+              <w:top w:type="dxa" w:w="40"/>
+              <w:left w:type="dxa" w:w="70"/>
+              <w:bottom w:type="dxa" w:w="40"/>
+              <w:right w:type="dxa" w:w="70"/>
+            </w:tcMar>
+          </w:tcPr>
+          <w:p>
+            <w:pPr>
+              <w:spacing w:after="18" w:line="236"/>
+            </w:pPr>
+            <w:r>
+              <w:rPr>
+                <w:rFonts w:ascii="Arial" w:cs="Arial" w:eastAsia="Arial" w:hAnsi="Arial"/>
+                <w:b/>
+                <w:bCs/>
+                <w:sz w:val="19"/>
+                <w:szCs w:val="19"/>
+              </w:rPr>
+              <w:t xml:space="preserve">Actor(es)</w:t>
+            </w:r>
+          </w:p>
+        </w:tc>
+        <w:tc>
+          <w:tcPr>
+            <w:tcW w:type="dxa" w:w="7060"/>
+            <w:tcMar>
+              <w:top w:type="dxa" w:w="40"/>
+              <w:left w:type="dxa" w:w="70"/>
+              <w:bottom w:type="dxa" w:w="40"/>
+              <w:right w:type="dxa" w:w="70"/>
+            </w:tcMar>
+          </w:tcPr>
+          <w:p>
+            <w:pPr>
+              <w:spacing w:after="18" w:line="236"/>
+            </w:pPr>
+            <w:r>
+              <w:rPr>
+                <w:rFonts w:ascii="Arial" w:cs="Arial" w:eastAsia="Arial" w:hAnsi="Arial"/>
+                <w:sz w:val="19"/>
+                <w:szCs w:val="19"/>
+              </w:rPr>
+              <w:t xml:space="preserve">Administrador</w:t>
+            </w:r>
+          </w:p>
+        </w:tc>
+      </w:tr>
+      <w:tr>
+        <w:tc>
+          <w:tcPr>
+            <w:tcW w:type="dxa" w:w="2300"/>
+            <w:shd w:fill="EAF0F8" w:val="clear"/>
+            <w:tcMar>
+              <w:top w:type="dxa" w:w="40"/>
+              <w:left w:type="dxa" w:w="70"/>
+              <w:bottom w:type="dxa" w:w="40"/>
+              <w:right w:type="dxa" w:w="70"/>
+            </w:tcMar>
+          </w:tcPr>
+          <w:p>
+            <w:pPr>
+              <w:spacing w:after="18" w:line="236"/>
+            </w:pPr>
+            <w:r>
+              <w:rPr>
+                <w:rFonts w:ascii="Arial" w:cs="Arial" w:eastAsia="Arial" w:hAnsi="Arial"/>
+                <w:b/>
+                <w:bCs/>
+                <w:sz w:val="19"/>
+                <w:szCs w:val="19"/>
+              </w:rPr>
+              <w:t xml:space="preserve">Requisito</w:t>
+            </w:r>
+          </w:p>
+        </w:tc>
+        <w:tc>
+          <w:tcPr>
+            <w:tcW w:type="dxa" w:w="7060"/>
+            <w:tcMar>
+              <w:top w:type="dxa" w:w="40"/>
+              <w:left w:type="dxa" w:w="70"/>
+              <w:bottom w:type="dxa" w:w="40"/>
+              <w:right w:type="dxa" w:w="70"/>
+            </w:tcMar>
+          </w:tcPr>
+          <w:p>
+            <w:pPr>
+              <w:spacing w:after="18" w:line="236"/>
+            </w:pPr>
+            <w:r>
+              <w:rPr>
+                <w:rFonts w:ascii="Arial" w:cs="Arial" w:eastAsia="Arial" w:hAnsi="Arial"/>
+                <w:sz w:val="19"/>
+                <w:szCs w:val="19"/>
+              </w:rPr>
+              <w:t xml:space="preserve">RF-REP-03</w:t>
+            </w:r>
+          </w:p>
+        </w:tc>
+      </w:tr>
+      <w:tr>
+        <w:tc>
+          <w:tcPr>
+            <w:tcW w:type="dxa" w:w="2300"/>
+            <w:shd w:fill="EAF0F8" w:val="clear"/>
+            <w:tcMar>
+              <w:top w:type="dxa" w:w="40"/>
+              <w:left w:type="dxa" w:w="70"/>
+              <w:bottom w:type="dxa" w:w="40"/>
+              <w:right w:type="dxa" w:w="70"/>
+            </w:tcMar>
+          </w:tcPr>
+          <w:p>
+            <w:pPr>
+              <w:spacing w:after="18" w:line="236"/>
+            </w:pPr>
+            <w:r>
+              <w:rPr>
+                <w:rFonts w:ascii="Arial" w:cs="Arial" w:eastAsia="Arial" w:hAnsi="Arial"/>
+                <w:b/>
+                <w:bCs/>
+                <w:sz w:val="19"/>
+                <w:szCs w:val="19"/>
+              </w:rPr>
+              <w:t xml:space="preserve">Descripción</w:t>
+            </w:r>
+          </w:p>
+        </w:tc>
+        <w:tc>
+          <w:tcPr>
+            <w:tcW w:type="dxa" w:w="7060"/>
+            <w:tcMar>
+              <w:top w:type="dxa" w:w="40"/>
+              <w:left w:type="dxa" w:w="70"/>
+              <w:bottom w:type="dxa" w:w="40"/>
+              <w:right w:type="dxa" w:w="70"/>
+            </w:tcMar>
+          </w:tcPr>
+          <w:p>
+            <w:pPr>
+              <w:spacing w:after="18" w:line="236"/>
+            </w:pPr>
+            <w:r>
+              <w:rPr>
+                <w:rFonts w:ascii="Arial" w:cs="Arial" w:eastAsia="Arial" w:hAnsi="Arial"/>
+                <w:sz w:val="19"/>
+                <w:szCs w:val="19"/>
+              </w:rPr>
+              <w:t xml:space="preserve">El administrador consulta los productos más vendidos en un período.</w:t>
+            </w:r>
+          </w:p>
+        </w:tc>
+      </w:tr>
+      <w:tr>
+        <w:tc>
+          <w:tcPr>
+            <w:tcW w:type="dxa" w:w="2300"/>
+            <w:shd w:fill="EAF0F8" w:val="clear"/>
+            <w:tcMar>
+              <w:top w:type="dxa" w:w="40"/>
+              <w:left w:type="dxa" w:w="70"/>
+              <w:bottom w:type="dxa" w:w="40"/>
+              <w:right w:type="dxa" w:w="70"/>
+            </w:tcMar>
+          </w:tcPr>
+          <w:p>
+            <w:pPr>
+              <w:spacing w:after="18" w:line="236"/>
+            </w:pPr>
+            <w:r>
+              <w:rPr>
+                <w:rFonts w:ascii="Arial" w:cs="Arial" w:eastAsia="Arial" w:hAnsi="Arial"/>
+                <w:b/>
+                <w:bCs/>
+                <w:sz w:val="19"/>
+                <w:szCs w:val="19"/>
+              </w:rPr>
+              <w:t xml:space="preserve">Precondiciones</w:t>
+            </w:r>
+          </w:p>
+        </w:tc>
+        <w:tc>
+          <w:tcPr>
+            <w:tcW w:type="dxa" w:w="7060"/>
+            <w:tcMar>
+              <w:top w:type="dxa" w:w="40"/>
+              <w:left w:type="dxa" w:w="70"/>
+              <w:bottom w:type="dxa" w:w="40"/>
+              <w:right w:type="dxa" w:w="70"/>
+            </w:tcMar>
+          </w:tcPr>
+          <w:p>
+            <w:pPr>
+              <w:spacing w:after="18" w:line="236"/>
+            </w:pPr>
+            <w:r>
+              <w:rPr>
+                <w:rFonts w:ascii="Arial" w:cs="Arial" w:eastAsia="Arial" w:hAnsi="Arial"/>
+                <w:sz w:val="19"/>
+                <w:szCs w:val="19"/>
+              </w:rPr>
+              <w:t xml:space="preserve">Existen ventas registradas.</w:t>
+            </w:r>
+          </w:p>
+        </w:tc>
+      </w:tr>
+      <w:tr>
+        <w:tc>
+          <w:tcPr>
+            <w:tcW w:type="dxa" w:w="2300"/>
+            <w:shd w:fill="EAF0F8" w:val="clear"/>
+            <w:tcMar>
+              <w:top w:type="dxa" w:w="40"/>
+              <w:left w:type="dxa" w:w="70"/>
+              <w:bottom w:type="dxa" w:w="40"/>
+              <w:right w:type="dxa" w:w="70"/>
+            </w:tcMar>
+          </w:tcPr>
+          <w:p>
+            <w:pPr>
+              <w:spacing w:after="18" w:line="236"/>
+            </w:pPr>
+            <w:r>
+              <w:rPr>
+                <w:rFonts w:ascii="Arial" w:cs="Arial" w:eastAsia="Arial" w:hAnsi="Arial"/>
+                <w:b/>
+                <w:bCs/>
+                <w:sz w:val="19"/>
+                <w:szCs w:val="19"/>
+              </w:rPr>
+              <w:t xml:space="preserve">Flujo principal</w:t>
+            </w:r>
+          </w:p>
+        </w:tc>
+        <w:tc>
+          <w:tcPr>
+            <w:tcW w:type="dxa" w:w="7060"/>
+            <w:tcMar>
+              <w:top w:type="dxa" w:w="40"/>
+              <w:left w:type="dxa" w:w="70"/>
+              <w:bottom w:type="dxa" w:w="40"/>
+              <w:right w:type="dxa" w:w="70"/>
+            </w:tcMar>
+          </w:tcPr>
+          <w:p>
+            <w:pPr>
+              <w:spacing w:after="18" w:line="236"/>
+            </w:pPr>
+            <w:r>
+              <w:rPr>
+                <w:rFonts w:ascii="Arial" w:cs="Arial" w:eastAsia="Arial" w:hAnsi="Arial"/>
+                <w:sz w:val="19"/>
+                <w:szCs w:val="19"/>
+              </w:rPr>
+              <w:t xml:space="preserve">1. Elige «Más vendidos», el período y el criterio (cantidad o ingresos).</w:t>
+            </w:r>
+          </w:p>
+          <w:p>
+            <w:pPr>
+              <w:spacing w:after="18" w:line="236"/>
+            </w:pPr>
+            <w:r>
+              <w:rPr>
+                <w:rFonts w:ascii="Arial" w:cs="Arial" w:eastAsia="Arial" w:hAnsi="Arial"/>
+                <w:sz w:val="19"/>
+                <w:szCs w:val="19"/>
+              </w:rPr>
+              <w:t xml:space="preserve">2. El sistema calcula el ranking de productos.</w:t>
+            </w:r>
+          </w:p>
+          <w:p>
+            <w:pPr>
+              <w:spacing w:after="18" w:line="236"/>
+            </w:pPr>
+            <w:r>
+              <w:rPr>
+                <w:rFonts w:ascii="Arial" w:cs="Arial" w:eastAsia="Arial" w:hAnsi="Arial"/>
+                <w:sz w:val="19"/>
+                <w:szCs w:val="19"/>
+              </w:rPr>
+              <w:t xml:space="preserve">3. Muestra los productos ordenados según el criterio.</w:t>
+            </w:r>
+          </w:p>
+        </w:tc>
+      </w:tr>
+      <w:tr>
+        <w:tc>
+          <w:tcPr>
+            <w:tcW w:type="dxa" w:w="2300"/>
+            <w:shd w:fill="EAF0F8" w:val="clear"/>
+            <w:tcMar>
+              <w:top w:type="dxa" w:w="40"/>
+              <w:left w:type="dxa" w:w="70"/>
+              <w:bottom w:type="dxa" w:w="40"/>
+              <w:right w:type="dxa" w:w="70"/>
+            </w:tcMar>
+          </w:tcPr>
+          <w:p>
+            <w:pPr>
+              <w:spacing w:after="18" w:line="236"/>
+            </w:pPr>
+            <w:r>
+              <w:rPr>
+                <w:rFonts w:ascii="Arial" w:cs="Arial" w:eastAsia="Arial" w:hAnsi="Arial"/>
+                <w:b/>
+                <w:bCs/>
+                <w:sz w:val="19"/>
+                <w:szCs w:val="19"/>
+              </w:rPr>
+              <w:t xml:space="preserve">Flujos alternativos</w:t>
+            </w:r>
+          </w:p>
+        </w:tc>
+        <w:tc>
+          <w:tcPr>
+            <w:tcW w:type="dxa" w:w="7060"/>
+            <w:tcMar>
+              <w:top w:type="dxa" w:w="40"/>
+              <w:left w:type="dxa" w:w="70"/>
+              <w:bottom w:type="dxa" w:w="40"/>
+              <w:right w:type="dxa" w:w="70"/>
+            </w:tcMar>
+          </w:tcPr>
+          <w:p>
+            <w:pPr>
+              <w:spacing w:after="18" w:line="236"/>
+            </w:pPr>
+            <w:r>
+              <w:rPr>
+                <w:rFonts w:ascii="Arial" w:cs="Arial" w:eastAsia="Arial" w:hAnsi="Arial"/>
+                <w:sz w:val="19"/>
+                <w:szCs w:val="19"/>
+              </w:rPr>
+              <w:t xml:space="preserve">3a. Exportar el reporte (CU-REP-06).</w:t>
+            </w:r>
+          </w:p>
+        </w:tc>
+      </w:tr>
+      <w:tr>
+        <w:tc>
+          <w:tcPr>
+            <w:tcW w:type="dxa" w:w="2300"/>
+            <w:shd w:fill="EAF0F8" w:val="clear"/>
+            <w:tcMar>
+              <w:top w:type="dxa" w:w="40"/>
+              <w:left w:type="dxa" w:w="70"/>
+              <w:bottom w:type="dxa" w:w="40"/>
+              <w:right w:type="dxa" w:w="70"/>
+            </w:tcMar>
+          </w:tcPr>
+          <w:p>
+            <w:pPr>
+              <w:spacing w:after="18" w:line="236"/>
+            </w:pPr>
+            <w:r>
+              <w:rPr>
+                <w:rFonts w:ascii="Arial" w:cs="Arial" w:eastAsia="Arial" w:hAnsi="Arial"/>
+                <w:b/>
+                <w:bCs/>
+                <w:sz w:val="19"/>
+                <w:szCs w:val="19"/>
+              </w:rPr>
+              <w:t xml:space="preserve">Excepciones</w:t>
+            </w:r>
+          </w:p>
+        </w:tc>
+        <w:tc>
+          <w:tcPr>
+            <w:tcW w:type="dxa" w:w="7060"/>
+            <w:tcMar>
+              <w:top w:type="dxa" w:w="40"/>
+              <w:left w:type="dxa" w:w="70"/>
+              <w:bottom w:type="dxa" w:w="40"/>
+              <w:right w:type="dxa" w:w="70"/>
+            </w:tcMar>
+          </w:tcPr>
+          <w:p>
+            <w:pPr>
+              <w:spacing w:after="18" w:line="236"/>
+            </w:pPr>
+            <w:r>
+              <w:rPr>
+                <w:rFonts w:ascii="Arial" w:cs="Arial" w:eastAsia="Arial" w:hAnsi="Arial"/>
+                <w:sz w:val="19"/>
+                <w:szCs w:val="19"/>
+              </w:rPr>
+              <w:t xml:space="preserve">*. Sin ventas: el sistema muestra el reporte vacío.</w:t>
+            </w:r>
+          </w:p>
+        </w:tc>
+      </w:tr>
+      <w:tr>
+        <w:tc>
+          <w:tcPr>
+            <w:tcW w:type="dxa" w:w="2300"/>
+            <w:shd w:fill="EAF0F8" w:val="clear"/>
+            <w:tcMar>
+              <w:top w:type="dxa" w:w="40"/>
+              <w:left w:type="dxa" w:w="70"/>
+              <w:bottom w:type="dxa" w:w="40"/>
+              <w:right w:type="dxa" w:w="70"/>
+            </w:tcMar>
+          </w:tcPr>
+          <w:p>
+            <w:pPr>
+              <w:spacing w:after="18" w:line="236"/>
+            </w:pPr>
+            <w:r>
+              <w:rPr>
+                <w:rFonts w:ascii="Arial" w:cs="Arial" w:eastAsia="Arial" w:hAnsi="Arial"/>
+                <w:b/>
+                <w:bCs/>
+                <w:sz w:val="19"/>
+                <w:szCs w:val="19"/>
+              </w:rPr>
+              <w:t xml:space="preserve">Reglas y validaciones</w:t>
+            </w:r>
+          </w:p>
+        </w:tc>
+        <w:tc>
+          <w:tcPr>
+            <w:tcW w:type="dxa" w:w="7060"/>
+            <w:tcMar>
+              <w:top w:type="dxa" w:w="40"/>
+              <w:left w:type="dxa" w:w="70"/>
+              <w:bottom w:type="dxa" w:w="40"/>
+              <w:right w:type="dxa" w:w="70"/>
+            </w:tcMar>
+          </w:tcPr>
+          <w:p>
+            <w:pPr>
+              <w:spacing w:after="18" w:line="236"/>
+            </w:pPr>
+            <w:r>
+              <w:rPr>
+                <w:rFonts w:ascii="Arial" w:cs="Arial" w:eastAsia="Arial" w:hAnsi="Arial"/>
+                <w:sz w:val="19"/>
+                <w:szCs w:val="19"/>
+              </w:rPr>
+              <w:t xml:space="preserve">Se basa en las ventas registradas; apoya las decisiones de compra.</w:t>
+            </w:r>
+          </w:p>
+        </w:tc>
+      </w:tr>
+      <w:tr>
+        <w:tc>
+          <w:tcPr>
+            <w:tcW w:type="dxa" w:w="2300"/>
+            <w:shd w:fill="EAF0F8" w:val="clear"/>
+            <w:tcMar>
+              <w:top w:type="dxa" w:w="40"/>
+              <w:left w:type="dxa" w:w="70"/>
+              <w:bottom w:type="dxa" w:w="40"/>
+              <w:right w:type="dxa" w:w="70"/>
+            </w:tcMar>
+          </w:tcPr>
+          <w:p>
+            <w:pPr>
+              <w:spacing w:after="18" w:line="236"/>
+            </w:pPr>
+            <w:r>
+              <w:rPr>
+                <w:rFonts w:ascii="Arial" w:cs="Arial" w:eastAsia="Arial" w:hAnsi="Arial"/>
+                <w:b/>
+                <w:bCs/>
+                <w:sz w:val="19"/>
+                <w:szCs w:val="19"/>
+              </w:rPr>
+              <w:t xml:space="preserve">Postcondiciones</w:t>
+            </w:r>
+          </w:p>
+        </w:tc>
+        <w:tc>
+          <w:tcPr>
+            <w:tcW w:type="dxa" w:w="7060"/>
+            <w:tcMar>
+              <w:top w:type="dxa" w:w="40"/>
+              <w:left w:type="dxa" w:w="70"/>
+              <w:bottom w:type="dxa" w:w="40"/>
+              <w:right w:type="dxa" w:w="70"/>
+            </w:tcMar>
+          </w:tcPr>
+          <w:p>
+            <w:pPr>
+              <w:spacing w:after="18" w:line="236"/>
+            </w:pPr>
+            <w:r>
+              <w:rPr>
+                <w:rFonts w:ascii="Arial" w:cs="Arial" w:eastAsia="Arial" w:hAnsi="Arial"/>
+                <w:sz w:val="19"/>
+                <w:szCs w:val="19"/>
+              </w:rPr>
+              <w:t xml:space="preserve">El administrador visualiza el ranking de productos.</w:t>
+            </w:r>
+          </w:p>
+        </w:tc>
+      </w:tr>
+      <w:tr>
+        <w:tc>
+          <w:tcPr>
+            <w:tcW w:type="dxa" w:w="2300"/>
+            <w:shd w:fill="EAF0F8" w:val="clear"/>
+            <w:tcMar>
+              <w:top w:type="dxa" w:w="40"/>
+              <w:left w:type="dxa" w:w="70"/>
+              <w:bottom w:type="dxa" w:w="40"/>
+              <w:right w:type="dxa" w:w="70"/>
+            </w:tcMar>
+          </w:tcPr>
+          <w:p>
+            <w:pPr>
+              <w:spacing w:after="18" w:line="236"/>
+            </w:pPr>
+            <w:r>
+              <w:rPr>
+                <w:rFonts w:ascii="Arial" w:cs="Arial" w:eastAsia="Arial" w:hAnsi="Arial"/>
+                <w:b/>
+                <w:bCs/>
+                <w:sz w:val="19"/>
+                <w:szCs w:val="19"/>
+              </w:rPr>
+              <w:t xml:space="preserve">Prioridad</w:t>
+            </w:r>
+          </w:p>
+        </w:tc>
+        <w:tc>
+          <w:tcPr>
+            <w:tcW w:type="dxa" w:w="7060"/>
+            <w:tcMar>
+              <w:top w:type="dxa" w:w="40"/>
+              <w:left w:type="dxa" w:w="70"/>
+              <w:bottom w:type="dxa" w:w="40"/>
+              <w:right w:type="dxa" w:w="70"/>
+            </w:tcMar>
+          </w:tcPr>
+          <w:p>
+            <w:pPr>
+              <w:spacing w:after="18" w:line="236"/>
+            </w:pPr>
+            <w:r>
+              <w:rPr>
+                <w:rFonts w:ascii="Arial" w:cs="Arial" w:eastAsia="Arial" w:hAnsi="Arial"/>
+                <w:sz w:val="19"/>
+                <w:szCs w:val="19"/>
+              </w:rPr>
+              <w:t xml:space="preserve">Media</w:t>
+            </w:r>
+          </w:p>
+        </w:tc>
+      </w:tr>
+    </w:tbl>
+    <w:p>
+      <w:pPr>
+        <w:spacing w:after="140"/>
+      </w:pPr>
+    </w:p>
+    <w:tbl>
+      <w:tblPr>
+        <w:tblW w:type="dxa" w:w="9360"/>
+        <w:tblBorders>
+          <w:top w:val="single" w:color="9CA3AF" w:sz="6"/>
+          <w:left w:val="single" w:color="9CA3AF" w:sz="6"/>
+          <w:bottom w:val="single" w:color="9CA3AF" w:sz="6"/>
+          <w:right w:val="single" w:color="9CA3AF" w:sz="6"/>
+          <w:insideH w:val="single" w:color="9CA3AF" w:sz="6"/>
+          <w:insideV w:val="single" w:color="9CA3AF" w:sz="6"/>
+        </w:tblBorders>
+        <w:tblLayout w:type="fixed"/>
+      </w:tblPr>
+      <w:tblGrid>
+        <w:gridCol w:w="2300"/>
+        <w:gridCol w:w="7060"/>
+      </w:tblGrid>
+      <w:tr>
+        <w:tc>
+          <w:tcPr>
+            <w:tcW w:type="dxa" w:w="9360"/>
+            <w:gridSpan w:val="2"/>
+            <w:shd w:fill="1F3864" w:val="clear"/>
+            <w:tcMar>
+              <w:top w:type="dxa" w:w="40"/>
+              <w:left w:type="dxa" w:w="70"/>
+              <w:bottom w:type="dxa" w:w="40"/>
+              <w:right w:type="dxa" w:w="70"/>
+            </w:tcMar>
+          </w:tcPr>
+          <w:p>
+            <w:pPr>
+              <w:spacing w:after="18" w:line="236"/>
+            </w:pPr>
+            <w:r>
+              <w:rPr>
+                <w:rFonts w:ascii="Arial" w:cs="Arial" w:eastAsia="Arial" w:hAnsi="Arial"/>
+                <w:b/>
+                <w:bCs/>
+                <w:color w:val="FFFFFF"/>
+                <w:sz w:val="19"/>
+                <w:szCs w:val="19"/>
+              </w:rPr>
+              <w:t xml:space="preserve">CU-REP-04 — Reporte de rotación</w:t>
+            </w:r>
+          </w:p>
+        </w:tc>
+      </w:tr>
+      <w:tr>
+        <w:tc>
+          <w:tcPr>
+            <w:tcW w:type="dxa" w:w="2300"/>
+            <w:shd w:fill="EAF0F8" w:val="clear"/>
+            <w:tcMar>
+              <w:top w:type="dxa" w:w="40"/>
+              <w:left w:type="dxa" w:w="70"/>
+              <w:bottom w:type="dxa" w:w="40"/>
+              <w:right w:type="dxa" w:w="70"/>
+            </w:tcMar>
+          </w:tcPr>
+          <w:p>
+            <w:pPr>
+              <w:spacing w:after="18" w:line="236"/>
+            </w:pPr>
+            <w:r>
+              <w:rPr>
+                <w:rFonts w:ascii="Arial" w:cs="Arial" w:eastAsia="Arial" w:hAnsi="Arial"/>
+                <w:b/>
+                <w:bCs/>
+                <w:sz w:val="19"/>
+                <w:szCs w:val="19"/>
+              </w:rPr>
+              <w:t xml:space="preserve">Actor(es)</w:t>
+            </w:r>
+          </w:p>
+        </w:tc>
+        <w:tc>
+          <w:tcPr>
+            <w:tcW w:type="dxa" w:w="7060"/>
+            <w:tcMar>
+              <w:top w:type="dxa" w:w="40"/>
+              <w:left w:type="dxa" w:w="70"/>
+              <w:bottom w:type="dxa" w:w="40"/>
+              <w:right w:type="dxa" w:w="70"/>
+            </w:tcMar>
+          </w:tcPr>
+          <w:p>
+            <w:pPr>
+              <w:spacing w:after="18" w:line="236"/>
+            </w:pPr>
+            <w:r>
+              <w:rPr>
+                <w:rFonts w:ascii="Arial" w:cs="Arial" w:eastAsia="Arial" w:hAnsi="Arial"/>
+                <w:sz w:val="19"/>
+                <w:szCs w:val="19"/>
+              </w:rPr>
+              <w:t xml:space="preserve">Administrador</w:t>
+            </w:r>
+          </w:p>
+        </w:tc>
+      </w:tr>
+      <w:tr>
+        <w:tc>
+          <w:tcPr>
+            <w:tcW w:type="dxa" w:w="2300"/>
+            <w:shd w:fill="EAF0F8" w:val="clear"/>
+            <w:tcMar>
+              <w:top w:type="dxa" w:w="40"/>
+              <w:left w:type="dxa" w:w="70"/>
+              <w:bottom w:type="dxa" w:w="40"/>
+              <w:right w:type="dxa" w:w="70"/>
+            </w:tcMar>
+          </w:tcPr>
+          <w:p>
+            <w:pPr>
+              <w:spacing w:after="18" w:line="236"/>
+            </w:pPr>
+            <w:r>
+              <w:rPr>
+                <w:rFonts w:ascii="Arial" w:cs="Arial" w:eastAsia="Arial" w:hAnsi="Arial"/>
+                <w:b/>
+                <w:bCs/>
+                <w:sz w:val="19"/>
+                <w:szCs w:val="19"/>
+              </w:rPr>
+              <w:t xml:space="preserve">Requisito</w:t>
+            </w:r>
+          </w:p>
+        </w:tc>
+        <w:tc>
+          <w:tcPr>
+            <w:tcW w:type="dxa" w:w="7060"/>
+            <w:tcMar>
+              <w:top w:type="dxa" w:w="40"/>
+              <w:left w:type="dxa" w:w="70"/>
+              <w:bottom w:type="dxa" w:w="40"/>
+              <w:right w:type="dxa" w:w="70"/>
+            </w:tcMar>
+          </w:tcPr>
+          <w:p>
+            <w:pPr>
+              <w:spacing w:after="18" w:line="236"/>
+            </w:pPr>
+            <w:r>
+              <w:rPr>
+                <w:rFonts w:ascii="Arial" w:cs="Arial" w:eastAsia="Arial" w:hAnsi="Arial"/>
+                <w:sz w:val="19"/>
+                <w:szCs w:val="19"/>
+              </w:rPr>
+              <w:t xml:space="preserve">RF-REP-04</w:t>
+            </w:r>
+          </w:p>
+        </w:tc>
+      </w:tr>
+      <w:tr>
+        <w:tc>
+          <w:tcPr>
+            <w:tcW w:type="dxa" w:w="2300"/>
+            <w:shd w:fill="EAF0F8" w:val="clear"/>
+            <w:tcMar>
+              <w:top w:type="dxa" w:w="40"/>
+              <w:left w:type="dxa" w:w="70"/>
+              <w:bottom w:type="dxa" w:w="40"/>
+              <w:right w:type="dxa" w:w="70"/>
+            </w:tcMar>
+          </w:tcPr>
+          <w:p>
+            <w:pPr>
+              <w:spacing w:after="18" w:line="236"/>
+            </w:pPr>
+            <w:r>
+              <w:rPr>
+                <w:rFonts w:ascii="Arial" w:cs="Arial" w:eastAsia="Arial" w:hAnsi="Arial"/>
+                <w:b/>
+                <w:bCs/>
+                <w:sz w:val="19"/>
+                <w:szCs w:val="19"/>
+              </w:rPr>
+              <w:t xml:space="preserve">Descripción</w:t>
+            </w:r>
+          </w:p>
+        </w:tc>
+        <w:tc>
+          <w:tcPr>
+            <w:tcW w:type="dxa" w:w="7060"/>
+            <w:tcMar>
+              <w:top w:type="dxa" w:w="40"/>
+              <w:left w:type="dxa" w:w="70"/>
+              <w:bottom w:type="dxa" w:w="40"/>
+              <w:right w:type="dxa" w:w="70"/>
+            </w:tcMar>
+          </w:tcPr>
+          <w:p>
+            <w:pPr>
+              <w:spacing w:after="18" w:line="236"/>
+            </w:pPr>
+            <w:r>
+              <w:rPr>
+                <w:rFonts w:ascii="Arial" w:cs="Arial" w:eastAsia="Arial" w:hAnsi="Arial"/>
+                <w:sz w:val="19"/>
+                <w:szCs w:val="19"/>
+              </w:rPr>
+              <w:t xml:space="preserve">El administrador consulta la rotación de los productos (velocidad de venta) en un período.</w:t>
+            </w:r>
+          </w:p>
+        </w:tc>
+      </w:tr>
+      <w:tr>
+        <w:tc>
+          <w:tcPr>
+            <w:tcW w:type="dxa" w:w="2300"/>
+            <w:shd w:fill="EAF0F8" w:val="clear"/>
+            <w:tcMar>
+              <w:top w:type="dxa" w:w="40"/>
+              <w:left w:type="dxa" w:w="70"/>
+              <w:bottom w:type="dxa" w:w="40"/>
+              <w:right w:type="dxa" w:w="70"/>
+            </w:tcMar>
+          </w:tcPr>
+          <w:p>
+            <w:pPr>
+              <w:spacing w:after="18" w:line="236"/>
+            </w:pPr>
+            <w:r>
+              <w:rPr>
+                <w:rFonts w:ascii="Arial" w:cs="Arial" w:eastAsia="Arial" w:hAnsi="Arial"/>
+                <w:b/>
+                <w:bCs/>
+                <w:sz w:val="19"/>
+                <w:szCs w:val="19"/>
+              </w:rPr>
+              <w:t xml:space="preserve">Precondiciones</w:t>
+            </w:r>
+          </w:p>
+        </w:tc>
+        <w:tc>
+          <w:tcPr>
+            <w:tcW w:type="dxa" w:w="7060"/>
+            <w:tcMar>
+              <w:top w:type="dxa" w:w="40"/>
+              <w:left w:type="dxa" w:w="70"/>
+              <w:bottom w:type="dxa" w:w="40"/>
+              <w:right w:type="dxa" w:w="70"/>
+            </w:tcMar>
+          </w:tcPr>
+          <w:p>
+            <w:pPr>
+              <w:spacing w:after="18" w:line="236"/>
+            </w:pPr>
+            <w:r>
+              <w:rPr>
+                <w:rFonts w:ascii="Arial" w:cs="Arial" w:eastAsia="Arial" w:hAnsi="Arial"/>
+                <w:sz w:val="19"/>
+                <w:szCs w:val="19"/>
+              </w:rPr>
+              <w:t xml:space="preserve">Existen ventas e inventario.</w:t>
+            </w:r>
+          </w:p>
+        </w:tc>
+      </w:tr>
+      <w:tr>
+        <w:tc>
+          <w:tcPr>
+            <w:tcW w:type="dxa" w:w="2300"/>
+            <w:shd w:fill="EAF0F8" w:val="clear"/>
+            <w:tcMar>
+              <w:top w:type="dxa" w:w="40"/>
+              <w:left w:type="dxa" w:w="70"/>
+              <w:bottom w:type="dxa" w:w="40"/>
+              <w:right w:type="dxa" w:w="70"/>
+            </w:tcMar>
+          </w:tcPr>
+          <w:p>
+            <w:pPr>
+              <w:spacing w:after="18" w:line="236"/>
+            </w:pPr>
+            <w:r>
+              <w:rPr>
+                <w:rFonts w:ascii="Arial" w:cs="Arial" w:eastAsia="Arial" w:hAnsi="Arial"/>
+                <w:b/>
+                <w:bCs/>
+                <w:sz w:val="19"/>
+                <w:szCs w:val="19"/>
+              </w:rPr>
+              <w:t xml:space="preserve">Flujo principal</w:t>
+            </w:r>
+          </w:p>
+        </w:tc>
+        <w:tc>
+          <w:tcPr>
+            <w:tcW w:type="dxa" w:w="7060"/>
+            <w:tcMar>
+              <w:top w:type="dxa" w:w="40"/>
+              <w:left w:type="dxa" w:w="70"/>
+              <w:bottom w:type="dxa" w:w="40"/>
+              <w:right w:type="dxa" w:w="70"/>
+            </w:tcMar>
+          </w:tcPr>
+          <w:p>
+            <w:pPr>
+              <w:spacing w:after="18" w:line="236"/>
+            </w:pPr>
+            <w:r>
+              <w:rPr>
+                <w:rFonts w:ascii="Arial" w:cs="Arial" w:eastAsia="Arial" w:hAnsi="Arial"/>
+                <w:sz w:val="19"/>
+                <w:szCs w:val="19"/>
+              </w:rPr>
+              <w:t xml:space="preserve">1. Elige «Rotación» y el período.</w:t>
+            </w:r>
+          </w:p>
+          <w:p>
+            <w:pPr>
+              <w:spacing w:after="18" w:line="236"/>
+            </w:pPr>
+            <w:r>
+              <w:rPr>
+                <w:rFonts w:ascii="Arial" w:cs="Arial" w:eastAsia="Arial" w:hAnsi="Arial"/>
+                <w:sz w:val="19"/>
+                <w:szCs w:val="19"/>
+              </w:rPr>
+              <w:t xml:space="preserve">2. El sistema calcula la rotación por producto (ventas frente a existencia promedio).</w:t>
+            </w:r>
+          </w:p>
+          <w:p>
+            <w:pPr>
+              <w:spacing w:after="18" w:line="236"/>
+            </w:pPr>
+            <w:r>
+              <w:rPr>
+                <w:rFonts w:ascii="Arial" w:cs="Arial" w:eastAsia="Arial" w:hAnsi="Arial"/>
+                <w:sz w:val="19"/>
+                <w:szCs w:val="19"/>
+              </w:rPr>
+              <w:t xml:space="preserve">3. Muestra los productos y destaca los de baja rotación.</w:t>
+            </w:r>
+          </w:p>
+        </w:tc>
+      </w:tr>
+      <w:tr>
+        <w:tc>
+          <w:tcPr>
+            <w:tcW w:type="dxa" w:w="2300"/>
+            <w:shd w:fill="EAF0F8" w:val="clear"/>
+            <w:tcMar>
+              <w:top w:type="dxa" w:w="40"/>
+              <w:left w:type="dxa" w:w="70"/>
+              <w:bottom w:type="dxa" w:w="40"/>
+              <w:right w:type="dxa" w:w="70"/>
+            </w:tcMar>
+          </w:tcPr>
+          <w:p>
+            <w:pPr>
+              <w:spacing w:after="18" w:line="236"/>
+            </w:pPr>
+            <w:r>
+              <w:rPr>
+                <w:rFonts w:ascii="Arial" w:cs="Arial" w:eastAsia="Arial" w:hAnsi="Arial"/>
+                <w:b/>
+                <w:bCs/>
+                <w:sz w:val="19"/>
+                <w:szCs w:val="19"/>
+              </w:rPr>
+              <w:t xml:space="preserve">Flujos alternativos</w:t>
+            </w:r>
+          </w:p>
+        </w:tc>
+        <w:tc>
+          <w:tcPr>
+            <w:tcW w:type="dxa" w:w="7060"/>
+            <w:tcMar>
+              <w:top w:type="dxa" w:w="40"/>
+              <w:left w:type="dxa" w:w="70"/>
+              <w:bottom w:type="dxa" w:w="40"/>
+              <w:right w:type="dxa" w:w="70"/>
+            </w:tcMar>
+          </w:tcPr>
+          <w:p>
+            <w:pPr>
+              <w:spacing w:after="18" w:line="236"/>
+            </w:pPr>
+            <w:r>
+              <w:rPr>
+                <w:rFonts w:ascii="Arial" w:cs="Arial" w:eastAsia="Arial" w:hAnsi="Arial"/>
+                <w:sz w:val="19"/>
+                <w:szCs w:val="19"/>
+              </w:rPr>
+              <w:t xml:space="preserve">3a. Exportar el reporte (CU-REP-06).</w:t>
+            </w:r>
+          </w:p>
+        </w:tc>
+      </w:tr>
+      <w:tr>
+        <w:tc>
+          <w:tcPr>
+            <w:tcW w:type="dxa" w:w="2300"/>
+            <w:shd w:fill="EAF0F8" w:val="clear"/>
+            <w:tcMar>
+              <w:top w:type="dxa" w:w="40"/>
+              <w:left w:type="dxa" w:w="70"/>
+              <w:bottom w:type="dxa" w:w="40"/>
+              <w:right w:type="dxa" w:w="70"/>
+            </w:tcMar>
+          </w:tcPr>
+          <w:p>
+            <w:pPr>
+              <w:spacing w:after="18" w:line="236"/>
+            </w:pPr>
+            <w:r>
+              <w:rPr>
+                <w:rFonts w:ascii="Arial" w:cs="Arial" w:eastAsia="Arial" w:hAnsi="Arial"/>
+                <w:b/>
+                <w:bCs/>
+                <w:sz w:val="19"/>
+                <w:szCs w:val="19"/>
+              </w:rPr>
+              <w:t xml:space="preserve">Excepciones</w:t>
+            </w:r>
+          </w:p>
+        </w:tc>
+        <w:tc>
+          <w:tcPr>
+            <w:tcW w:type="dxa" w:w="7060"/>
+            <w:tcMar>
+              <w:top w:type="dxa" w:w="40"/>
+              <w:left w:type="dxa" w:w="70"/>
+              <w:bottom w:type="dxa" w:w="40"/>
+              <w:right w:type="dxa" w:w="70"/>
+            </w:tcMar>
+          </w:tcPr>
+          <w:p>
+            <w:pPr>
+              <w:spacing w:after="18" w:line="236"/>
+            </w:pPr>
+            <w:r>
+              <w:rPr>
+                <w:rFonts w:ascii="Arial" w:cs="Arial" w:eastAsia="Arial" w:hAnsi="Arial"/>
+                <w:sz w:val="19"/>
+                <w:szCs w:val="19"/>
+              </w:rPr>
+              <w:t xml:space="preserve">*. Productos sin historial suficiente: se excluyen o se marcan.</w:t>
+            </w:r>
+          </w:p>
+        </w:tc>
+      </w:tr>
+      <w:tr>
+        <w:tc>
+          <w:tcPr>
+            <w:tcW w:type="dxa" w:w="2300"/>
+            <w:shd w:fill="EAF0F8" w:val="clear"/>
+            <w:tcMar>
+              <w:top w:type="dxa" w:w="40"/>
+              <w:left w:type="dxa" w:w="70"/>
+              <w:bottom w:type="dxa" w:w="40"/>
+              <w:right w:type="dxa" w:w="70"/>
+            </w:tcMar>
+          </w:tcPr>
+          <w:p>
+            <w:pPr>
+              <w:spacing w:after="18" w:line="236"/>
+            </w:pPr>
+            <w:r>
+              <w:rPr>
+                <w:rFonts w:ascii="Arial" w:cs="Arial" w:eastAsia="Arial" w:hAnsi="Arial"/>
+                <w:b/>
+                <w:bCs/>
+                <w:sz w:val="19"/>
+                <w:szCs w:val="19"/>
+              </w:rPr>
+              <w:t xml:space="preserve">Reglas y validaciones</w:t>
+            </w:r>
+          </w:p>
+        </w:tc>
+        <w:tc>
+          <w:tcPr>
+            <w:tcW w:type="dxa" w:w="7060"/>
+            <w:tcMar>
+              <w:top w:type="dxa" w:w="40"/>
+              <w:left w:type="dxa" w:w="70"/>
+              <w:bottom w:type="dxa" w:w="40"/>
+              <w:right w:type="dxa" w:w="70"/>
+            </w:tcMar>
+          </w:tcPr>
+          <w:p>
+            <w:pPr>
+              <w:spacing w:after="18" w:line="236"/>
+            </w:pPr>
+            <w:r>
+              <w:rPr>
+                <w:rFonts w:ascii="Arial" w:cs="Arial" w:eastAsia="Arial" w:hAnsi="Arial"/>
+                <w:sz w:val="19"/>
+                <w:szCs w:val="19"/>
+              </w:rPr>
+              <w:t xml:space="preserve">Se relaciona con la alerta de baja rotación (CU-INV-08); apoya promociones y compras.</w:t>
+            </w:r>
+          </w:p>
+        </w:tc>
+      </w:tr>
+      <w:tr>
+        <w:tc>
+          <w:tcPr>
+            <w:tcW w:type="dxa" w:w="2300"/>
+            <w:shd w:fill="EAF0F8" w:val="clear"/>
+            <w:tcMar>
+              <w:top w:type="dxa" w:w="40"/>
+              <w:left w:type="dxa" w:w="70"/>
+              <w:bottom w:type="dxa" w:w="40"/>
+              <w:right w:type="dxa" w:w="70"/>
+            </w:tcMar>
+          </w:tcPr>
+          <w:p>
+            <w:pPr>
+              <w:spacing w:after="18" w:line="236"/>
+            </w:pPr>
+            <w:r>
+              <w:rPr>
+                <w:rFonts w:ascii="Arial" w:cs="Arial" w:eastAsia="Arial" w:hAnsi="Arial"/>
+                <w:b/>
+                <w:bCs/>
+                <w:sz w:val="19"/>
+                <w:szCs w:val="19"/>
+              </w:rPr>
+              <w:t xml:space="preserve">Postcondiciones</w:t>
+            </w:r>
+          </w:p>
+        </w:tc>
+        <w:tc>
+          <w:tcPr>
+            <w:tcW w:type="dxa" w:w="7060"/>
+            <w:tcMar>
+              <w:top w:type="dxa" w:w="40"/>
+              <w:left w:type="dxa" w:w="70"/>
+              <w:bottom w:type="dxa" w:w="40"/>
+              <w:right w:type="dxa" w:w="70"/>
+            </w:tcMar>
+          </w:tcPr>
+          <w:p>
+            <w:pPr>
+              <w:spacing w:after="18" w:line="236"/>
+            </w:pPr>
+            <w:r>
+              <w:rPr>
+                <w:rFonts w:ascii="Arial" w:cs="Arial" w:eastAsia="Arial" w:hAnsi="Arial"/>
+                <w:sz w:val="19"/>
+                <w:szCs w:val="19"/>
+              </w:rPr>
+              <w:t xml:space="preserve">El administrador visualiza la rotación de los productos.</w:t>
+            </w:r>
+          </w:p>
+        </w:tc>
+      </w:tr>
+      <w:tr>
+        <w:tc>
+          <w:tcPr>
+            <w:tcW w:type="dxa" w:w="2300"/>
+            <w:shd w:fill="EAF0F8" w:val="clear"/>
+            <w:tcMar>
+              <w:top w:type="dxa" w:w="40"/>
+              <w:left w:type="dxa" w:w="70"/>
+              <w:bottom w:type="dxa" w:w="40"/>
+              <w:right w:type="dxa" w:w="70"/>
+            </w:tcMar>
+          </w:tcPr>
+          <w:p>
+            <w:pPr>
+              <w:spacing w:after="18" w:line="236"/>
+            </w:pPr>
+            <w:r>
+              <w:rPr>
+                <w:rFonts w:ascii="Arial" w:cs="Arial" w:eastAsia="Arial" w:hAnsi="Arial"/>
+                <w:b/>
+                <w:bCs/>
+                <w:sz w:val="19"/>
+                <w:szCs w:val="19"/>
+              </w:rPr>
+              <w:t xml:space="preserve">Prioridad</w:t>
+            </w:r>
+          </w:p>
+        </w:tc>
+        <w:tc>
+          <w:tcPr>
+            <w:tcW w:type="dxa" w:w="7060"/>
+            <w:tcMar>
+              <w:top w:type="dxa" w:w="40"/>
+              <w:left w:type="dxa" w:w="70"/>
+              <w:bottom w:type="dxa" w:w="40"/>
+              <w:right w:type="dxa" w:w="70"/>
+            </w:tcMar>
+          </w:tcPr>
+          <w:p>
+            <w:pPr>
+              <w:spacing w:after="18" w:line="236"/>
+            </w:pPr>
+            <w:r>
+              <w:rPr>
+                <w:rFonts w:ascii="Arial" w:cs="Arial" w:eastAsia="Arial" w:hAnsi="Arial"/>
+                <w:sz w:val="19"/>
+                <w:szCs w:val="19"/>
+              </w:rPr>
+              <w:t xml:space="preserve">Baja</w:t>
+            </w:r>
+          </w:p>
+        </w:tc>
+      </w:tr>
+    </w:tbl>
+    <w:p>
+      <w:pPr>
+        <w:spacing w:after="140"/>
+      </w:pPr>
+    </w:p>
+    <w:tbl>
+      <w:tblPr>
+        <w:tblW w:type="dxa" w:w="9360"/>
+        <w:tblBorders>
+          <w:top w:val="single" w:color="9CA3AF" w:sz="6"/>
+          <w:left w:val="single" w:color="9CA3AF" w:sz="6"/>
+          <w:bottom w:val="single" w:color="9CA3AF" w:sz="6"/>
+          <w:right w:val="single" w:color="9CA3AF" w:sz="6"/>
+          <w:insideH w:val="single" w:color="9CA3AF" w:sz="6"/>
+          <w:insideV w:val="single" w:color="9CA3AF" w:sz="6"/>
+        </w:tblBorders>
+        <w:tblLayout w:type="fixed"/>
+      </w:tblPr>
+      <w:tblGrid>
+        <w:gridCol w:w="2300"/>
+        <w:gridCol w:w="7060"/>
+      </w:tblGrid>
+      <w:tr>
+        <w:tc>
+          <w:tcPr>
+            <w:tcW w:type="dxa" w:w="9360"/>
+            <w:gridSpan w:val="2"/>
+            <w:shd w:fill="1F3864" w:val="clear"/>
+            <w:tcMar>
+              <w:top w:type="dxa" w:w="40"/>
+              <w:left w:type="dxa" w:w="70"/>
+              <w:bottom w:type="dxa" w:w="40"/>
+              <w:right w:type="dxa" w:w="70"/>
+            </w:tcMar>
+          </w:tcPr>
+          <w:p>
+            <w:pPr>
+              <w:spacing w:after="18" w:line="236"/>
+            </w:pPr>
+            <w:r>
+              <w:rPr>
+                <w:rFonts w:ascii="Arial" w:cs="Arial" w:eastAsia="Arial" w:hAnsi="Arial"/>
+                <w:b/>
+                <w:bCs/>
+                <w:color w:val="FFFFFF"/>
+                <w:sz w:val="19"/>
+                <w:szCs w:val="19"/>
+              </w:rPr>
+              <w:t xml:space="preserve">CU-REP-05 — Reporte de utilidad</w:t>
+            </w:r>
+          </w:p>
+        </w:tc>
+      </w:tr>
+      <w:tr>
+        <w:tc>
+          <w:tcPr>
+            <w:tcW w:type="dxa" w:w="2300"/>
+            <w:shd w:fill="EAF0F8" w:val="clear"/>
+            <w:tcMar>
+              <w:top w:type="dxa" w:w="40"/>
+              <w:left w:type="dxa" w:w="70"/>
+              <w:bottom w:type="dxa" w:w="40"/>
+              <w:right w:type="dxa" w:w="70"/>
+            </w:tcMar>
+          </w:tcPr>
+          <w:p>
+            <w:pPr>
+              <w:spacing w:after="18" w:line="236"/>
+            </w:pPr>
+            <w:r>
+              <w:rPr>
+                <w:rFonts w:ascii="Arial" w:cs="Arial" w:eastAsia="Arial" w:hAnsi="Arial"/>
+                <w:b/>
+                <w:bCs/>
+                <w:sz w:val="19"/>
+                <w:szCs w:val="19"/>
+              </w:rPr>
+              <w:t xml:space="preserve">Actor(es)</w:t>
+            </w:r>
+          </w:p>
+        </w:tc>
+        <w:tc>
+          <w:tcPr>
+            <w:tcW w:type="dxa" w:w="7060"/>
+            <w:tcMar>
+              <w:top w:type="dxa" w:w="40"/>
+              <w:left w:type="dxa" w:w="70"/>
+              <w:bottom w:type="dxa" w:w="40"/>
+              <w:right w:type="dxa" w:w="70"/>
+            </w:tcMar>
+          </w:tcPr>
+          <w:p>
+            <w:pPr>
+              <w:spacing w:after="18" w:line="236"/>
+            </w:pPr>
+            <w:r>
+              <w:rPr>
+                <w:rFonts w:ascii="Arial" w:cs="Arial" w:eastAsia="Arial" w:hAnsi="Arial"/>
+                <w:sz w:val="19"/>
+                <w:szCs w:val="19"/>
+              </w:rPr>
+              <w:t xml:space="preserve">Administrador</w:t>
+            </w:r>
+          </w:p>
+        </w:tc>
+      </w:tr>
+      <w:tr>
+        <w:tc>
+          <w:tcPr>
+            <w:tcW w:type="dxa" w:w="2300"/>
+            <w:shd w:fill="EAF0F8" w:val="clear"/>
+            <w:tcMar>
+              <w:top w:type="dxa" w:w="40"/>
+              <w:left w:type="dxa" w:w="70"/>
+              <w:bottom w:type="dxa" w:w="40"/>
+              <w:right w:type="dxa" w:w="70"/>
+            </w:tcMar>
+          </w:tcPr>
+          <w:p>
+            <w:pPr>
+              <w:spacing w:after="18" w:line="236"/>
+            </w:pPr>
+            <w:r>
+              <w:rPr>
+                <w:rFonts w:ascii="Arial" w:cs="Arial" w:eastAsia="Arial" w:hAnsi="Arial"/>
+                <w:b/>
+                <w:bCs/>
+                <w:sz w:val="19"/>
+                <w:szCs w:val="19"/>
+              </w:rPr>
+              <w:t xml:space="preserve">Requisito</w:t>
+            </w:r>
+          </w:p>
+        </w:tc>
+        <w:tc>
+          <w:tcPr>
+            <w:tcW w:type="dxa" w:w="7060"/>
+            <w:tcMar>
+              <w:top w:type="dxa" w:w="40"/>
+              <w:left w:type="dxa" w:w="70"/>
+              <w:bottom w:type="dxa" w:w="40"/>
+              <w:right w:type="dxa" w:w="70"/>
+            </w:tcMar>
+          </w:tcPr>
+          <w:p>
+            <w:pPr>
+              <w:spacing w:after="18" w:line="236"/>
+            </w:pPr>
+            <w:r>
+              <w:rPr>
+                <w:rFonts w:ascii="Arial" w:cs="Arial" w:eastAsia="Arial" w:hAnsi="Arial"/>
+                <w:sz w:val="19"/>
+                <w:szCs w:val="19"/>
+              </w:rPr>
+              <w:t xml:space="preserve">RF-REP-05</w:t>
+            </w:r>
+          </w:p>
+        </w:tc>
+      </w:tr>
+      <w:tr>
+        <w:tc>
+          <w:tcPr>
+            <w:tcW w:type="dxa" w:w="2300"/>
+            <w:shd w:fill="EAF0F8" w:val="clear"/>
+            <w:tcMar>
+              <w:top w:type="dxa" w:w="40"/>
+              <w:left w:type="dxa" w:w="70"/>
+              <w:bottom w:type="dxa" w:w="40"/>
+              <w:right w:type="dxa" w:w="70"/>
+            </w:tcMar>
+          </w:tcPr>
+          <w:p>
+            <w:pPr>
+              <w:spacing w:after="18" w:line="236"/>
+            </w:pPr>
+            <w:r>
+              <w:rPr>
+                <w:rFonts w:ascii="Arial" w:cs="Arial" w:eastAsia="Arial" w:hAnsi="Arial"/>
+                <w:b/>
+                <w:bCs/>
+                <w:sz w:val="19"/>
+                <w:szCs w:val="19"/>
+              </w:rPr>
+              <w:t xml:space="preserve">Descripción</w:t>
+            </w:r>
+          </w:p>
+        </w:tc>
+        <w:tc>
+          <w:tcPr>
+            <w:tcW w:type="dxa" w:w="7060"/>
+            <w:tcMar>
+              <w:top w:type="dxa" w:w="40"/>
+              <w:left w:type="dxa" w:w="70"/>
+              <w:bottom w:type="dxa" w:w="40"/>
+              <w:right w:type="dxa" w:w="70"/>
+            </w:tcMar>
+          </w:tcPr>
+          <w:p>
+            <w:pPr>
+              <w:spacing w:after="18" w:line="236"/>
+            </w:pPr>
+            <w:r>
+              <w:rPr>
+                <w:rFonts w:ascii="Arial" w:cs="Arial" w:eastAsia="Arial" w:hAnsi="Arial"/>
+                <w:sz w:val="19"/>
+                <w:szCs w:val="19"/>
+              </w:rPr>
+              <w:t xml:space="preserve">El administrador consulta la utilidad de las ventas (precio de venta menos costo real por PEPS) en un período.</w:t>
+            </w:r>
+          </w:p>
+        </w:tc>
+      </w:tr>
+      <w:tr>
+        <w:tc>
+          <w:tcPr>
+            <w:tcW w:type="dxa" w:w="2300"/>
+            <w:shd w:fill="EAF0F8" w:val="clear"/>
+            <w:tcMar>
+              <w:top w:type="dxa" w:w="40"/>
+              <w:left w:type="dxa" w:w="70"/>
+              <w:bottom w:type="dxa" w:w="40"/>
+              <w:right w:type="dxa" w:w="70"/>
+            </w:tcMar>
+          </w:tcPr>
+          <w:p>
+            <w:pPr>
+              <w:spacing w:after="18" w:line="236"/>
+            </w:pPr>
+            <w:r>
+              <w:rPr>
+                <w:rFonts w:ascii="Arial" w:cs="Arial" w:eastAsia="Arial" w:hAnsi="Arial"/>
+                <w:b/>
+                <w:bCs/>
+                <w:sz w:val="19"/>
+                <w:szCs w:val="19"/>
+              </w:rPr>
+              <w:t xml:space="preserve">Precondiciones</w:t>
+            </w:r>
+          </w:p>
+        </w:tc>
+        <w:tc>
+          <w:tcPr>
+            <w:tcW w:type="dxa" w:w="7060"/>
+            <w:tcMar>
+              <w:top w:type="dxa" w:w="40"/>
+              <w:left w:type="dxa" w:w="70"/>
+              <w:bottom w:type="dxa" w:w="40"/>
+              <w:right w:type="dxa" w:w="70"/>
+            </w:tcMar>
+          </w:tcPr>
+          <w:p>
+            <w:pPr>
+              <w:spacing w:after="18" w:line="236"/>
+            </w:pPr>
+            <w:r>
+              <w:rPr>
+                <w:rFonts w:ascii="Arial" w:cs="Arial" w:eastAsia="Arial" w:hAnsi="Arial"/>
+                <w:sz w:val="19"/>
+                <w:szCs w:val="19"/>
+              </w:rPr>
+              <w:t xml:space="preserve">Existen ventas con su costo registrado.</w:t>
+            </w:r>
+          </w:p>
+        </w:tc>
+      </w:tr>
+      <w:tr>
+        <w:tc>
+          <w:tcPr>
+            <w:tcW w:type="dxa" w:w="2300"/>
+            <w:shd w:fill="EAF0F8" w:val="clear"/>
+            <w:tcMar>
+              <w:top w:type="dxa" w:w="40"/>
+              <w:left w:type="dxa" w:w="70"/>
+              <w:bottom w:type="dxa" w:w="40"/>
+              <w:right w:type="dxa" w:w="70"/>
+            </w:tcMar>
+          </w:tcPr>
+          <w:p>
+            <w:pPr>
+              <w:spacing w:after="18" w:line="236"/>
+            </w:pPr>
+            <w:r>
+              <w:rPr>
+                <w:rFonts w:ascii="Arial" w:cs="Arial" w:eastAsia="Arial" w:hAnsi="Arial"/>
+                <w:b/>
+                <w:bCs/>
+                <w:sz w:val="19"/>
+                <w:szCs w:val="19"/>
+              </w:rPr>
+              <w:t xml:space="preserve">Flujo principal</w:t>
+            </w:r>
+          </w:p>
+        </w:tc>
+        <w:tc>
+          <w:tcPr>
+            <w:tcW w:type="dxa" w:w="7060"/>
+            <w:tcMar>
+              <w:top w:type="dxa" w:w="40"/>
+              <w:left w:type="dxa" w:w="70"/>
+              <w:bottom w:type="dxa" w:w="40"/>
+              <w:right w:type="dxa" w:w="70"/>
+            </w:tcMar>
+          </w:tcPr>
+          <w:p>
+            <w:pPr>
+              <w:spacing w:after="18" w:line="236"/>
+            </w:pPr>
+            <w:r>
+              <w:rPr>
+                <w:rFonts w:ascii="Arial" w:cs="Arial" w:eastAsia="Arial" w:hAnsi="Arial"/>
+                <w:sz w:val="19"/>
+                <w:szCs w:val="19"/>
+              </w:rPr>
+              <w:t xml:space="preserve">1. Elige «Utilidad» y el período.</w:t>
+            </w:r>
+          </w:p>
+          <w:p>
+            <w:pPr>
+              <w:spacing w:after="18" w:line="236"/>
+            </w:pPr>
+            <w:r>
+              <w:rPr>
+                <w:rFonts w:ascii="Arial" w:cs="Arial" w:eastAsia="Arial" w:hAnsi="Arial"/>
+                <w:sz w:val="19"/>
+                <w:szCs w:val="19"/>
+              </w:rPr>
+              <w:t xml:space="preserve">2. El sistema toma cada venta con su costo real (PEPS) y su precio.</w:t>
+            </w:r>
+          </w:p>
+          <w:p>
+            <w:pPr>
+              <w:spacing w:after="18" w:line="236"/>
+            </w:pPr>
+            <w:r>
+              <w:rPr>
+                <w:rFonts w:ascii="Arial" w:cs="Arial" w:eastAsia="Arial" w:hAnsi="Arial"/>
+                <w:sz w:val="19"/>
+                <w:szCs w:val="19"/>
+              </w:rPr>
+              <w:t xml:space="preserve">3. Calcula la utilidad por producto y total.</w:t>
+            </w:r>
+          </w:p>
+          <w:p>
+            <w:pPr>
+              <w:spacing w:after="18" w:line="236"/>
+            </w:pPr>
+            <w:r>
+              <w:rPr>
+                <w:rFonts w:ascii="Arial" w:cs="Arial" w:eastAsia="Arial" w:hAnsi="Arial"/>
+                <w:sz w:val="19"/>
+                <w:szCs w:val="19"/>
+              </w:rPr>
+              <w:t xml:space="preserve">4. Muestra el reporte.</w:t>
+            </w:r>
+          </w:p>
+        </w:tc>
+      </w:tr>
+      <w:tr>
+        <w:tc>
+          <w:tcPr>
+            <w:tcW w:type="dxa" w:w="2300"/>
+            <w:shd w:fill="EAF0F8" w:val="clear"/>
+            <w:tcMar>
+              <w:top w:type="dxa" w:w="40"/>
+              <w:left w:type="dxa" w:w="70"/>
+              <w:bottom w:type="dxa" w:w="40"/>
+              <w:right w:type="dxa" w:w="70"/>
+            </w:tcMar>
+          </w:tcPr>
+          <w:p>
+            <w:pPr>
+              <w:spacing w:after="18" w:line="236"/>
+            </w:pPr>
+            <w:r>
+              <w:rPr>
+                <w:rFonts w:ascii="Arial" w:cs="Arial" w:eastAsia="Arial" w:hAnsi="Arial"/>
+                <w:b/>
+                <w:bCs/>
+                <w:sz w:val="19"/>
+                <w:szCs w:val="19"/>
+              </w:rPr>
+              <w:t xml:space="preserve">Flujos alternativos</w:t>
+            </w:r>
+          </w:p>
+        </w:tc>
+        <w:tc>
+          <w:tcPr>
+            <w:tcW w:type="dxa" w:w="7060"/>
+            <w:tcMar>
+              <w:top w:type="dxa" w:w="40"/>
+              <w:left w:type="dxa" w:w="70"/>
+              <w:bottom w:type="dxa" w:w="40"/>
+              <w:right w:type="dxa" w:w="70"/>
+            </w:tcMar>
+          </w:tcPr>
+          <w:p>
+            <w:pPr>
+              <w:spacing w:after="18" w:line="236"/>
+            </w:pPr>
+            <w:r>
+              <w:rPr>
+                <w:rFonts w:ascii="Arial" w:cs="Arial" w:eastAsia="Arial" w:hAnsi="Arial"/>
+                <w:sz w:val="19"/>
+                <w:szCs w:val="19"/>
+              </w:rPr>
+              <w:t xml:space="preserve">4a. Exportar el reporte (CU-REP-06).</w:t>
+            </w:r>
+          </w:p>
+        </w:tc>
+      </w:tr>
+      <w:tr>
+        <w:tc>
+          <w:tcPr>
+            <w:tcW w:type="dxa" w:w="2300"/>
+            <w:shd w:fill="EAF0F8" w:val="clear"/>
+            <w:tcMar>
+              <w:top w:type="dxa" w:w="40"/>
+              <w:left w:type="dxa" w:w="70"/>
+              <w:bottom w:type="dxa" w:w="40"/>
+              <w:right w:type="dxa" w:w="70"/>
+            </w:tcMar>
+          </w:tcPr>
+          <w:p>
+            <w:pPr>
+              <w:spacing w:after="18" w:line="236"/>
+            </w:pPr>
+            <w:r>
+              <w:rPr>
+                <w:rFonts w:ascii="Arial" w:cs="Arial" w:eastAsia="Arial" w:hAnsi="Arial"/>
+                <w:b/>
+                <w:bCs/>
+                <w:sz w:val="19"/>
+                <w:szCs w:val="19"/>
+              </w:rPr>
+              <w:t xml:space="preserve">Excepciones</w:t>
+            </w:r>
+          </w:p>
+        </w:tc>
+        <w:tc>
+          <w:tcPr>
+            <w:tcW w:type="dxa" w:w="7060"/>
+            <w:tcMar>
+              <w:top w:type="dxa" w:w="40"/>
+              <w:left w:type="dxa" w:w="70"/>
+              <w:bottom w:type="dxa" w:w="40"/>
+              <w:right w:type="dxa" w:w="70"/>
+            </w:tcMar>
+          </w:tcPr>
+          <w:p>
+            <w:pPr>
+              <w:spacing w:after="18" w:line="236"/>
+            </w:pPr>
+            <w:r>
+              <w:rPr>
+                <w:rFonts w:ascii="Arial" w:cs="Arial" w:eastAsia="Arial" w:hAnsi="Arial"/>
+                <w:sz w:val="19"/>
+                <w:szCs w:val="19"/>
+              </w:rPr>
+              <w:t xml:space="preserve">*. Sin ventas: el sistema muestra el reporte vacío.</w:t>
+            </w:r>
+          </w:p>
+        </w:tc>
+      </w:tr>
+      <w:tr>
+        <w:tc>
+          <w:tcPr>
+            <w:tcW w:type="dxa" w:w="2300"/>
+            <w:shd w:fill="EAF0F8" w:val="clear"/>
+            <w:tcMar>
+              <w:top w:type="dxa" w:w="40"/>
+              <w:left w:type="dxa" w:w="70"/>
+              <w:bottom w:type="dxa" w:w="40"/>
+              <w:right w:type="dxa" w:w="70"/>
+            </w:tcMar>
+          </w:tcPr>
+          <w:p>
+            <w:pPr>
+              <w:spacing w:after="18" w:line="236"/>
+            </w:pPr>
+            <w:r>
+              <w:rPr>
+                <w:rFonts w:ascii="Arial" w:cs="Arial" w:eastAsia="Arial" w:hAnsi="Arial"/>
+                <w:b/>
+                <w:bCs/>
+                <w:sz w:val="19"/>
+                <w:szCs w:val="19"/>
+              </w:rPr>
+              <w:t xml:space="preserve">Reglas y validaciones</w:t>
+            </w:r>
+          </w:p>
+        </w:tc>
+        <w:tc>
+          <w:tcPr>
+            <w:tcW w:type="dxa" w:w="7060"/>
+            <w:tcMar>
+              <w:top w:type="dxa" w:w="40"/>
+              <w:left w:type="dxa" w:w="70"/>
+              <w:bottom w:type="dxa" w:w="40"/>
+              <w:right w:type="dxa" w:w="70"/>
+            </w:tcMar>
+          </w:tcPr>
+          <w:p>
+            <w:pPr>
+              <w:spacing w:after="18" w:line="236"/>
+            </w:pPr>
+            <w:r>
+              <w:rPr>
+                <w:rFonts w:ascii="Arial" w:cs="Arial" w:eastAsia="Arial" w:hAnsi="Arial"/>
+                <w:sz w:val="19"/>
+                <w:szCs w:val="19"/>
+              </w:rPr>
+              <w:t xml:space="preserve">La utilidad usa el costo histórico del despacho (PEPS), no el costo actual, y el precio de cada venta.</w:t>
+            </w:r>
+          </w:p>
+        </w:tc>
+      </w:tr>
+      <w:tr>
+        <w:tc>
+          <w:tcPr>
+            <w:tcW w:type="dxa" w:w="2300"/>
+            <w:shd w:fill="EAF0F8" w:val="clear"/>
+            <w:tcMar>
+              <w:top w:type="dxa" w:w="40"/>
+              <w:left w:type="dxa" w:w="70"/>
+              <w:bottom w:type="dxa" w:w="40"/>
+              <w:right w:type="dxa" w:w="70"/>
+            </w:tcMar>
+          </w:tcPr>
+          <w:p>
+            <w:pPr>
+              <w:spacing w:after="18" w:line="236"/>
+            </w:pPr>
+            <w:r>
+              <w:rPr>
+                <w:rFonts w:ascii="Arial" w:cs="Arial" w:eastAsia="Arial" w:hAnsi="Arial"/>
+                <w:b/>
+                <w:bCs/>
+                <w:sz w:val="19"/>
+                <w:szCs w:val="19"/>
+              </w:rPr>
+              <w:t xml:space="preserve">Postcondiciones</w:t>
+            </w:r>
+          </w:p>
+        </w:tc>
+        <w:tc>
+          <w:tcPr>
+            <w:tcW w:type="dxa" w:w="7060"/>
+            <w:tcMar>
+              <w:top w:type="dxa" w:w="40"/>
+              <w:left w:type="dxa" w:w="70"/>
+              <w:bottom w:type="dxa" w:w="40"/>
+              <w:right w:type="dxa" w:w="70"/>
+            </w:tcMar>
+          </w:tcPr>
+          <w:p>
+            <w:pPr>
+              <w:spacing w:after="18" w:line="236"/>
+            </w:pPr>
+            <w:r>
+              <w:rPr>
+                <w:rFonts w:ascii="Arial" w:cs="Arial" w:eastAsia="Arial" w:hAnsi="Arial"/>
+                <w:sz w:val="19"/>
+                <w:szCs w:val="19"/>
+              </w:rPr>
+              <w:t xml:space="preserve">El administrador visualiza la utilidad del período.</w:t>
+            </w:r>
+          </w:p>
+        </w:tc>
+      </w:tr>
+      <w:tr>
+        <w:tc>
+          <w:tcPr>
+            <w:tcW w:type="dxa" w:w="2300"/>
+            <w:shd w:fill="EAF0F8" w:val="clear"/>
+            <w:tcMar>
+              <w:top w:type="dxa" w:w="40"/>
+              <w:left w:type="dxa" w:w="70"/>
+              <w:bottom w:type="dxa" w:w="40"/>
+              <w:right w:type="dxa" w:w="70"/>
+            </w:tcMar>
+          </w:tcPr>
+          <w:p>
+            <w:pPr>
+              <w:spacing w:after="18" w:line="236"/>
+            </w:pPr>
+            <w:r>
+              <w:rPr>
+                <w:rFonts w:ascii="Arial" w:cs="Arial" w:eastAsia="Arial" w:hAnsi="Arial"/>
+                <w:b/>
+                <w:bCs/>
+                <w:sz w:val="19"/>
+                <w:szCs w:val="19"/>
+              </w:rPr>
+              <w:t xml:space="preserve">Prioridad</w:t>
+            </w:r>
+          </w:p>
+        </w:tc>
+        <w:tc>
+          <w:tcPr>
+            <w:tcW w:type="dxa" w:w="7060"/>
+            <w:tcMar>
+              <w:top w:type="dxa" w:w="40"/>
+              <w:left w:type="dxa" w:w="70"/>
+              <w:bottom w:type="dxa" w:w="40"/>
+              <w:right w:type="dxa" w:w="70"/>
+            </w:tcMar>
+          </w:tcPr>
+          <w:p>
+            <w:pPr>
+              <w:spacing w:after="18" w:line="236"/>
+            </w:pPr>
+            <w:r>
+              <w:rPr>
+                <w:rFonts w:ascii="Arial" w:cs="Arial" w:eastAsia="Arial" w:hAnsi="Arial"/>
+                <w:sz w:val="19"/>
+                <w:szCs w:val="19"/>
+              </w:rPr>
+              <w:t xml:space="preserve">Media</w:t>
+            </w:r>
+          </w:p>
+        </w:tc>
+      </w:tr>
+    </w:tbl>
+    <w:p>
+      <w:pPr>
+        <w:spacing w:after="140"/>
+      </w:pPr>
+    </w:p>
+    <w:tbl>
+      <w:tblPr>
+        <w:tblW w:type="dxa" w:w="9360"/>
+        <w:tblBorders>
+          <w:top w:val="single" w:color="9CA3AF" w:sz="6"/>
+          <w:left w:val="single" w:color="9CA3AF" w:sz="6"/>
+          <w:bottom w:val="single" w:color="9CA3AF" w:sz="6"/>
+          <w:right w:val="single" w:color="9CA3AF" w:sz="6"/>
+          <w:insideH w:val="single" w:color="9CA3AF" w:sz="6"/>
+          <w:insideV w:val="single" w:color="9CA3AF" w:sz="6"/>
+        </w:tblBorders>
+        <w:tblLayout w:type="fixed"/>
+      </w:tblPr>
+      <w:tblGrid>
+        <w:gridCol w:w="2300"/>
+        <w:gridCol w:w="7060"/>
+      </w:tblGrid>
+      <w:tr>
+        <w:tc>
+          <w:tcPr>
+            <w:tcW w:type="dxa" w:w="9360"/>
+            <w:gridSpan w:val="2"/>
+            <w:shd w:fill="1F3864" w:val="clear"/>
+            <w:tcMar>
+              <w:top w:type="dxa" w:w="40"/>
+              <w:left w:type="dxa" w:w="70"/>
+              <w:bottom w:type="dxa" w:w="40"/>
+              <w:right w:type="dxa" w:w="70"/>
+            </w:tcMar>
+          </w:tcPr>
+          <w:p>
+            <w:pPr>
+              <w:spacing w:after="18" w:line="236"/>
+            </w:pPr>
+            <w:r>
+              <w:rPr>
+                <w:rFonts w:ascii="Arial" w:cs="Arial" w:eastAsia="Arial" w:hAnsi="Arial"/>
+                <w:b/>
+                <w:bCs/>
+                <w:color w:val="FFFFFF"/>
+                <w:sz w:val="19"/>
+                <w:szCs w:val="19"/>
+              </w:rPr>
+              <w:t xml:space="preserve">CU-REP-06 — Exportar reportes</w:t>
+            </w:r>
+          </w:p>
+        </w:tc>
+      </w:tr>
+      <w:tr>
+        <w:tc>
+          <w:tcPr>
+            <w:tcW w:type="dxa" w:w="2300"/>
+            <w:shd w:fill="EAF0F8" w:val="clear"/>
+            <w:tcMar>
+              <w:top w:type="dxa" w:w="40"/>
+              <w:left w:type="dxa" w:w="70"/>
+              <w:bottom w:type="dxa" w:w="40"/>
+              <w:right w:type="dxa" w:w="70"/>
+            </w:tcMar>
+          </w:tcPr>
+          <w:p>
+            <w:pPr>
+              <w:spacing w:after="18" w:line="236"/>
+            </w:pPr>
+            <w:r>
+              <w:rPr>
+                <w:rFonts w:ascii="Arial" w:cs="Arial" w:eastAsia="Arial" w:hAnsi="Arial"/>
+                <w:b/>
+                <w:bCs/>
+                <w:sz w:val="19"/>
+                <w:szCs w:val="19"/>
+              </w:rPr>
+              <w:t xml:space="preserve">Actor(es)</w:t>
+            </w:r>
+          </w:p>
+        </w:tc>
+        <w:tc>
+          <w:tcPr>
+            <w:tcW w:type="dxa" w:w="7060"/>
+            <w:tcMar>
+              <w:top w:type="dxa" w:w="40"/>
+              <w:left w:type="dxa" w:w="70"/>
+              <w:bottom w:type="dxa" w:w="40"/>
+              <w:right w:type="dxa" w:w="70"/>
+            </w:tcMar>
+          </w:tcPr>
+          <w:p>
+            <w:pPr>
+              <w:spacing w:after="18" w:line="236"/>
+            </w:pPr>
+            <w:r>
+              <w:rPr>
+                <w:rFonts w:ascii="Arial" w:cs="Arial" w:eastAsia="Arial" w:hAnsi="Arial"/>
+                <w:sz w:val="19"/>
+                <w:szCs w:val="19"/>
+              </w:rPr>
+              <w:t xml:space="preserve">Administrador</w:t>
+            </w:r>
+          </w:p>
+        </w:tc>
+      </w:tr>
+      <w:tr>
+        <w:tc>
+          <w:tcPr>
+            <w:tcW w:type="dxa" w:w="2300"/>
+            <w:shd w:fill="EAF0F8" w:val="clear"/>
+            <w:tcMar>
+              <w:top w:type="dxa" w:w="40"/>
+              <w:left w:type="dxa" w:w="70"/>
+              <w:bottom w:type="dxa" w:w="40"/>
+              <w:right w:type="dxa" w:w="70"/>
+            </w:tcMar>
+          </w:tcPr>
+          <w:p>
+            <w:pPr>
+              <w:spacing w:after="18" w:line="236"/>
+            </w:pPr>
+            <w:r>
+              <w:rPr>
+                <w:rFonts w:ascii="Arial" w:cs="Arial" w:eastAsia="Arial" w:hAnsi="Arial"/>
+                <w:b/>
+                <w:bCs/>
+                <w:sz w:val="19"/>
+                <w:szCs w:val="19"/>
+              </w:rPr>
+              <w:t xml:space="preserve">Requisito</w:t>
+            </w:r>
+          </w:p>
+        </w:tc>
+        <w:tc>
+          <w:tcPr>
+            <w:tcW w:type="dxa" w:w="7060"/>
+            <w:tcMar>
+              <w:top w:type="dxa" w:w="40"/>
+              <w:left w:type="dxa" w:w="70"/>
+              <w:bottom w:type="dxa" w:w="40"/>
+              <w:right w:type="dxa" w:w="70"/>
+            </w:tcMar>
+          </w:tcPr>
+          <w:p>
+            <w:pPr>
+              <w:spacing w:after="18" w:line="236"/>
+            </w:pPr>
+            <w:r>
+              <w:rPr>
+                <w:rFonts w:ascii="Arial" w:cs="Arial" w:eastAsia="Arial" w:hAnsi="Arial"/>
+                <w:sz w:val="19"/>
+                <w:szCs w:val="19"/>
+              </w:rPr>
+              <w:t xml:space="preserve">RF-REP-06</w:t>
+            </w:r>
+          </w:p>
+        </w:tc>
+      </w:tr>
+      <w:tr>
+        <w:tc>
+          <w:tcPr>
+            <w:tcW w:type="dxa" w:w="2300"/>
+            <w:shd w:fill="EAF0F8" w:val="clear"/>
+            <w:tcMar>
+              <w:top w:type="dxa" w:w="40"/>
+              <w:left w:type="dxa" w:w="70"/>
+              <w:bottom w:type="dxa" w:w="40"/>
+              <w:right w:type="dxa" w:w="70"/>
+            </w:tcMar>
+          </w:tcPr>
+          <w:p>
+            <w:pPr>
+              <w:spacing w:after="18" w:line="236"/>
+            </w:pPr>
+            <w:r>
+              <w:rPr>
+                <w:rFonts w:ascii="Arial" w:cs="Arial" w:eastAsia="Arial" w:hAnsi="Arial"/>
+                <w:b/>
+                <w:bCs/>
+                <w:sz w:val="19"/>
+                <w:szCs w:val="19"/>
+              </w:rPr>
+              <w:t xml:space="preserve">Descripción</w:t>
+            </w:r>
+          </w:p>
+        </w:tc>
+        <w:tc>
+          <w:tcPr>
+            <w:tcW w:type="dxa" w:w="7060"/>
+            <w:tcMar>
+              <w:top w:type="dxa" w:w="40"/>
+              <w:left w:type="dxa" w:w="70"/>
+              <w:bottom w:type="dxa" w:w="40"/>
+              <w:right w:type="dxa" w:w="70"/>
+            </w:tcMar>
+          </w:tcPr>
+          <w:p>
+            <w:pPr>
+              <w:spacing w:after="18" w:line="236"/>
+            </w:pPr>
+            <w:r>
+              <w:rPr>
+                <w:rFonts w:ascii="Arial" w:cs="Arial" w:eastAsia="Arial" w:hAnsi="Arial"/>
+                <w:sz w:val="19"/>
+                <w:szCs w:val="19"/>
+              </w:rPr>
+              <w:t xml:space="preserve">El administrador exporta cualquiera de los reportes a un archivo (por ejemplo, PDF o Excel). Extiende a los reportes.</w:t>
+            </w:r>
+          </w:p>
+        </w:tc>
+      </w:tr>
+      <w:tr>
+        <w:tc>
+          <w:tcPr>
+            <w:tcW w:type="dxa" w:w="2300"/>
+            <w:shd w:fill="EAF0F8" w:val="clear"/>
+            <w:tcMar>
+              <w:top w:type="dxa" w:w="40"/>
+              <w:left w:type="dxa" w:w="70"/>
+              <w:bottom w:type="dxa" w:w="40"/>
+              <w:right w:type="dxa" w:w="70"/>
+            </w:tcMar>
+          </w:tcPr>
+          <w:p>
+            <w:pPr>
+              <w:spacing w:after="18" w:line="236"/>
+            </w:pPr>
+            <w:r>
+              <w:rPr>
+                <w:rFonts w:ascii="Arial" w:cs="Arial" w:eastAsia="Arial" w:hAnsi="Arial"/>
+                <w:b/>
+                <w:bCs/>
+                <w:sz w:val="19"/>
+                <w:szCs w:val="19"/>
+              </w:rPr>
+              <w:t xml:space="preserve">Precondiciones</w:t>
+            </w:r>
+          </w:p>
+        </w:tc>
+        <w:tc>
+          <w:tcPr>
+            <w:tcW w:type="dxa" w:w="7060"/>
+            <w:tcMar>
+              <w:top w:type="dxa" w:w="40"/>
+              <w:left w:type="dxa" w:w="70"/>
+              <w:bottom w:type="dxa" w:w="40"/>
+              <w:right w:type="dxa" w:w="70"/>
+            </w:tcMar>
+          </w:tcPr>
+          <w:p>
+            <w:pPr>
+              <w:spacing w:after="18" w:line="236"/>
+            </w:pPr>
+            <w:r>
+              <w:rPr>
+                <w:rFonts w:ascii="Arial" w:cs="Arial" w:eastAsia="Arial" w:hAnsi="Arial"/>
+                <w:sz w:val="19"/>
+                <w:szCs w:val="19"/>
+              </w:rPr>
+              <w:t xml:space="preserve">Hay un reporte generado en pantalla.</w:t>
+            </w:r>
+          </w:p>
+        </w:tc>
+      </w:tr>
+      <w:tr>
+        <w:tc>
+          <w:tcPr>
+            <w:tcW w:type="dxa" w:w="2300"/>
+            <w:shd w:fill="EAF0F8" w:val="clear"/>
+            <w:tcMar>
+              <w:top w:type="dxa" w:w="40"/>
+              <w:left w:type="dxa" w:w="70"/>
+              <w:bottom w:type="dxa" w:w="40"/>
+              <w:right w:type="dxa" w:w="70"/>
+            </w:tcMar>
+          </w:tcPr>
+          <w:p>
+            <w:pPr>
+              <w:spacing w:after="18" w:line="236"/>
+            </w:pPr>
+            <w:r>
+              <w:rPr>
+                <w:rFonts w:ascii="Arial" w:cs="Arial" w:eastAsia="Arial" w:hAnsi="Arial"/>
+                <w:b/>
+                <w:bCs/>
+                <w:sz w:val="19"/>
+                <w:szCs w:val="19"/>
+              </w:rPr>
+              <w:t xml:space="preserve">Flujo principal</w:t>
+            </w:r>
+          </w:p>
+        </w:tc>
+        <w:tc>
+          <w:tcPr>
+            <w:tcW w:type="dxa" w:w="7060"/>
+            <w:tcMar>
+              <w:top w:type="dxa" w:w="40"/>
+              <w:left w:type="dxa" w:w="70"/>
+              <w:bottom w:type="dxa" w:w="40"/>
+              <w:right w:type="dxa" w:w="70"/>
+            </w:tcMar>
+          </w:tcPr>
+          <w:p>
+            <w:pPr>
+              <w:spacing w:after="18" w:line="236"/>
+            </w:pPr>
+            <w:r>
+              <w:rPr>
+                <w:rFonts w:ascii="Arial" w:cs="Arial" w:eastAsia="Arial" w:hAnsi="Arial"/>
+                <w:sz w:val="19"/>
+                <w:szCs w:val="19"/>
+              </w:rPr>
+              <w:t xml:space="preserve">1. En el reporte, elige «Exportar» y el formato.</w:t>
+            </w:r>
+          </w:p>
+          <w:p>
+            <w:pPr>
+              <w:spacing w:after="18" w:line="236"/>
+            </w:pPr>
+            <w:r>
+              <w:rPr>
+                <w:rFonts w:ascii="Arial" w:cs="Arial" w:eastAsia="Arial" w:hAnsi="Arial"/>
+                <w:sz w:val="19"/>
+                <w:szCs w:val="19"/>
+              </w:rPr>
+              <w:t xml:space="preserve">2. El sistema genera el archivo con el contenido del reporte.</w:t>
+            </w:r>
+          </w:p>
+          <w:p>
+            <w:pPr>
+              <w:spacing w:after="18" w:line="236"/>
+            </w:pPr>
+            <w:r>
+              <w:rPr>
+                <w:rFonts w:ascii="Arial" w:cs="Arial" w:eastAsia="Arial" w:hAnsi="Arial"/>
+                <w:sz w:val="19"/>
+                <w:szCs w:val="19"/>
+              </w:rPr>
+              <w:t xml:space="preserve">3. Lo descarga o lo ofrece para guardar.</w:t>
+            </w:r>
+          </w:p>
+        </w:tc>
+      </w:tr>
+      <w:tr>
+        <w:tc>
+          <w:tcPr>
+            <w:tcW w:type="dxa" w:w="2300"/>
+            <w:shd w:fill="EAF0F8" w:val="clear"/>
+            <w:tcMar>
+              <w:top w:type="dxa" w:w="40"/>
+              <w:left w:type="dxa" w:w="70"/>
+              <w:bottom w:type="dxa" w:w="40"/>
+              <w:right w:type="dxa" w:w="70"/>
+            </w:tcMar>
+          </w:tcPr>
+          <w:p>
+            <w:pPr>
+              <w:spacing w:after="18" w:line="236"/>
+            </w:pPr>
+            <w:r>
+              <w:rPr>
+                <w:rFonts w:ascii="Arial" w:cs="Arial" w:eastAsia="Arial" w:hAnsi="Arial"/>
+                <w:b/>
+                <w:bCs/>
+                <w:sz w:val="19"/>
+                <w:szCs w:val="19"/>
+              </w:rPr>
+              <w:t xml:space="preserve">Flujos alternativos</w:t>
+            </w:r>
+          </w:p>
+        </w:tc>
+        <w:tc>
+          <w:tcPr>
+            <w:tcW w:type="dxa" w:w="7060"/>
+            <w:tcMar>
+              <w:top w:type="dxa" w:w="40"/>
+              <w:left w:type="dxa" w:w="70"/>
+              <w:bottom w:type="dxa" w:w="40"/>
+              <w:right w:type="dxa" w:w="70"/>
+            </w:tcMar>
+          </w:tcPr>
+          <w:p>
+            <w:pPr>
+              <w:spacing w:after="18" w:line="236"/>
+            </w:pPr>
+            <w:r>
+              <w:rPr>
+                <w:rFonts w:ascii="Arial" w:cs="Arial" w:eastAsia="Arial" w:hAnsi="Arial"/>
+                <w:sz w:val="19"/>
+                <w:szCs w:val="19"/>
+              </w:rPr>
+              <w:t xml:space="preserve">1a. Elegir el rango o las columnas antes de exportar.</w:t>
+            </w:r>
+          </w:p>
+        </w:tc>
+      </w:tr>
+      <w:tr>
+        <w:tc>
+          <w:tcPr>
+            <w:tcW w:type="dxa" w:w="2300"/>
+            <w:shd w:fill="EAF0F8" w:val="clear"/>
+            <w:tcMar>
+              <w:top w:type="dxa" w:w="40"/>
+              <w:left w:type="dxa" w:w="70"/>
+              <w:bottom w:type="dxa" w:w="40"/>
+              <w:right w:type="dxa" w:w="70"/>
+            </w:tcMar>
+          </w:tcPr>
+          <w:p>
+            <w:pPr>
+              <w:spacing w:after="18" w:line="236"/>
+            </w:pPr>
+            <w:r>
+              <w:rPr>
+                <w:rFonts w:ascii="Arial" w:cs="Arial" w:eastAsia="Arial" w:hAnsi="Arial"/>
+                <w:b/>
+                <w:bCs/>
+                <w:sz w:val="19"/>
+                <w:szCs w:val="19"/>
+              </w:rPr>
+              <w:t xml:space="preserve">Excepciones</w:t>
+            </w:r>
+          </w:p>
+        </w:tc>
+        <w:tc>
+          <w:tcPr>
+            <w:tcW w:type="dxa" w:w="7060"/>
+            <w:tcMar>
+              <w:top w:type="dxa" w:w="40"/>
+              <w:left w:type="dxa" w:w="70"/>
+              <w:bottom w:type="dxa" w:w="40"/>
+              <w:right w:type="dxa" w:w="70"/>
+            </w:tcMar>
+          </w:tcPr>
+          <w:p>
+            <w:pPr>
+              <w:spacing w:after="18" w:line="236"/>
+            </w:pPr>
+            <w:r>
+              <w:rPr>
+                <w:rFonts w:ascii="Arial" w:cs="Arial" w:eastAsia="Arial" w:hAnsi="Arial"/>
+                <w:sz w:val="19"/>
+                <w:szCs w:val="19"/>
+              </w:rPr>
+              <w:t xml:space="preserve">*. Error al generar el archivo: el sistema informa y permite reintentar.</w:t>
+            </w:r>
+          </w:p>
+        </w:tc>
+      </w:tr>
+      <w:tr>
+        <w:tc>
+          <w:tcPr>
+            <w:tcW w:type="dxa" w:w="2300"/>
+            <w:shd w:fill="EAF0F8" w:val="clear"/>
+            <w:tcMar>
+              <w:top w:type="dxa" w:w="40"/>
+              <w:left w:type="dxa" w:w="70"/>
+              <w:bottom w:type="dxa" w:w="40"/>
+              <w:right w:type="dxa" w:w="70"/>
+            </w:tcMar>
+          </w:tcPr>
+          <w:p>
+            <w:pPr>
+              <w:spacing w:after="18" w:line="236"/>
+            </w:pPr>
+            <w:r>
+              <w:rPr>
+                <w:rFonts w:ascii="Arial" w:cs="Arial" w:eastAsia="Arial" w:hAnsi="Arial"/>
+                <w:b/>
+                <w:bCs/>
+                <w:sz w:val="19"/>
+                <w:szCs w:val="19"/>
+              </w:rPr>
+              <w:t xml:space="preserve">Reglas y validaciones</w:t>
+            </w:r>
+          </w:p>
+        </w:tc>
+        <w:tc>
+          <w:tcPr>
+            <w:tcW w:type="dxa" w:w="7060"/>
+            <w:tcMar>
+              <w:top w:type="dxa" w:w="40"/>
+              <w:left w:type="dxa" w:w="70"/>
+              <w:bottom w:type="dxa" w:w="40"/>
+              <w:right w:type="dxa" w:w="70"/>
+            </w:tcMar>
+          </w:tcPr>
+          <w:p>
+            <w:pPr>
+              <w:spacing w:after="18" w:line="236"/>
+            </w:pPr>
+            <w:r>
+              <w:rPr>
+                <w:rFonts w:ascii="Arial" w:cs="Arial" w:eastAsia="Arial" w:hAnsi="Arial"/>
+                <w:sz w:val="19"/>
+                <w:szCs w:val="19"/>
+              </w:rPr>
+              <w:t xml:space="preserve">Es un comportamiento opcional que extiende a los reportes; el archivo refleja los datos mostrados.</w:t>
+            </w:r>
+          </w:p>
+        </w:tc>
+      </w:tr>
+      <w:tr>
+        <w:tc>
+          <w:tcPr>
+            <w:tcW w:type="dxa" w:w="2300"/>
+            <w:shd w:fill="EAF0F8" w:val="clear"/>
+            <w:tcMar>
+              <w:top w:type="dxa" w:w="40"/>
+              <w:left w:type="dxa" w:w="70"/>
+              <w:bottom w:type="dxa" w:w="40"/>
+              <w:right w:type="dxa" w:w="70"/>
+            </w:tcMar>
+          </w:tcPr>
+          <w:p>
+            <w:pPr>
+              <w:spacing w:after="18" w:line="236"/>
+            </w:pPr>
+            <w:r>
+              <w:rPr>
+                <w:rFonts w:ascii="Arial" w:cs="Arial" w:eastAsia="Arial" w:hAnsi="Arial"/>
+                <w:b/>
+                <w:bCs/>
+                <w:sz w:val="19"/>
+                <w:szCs w:val="19"/>
+              </w:rPr>
+              <w:t xml:space="preserve">Postcondiciones</w:t>
+            </w:r>
+          </w:p>
+        </w:tc>
+        <w:tc>
+          <w:tcPr>
+            <w:tcW w:type="dxa" w:w="7060"/>
+            <w:tcMar>
+              <w:top w:type="dxa" w:w="40"/>
+              <w:left w:type="dxa" w:w="70"/>
+              <w:bottom w:type="dxa" w:w="40"/>
+              <w:right w:type="dxa" w:w="70"/>
+            </w:tcMar>
+          </w:tcPr>
+          <w:p>
+            <w:pPr>
+              <w:spacing w:after="18" w:line="236"/>
+            </w:pPr>
+            <w:r>
+              <w:rPr>
+                <w:rFonts w:ascii="Arial" w:cs="Arial" w:eastAsia="Arial" w:hAnsi="Arial"/>
+                <w:sz w:val="19"/>
+                <w:szCs w:val="19"/>
+              </w:rPr>
+              <w:t xml:space="preserve">El administrador obtiene el reporte en un archivo.</w:t>
+            </w:r>
+          </w:p>
+        </w:tc>
+      </w:tr>
+      <w:tr>
+        <w:tc>
+          <w:tcPr>
+            <w:tcW w:type="dxa" w:w="2300"/>
+            <w:shd w:fill="EAF0F8" w:val="clear"/>
+            <w:tcMar>
+              <w:top w:type="dxa" w:w="40"/>
+              <w:left w:type="dxa" w:w="70"/>
+              <w:bottom w:type="dxa" w:w="40"/>
+              <w:right w:type="dxa" w:w="70"/>
+            </w:tcMar>
+          </w:tcPr>
+          <w:p>
+            <w:pPr>
+              <w:spacing w:after="18" w:line="236"/>
+            </w:pPr>
+            <w:r>
+              <w:rPr>
+                <w:rFonts w:ascii="Arial" w:cs="Arial" w:eastAsia="Arial" w:hAnsi="Arial"/>
+                <w:b/>
+                <w:bCs/>
+                <w:sz w:val="19"/>
+                <w:szCs w:val="19"/>
+              </w:rPr>
+              <w:t xml:space="preserve">Prioridad</w:t>
+            </w:r>
+          </w:p>
+        </w:tc>
+        <w:tc>
+          <w:tcPr>
+            <w:tcW w:type="dxa" w:w="7060"/>
+            <w:tcMar>
+              <w:top w:type="dxa" w:w="40"/>
+              <w:left w:type="dxa" w:w="70"/>
+              <w:bottom w:type="dxa" w:w="40"/>
+              <w:right w:type="dxa" w:w="70"/>
+            </w:tcMar>
+          </w:tcPr>
+          <w:p>
+            <w:pPr>
+              <w:spacing w:after="18" w:line="236"/>
+            </w:pPr>
+            <w:r>
+              <w:rPr>
+                <w:rFonts w:ascii="Arial" w:cs="Arial" w:eastAsia="Arial" w:hAnsi="Arial"/>
+                <w:sz w:val="19"/>
+                <w:szCs w:val="19"/>
+              </w:rPr>
+              <w:t xml:space="preserve">Media</w:t>
+            </w:r>
+          </w:p>
+        </w:tc>
+      </w:tr>
+    </w:tbl>
+    <w:p>
+      <w:pPr>
+        <w:spacing w:after="140"/>
+      </w:pPr>
+    </w:p>
     <w:sectPr>
       <w:footerReference w:type="default" r:id="rId7"/>
       <w:pgSz w:w="12240" w:h="15840" w:orient="portrait"/>

</xml_diff>

<commit_message>
Agrego los casos de uso extendidos del módulo de multisede
</commit_message>
<xml_diff>
--- a/docs/diseno/INVENTRA_Analisis_Diseno_UML.docx
+++ b/docs/diseno/INVENTRA_Analisis_Diseno_UML.docx
@@ -1401,6 +1401,41 @@
       <w:r>
         <w:fldChar w:fldCharType="begin" w:dirty="true"/>
         <w:instrText xml:space="preserve">PAGEREF bm46</w:instrText>
+        <w:fldChar w:fldCharType="end"/>
+      </w:r>
+    </w:p>
+    <w:p>
+      <w:pPr>
+        <w:tabs>
+          <w:tab w:val="right" w:pos="9200" w:leader="dot"/>
+        </w:tabs>
+        <w:spacing w:after="40" w:line="252"/>
+        <w:ind w:left="360"/>
+      </w:pPr>
+      <w:hyperlink w:history="1" w:anchor="bm47">
+        <w:r>
+          <w:rPr>
+            <w:rFonts w:ascii="Arial" w:cs="Arial" w:eastAsia="Arial" w:hAnsi="Arial"/>
+            <w:b w:val="false"/>
+            <w:bCs w:val="false"/>
+            <w:color w:val="1F3864"/>
+            <w:sz w:val="20"/>
+            <w:szCs w:val="20"/>
+          </w:rPr>
+          <w:t xml:space="preserve">9.6 Módulo SED — Multisede y multiusuario</w:t>
+        </w:r>
+      </w:hyperlink>
+      <w:r>
+        <w:rPr>
+          <w:rFonts w:ascii="Arial" w:cs="Arial" w:eastAsia="Arial" w:hAnsi="Arial"/>
+          <w:sz w:val="20"/>
+          <w:szCs w:val="20"/>
+        </w:rPr>
+        <w:t xml:space="preserve">	</w:t>
+      </w:r>
+      <w:r>
+        <w:fldChar w:fldCharType="begin" w:dirty="true"/>
+        <w:instrText xml:space="preserve">PAGEREF bm47</w:instrText>
         <w:fldChar w:fldCharType="end"/>
       </w:r>
     </w:p>
@@ -30463,6 +30498,3166 @@
         <w:spacing w:after="140"/>
       </w:pPr>
     </w:p>
+    <w:p>
+      <w:pPr>
+        <w:pStyle w:val="Heading2"/>
+        <w:spacing w:after="80" w:before="150"/>
+      </w:pPr>
+      <w:bookmarkStart w:name="bm47" w:id="47"/>
+      <w:r>
+        <w:rPr>
+          <w:rFonts w:ascii="Arial" w:cs="Arial" w:eastAsia="Arial" w:hAnsi="Arial"/>
+          <w:b/>
+          <w:bCs/>
+          <w:color w:val="2E5496"/>
+          <w:sz w:val="23"/>
+          <w:szCs w:val="23"/>
+        </w:rPr>
+        <w:t xml:space="preserve">9.6 Módulo SED — Multisede y multiusuario</w:t>
+      </w:r>
+      <w:bookmarkEnd w:id="47"/>
+    </w:p>
+    <w:tbl>
+      <w:tblPr>
+        <w:tblW w:type="dxa" w:w="9360"/>
+        <w:tblBorders>
+          <w:top w:val="single" w:color="9CA3AF" w:sz="6"/>
+          <w:left w:val="single" w:color="9CA3AF" w:sz="6"/>
+          <w:bottom w:val="single" w:color="9CA3AF" w:sz="6"/>
+          <w:right w:val="single" w:color="9CA3AF" w:sz="6"/>
+          <w:insideH w:val="single" w:color="9CA3AF" w:sz="6"/>
+          <w:insideV w:val="single" w:color="9CA3AF" w:sz="6"/>
+        </w:tblBorders>
+        <w:tblLayout w:type="fixed"/>
+      </w:tblPr>
+      <w:tblGrid>
+        <w:gridCol w:w="2300"/>
+        <w:gridCol w:w="7060"/>
+      </w:tblGrid>
+      <w:tr>
+        <w:tc>
+          <w:tcPr>
+            <w:tcW w:type="dxa" w:w="9360"/>
+            <w:gridSpan w:val="2"/>
+            <w:shd w:fill="1F3864" w:val="clear"/>
+            <w:tcMar>
+              <w:top w:type="dxa" w:w="40"/>
+              <w:left w:type="dxa" w:w="70"/>
+              <w:bottom w:type="dxa" w:w="40"/>
+              <w:right w:type="dxa" w:w="70"/>
+            </w:tcMar>
+          </w:tcPr>
+          <w:p>
+            <w:pPr>
+              <w:spacing w:after="18" w:line="236"/>
+            </w:pPr>
+            <w:r>
+              <w:rPr>
+                <w:rFonts w:ascii="Arial" w:cs="Arial" w:eastAsia="Arial" w:hAnsi="Arial"/>
+                <w:b/>
+                <w:bCs/>
+                <w:color w:val="FFFFFF"/>
+                <w:sz w:val="19"/>
+                <w:szCs w:val="19"/>
+              </w:rPr>
+              <w:t xml:space="preserve">CU-SED-01 — Registrar sede</w:t>
+            </w:r>
+          </w:p>
+        </w:tc>
+      </w:tr>
+      <w:tr>
+        <w:tc>
+          <w:tcPr>
+            <w:tcW w:type="dxa" w:w="2300"/>
+            <w:shd w:fill="EAF0F8" w:val="clear"/>
+            <w:tcMar>
+              <w:top w:type="dxa" w:w="40"/>
+              <w:left w:type="dxa" w:w="70"/>
+              <w:bottom w:type="dxa" w:w="40"/>
+              <w:right w:type="dxa" w:w="70"/>
+            </w:tcMar>
+          </w:tcPr>
+          <w:p>
+            <w:pPr>
+              <w:spacing w:after="18" w:line="236"/>
+            </w:pPr>
+            <w:r>
+              <w:rPr>
+                <w:rFonts w:ascii="Arial" w:cs="Arial" w:eastAsia="Arial" w:hAnsi="Arial"/>
+                <w:b/>
+                <w:bCs/>
+                <w:sz w:val="19"/>
+                <w:szCs w:val="19"/>
+              </w:rPr>
+              <w:t xml:space="preserve">Actor(es)</w:t>
+            </w:r>
+          </w:p>
+        </w:tc>
+        <w:tc>
+          <w:tcPr>
+            <w:tcW w:type="dxa" w:w="7060"/>
+            <w:tcMar>
+              <w:top w:type="dxa" w:w="40"/>
+              <w:left w:type="dxa" w:w="70"/>
+              <w:bottom w:type="dxa" w:w="40"/>
+              <w:right w:type="dxa" w:w="70"/>
+            </w:tcMar>
+          </w:tcPr>
+          <w:p>
+            <w:pPr>
+              <w:spacing w:after="18" w:line="236"/>
+            </w:pPr>
+            <w:r>
+              <w:rPr>
+                <w:rFonts w:ascii="Arial" w:cs="Arial" w:eastAsia="Arial" w:hAnsi="Arial"/>
+                <w:sz w:val="19"/>
+                <w:szCs w:val="19"/>
+              </w:rPr>
+              <w:t xml:space="preserve">Administrador</w:t>
+            </w:r>
+          </w:p>
+        </w:tc>
+      </w:tr>
+      <w:tr>
+        <w:tc>
+          <w:tcPr>
+            <w:tcW w:type="dxa" w:w="2300"/>
+            <w:shd w:fill="EAF0F8" w:val="clear"/>
+            <w:tcMar>
+              <w:top w:type="dxa" w:w="40"/>
+              <w:left w:type="dxa" w:w="70"/>
+              <w:bottom w:type="dxa" w:w="40"/>
+              <w:right w:type="dxa" w:w="70"/>
+            </w:tcMar>
+          </w:tcPr>
+          <w:p>
+            <w:pPr>
+              <w:spacing w:after="18" w:line="236"/>
+            </w:pPr>
+            <w:r>
+              <w:rPr>
+                <w:rFonts w:ascii="Arial" w:cs="Arial" w:eastAsia="Arial" w:hAnsi="Arial"/>
+                <w:b/>
+                <w:bCs/>
+                <w:sz w:val="19"/>
+                <w:szCs w:val="19"/>
+              </w:rPr>
+              <w:t xml:space="preserve">Requisito</w:t>
+            </w:r>
+          </w:p>
+        </w:tc>
+        <w:tc>
+          <w:tcPr>
+            <w:tcW w:type="dxa" w:w="7060"/>
+            <w:tcMar>
+              <w:top w:type="dxa" w:w="40"/>
+              <w:left w:type="dxa" w:w="70"/>
+              <w:bottom w:type="dxa" w:w="40"/>
+              <w:right w:type="dxa" w:w="70"/>
+            </w:tcMar>
+          </w:tcPr>
+          <w:p>
+            <w:pPr>
+              <w:spacing w:after="18" w:line="236"/>
+            </w:pPr>
+            <w:r>
+              <w:rPr>
+                <w:rFonts w:ascii="Arial" w:cs="Arial" w:eastAsia="Arial" w:hAnsi="Arial"/>
+                <w:sz w:val="19"/>
+                <w:szCs w:val="19"/>
+              </w:rPr>
+              <w:t xml:space="preserve">RF-SED-01</w:t>
+            </w:r>
+          </w:p>
+        </w:tc>
+      </w:tr>
+      <w:tr>
+        <w:tc>
+          <w:tcPr>
+            <w:tcW w:type="dxa" w:w="2300"/>
+            <w:shd w:fill="EAF0F8" w:val="clear"/>
+            <w:tcMar>
+              <w:top w:type="dxa" w:w="40"/>
+              <w:left w:type="dxa" w:w="70"/>
+              <w:bottom w:type="dxa" w:w="40"/>
+              <w:right w:type="dxa" w:w="70"/>
+            </w:tcMar>
+          </w:tcPr>
+          <w:p>
+            <w:pPr>
+              <w:spacing w:after="18" w:line="236"/>
+            </w:pPr>
+            <w:r>
+              <w:rPr>
+                <w:rFonts w:ascii="Arial" w:cs="Arial" w:eastAsia="Arial" w:hAnsi="Arial"/>
+                <w:b/>
+                <w:bCs/>
+                <w:sz w:val="19"/>
+                <w:szCs w:val="19"/>
+              </w:rPr>
+              <w:t xml:space="preserve">Descripción</w:t>
+            </w:r>
+          </w:p>
+        </w:tc>
+        <w:tc>
+          <w:tcPr>
+            <w:tcW w:type="dxa" w:w="7060"/>
+            <w:tcMar>
+              <w:top w:type="dxa" w:w="40"/>
+              <w:left w:type="dxa" w:w="70"/>
+              <w:bottom w:type="dxa" w:w="40"/>
+              <w:right w:type="dxa" w:w="70"/>
+            </w:tcMar>
+          </w:tcPr>
+          <w:p>
+            <w:pPr>
+              <w:spacing w:after="18" w:line="236"/>
+            </w:pPr>
+            <w:r>
+              <w:rPr>
+                <w:rFonts w:ascii="Arial" w:cs="Arial" w:eastAsia="Arial" w:hAnsi="Arial"/>
+                <w:sz w:val="19"/>
+                <w:szCs w:val="19"/>
+              </w:rPr>
+              <w:t xml:space="preserve">El administrador crea una nueva sede (sucursal) de la licorera.</w:t>
+            </w:r>
+          </w:p>
+        </w:tc>
+      </w:tr>
+      <w:tr>
+        <w:tc>
+          <w:tcPr>
+            <w:tcW w:type="dxa" w:w="2300"/>
+            <w:shd w:fill="EAF0F8" w:val="clear"/>
+            <w:tcMar>
+              <w:top w:type="dxa" w:w="40"/>
+              <w:left w:type="dxa" w:w="70"/>
+              <w:bottom w:type="dxa" w:w="40"/>
+              <w:right w:type="dxa" w:w="70"/>
+            </w:tcMar>
+          </w:tcPr>
+          <w:p>
+            <w:pPr>
+              <w:spacing w:after="18" w:line="236"/>
+            </w:pPr>
+            <w:r>
+              <w:rPr>
+                <w:rFonts w:ascii="Arial" w:cs="Arial" w:eastAsia="Arial" w:hAnsi="Arial"/>
+                <w:b/>
+                <w:bCs/>
+                <w:sz w:val="19"/>
+                <w:szCs w:val="19"/>
+              </w:rPr>
+              <w:t xml:space="preserve">Precondiciones</w:t>
+            </w:r>
+          </w:p>
+        </w:tc>
+        <w:tc>
+          <w:tcPr>
+            <w:tcW w:type="dxa" w:w="7060"/>
+            <w:tcMar>
+              <w:top w:type="dxa" w:w="40"/>
+              <w:left w:type="dxa" w:w="70"/>
+              <w:bottom w:type="dxa" w:w="40"/>
+              <w:right w:type="dxa" w:w="70"/>
+            </w:tcMar>
+          </w:tcPr>
+          <w:p>
+            <w:pPr>
+              <w:spacing w:after="18" w:line="236"/>
+            </w:pPr>
+            <w:r>
+              <w:rPr>
+                <w:rFonts w:ascii="Arial" w:cs="Arial" w:eastAsia="Arial" w:hAnsi="Arial"/>
+                <w:sz w:val="19"/>
+                <w:szCs w:val="19"/>
+              </w:rPr>
+              <w:t xml:space="preserve">El administrador está autenticado y la suscripción incluye multisede (plan Pro).</w:t>
+            </w:r>
+          </w:p>
+        </w:tc>
+      </w:tr>
+      <w:tr>
+        <w:tc>
+          <w:tcPr>
+            <w:tcW w:type="dxa" w:w="2300"/>
+            <w:shd w:fill="EAF0F8" w:val="clear"/>
+            <w:tcMar>
+              <w:top w:type="dxa" w:w="40"/>
+              <w:left w:type="dxa" w:w="70"/>
+              <w:bottom w:type="dxa" w:w="40"/>
+              <w:right w:type="dxa" w:w="70"/>
+            </w:tcMar>
+          </w:tcPr>
+          <w:p>
+            <w:pPr>
+              <w:spacing w:after="18" w:line="236"/>
+            </w:pPr>
+            <w:r>
+              <w:rPr>
+                <w:rFonts w:ascii="Arial" w:cs="Arial" w:eastAsia="Arial" w:hAnsi="Arial"/>
+                <w:b/>
+                <w:bCs/>
+                <w:sz w:val="19"/>
+                <w:szCs w:val="19"/>
+              </w:rPr>
+              <w:t xml:space="preserve">Flujo principal</w:t>
+            </w:r>
+          </w:p>
+        </w:tc>
+        <w:tc>
+          <w:tcPr>
+            <w:tcW w:type="dxa" w:w="7060"/>
+            <w:tcMar>
+              <w:top w:type="dxa" w:w="40"/>
+              <w:left w:type="dxa" w:w="70"/>
+              <w:bottom w:type="dxa" w:w="40"/>
+              <w:right w:type="dxa" w:w="70"/>
+            </w:tcMar>
+          </w:tcPr>
+          <w:p>
+            <w:pPr>
+              <w:spacing w:after="18" w:line="236"/>
+            </w:pPr>
+            <w:r>
+              <w:rPr>
+                <w:rFonts w:ascii="Arial" w:cs="Arial" w:eastAsia="Arial" w:hAnsi="Arial"/>
+                <w:sz w:val="19"/>
+                <w:szCs w:val="19"/>
+              </w:rPr>
+              <w:t xml:space="preserve">1. Elige «Registrar sede».</w:t>
+            </w:r>
+          </w:p>
+          <w:p>
+            <w:pPr>
+              <w:spacing w:after="18" w:line="236"/>
+            </w:pPr>
+            <w:r>
+              <w:rPr>
+                <w:rFonts w:ascii="Arial" w:cs="Arial" w:eastAsia="Arial" w:hAnsi="Arial"/>
+                <w:sz w:val="19"/>
+                <w:szCs w:val="19"/>
+              </w:rPr>
+              <w:t xml:space="preserve">2. Ingresa el nombre, la dirección y los datos de la sede.</w:t>
+            </w:r>
+          </w:p>
+          <w:p>
+            <w:pPr>
+              <w:spacing w:after="18" w:line="236"/>
+            </w:pPr>
+            <w:r>
+              <w:rPr>
+                <w:rFonts w:ascii="Arial" w:cs="Arial" w:eastAsia="Arial" w:hAnsi="Arial"/>
+                <w:sz w:val="19"/>
+                <w:szCs w:val="19"/>
+              </w:rPr>
+              <w:t xml:space="preserve">3. El sistema valida los datos.</w:t>
+            </w:r>
+          </w:p>
+          <w:p>
+            <w:pPr>
+              <w:spacing w:after="18" w:line="236"/>
+            </w:pPr>
+            <w:r>
+              <w:rPr>
+                <w:rFonts w:ascii="Arial" w:cs="Arial" w:eastAsia="Arial" w:hAnsi="Arial"/>
+                <w:sz w:val="19"/>
+                <w:szCs w:val="19"/>
+              </w:rPr>
+              <w:t xml:space="preserve">4. El sistema crea la sede en estado activa.</w:t>
+            </w:r>
+          </w:p>
+          <w:p>
+            <w:pPr>
+              <w:spacing w:after="18" w:line="236"/>
+            </w:pPr>
+            <w:r>
+              <w:rPr>
+                <w:rFonts w:ascii="Arial" w:cs="Arial" w:eastAsia="Arial" w:hAnsi="Arial"/>
+                <w:sz w:val="19"/>
+                <w:szCs w:val="19"/>
+              </w:rPr>
+              <w:t xml:space="preserve">5. El sistema confirma y la muestra en el listado de sedes.</w:t>
+            </w:r>
+          </w:p>
+        </w:tc>
+      </w:tr>
+      <w:tr>
+        <w:tc>
+          <w:tcPr>
+            <w:tcW w:type="dxa" w:w="2300"/>
+            <w:shd w:fill="EAF0F8" w:val="clear"/>
+            <w:tcMar>
+              <w:top w:type="dxa" w:w="40"/>
+              <w:left w:type="dxa" w:w="70"/>
+              <w:bottom w:type="dxa" w:w="40"/>
+              <w:right w:type="dxa" w:w="70"/>
+            </w:tcMar>
+          </w:tcPr>
+          <w:p>
+            <w:pPr>
+              <w:spacing w:after="18" w:line="236"/>
+            </w:pPr>
+            <w:r>
+              <w:rPr>
+                <w:rFonts w:ascii="Arial" w:cs="Arial" w:eastAsia="Arial" w:hAnsi="Arial"/>
+                <w:b/>
+                <w:bCs/>
+                <w:sz w:val="19"/>
+                <w:szCs w:val="19"/>
+              </w:rPr>
+              <w:t xml:space="preserve">Flujos alternativos</w:t>
+            </w:r>
+          </w:p>
+        </w:tc>
+        <w:tc>
+          <w:tcPr>
+            <w:tcW w:type="dxa" w:w="7060"/>
+            <w:tcMar>
+              <w:top w:type="dxa" w:w="40"/>
+              <w:left w:type="dxa" w:w="70"/>
+              <w:bottom w:type="dxa" w:w="40"/>
+              <w:right w:type="dxa" w:w="70"/>
+            </w:tcMar>
+          </w:tcPr>
+          <w:p>
+            <w:pPr>
+              <w:spacing w:after="18" w:line="236"/>
+            </w:pPr>
+            <w:r>
+              <w:rPr>
+                <w:rFonts w:ascii="Arial" w:cs="Arial" w:eastAsia="Arial" w:hAnsi="Arial"/>
+                <w:sz w:val="19"/>
+                <w:szCs w:val="19"/>
+              </w:rPr>
+              <w:t xml:space="preserve">—</w:t>
+            </w:r>
+          </w:p>
+        </w:tc>
+      </w:tr>
+      <w:tr>
+        <w:tc>
+          <w:tcPr>
+            <w:tcW w:type="dxa" w:w="2300"/>
+            <w:shd w:fill="EAF0F8" w:val="clear"/>
+            <w:tcMar>
+              <w:top w:type="dxa" w:w="40"/>
+              <w:left w:type="dxa" w:w="70"/>
+              <w:bottom w:type="dxa" w:w="40"/>
+              <w:right w:type="dxa" w:w="70"/>
+            </w:tcMar>
+          </w:tcPr>
+          <w:p>
+            <w:pPr>
+              <w:spacing w:after="18" w:line="236"/>
+            </w:pPr>
+            <w:r>
+              <w:rPr>
+                <w:rFonts w:ascii="Arial" w:cs="Arial" w:eastAsia="Arial" w:hAnsi="Arial"/>
+                <w:b/>
+                <w:bCs/>
+                <w:sz w:val="19"/>
+                <w:szCs w:val="19"/>
+              </w:rPr>
+              <w:t xml:space="preserve">Excepciones</w:t>
+            </w:r>
+          </w:p>
+        </w:tc>
+        <w:tc>
+          <w:tcPr>
+            <w:tcW w:type="dxa" w:w="7060"/>
+            <w:tcMar>
+              <w:top w:type="dxa" w:w="40"/>
+              <w:left w:type="dxa" w:w="70"/>
+              <w:bottom w:type="dxa" w:w="40"/>
+              <w:right w:type="dxa" w:w="70"/>
+            </w:tcMar>
+          </w:tcPr>
+          <w:p>
+            <w:pPr>
+              <w:spacing w:after="18" w:line="236"/>
+            </w:pPr>
+            <w:r>
+              <w:rPr>
+                <w:rFonts w:ascii="Arial" w:cs="Arial" w:eastAsia="Arial" w:hAnsi="Arial"/>
+                <w:sz w:val="19"/>
+                <w:szCs w:val="19"/>
+              </w:rPr>
+              <w:t xml:space="preserve">3a. Datos inválidos o nombre duplicado: el sistema informa y no crea la sede.</w:t>
+            </w:r>
+          </w:p>
+          <w:p>
+            <w:pPr>
+              <w:spacing w:after="18" w:line="236"/>
+            </w:pPr>
+            <w:r>
+              <w:rPr>
+                <w:rFonts w:ascii="Arial" w:cs="Arial" w:eastAsia="Arial" w:hAnsi="Arial"/>
+                <w:sz w:val="19"/>
+                <w:szCs w:val="19"/>
+              </w:rPr>
+              <w:t xml:space="preserve">*. El plan no incluye multisede: el sistema restringe la función (CU-SUS-04) e invita a cambiar de plan.</w:t>
+            </w:r>
+          </w:p>
+        </w:tc>
+      </w:tr>
+      <w:tr>
+        <w:tc>
+          <w:tcPr>
+            <w:tcW w:type="dxa" w:w="2300"/>
+            <w:shd w:fill="EAF0F8" w:val="clear"/>
+            <w:tcMar>
+              <w:top w:type="dxa" w:w="40"/>
+              <w:left w:type="dxa" w:w="70"/>
+              <w:bottom w:type="dxa" w:w="40"/>
+              <w:right w:type="dxa" w:w="70"/>
+            </w:tcMar>
+          </w:tcPr>
+          <w:p>
+            <w:pPr>
+              <w:spacing w:after="18" w:line="236"/>
+            </w:pPr>
+            <w:r>
+              <w:rPr>
+                <w:rFonts w:ascii="Arial" w:cs="Arial" w:eastAsia="Arial" w:hAnsi="Arial"/>
+                <w:b/>
+                <w:bCs/>
+                <w:sz w:val="19"/>
+                <w:szCs w:val="19"/>
+              </w:rPr>
+              <w:t xml:space="preserve">Reglas y validaciones</w:t>
+            </w:r>
+          </w:p>
+        </w:tc>
+        <w:tc>
+          <w:tcPr>
+            <w:tcW w:type="dxa" w:w="7060"/>
+            <w:tcMar>
+              <w:top w:type="dxa" w:w="40"/>
+              <w:left w:type="dxa" w:w="70"/>
+              <w:bottom w:type="dxa" w:w="40"/>
+              <w:right w:type="dxa" w:w="70"/>
+            </w:tcMar>
+          </w:tcPr>
+          <w:p>
+            <w:pPr>
+              <w:spacing w:after="18" w:line="236"/>
+            </w:pPr>
+            <w:r>
+              <w:rPr>
+                <w:rFonts w:ascii="Arial" w:cs="Arial" w:eastAsia="Arial" w:hAnsi="Arial"/>
+                <w:sz w:val="19"/>
+                <w:szCs w:val="19"/>
+              </w:rPr>
+              <w:t xml:space="preserve">La función multisede pertenece al plan Pro; cada sede maneja su propio inventario y usuarios; el nombre es único por licorera.</w:t>
+            </w:r>
+          </w:p>
+        </w:tc>
+      </w:tr>
+      <w:tr>
+        <w:tc>
+          <w:tcPr>
+            <w:tcW w:type="dxa" w:w="2300"/>
+            <w:shd w:fill="EAF0F8" w:val="clear"/>
+            <w:tcMar>
+              <w:top w:type="dxa" w:w="40"/>
+              <w:left w:type="dxa" w:w="70"/>
+              <w:bottom w:type="dxa" w:w="40"/>
+              <w:right w:type="dxa" w:w="70"/>
+            </w:tcMar>
+          </w:tcPr>
+          <w:p>
+            <w:pPr>
+              <w:spacing w:after="18" w:line="236"/>
+            </w:pPr>
+            <w:r>
+              <w:rPr>
+                <w:rFonts w:ascii="Arial" w:cs="Arial" w:eastAsia="Arial" w:hAnsi="Arial"/>
+                <w:b/>
+                <w:bCs/>
+                <w:sz w:val="19"/>
+                <w:szCs w:val="19"/>
+              </w:rPr>
+              <w:t xml:space="preserve">Postcondiciones</w:t>
+            </w:r>
+          </w:p>
+        </w:tc>
+        <w:tc>
+          <w:tcPr>
+            <w:tcW w:type="dxa" w:w="7060"/>
+            <w:tcMar>
+              <w:top w:type="dxa" w:w="40"/>
+              <w:left w:type="dxa" w:w="70"/>
+              <w:bottom w:type="dxa" w:w="40"/>
+              <w:right w:type="dxa" w:w="70"/>
+            </w:tcMar>
+          </w:tcPr>
+          <w:p>
+            <w:pPr>
+              <w:spacing w:after="18" w:line="236"/>
+            </w:pPr>
+            <w:r>
+              <w:rPr>
+                <w:rFonts w:ascii="Arial" w:cs="Arial" w:eastAsia="Arial" w:hAnsi="Arial"/>
+                <w:sz w:val="19"/>
+                <w:szCs w:val="19"/>
+              </w:rPr>
+              <w:t xml:space="preserve">La sede queda creada y disponible para operar.</w:t>
+            </w:r>
+          </w:p>
+        </w:tc>
+      </w:tr>
+      <w:tr>
+        <w:tc>
+          <w:tcPr>
+            <w:tcW w:type="dxa" w:w="2300"/>
+            <w:shd w:fill="EAF0F8" w:val="clear"/>
+            <w:tcMar>
+              <w:top w:type="dxa" w:w="40"/>
+              <w:left w:type="dxa" w:w="70"/>
+              <w:bottom w:type="dxa" w:w="40"/>
+              <w:right w:type="dxa" w:w="70"/>
+            </w:tcMar>
+          </w:tcPr>
+          <w:p>
+            <w:pPr>
+              <w:spacing w:after="18" w:line="236"/>
+            </w:pPr>
+            <w:r>
+              <w:rPr>
+                <w:rFonts w:ascii="Arial" w:cs="Arial" w:eastAsia="Arial" w:hAnsi="Arial"/>
+                <w:b/>
+                <w:bCs/>
+                <w:sz w:val="19"/>
+                <w:szCs w:val="19"/>
+              </w:rPr>
+              <w:t xml:space="preserve">Prioridad</w:t>
+            </w:r>
+          </w:p>
+        </w:tc>
+        <w:tc>
+          <w:tcPr>
+            <w:tcW w:type="dxa" w:w="7060"/>
+            <w:tcMar>
+              <w:top w:type="dxa" w:w="40"/>
+              <w:left w:type="dxa" w:w="70"/>
+              <w:bottom w:type="dxa" w:w="40"/>
+              <w:right w:type="dxa" w:w="70"/>
+            </w:tcMar>
+          </w:tcPr>
+          <w:p>
+            <w:pPr>
+              <w:spacing w:after="18" w:line="236"/>
+            </w:pPr>
+            <w:r>
+              <w:rPr>
+                <w:rFonts w:ascii="Arial" w:cs="Arial" w:eastAsia="Arial" w:hAnsi="Arial"/>
+                <w:sz w:val="19"/>
+                <w:szCs w:val="19"/>
+              </w:rPr>
+              <w:t xml:space="preserve">Alta</w:t>
+            </w:r>
+          </w:p>
+        </w:tc>
+      </w:tr>
+    </w:tbl>
+    <w:p>
+      <w:pPr>
+        <w:spacing w:after="140"/>
+      </w:pPr>
+    </w:p>
+    <w:tbl>
+      <w:tblPr>
+        <w:tblW w:type="dxa" w:w="9360"/>
+        <w:tblBorders>
+          <w:top w:val="single" w:color="9CA3AF" w:sz="6"/>
+          <w:left w:val="single" w:color="9CA3AF" w:sz="6"/>
+          <w:bottom w:val="single" w:color="9CA3AF" w:sz="6"/>
+          <w:right w:val="single" w:color="9CA3AF" w:sz="6"/>
+          <w:insideH w:val="single" w:color="9CA3AF" w:sz="6"/>
+          <w:insideV w:val="single" w:color="9CA3AF" w:sz="6"/>
+        </w:tblBorders>
+        <w:tblLayout w:type="fixed"/>
+      </w:tblPr>
+      <w:tblGrid>
+        <w:gridCol w:w="2300"/>
+        <w:gridCol w:w="7060"/>
+      </w:tblGrid>
+      <w:tr>
+        <w:tc>
+          <w:tcPr>
+            <w:tcW w:type="dxa" w:w="9360"/>
+            <w:gridSpan w:val="2"/>
+            <w:shd w:fill="1F3864" w:val="clear"/>
+            <w:tcMar>
+              <w:top w:type="dxa" w:w="40"/>
+              <w:left w:type="dxa" w:w="70"/>
+              <w:bottom w:type="dxa" w:w="40"/>
+              <w:right w:type="dxa" w:w="70"/>
+            </w:tcMar>
+          </w:tcPr>
+          <w:p>
+            <w:pPr>
+              <w:spacing w:after="18" w:line="236"/>
+            </w:pPr>
+            <w:r>
+              <w:rPr>
+                <w:rFonts w:ascii="Arial" w:cs="Arial" w:eastAsia="Arial" w:hAnsi="Arial"/>
+                <w:b/>
+                <w:bCs/>
+                <w:color w:val="FFFFFF"/>
+                <w:sz w:val="19"/>
+                <w:szCs w:val="19"/>
+              </w:rPr>
+              <w:t xml:space="preserve">CU-SED-02 — Gestionar sedes</w:t>
+            </w:r>
+          </w:p>
+        </w:tc>
+      </w:tr>
+      <w:tr>
+        <w:tc>
+          <w:tcPr>
+            <w:tcW w:type="dxa" w:w="2300"/>
+            <w:shd w:fill="EAF0F8" w:val="clear"/>
+            <w:tcMar>
+              <w:top w:type="dxa" w:w="40"/>
+              <w:left w:type="dxa" w:w="70"/>
+              <w:bottom w:type="dxa" w:w="40"/>
+              <w:right w:type="dxa" w:w="70"/>
+            </w:tcMar>
+          </w:tcPr>
+          <w:p>
+            <w:pPr>
+              <w:spacing w:after="18" w:line="236"/>
+            </w:pPr>
+            <w:r>
+              <w:rPr>
+                <w:rFonts w:ascii="Arial" w:cs="Arial" w:eastAsia="Arial" w:hAnsi="Arial"/>
+                <w:b/>
+                <w:bCs/>
+                <w:sz w:val="19"/>
+                <w:szCs w:val="19"/>
+              </w:rPr>
+              <w:t xml:space="preserve">Actor(es)</w:t>
+            </w:r>
+          </w:p>
+        </w:tc>
+        <w:tc>
+          <w:tcPr>
+            <w:tcW w:type="dxa" w:w="7060"/>
+            <w:tcMar>
+              <w:top w:type="dxa" w:w="40"/>
+              <w:left w:type="dxa" w:w="70"/>
+              <w:bottom w:type="dxa" w:w="40"/>
+              <w:right w:type="dxa" w:w="70"/>
+            </w:tcMar>
+          </w:tcPr>
+          <w:p>
+            <w:pPr>
+              <w:spacing w:after="18" w:line="236"/>
+            </w:pPr>
+            <w:r>
+              <w:rPr>
+                <w:rFonts w:ascii="Arial" w:cs="Arial" w:eastAsia="Arial" w:hAnsi="Arial"/>
+                <w:sz w:val="19"/>
+                <w:szCs w:val="19"/>
+              </w:rPr>
+              <w:t xml:space="preserve">Administrador</w:t>
+            </w:r>
+          </w:p>
+        </w:tc>
+      </w:tr>
+      <w:tr>
+        <w:tc>
+          <w:tcPr>
+            <w:tcW w:type="dxa" w:w="2300"/>
+            <w:shd w:fill="EAF0F8" w:val="clear"/>
+            <w:tcMar>
+              <w:top w:type="dxa" w:w="40"/>
+              <w:left w:type="dxa" w:w="70"/>
+              <w:bottom w:type="dxa" w:w="40"/>
+              <w:right w:type="dxa" w:w="70"/>
+            </w:tcMar>
+          </w:tcPr>
+          <w:p>
+            <w:pPr>
+              <w:spacing w:after="18" w:line="236"/>
+            </w:pPr>
+            <w:r>
+              <w:rPr>
+                <w:rFonts w:ascii="Arial" w:cs="Arial" w:eastAsia="Arial" w:hAnsi="Arial"/>
+                <w:b/>
+                <w:bCs/>
+                <w:sz w:val="19"/>
+                <w:szCs w:val="19"/>
+              </w:rPr>
+              <w:t xml:space="preserve">Requisito</w:t>
+            </w:r>
+          </w:p>
+        </w:tc>
+        <w:tc>
+          <w:tcPr>
+            <w:tcW w:type="dxa" w:w="7060"/>
+            <w:tcMar>
+              <w:top w:type="dxa" w:w="40"/>
+              <w:left w:type="dxa" w:w="70"/>
+              <w:bottom w:type="dxa" w:w="40"/>
+              <w:right w:type="dxa" w:w="70"/>
+            </w:tcMar>
+          </w:tcPr>
+          <w:p>
+            <w:pPr>
+              <w:spacing w:after="18" w:line="236"/>
+            </w:pPr>
+            <w:r>
+              <w:rPr>
+                <w:rFonts w:ascii="Arial" w:cs="Arial" w:eastAsia="Arial" w:hAnsi="Arial"/>
+                <w:sz w:val="19"/>
+                <w:szCs w:val="19"/>
+              </w:rPr>
+              <w:t xml:space="preserve">RF-SED-02</w:t>
+            </w:r>
+          </w:p>
+        </w:tc>
+      </w:tr>
+      <w:tr>
+        <w:tc>
+          <w:tcPr>
+            <w:tcW w:type="dxa" w:w="2300"/>
+            <w:shd w:fill="EAF0F8" w:val="clear"/>
+            <w:tcMar>
+              <w:top w:type="dxa" w:w="40"/>
+              <w:left w:type="dxa" w:w="70"/>
+              <w:bottom w:type="dxa" w:w="40"/>
+              <w:right w:type="dxa" w:w="70"/>
+            </w:tcMar>
+          </w:tcPr>
+          <w:p>
+            <w:pPr>
+              <w:spacing w:after="18" w:line="236"/>
+            </w:pPr>
+            <w:r>
+              <w:rPr>
+                <w:rFonts w:ascii="Arial" w:cs="Arial" w:eastAsia="Arial" w:hAnsi="Arial"/>
+                <w:b/>
+                <w:bCs/>
+                <w:sz w:val="19"/>
+                <w:szCs w:val="19"/>
+              </w:rPr>
+              <w:t xml:space="preserve">Descripción</w:t>
+            </w:r>
+          </w:p>
+        </w:tc>
+        <w:tc>
+          <w:tcPr>
+            <w:tcW w:type="dxa" w:w="7060"/>
+            <w:tcMar>
+              <w:top w:type="dxa" w:w="40"/>
+              <w:left w:type="dxa" w:w="70"/>
+              <w:bottom w:type="dxa" w:w="40"/>
+              <w:right w:type="dxa" w:w="70"/>
+            </w:tcMar>
+          </w:tcPr>
+          <w:p>
+            <w:pPr>
+              <w:spacing w:after="18" w:line="236"/>
+            </w:pPr>
+            <w:r>
+              <w:rPr>
+                <w:rFonts w:ascii="Arial" w:cs="Arial" w:eastAsia="Arial" w:hAnsi="Arial"/>
+                <w:sz w:val="19"/>
+                <w:szCs w:val="19"/>
+              </w:rPr>
+              <w:t xml:space="preserve">El administrador consulta, edita e inactiva las sedes.</w:t>
+            </w:r>
+          </w:p>
+        </w:tc>
+      </w:tr>
+      <w:tr>
+        <w:tc>
+          <w:tcPr>
+            <w:tcW w:type="dxa" w:w="2300"/>
+            <w:shd w:fill="EAF0F8" w:val="clear"/>
+            <w:tcMar>
+              <w:top w:type="dxa" w:w="40"/>
+              <w:left w:type="dxa" w:w="70"/>
+              <w:bottom w:type="dxa" w:w="40"/>
+              <w:right w:type="dxa" w:w="70"/>
+            </w:tcMar>
+          </w:tcPr>
+          <w:p>
+            <w:pPr>
+              <w:spacing w:after="18" w:line="236"/>
+            </w:pPr>
+            <w:r>
+              <w:rPr>
+                <w:rFonts w:ascii="Arial" w:cs="Arial" w:eastAsia="Arial" w:hAnsi="Arial"/>
+                <w:b/>
+                <w:bCs/>
+                <w:sz w:val="19"/>
+                <w:szCs w:val="19"/>
+              </w:rPr>
+              <w:t xml:space="preserve">Precondiciones</w:t>
+            </w:r>
+          </w:p>
+        </w:tc>
+        <w:tc>
+          <w:tcPr>
+            <w:tcW w:type="dxa" w:w="7060"/>
+            <w:tcMar>
+              <w:top w:type="dxa" w:w="40"/>
+              <w:left w:type="dxa" w:w="70"/>
+              <w:bottom w:type="dxa" w:w="40"/>
+              <w:right w:type="dxa" w:w="70"/>
+            </w:tcMar>
+          </w:tcPr>
+          <w:p>
+            <w:pPr>
+              <w:spacing w:after="18" w:line="236"/>
+            </w:pPr>
+            <w:r>
+              <w:rPr>
+                <w:rFonts w:ascii="Arial" w:cs="Arial" w:eastAsia="Arial" w:hAnsi="Arial"/>
+                <w:sz w:val="19"/>
+                <w:szCs w:val="19"/>
+              </w:rPr>
+              <w:t xml:space="preserve">Existen sedes registradas y la suscripción incluye multisede.</w:t>
+            </w:r>
+          </w:p>
+        </w:tc>
+      </w:tr>
+      <w:tr>
+        <w:tc>
+          <w:tcPr>
+            <w:tcW w:type="dxa" w:w="2300"/>
+            <w:shd w:fill="EAF0F8" w:val="clear"/>
+            <w:tcMar>
+              <w:top w:type="dxa" w:w="40"/>
+              <w:left w:type="dxa" w:w="70"/>
+              <w:bottom w:type="dxa" w:w="40"/>
+              <w:right w:type="dxa" w:w="70"/>
+            </w:tcMar>
+          </w:tcPr>
+          <w:p>
+            <w:pPr>
+              <w:spacing w:after="18" w:line="236"/>
+            </w:pPr>
+            <w:r>
+              <w:rPr>
+                <w:rFonts w:ascii="Arial" w:cs="Arial" w:eastAsia="Arial" w:hAnsi="Arial"/>
+                <w:b/>
+                <w:bCs/>
+                <w:sz w:val="19"/>
+                <w:szCs w:val="19"/>
+              </w:rPr>
+              <w:t xml:space="preserve">Flujo principal</w:t>
+            </w:r>
+          </w:p>
+        </w:tc>
+        <w:tc>
+          <w:tcPr>
+            <w:tcW w:type="dxa" w:w="7060"/>
+            <w:tcMar>
+              <w:top w:type="dxa" w:w="40"/>
+              <w:left w:type="dxa" w:w="70"/>
+              <w:bottom w:type="dxa" w:w="40"/>
+              <w:right w:type="dxa" w:w="70"/>
+            </w:tcMar>
+          </w:tcPr>
+          <w:p>
+            <w:pPr>
+              <w:spacing w:after="18" w:line="236"/>
+            </w:pPr>
+            <w:r>
+              <w:rPr>
+                <w:rFonts w:ascii="Arial" w:cs="Arial" w:eastAsia="Arial" w:hAnsi="Arial"/>
+                <w:sz w:val="19"/>
+                <w:szCs w:val="19"/>
+              </w:rPr>
+              <w:t xml:space="preserve">1. Abre la administración de sedes.</w:t>
+            </w:r>
+          </w:p>
+          <w:p>
+            <w:pPr>
+              <w:spacing w:after="18" w:line="236"/>
+            </w:pPr>
+            <w:r>
+              <w:rPr>
+                <w:rFonts w:ascii="Arial" w:cs="Arial" w:eastAsia="Arial" w:hAnsi="Arial"/>
+                <w:sz w:val="19"/>
+                <w:szCs w:val="19"/>
+              </w:rPr>
+              <w:t xml:space="preserve">2. El sistema muestra las sedes con su estado.</w:t>
+            </w:r>
+          </w:p>
+          <w:p>
+            <w:pPr>
+              <w:spacing w:after="18" w:line="236"/>
+            </w:pPr>
+            <w:r>
+              <w:rPr>
+                <w:rFonts w:ascii="Arial" w:cs="Arial" w:eastAsia="Arial" w:hAnsi="Arial"/>
+                <w:sz w:val="19"/>
+                <w:szCs w:val="19"/>
+              </w:rPr>
+              <w:t xml:space="preserve">3. Selecciona una sede y edita sus datos o cambia su estado.</w:t>
+            </w:r>
+          </w:p>
+          <w:p>
+            <w:pPr>
+              <w:spacing w:after="18" w:line="236"/>
+            </w:pPr>
+            <w:r>
+              <w:rPr>
+                <w:rFonts w:ascii="Arial" w:cs="Arial" w:eastAsia="Arial" w:hAnsi="Arial"/>
+                <w:sz w:val="19"/>
+                <w:szCs w:val="19"/>
+              </w:rPr>
+              <w:t xml:space="preserve">4. El sistema valida y guarda los cambios.</w:t>
+            </w:r>
+          </w:p>
+        </w:tc>
+      </w:tr>
+      <w:tr>
+        <w:tc>
+          <w:tcPr>
+            <w:tcW w:type="dxa" w:w="2300"/>
+            <w:shd w:fill="EAF0F8" w:val="clear"/>
+            <w:tcMar>
+              <w:top w:type="dxa" w:w="40"/>
+              <w:left w:type="dxa" w:w="70"/>
+              <w:bottom w:type="dxa" w:w="40"/>
+              <w:right w:type="dxa" w:w="70"/>
+            </w:tcMar>
+          </w:tcPr>
+          <w:p>
+            <w:pPr>
+              <w:spacing w:after="18" w:line="236"/>
+            </w:pPr>
+            <w:r>
+              <w:rPr>
+                <w:rFonts w:ascii="Arial" w:cs="Arial" w:eastAsia="Arial" w:hAnsi="Arial"/>
+                <w:b/>
+                <w:bCs/>
+                <w:sz w:val="19"/>
+                <w:szCs w:val="19"/>
+              </w:rPr>
+              <w:t xml:space="preserve">Flujos alternativos</w:t>
+            </w:r>
+          </w:p>
+        </w:tc>
+        <w:tc>
+          <w:tcPr>
+            <w:tcW w:type="dxa" w:w="7060"/>
+            <w:tcMar>
+              <w:top w:type="dxa" w:w="40"/>
+              <w:left w:type="dxa" w:w="70"/>
+              <w:bottom w:type="dxa" w:w="40"/>
+              <w:right w:type="dxa" w:w="70"/>
+            </w:tcMar>
+          </w:tcPr>
+          <w:p>
+            <w:pPr>
+              <w:spacing w:after="18" w:line="236"/>
+            </w:pPr>
+            <w:r>
+              <w:rPr>
+                <w:rFonts w:ascii="Arial" w:cs="Arial" w:eastAsia="Arial" w:hAnsi="Arial"/>
+                <w:sz w:val="19"/>
+                <w:szCs w:val="19"/>
+              </w:rPr>
+              <w:t xml:space="preserve">3a. Inactivar una sede (baja lógica).</w:t>
+            </w:r>
+          </w:p>
+          <w:p>
+            <w:pPr>
+              <w:spacing w:after="18" w:line="236"/>
+            </w:pPr>
+            <w:r>
+              <w:rPr>
+                <w:rFonts w:ascii="Arial" w:cs="Arial" w:eastAsia="Arial" w:hAnsi="Arial"/>
+                <w:sz w:val="19"/>
+                <w:szCs w:val="19"/>
+              </w:rPr>
+              <w:t xml:space="preserve">3b. Reactivar una sede inactiva.</w:t>
+            </w:r>
+          </w:p>
+        </w:tc>
+      </w:tr>
+      <w:tr>
+        <w:tc>
+          <w:tcPr>
+            <w:tcW w:type="dxa" w:w="2300"/>
+            <w:shd w:fill="EAF0F8" w:val="clear"/>
+            <w:tcMar>
+              <w:top w:type="dxa" w:w="40"/>
+              <w:left w:type="dxa" w:w="70"/>
+              <w:bottom w:type="dxa" w:w="40"/>
+              <w:right w:type="dxa" w:w="70"/>
+            </w:tcMar>
+          </w:tcPr>
+          <w:p>
+            <w:pPr>
+              <w:spacing w:after="18" w:line="236"/>
+            </w:pPr>
+            <w:r>
+              <w:rPr>
+                <w:rFonts w:ascii="Arial" w:cs="Arial" w:eastAsia="Arial" w:hAnsi="Arial"/>
+                <w:b/>
+                <w:bCs/>
+                <w:sz w:val="19"/>
+                <w:szCs w:val="19"/>
+              </w:rPr>
+              <w:t xml:space="preserve">Excepciones</w:t>
+            </w:r>
+          </w:p>
+        </w:tc>
+        <w:tc>
+          <w:tcPr>
+            <w:tcW w:type="dxa" w:w="7060"/>
+            <w:tcMar>
+              <w:top w:type="dxa" w:w="40"/>
+              <w:left w:type="dxa" w:w="70"/>
+              <w:bottom w:type="dxa" w:w="40"/>
+              <w:right w:type="dxa" w:w="70"/>
+            </w:tcMar>
+          </w:tcPr>
+          <w:p>
+            <w:pPr>
+              <w:spacing w:after="18" w:line="236"/>
+            </w:pPr>
+            <w:r>
+              <w:rPr>
+                <w:rFonts w:ascii="Arial" w:cs="Arial" w:eastAsia="Arial" w:hAnsi="Arial"/>
+                <w:sz w:val="19"/>
+                <w:szCs w:val="19"/>
+              </w:rPr>
+              <w:t xml:space="preserve">*. Sede con inventario o ventas activas: el sistema advierte antes de inactivarla.</w:t>
+            </w:r>
+          </w:p>
+        </w:tc>
+      </w:tr>
+      <w:tr>
+        <w:tc>
+          <w:tcPr>
+            <w:tcW w:type="dxa" w:w="2300"/>
+            <w:shd w:fill="EAF0F8" w:val="clear"/>
+            <w:tcMar>
+              <w:top w:type="dxa" w:w="40"/>
+              <w:left w:type="dxa" w:w="70"/>
+              <w:bottom w:type="dxa" w:w="40"/>
+              <w:right w:type="dxa" w:w="70"/>
+            </w:tcMar>
+          </w:tcPr>
+          <w:p>
+            <w:pPr>
+              <w:spacing w:after="18" w:line="236"/>
+            </w:pPr>
+            <w:r>
+              <w:rPr>
+                <w:rFonts w:ascii="Arial" w:cs="Arial" w:eastAsia="Arial" w:hAnsi="Arial"/>
+                <w:b/>
+                <w:bCs/>
+                <w:sz w:val="19"/>
+                <w:szCs w:val="19"/>
+              </w:rPr>
+              <w:t xml:space="preserve">Reglas y validaciones</w:t>
+            </w:r>
+          </w:p>
+        </w:tc>
+        <w:tc>
+          <w:tcPr>
+            <w:tcW w:type="dxa" w:w="7060"/>
+            <w:tcMar>
+              <w:top w:type="dxa" w:w="40"/>
+              <w:left w:type="dxa" w:w="70"/>
+              <w:bottom w:type="dxa" w:w="40"/>
+              <w:right w:type="dxa" w:w="70"/>
+            </w:tcMar>
+          </w:tcPr>
+          <w:p>
+            <w:pPr>
+              <w:spacing w:after="18" w:line="236"/>
+            </w:pPr>
+            <w:r>
+              <w:rPr>
+                <w:rFonts w:ascii="Arial" w:cs="Arial" w:eastAsia="Arial" w:hAnsi="Arial"/>
+                <w:sz w:val="19"/>
+                <w:szCs w:val="19"/>
+              </w:rPr>
+              <w:t xml:space="preserve">La baja es lógica para conservar el historial; una sede inactiva no opera (no recibe ventas ni inventario).</w:t>
+            </w:r>
+          </w:p>
+        </w:tc>
+      </w:tr>
+      <w:tr>
+        <w:tc>
+          <w:tcPr>
+            <w:tcW w:type="dxa" w:w="2300"/>
+            <w:shd w:fill="EAF0F8" w:val="clear"/>
+            <w:tcMar>
+              <w:top w:type="dxa" w:w="40"/>
+              <w:left w:type="dxa" w:w="70"/>
+              <w:bottom w:type="dxa" w:w="40"/>
+              <w:right w:type="dxa" w:w="70"/>
+            </w:tcMar>
+          </w:tcPr>
+          <w:p>
+            <w:pPr>
+              <w:spacing w:after="18" w:line="236"/>
+            </w:pPr>
+            <w:r>
+              <w:rPr>
+                <w:rFonts w:ascii="Arial" w:cs="Arial" w:eastAsia="Arial" w:hAnsi="Arial"/>
+                <w:b/>
+                <w:bCs/>
+                <w:sz w:val="19"/>
+                <w:szCs w:val="19"/>
+              </w:rPr>
+              <w:t xml:space="preserve">Postcondiciones</w:t>
+            </w:r>
+          </w:p>
+        </w:tc>
+        <w:tc>
+          <w:tcPr>
+            <w:tcW w:type="dxa" w:w="7060"/>
+            <w:tcMar>
+              <w:top w:type="dxa" w:w="40"/>
+              <w:left w:type="dxa" w:w="70"/>
+              <w:bottom w:type="dxa" w:w="40"/>
+              <w:right w:type="dxa" w:w="70"/>
+            </w:tcMar>
+          </w:tcPr>
+          <w:p>
+            <w:pPr>
+              <w:spacing w:after="18" w:line="236"/>
+            </w:pPr>
+            <w:r>
+              <w:rPr>
+                <w:rFonts w:ascii="Arial" w:cs="Arial" w:eastAsia="Arial" w:hAnsi="Arial"/>
+                <w:sz w:val="19"/>
+                <w:szCs w:val="19"/>
+              </w:rPr>
+              <w:t xml:space="preserve">Las sedes quedan actualizadas.</w:t>
+            </w:r>
+          </w:p>
+        </w:tc>
+      </w:tr>
+      <w:tr>
+        <w:tc>
+          <w:tcPr>
+            <w:tcW w:type="dxa" w:w="2300"/>
+            <w:shd w:fill="EAF0F8" w:val="clear"/>
+            <w:tcMar>
+              <w:top w:type="dxa" w:w="40"/>
+              <w:left w:type="dxa" w:w="70"/>
+              <w:bottom w:type="dxa" w:w="40"/>
+              <w:right w:type="dxa" w:w="70"/>
+            </w:tcMar>
+          </w:tcPr>
+          <w:p>
+            <w:pPr>
+              <w:spacing w:after="18" w:line="236"/>
+            </w:pPr>
+            <w:r>
+              <w:rPr>
+                <w:rFonts w:ascii="Arial" w:cs="Arial" w:eastAsia="Arial" w:hAnsi="Arial"/>
+                <w:b/>
+                <w:bCs/>
+                <w:sz w:val="19"/>
+                <w:szCs w:val="19"/>
+              </w:rPr>
+              <w:t xml:space="preserve">Prioridad</w:t>
+            </w:r>
+          </w:p>
+        </w:tc>
+        <w:tc>
+          <w:tcPr>
+            <w:tcW w:type="dxa" w:w="7060"/>
+            <w:tcMar>
+              <w:top w:type="dxa" w:w="40"/>
+              <w:left w:type="dxa" w:w="70"/>
+              <w:bottom w:type="dxa" w:w="40"/>
+              <w:right w:type="dxa" w:w="70"/>
+            </w:tcMar>
+          </w:tcPr>
+          <w:p>
+            <w:pPr>
+              <w:spacing w:after="18" w:line="236"/>
+            </w:pPr>
+            <w:r>
+              <w:rPr>
+                <w:rFonts w:ascii="Arial" w:cs="Arial" w:eastAsia="Arial" w:hAnsi="Arial"/>
+                <w:sz w:val="19"/>
+                <w:szCs w:val="19"/>
+              </w:rPr>
+              <w:t xml:space="preserve">Media</w:t>
+            </w:r>
+          </w:p>
+        </w:tc>
+      </w:tr>
+    </w:tbl>
+    <w:p>
+      <w:pPr>
+        <w:spacing w:after="140"/>
+      </w:pPr>
+    </w:p>
+    <w:tbl>
+      <w:tblPr>
+        <w:tblW w:type="dxa" w:w="9360"/>
+        <w:tblBorders>
+          <w:top w:val="single" w:color="9CA3AF" w:sz="6"/>
+          <w:left w:val="single" w:color="9CA3AF" w:sz="6"/>
+          <w:bottom w:val="single" w:color="9CA3AF" w:sz="6"/>
+          <w:right w:val="single" w:color="9CA3AF" w:sz="6"/>
+          <w:insideH w:val="single" w:color="9CA3AF" w:sz="6"/>
+          <w:insideV w:val="single" w:color="9CA3AF" w:sz="6"/>
+        </w:tblBorders>
+        <w:tblLayout w:type="fixed"/>
+      </w:tblPr>
+      <w:tblGrid>
+        <w:gridCol w:w="2300"/>
+        <w:gridCol w:w="7060"/>
+      </w:tblGrid>
+      <w:tr>
+        <w:tc>
+          <w:tcPr>
+            <w:tcW w:type="dxa" w:w="9360"/>
+            <w:gridSpan w:val="2"/>
+            <w:shd w:fill="1F3864" w:val="clear"/>
+            <w:tcMar>
+              <w:top w:type="dxa" w:w="40"/>
+              <w:left w:type="dxa" w:w="70"/>
+              <w:bottom w:type="dxa" w:w="40"/>
+              <w:right w:type="dxa" w:w="70"/>
+            </w:tcMar>
+          </w:tcPr>
+          <w:p>
+            <w:pPr>
+              <w:spacing w:after="18" w:line="236"/>
+            </w:pPr>
+            <w:r>
+              <w:rPr>
+                <w:rFonts w:ascii="Arial" w:cs="Arial" w:eastAsia="Arial" w:hAnsi="Arial"/>
+                <w:b/>
+                <w:bCs/>
+                <w:color w:val="FFFFFF"/>
+                <w:sz w:val="19"/>
+                <w:szCs w:val="19"/>
+              </w:rPr>
+              <w:t xml:space="preserve">CU-SED-03 — Asignar usuarios a sedes</w:t>
+            </w:r>
+          </w:p>
+        </w:tc>
+      </w:tr>
+      <w:tr>
+        <w:tc>
+          <w:tcPr>
+            <w:tcW w:type="dxa" w:w="2300"/>
+            <w:shd w:fill="EAF0F8" w:val="clear"/>
+            <w:tcMar>
+              <w:top w:type="dxa" w:w="40"/>
+              <w:left w:type="dxa" w:w="70"/>
+              <w:bottom w:type="dxa" w:w="40"/>
+              <w:right w:type="dxa" w:w="70"/>
+            </w:tcMar>
+          </w:tcPr>
+          <w:p>
+            <w:pPr>
+              <w:spacing w:after="18" w:line="236"/>
+            </w:pPr>
+            <w:r>
+              <w:rPr>
+                <w:rFonts w:ascii="Arial" w:cs="Arial" w:eastAsia="Arial" w:hAnsi="Arial"/>
+                <w:b/>
+                <w:bCs/>
+                <w:sz w:val="19"/>
+                <w:szCs w:val="19"/>
+              </w:rPr>
+              <w:t xml:space="preserve">Actor(es)</w:t>
+            </w:r>
+          </w:p>
+        </w:tc>
+        <w:tc>
+          <w:tcPr>
+            <w:tcW w:type="dxa" w:w="7060"/>
+            <w:tcMar>
+              <w:top w:type="dxa" w:w="40"/>
+              <w:left w:type="dxa" w:w="70"/>
+              <w:bottom w:type="dxa" w:w="40"/>
+              <w:right w:type="dxa" w:w="70"/>
+            </w:tcMar>
+          </w:tcPr>
+          <w:p>
+            <w:pPr>
+              <w:spacing w:after="18" w:line="236"/>
+            </w:pPr>
+            <w:r>
+              <w:rPr>
+                <w:rFonts w:ascii="Arial" w:cs="Arial" w:eastAsia="Arial" w:hAnsi="Arial"/>
+                <w:sz w:val="19"/>
+                <w:szCs w:val="19"/>
+              </w:rPr>
+              <w:t xml:space="preserve">Administrador</w:t>
+            </w:r>
+          </w:p>
+        </w:tc>
+      </w:tr>
+      <w:tr>
+        <w:tc>
+          <w:tcPr>
+            <w:tcW w:type="dxa" w:w="2300"/>
+            <w:shd w:fill="EAF0F8" w:val="clear"/>
+            <w:tcMar>
+              <w:top w:type="dxa" w:w="40"/>
+              <w:left w:type="dxa" w:w="70"/>
+              <w:bottom w:type="dxa" w:w="40"/>
+              <w:right w:type="dxa" w:w="70"/>
+            </w:tcMar>
+          </w:tcPr>
+          <w:p>
+            <w:pPr>
+              <w:spacing w:after="18" w:line="236"/>
+            </w:pPr>
+            <w:r>
+              <w:rPr>
+                <w:rFonts w:ascii="Arial" w:cs="Arial" w:eastAsia="Arial" w:hAnsi="Arial"/>
+                <w:b/>
+                <w:bCs/>
+                <w:sz w:val="19"/>
+                <w:szCs w:val="19"/>
+              </w:rPr>
+              <w:t xml:space="preserve">Requisito</w:t>
+            </w:r>
+          </w:p>
+        </w:tc>
+        <w:tc>
+          <w:tcPr>
+            <w:tcW w:type="dxa" w:w="7060"/>
+            <w:tcMar>
+              <w:top w:type="dxa" w:w="40"/>
+              <w:left w:type="dxa" w:w="70"/>
+              <w:bottom w:type="dxa" w:w="40"/>
+              <w:right w:type="dxa" w:w="70"/>
+            </w:tcMar>
+          </w:tcPr>
+          <w:p>
+            <w:pPr>
+              <w:spacing w:after="18" w:line="236"/>
+            </w:pPr>
+            <w:r>
+              <w:rPr>
+                <w:rFonts w:ascii="Arial" w:cs="Arial" w:eastAsia="Arial" w:hAnsi="Arial"/>
+                <w:sz w:val="19"/>
+                <w:szCs w:val="19"/>
+              </w:rPr>
+              <w:t xml:space="preserve">RF-SED-03</w:t>
+            </w:r>
+          </w:p>
+        </w:tc>
+      </w:tr>
+      <w:tr>
+        <w:tc>
+          <w:tcPr>
+            <w:tcW w:type="dxa" w:w="2300"/>
+            <w:shd w:fill="EAF0F8" w:val="clear"/>
+            <w:tcMar>
+              <w:top w:type="dxa" w:w="40"/>
+              <w:left w:type="dxa" w:w="70"/>
+              <w:bottom w:type="dxa" w:w="40"/>
+              <w:right w:type="dxa" w:w="70"/>
+            </w:tcMar>
+          </w:tcPr>
+          <w:p>
+            <w:pPr>
+              <w:spacing w:after="18" w:line="236"/>
+            </w:pPr>
+            <w:r>
+              <w:rPr>
+                <w:rFonts w:ascii="Arial" w:cs="Arial" w:eastAsia="Arial" w:hAnsi="Arial"/>
+                <w:b/>
+                <w:bCs/>
+                <w:sz w:val="19"/>
+                <w:szCs w:val="19"/>
+              </w:rPr>
+              <w:t xml:space="preserve">Descripción</w:t>
+            </w:r>
+          </w:p>
+        </w:tc>
+        <w:tc>
+          <w:tcPr>
+            <w:tcW w:type="dxa" w:w="7060"/>
+            <w:tcMar>
+              <w:top w:type="dxa" w:w="40"/>
+              <w:left w:type="dxa" w:w="70"/>
+              <w:bottom w:type="dxa" w:w="40"/>
+              <w:right w:type="dxa" w:w="70"/>
+            </w:tcMar>
+          </w:tcPr>
+          <w:p>
+            <w:pPr>
+              <w:spacing w:after="18" w:line="236"/>
+            </w:pPr>
+            <w:r>
+              <w:rPr>
+                <w:rFonts w:ascii="Arial" w:cs="Arial" w:eastAsia="Arial" w:hAnsi="Arial"/>
+                <w:sz w:val="19"/>
+                <w:szCs w:val="19"/>
+              </w:rPr>
+              <w:t xml:space="preserve">El administrador asigna los usuarios (vendedores) a las sedes donde trabajarán.</w:t>
+            </w:r>
+          </w:p>
+        </w:tc>
+      </w:tr>
+      <w:tr>
+        <w:tc>
+          <w:tcPr>
+            <w:tcW w:type="dxa" w:w="2300"/>
+            <w:shd w:fill="EAF0F8" w:val="clear"/>
+            <w:tcMar>
+              <w:top w:type="dxa" w:w="40"/>
+              <w:left w:type="dxa" w:w="70"/>
+              <w:bottom w:type="dxa" w:w="40"/>
+              <w:right w:type="dxa" w:w="70"/>
+            </w:tcMar>
+          </w:tcPr>
+          <w:p>
+            <w:pPr>
+              <w:spacing w:after="18" w:line="236"/>
+            </w:pPr>
+            <w:r>
+              <w:rPr>
+                <w:rFonts w:ascii="Arial" w:cs="Arial" w:eastAsia="Arial" w:hAnsi="Arial"/>
+                <w:b/>
+                <w:bCs/>
+                <w:sz w:val="19"/>
+                <w:szCs w:val="19"/>
+              </w:rPr>
+              <w:t xml:space="preserve">Precondiciones</w:t>
+            </w:r>
+          </w:p>
+        </w:tc>
+        <w:tc>
+          <w:tcPr>
+            <w:tcW w:type="dxa" w:w="7060"/>
+            <w:tcMar>
+              <w:top w:type="dxa" w:w="40"/>
+              <w:left w:type="dxa" w:w="70"/>
+              <w:bottom w:type="dxa" w:w="40"/>
+              <w:right w:type="dxa" w:w="70"/>
+            </w:tcMar>
+          </w:tcPr>
+          <w:p>
+            <w:pPr>
+              <w:spacing w:after="18" w:line="236"/>
+            </w:pPr>
+            <w:r>
+              <w:rPr>
+                <w:rFonts w:ascii="Arial" w:cs="Arial" w:eastAsia="Arial" w:hAnsi="Arial"/>
+                <w:sz w:val="19"/>
+                <w:szCs w:val="19"/>
+              </w:rPr>
+              <w:t xml:space="preserve">Existen usuarios y sedes; la suscripción incluye multisede.</w:t>
+            </w:r>
+          </w:p>
+        </w:tc>
+      </w:tr>
+      <w:tr>
+        <w:tc>
+          <w:tcPr>
+            <w:tcW w:type="dxa" w:w="2300"/>
+            <w:shd w:fill="EAF0F8" w:val="clear"/>
+            <w:tcMar>
+              <w:top w:type="dxa" w:w="40"/>
+              <w:left w:type="dxa" w:w="70"/>
+              <w:bottom w:type="dxa" w:w="40"/>
+              <w:right w:type="dxa" w:w="70"/>
+            </w:tcMar>
+          </w:tcPr>
+          <w:p>
+            <w:pPr>
+              <w:spacing w:after="18" w:line="236"/>
+            </w:pPr>
+            <w:r>
+              <w:rPr>
+                <w:rFonts w:ascii="Arial" w:cs="Arial" w:eastAsia="Arial" w:hAnsi="Arial"/>
+                <w:b/>
+                <w:bCs/>
+                <w:sz w:val="19"/>
+                <w:szCs w:val="19"/>
+              </w:rPr>
+              <w:t xml:space="preserve">Flujo principal</w:t>
+            </w:r>
+          </w:p>
+        </w:tc>
+        <w:tc>
+          <w:tcPr>
+            <w:tcW w:type="dxa" w:w="7060"/>
+            <w:tcMar>
+              <w:top w:type="dxa" w:w="40"/>
+              <w:left w:type="dxa" w:w="70"/>
+              <w:bottom w:type="dxa" w:w="40"/>
+              <w:right w:type="dxa" w:w="70"/>
+            </w:tcMar>
+          </w:tcPr>
+          <w:p>
+            <w:pPr>
+              <w:spacing w:after="18" w:line="236"/>
+            </w:pPr>
+            <w:r>
+              <w:rPr>
+                <w:rFonts w:ascii="Arial" w:cs="Arial" w:eastAsia="Arial" w:hAnsi="Arial"/>
+                <w:sz w:val="19"/>
+                <w:szCs w:val="19"/>
+              </w:rPr>
+              <w:t xml:space="preserve">1. Selecciona una sede o un usuario.</w:t>
+            </w:r>
+          </w:p>
+          <w:p>
+            <w:pPr>
+              <w:spacing w:after="18" w:line="236"/>
+            </w:pPr>
+            <w:r>
+              <w:rPr>
+                <w:rFonts w:ascii="Arial" w:cs="Arial" w:eastAsia="Arial" w:hAnsi="Arial"/>
+                <w:sz w:val="19"/>
+                <w:szCs w:val="19"/>
+              </w:rPr>
+              <w:t xml:space="preserve">2. Asigna uno o varios usuarios a la sede.</w:t>
+            </w:r>
+          </w:p>
+          <w:p>
+            <w:pPr>
+              <w:spacing w:after="18" w:line="236"/>
+            </w:pPr>
+            <w:r>
+              <w:rPr>
+                <w:rFonts w:ascii="Arial" w:cs="Arial" w:eastAsia="Arial" w:hAnsi="Arial"/>
+                <w:sz w:val="19"/>
+                <w:szCs w:val="19"/>
+              </w:rPr>
+              <w:t xml:space="preserve">3. El sistema valida y guarda la asignación.</w:t>
+            </w:r>
+          </w:p>
+        </w:tc>
+      </w:tr>
+      <w:tr>
+        <w:tc>
+          <w:tcPr>
+            <w:tcW w:type="dxa" w:w="2300"/>
+            <w:shd w:fill="EAF0F8" w:val="clear"/>
+            <w:tcMar>
+              <w:top w:type="dxa" w:w="40"/>
+              <w:left w:type="dxa" w:w="70"/>
+              <w:bottom w:type="dxa" w:w="40"/>
+              <w:right w:type="dxa" w:w="70"/>
+            </w:tcMar>
+          </w:tcPr>
+          <w:p>
+            <w:pPr>
+              <w:spacing w:after="18" w:line="236"/>
+            </w:pPr>
+            <w:r>
+              <w:rPr>
+                <w:rFonts w:ascii="Arial" w:cs="Arial" w:eastAsia="Arial" w:hAnsi="Arial"/>
+                <w:b/>
+                <w:bCs/>
+                <w:sz w:val="19"/>
+                <w:szCs w:val="19"/>
+              </w:rPr>
+              <w:t xml:space="preserve">Flujos alternativos</w:t>
+            </w:r>
+          </w:p>
+        </w:tc>
+        <w:tc>
+          <w:tcPr>
+            <w:tcW w:type="dxa" w:w="7060"/>
+            <w:tcMar>
+              <w:top w:type="dxa" w:w="40"/>
+              <w:left w:type="dxa" w:w="70"/>
+              <w:bottom w:type="dxa" w:w="40"/>
+              <w:right w:type="dxa" w:w="70"/>
+            </w:tcMar>
+          </w:tcPr>
+          <w:p>
+            <w:pPr>
+              <w:spacing w:after="18" w:line="236"/>
+            </w:pPr>
+            <w:r>
+              <w:rPr>
+                <w:rFonts w:ascii="Arial" w:cs="Arial" w:eastAsia="Arial" w:hAnsi="Arial"/>
+                <w:sz w:val="19"/>
+                <w:szCs w:val="19"/>
+              </w:rPr>
+              <w:t xml:space="preserve">2a. Reasignar o quitar un usuario de una sede.</w:t>
+            </w:r>
+          </w:p>
+        </w:tc>
+      </w:tr>
+      <w:tr>
+        <w:tc>
+          <w:tcPr>
+            <w:tcW w:type="dxa" w:w="2300"/>
+            <w:shd w:fill="EAF0F8" w:val="clear"/>
+            <w:tcMar>
+              <w:top w:type="dxa" w:w="40"/>
+              <w:left w:type="dxa" w:w="70"/>
+              <w:bottom w:type="dxa" w:w="40"/>
+              <w:right w:type="dxa" w:w="70"/>
+            </w:tcMar>
+          </w:tcPr>
+          <w:p>
+            <w:pPr>
+              <w:spacing w:after="18" w:line="236"/>
+            </w:pPr>
+            <w:r>
+              <w:rPr>
+                <w:rFonts w:ascii="Arial" w:cs="Arial" w:eastAsia="Arial" w:hAnsi="Arial"/>
+                <w:b/>
+                <w:bCs/>
+                <w:sz w:val="19"/>
+                <w:szCs w:val="19"/>
+              </w:rPr>
+              <w:t xml:space="preserve">Excepciones</w:t>
+            </w:r>
+          </w:p>
+        </w:tc>
+        <w:tc>
+          <w:tcPr>
+            <w:tcW w:type="dxa" w:w="7060"/>
+            <w:tcMar>
+              <w:top w:type="dxa" w:w="40"/>
+              <w:left w:type="dxa" w:w="70"/>
+              <w:bottom w:type="dxa" w:w="40"/>
+              <w:right w:type="dxa" w:w="70"/>
+            </w:tcMar>
+          </w:tcPr>
+          <w:p>
+            <w:pPr>
+              <w:spacing w:after="18" w:line="236"/>
+            </w:pPr>
+            <w:r>
+              <w:rPr>
+                <w:rFonts w:ascii="Arial" w:cs="Arial" w:eastAsia="Arial" w:hAnsi="Arial"/>
+                <w:sz w:val="19"/>
+                <w:szCs w:val="19"/>
+              </w:rPr>
+              <w:t xml:space="preserve">*. Usuario inactivo: no puede asignarse.</w:t>
+            </w:r>
+          </w:p>
+        </w:tc>
+      </w:tr>
+      <w:tr>
+        <w:tc>
+          <w:tcPr>
+            <w:tcW w:type="dxa" w:w="2300"/>
+            <w:shd w:fill="EAF0F8" w:val="clear"/>
+            <w:tcMar>
+              <w:top w:type="dxa" w:w="40"/>
+              <w:left w:type="dxa" w:w="70"/>
+              <w:bottom w:type="dxa" w:w="40"/>
+              <w:right w:type="dxa" w:w="70"/>
+            </w:tcMar>
+          </w:tcPr>
+          <w:p>
+            <w:pPr>
+              <w:spacing w:after="18" w:line="236"/>
+            </w:pPr>
+            <w:r>
+              <w:rPr>
+                <w:rFonts w:ascii="Arial" w:cs="Arial" w:eastAsia="Arial" w:hAnsi="Arial"/>
+                <w:b/>
+                <w:bCs/>
+                <w:sz w:val="19"/>
+                <w:szCs w:val="19"/>
+              </w:rPr>
+              <w:t xml:space="preserve">Reglas y validaciones</w:t>
+            </w:r>
+          </w:p>
+        </w:tc>
+        <w:tc>
+          <w:tcPr>
+            <w:tcW w:type="dxa" w:w="7060"/>
+            <w:tcMar>
+              <w:top w:type="dxa" w:w="40"/>
+              <w:left w:type="dxa" w:w="70"/>
+              <w:bottom w:type="dxa" w:w="40"/>
+              <w:right w:type="dxa" w:w="70"/>
+            </w:tcMar>
+          </w:tcPr>
+          <w:p>
+            <w:pPr>
+              <w:spacing w:after="18" w:line="236"/>
+            </w:pPr>
+            <w:r>
+              <w:rPr>
+                <w:rFonts w:ascii="Arial" w:cs="Arial" w:eastAsia="Arial" w:hAnsi="Arial"/>
+                <w:sz w:val="19"/>
+                <w:szCs w:val="19"/>
+              </w:rPr>
+              <w:t xml:space="preserve">Un usuario opera en la sede o sedes asignadas; sus ventas y consultas se limitan a su sede según sus permisos.</w:t>
+            </w:r>
+          </w:p>
+        </w:tc>
+      </w:tr>
+      <w:tr>
+        <w:tc>
+          <w:tcPr>
+            <w:tcW w:type="dxa" w:w="2300"/>
+            <w:shd w:fill="EAF0F8" w:val="clear"/>
+            <w:tcMar>
+              <w:top w:type="dxa" w:w="40"/>
+              <w:left w:type="dxa" w:w="70"/>
+              <w:bottom w:type="dxa" w:w="40"/>
+              <w:right w:type="dxa" w:w="70"/>
+            </w:tcMar>
+          </w:tcPr>
+          <w:p>
+            <w:pPr>
+              <w:spacing w:after="18" w:line="236"/>
+            </w:pPr>
+            <w:r>
+              <w:rPr>
+                <w:rFonts w:ascii="Arial" w:cs="Arial" w:eastAsia="Arial" w:hAnsi="Arial"/>
+                <w:b/>
+                <w:bCs/>
+                <w:sz w:val="19"/>
+                <w:szCs w:val="19"/>
+              </w:rPr>
+              <w:t xml:space="preserve">Postcondiciones</w:t>
+            </w:r>
+          </w:p>
+        </w:tc>
+        <w:tc>
+          <w:tcPr>
+            <w:tcW w:type="dxa" w:w="7060"/>
+            <w:tcMar>
+              <w:top w:type="dxa" w:w="40"/>
+              <w:left w:type="dxa" w:w="70"/>
+              <w:bottom w:type="dxa" w:w="40"/>
+              <w:right w:type="dxa" w:w="70"/>
+            </w:tcMar>
+          </w:tcPr>
+          <w:p>
+            <w:pPr>
+              <w:spacing w:after="18" w:line="236"/>
+            </w:pPr>
+            <w:r>
+              <w:rPr>
+                <w:rFonts w:ascii="Arial" w:cs="Arial" w:eastAsia="Arial" w:hAnsi="Arial"/>
+                <w:sz w:val="19"/>
+                <w:szCs w:val="19"/>
+              </w:rPr>
+              <w:t xml:space="preserve">Los usuarios quedan asignados a sus sedes.</w:t>
+            </w:r>
+          </w:p>
+        </w:tc>
+      </w:tr>
+      <w:tr>
+        <w:tc>
+          <w:tcPr>
+            <w:tcW w:type="dxa" w:w="2300"/>
+            <w:shd w:fill="EAF0F8" w:val="clear"/>
+            <w:tcMar>
+              <w:top w:type="dxa" w:w="40"/>
+              <w:left w:type="dxa" w:w="70"/>
+              <w:bottom w:type="dxa" w:w="40"/>
+              <w:right w:type="dxa" w:w="70"/>
+            </w:tcMar>
+          </w:tcPr>
+          <w:p>
+            <w:pPr>
+              <w:spacing w:after="18" w:line="236"/>
+            </w:pPr>
+            <w:r>
+              <w:rPr>
+                <w:rFonts w:ascii="Arial" w:cs="Arial" w:eastAsia="Arial" w:hAnsi="Arial"/>
+                <w:b/>
+                <w:bCs/>
+                <w:sz w:val="19"/>
+                <w:szCs w:val="19"/>
+              </w:rPr>
+              <w:t xml:space="preserve">Prioridad</w:t>
+            </w:r>
+          </w:p>
+        </w:tc>
+        <w:tc>
+          <w:tcPr>
+            <w:tcW w:type="dxa" w:w="7060"/>
+            <w:tcMar>
+              <w:top w:type="dxa" w:w="40"/>
+              <w:left w:type="dxa" w:w="70"/>
+              <w:bottom w:type="dxa" w:w="40"/>
+              <w:right w:type="dxa" w:w="70"/>
+            </w:tcMar>
+          </w:tcPr>
+          <w:p>
+            <w:pPr>
+              <w:spacing w:after="18" w:line="236"/>
+            </w:pPr>
+            <w:r>
+              <w:rPr>
+                <w:rFonts w:ascii="Arial" w:cs="Arial" w:eastAsia="Arial" w:hAnsi="Arial"/>
+                <w:sz w:val="19"/>
+                <w:szCs w:val="19"/>
+              </w:rPr>
+              <w:t xml:space="preserve">Media</w:t>
+            </w:r>
+          </w:p>
+        </w:tc>
+      </w:tr>
+    </w:tbl>
+    <w:p>
+      <w:pPr>
+        <w:spacing w:after="140"/>
+      </w:pPr>
+    </w:p>
+    <w:tbl>
+      <w:tblPr>
+        <w:tblW w:type="dxa" w:w="9360"/>
+        <w:tblBorders>
+          <w:top w:val="single" w:color="9CA3AF" w:sz="6"/>
+          <w:left w:val="single" w:color="9CA3AF" w:sz="6"/>
+          <w:bottom w:val="single" w:color="9CA3AF" w:sz="6"/>
+          <w:right w:val="single" w:color="9CA3AF" w:sz="6"/>
+          <w:insideH w:val="single" w:color="9CA3AF" w:sz="6"/>
+          <w:insideV w:val="single" w:color="9CA3AF" w:sz="6"/>
+        </w:tblBorders>
+        <w:tblLayout w:type="fixed"/>
+      </w:tblPr>
+      <w:tblGrid>
+        <w:gridCol w:w="2300"/>
+        <w:gridCol w:w="7060"/>
+      </w:tblGrid>
+      <w:tr>
+        <w:tc>
+          <w:tcPr>
+            <w:tcW w:type="dxa" w:w="9360"/>
+            <w:gridSpan w:val="2"/>
+            <w:shd w:fill="1F3864" w:val="clear"/>
+            <w:tcMar>
+              <w:top w:type="dxa" w:w="40"/>
+              <w:left w:type="dxa" w:w="70"/>
+              <w:bottom w:type="dxa" w:w="40"/>
+              <w:right w:type="dxa" w:w="70"/>
+            </w:tcMar>
+          </w:tcPr>
+          <w:p>
+            <w:pPr>
+              <w:spacing w:after="18" w:line="236"/>
+            </w:pPr>
+            <w:r>
+              <w:rPr>
+                <w:rFonts w:ascii="Arial" w:cs="Arial" w:eastAsia="Arial" w:hAnsi="Arial"/>
+                <w:b/>
+                <w:bCs/>
+                <w:color w:val="FFFFFF"/>
+                <w:sz w:val="19"/>
+                <w:szCs w:val="19"/>
+              </w:rPr>
+              <w:t xml:space="preserve">CU-SED-04 — Consultar inventario por sede</w:t>
+            </w:r>
+          </w:p>
+        </w:tc>
+      </w:tr>
+      <w:tr>
+        <w:tc>
+          <w:tcPr>
+            <w:tcW w:type="dxa" w:w="2300"/>
+            <w:shd w:fill="EAF0F8" w:val="clear"/>
+            <w:tcMar>
+              <w:top w:type="dxa" w:w="40"/>
+              <w:left w:type="dxa" w:w="70"/>
+              <w:bottom w:type="dxa" w:w="40"/>
+              <w:right w:type="dxa" w:w="70"/>
+            </w:tcMar>
+          </w:tcPr>
+          <w:p>
+            <w:pPr>
+              <w:spacing w:after="18" w:line="236"/>
+            </w:pPr>
+            <w:r>
+              <w:rPr>
+                <w:rFonts w:ascii="Arial" w:cs="Arial" w:eastAsia="Arial" w:hAnsi="Arial"/>
+                <w:b/>
+                <w:bCs/>
+                <w:sz w:val="19"/>
+                <w:szCs w:val="19"/>
+              </w:rPr>
+              <w:t xml:space="preserve">Actor(es)</w:t>
+            </w:r>
+          </w:p>
+        </w:tc>
+        <w:tc>
+          <w:tcPr>
+            <w:tcW w:type="dxa" w:w="7060"/>
+            <w:tcMar>
+              <w:top w:type="dxa" w:w="40"/>
+              <w:left w:type="dxa" w:w="70"/>
+              <w:bottom w:type="dxa" w:w="40"/>
+              <w:right w:type="dxa" w:w="70"/>
+            </w:tcMar>
+          </w:tcPr>
+          <w:p>
+            <w:pPr>
+              <w:spacing w:after="18" w:line="236"/>
+            </w:pPr>
+            <w:r>
+              <w:rPr>
+                <w:rFonts w:ascii="Arial" w:cs="Arial" w:eastAsia="Arial" w:hAnsi="Arial"/>
+                <w:sz w:val="19"/>
+                <w:szCs w:val="19"/>
+              </w:rPr>
+              <w:t xml:space="preserve">Administrador, Vendedor</w:t>
+            </w:r>
+          </w:p>
+        </w:tc>
+      </w:tr>
+      <w:tr>
+        <w:tc>
+          <w:tcPr>
+            <w:tcW w:type="dxa" w:w="2300"/>
+            <w:shd w:fill="EAF0F8" w:val="clear"/>
+            <w:tcMar>
+              <w:top w:type="dxa" w:w="40"/>
+              <w:left w:type="dxa" w:w="70"/>
+              <w:bottom w:type="dxa" w:w="40"/>
+              <w:right w:type="dxa" w:w="70"/>
+            </w:tcMar>
+          </w:tcPr>
+          <w:p>
+            <w:pPr>
+              <w:spacing w:after="18" w:line="236"/>
+            </w:pPr>
+            <w:r>
+              <w:rPr>
+                <w:rFonts w:ascii="Arial" w:cs="Arial" w:eastAsia="Arial" w:hAnsi="Arial"/>
+                <w:b/>
+                <w:bCs/>
+                <w:sz w:val="19"/>
+                <w:szCs w:val="19"/>
+              </w:rPr>
+              <w:t xml:space="preserve">Requisito</w:t>
+            </w:r>
+          </w:p>
+        </w:tc>
+        <w:tc>
+          <w:tcPr>
+            <w:tcW w:type="dxa" w:w="7060"/>
+            <w:tcMar>
+              <w:top w:type="dxa" w:w="40"/>
+              <w:left w:type="dxa" w:w="70"/>
+              <w:bottom w:type="dxa" w:w="40"/>
+              <w:right w:type="dxa" w:w="70"/>
+            </w:tcMar>
+          </w:tcPr>
+          <w:p>
+            <w:pPr>
+              <w:spacing w:after="18" w:line="236"/>
+            </w:pPr>
+            <w:r>
+              <w:rPr>
+                <w:rFonts w:ascii="Arial" w:cs="Arial" w:eastAsia="Arial" w:hAnsi="Arial"/>
+                <w:sz w:val="19"/>
+                <w:szCs w:val="19"/>
+              </w:rPr>
+              <w:t xml:space="preserve">RF-SED-04</w:t>
+            </w:r>
+          </w:p>
+        </w:tc>
+      </w:tr>
+      <w:tr>
+        <w:tc>
+          <w:tcPr>
+            <w:tcW w:type="dxa" w:w="2300"/>
+            <w:shd w:fill="EAF0F8" w:val="clear"/>
+            <w:tcMar>
+              <w:top w:type="dxa" w:w="40"/>
+              <w:left w:type="dxa" w:w="70"/>
+              <w:bottom w:type="dxa" w:w="40"/>
+              <w:right w:type="dxa" w:w="70"/>
+            </w:tcMar>
+          </w:tcPr>
+          <w:p>
+            <w:pPr>
+              <w:spacing w:after="18" w:line="236"/>
+            </w:pPr>
+            <w:r>
+              <w:rPr>
+                <w:rFonts w:ascii="Arial" w:cs="Arial" w:eastAsia="Arial" w:hAnsi="Arial"/>
+                <w:b/>
+                <w:bCs/>
+                <w:sz w:val="19"/>
+                <w:szCs w:val="19"/>
+              </w:rPr>
+              <w:t xml:space="preserve">Descripción</w:t>
+            </w:r>
+          </w:p>
+        </w:tc>
+        <w:tc>
+          <w:tcPr>
+            <w:tcW w:type="dxa" w:w="7060"/>
+            <w:tcMar>
+              <w:top w:type="dxa" w:w="40"/>
+              <w:left w:type="dxa" w:w="70"/>
+              <w:bottom w:type="dxa" w:w="40"/>
+              <w:right w:type="dxa" w:w="70"/>
+            </w:tcMar>
+          </w:tcPr>
+          <w:p>
+            <w:pPr>
+              <w:spacing w:after="18" w:line="236"/>
+            </w:pPr>
+            <w:r>
+              <w:rPr>
+                <w:rFonts w:ascii="Arial" w:cs="Arial" w:eastAsia="Arial" w:hAnsi="Arial"/>
+                <w:sz w:val="19"/>
+                <w:szCs w:val="19"/>
+              </w:rPr>
+              <w:t xml:space="preserve">El usuario consulta las existencias de productos en cada sede.</w:t>
+            </w:r>
+          </w:p>
+        </w:tc>
+      </w:tr>
+      <w:tr>
+        <w:tc>
+          <w:tcPr>
+            <w:tcW w:type="dxa" w:w="2300"/>
+            <w:shd w:fill="EAF0F8" w:val="clear"/>
+            <w:tcMar>
+              <w:top w:type="dxa" w:w="40"/>
+              <w:left w:type="dxa" w:w="70"/>
+              <w:bottom w:type="dxa" w:w="40"/>
+              <w:right w:type="dxa" w:w="70"/>
+            </w:tcMar>
+          </w:tcPr>
+          <w:p>
+            <w:pPr>
+              <w:spacing w:after="18" w:line="236"/>
+            </w:pPr>
+            <w:r>
+              <w:rPr>
+                <w:rFonts w:ascii="Arial" w:cs="Arial" w:eastAsia="Arial" w:hAnsi="Arial"/>
+                <w:b/>
+                <w:bCs/>
+                <w:sz w:val="19"/>
+                <w:szCs w:val="19"/>
+              </w:rPr>
+              <w:t xml:space="preserve">Precondiciones</w:t>
+            </w:r>
+          </w:p>
+        </w:tc>
+        <w:tc>
+          <w:tcPr>
+            <w:tcW w:type="dxa" w:w="7060"/>
+            <w:tcMar>
+              <w:top w:type="dxa" w:w="40"/>
+              <w:left w:type="dxa" w:w="70"/>
+              <w:bottom w:type="dxa" w:w="40"/>
+              <w:right w:type="dxa" w:w="70"/>
+            </w:tcMar>
+          </w:tcPr>
+          <w:p>
+            <w:pPr>
+              <w:spacing w:after="18" w:line="236"/>
+            </w:pPr>
+            <w:r>
+              <w:rPr>
+                <w:rFonts w:ascii="Arial" w:cs="Arial" w:eastAsia="Arial" w:hAnsi="Arial"/>
+                <w:sz w:val="19"/>
+                <w:szCs w:val="19"/>
+              </w:rPr>
+              <w:t xml:space="preserve">Existen sedes con inventario; la suscripción incluye multisede.</w:t>
+            </w:r>
+          </w:p>
+        </w:tc>
+      </w:tr>
+      <w:tr>
+        <w:tc>
+          <w:tcPr>
+            <w:tcW w:type="dxa" w:w="2300"/>
+            <w:shd w:fill="EAF0F8" w:val="clear"/>
+            <w:tcMar>
+              <w:top w:type="dxa" w:w="40"/>
+              <w:left w:type="dxa" w:w="70"/>
+              <w:bottom w:type="dxa" w:w="40"/>
+              <w:right w:type="dxa" w:w="70"/>
+            </w:tcMar>
+          </w:tcPr>
+          <w:p>
+            <w:pPr>
+              <w:spacing w:after="18" w:line="236"/>
+            </w:pPr>
+            <w:r>
+              <w:rPr>
+                <w:rFonts w:ascii="Arial" w:cs="Arial" w:eastAsia="Arial" w:hAnsi="Arial"/>
+                <w:b/>
+                <w:bCs/>
+                <w:sz w:val="19"/>
+                <w:szCs w:val="19"/>
+              </w:rPr>
+              <w:t xml:space="preserve">Flujo principal</w:t>
+            </w:r>
+          </w:p>
+        </w:tc>
+        <w:tc>
+          <w:tcPr>
+            <w:tcW w:type="dxa" w:w="7060"/>
+            <w:tcMar>
+              <w:top w:type="dxa" w:w="40"/>
+              <w:left w:type="dxa" w:w="70"/>
+              <w:bottom w:type="dxa" w:w="40"/>
+              <w:right w:type="dxa" w:w="70"/>
+            </w:tcMar>
+          </w:tcPr>
+          <w:p>
+            <w:pPr>
+              <w:spacing w:after="18" w:line="236"/>
+            </w:pPr>
+            <w:r>
+              <w:rPr>
+                <w:rFonts w:ascii="Arial" w:cs="Arial" w:eastAsia="Arial" w:hAnsi="Arial"/>
+                <w:sz w:val="19"/>
+                <w:szCs w:val="19"/>
+              </w:rPr>
+              <w:t xml:space="preserve">1. Elige «Inventario por sede» y selecciona la sede.</w:t>
+            </w:r>
+          </w:p>
+          <w:p>
+            <w:pPr>
+              <w:spacing w:after="18" w:line="236"/>
+            </w:pPr>
+            <w:r>
+              <w:rPr>
+                <w:rFonts w:ascii="Arial" w:cs="Arial" w:eastAsia="Arial" w:hAnsi="Arial"/>
+                <w:sz w:val="19"/>
+                <w:szCs w:val="19"/>
+              </w:rPr>
+              <w:t xml:space="preserve">2. El sistema muestra las existencias de los productos en esa sede.</w:t>
+            </w:r>
+          </w:p>
+          <w:p>
+            <w:pPr>
+              <w:spacing w:after="18" w:line="236"/>
+            </w:pPr>
+            <w:r>
+              <w:rPr>
+                <w:rFonts w:ascii="Arial" w:cs="Arial" w:eastAsia="Arial" w:hAnsi="Arial"/>
+                <w:sz w:val="19"/>
+                <w:szCs w:val="19"/>
+              </w:rPr>
+              <w:t xml:space="preserve">3. El usuario filtra o busca.</w:t>
+            </w:r>
+          </w:p>
+        </w:tc>
+      </w:tr>
+      <w:tr>
+        <w:tc>
+          <w:tcPr>
+            <w:tcW w:type="dxa" w:w="2300"/>
+            <w:shd w:fill="EAF0F8" w:val="clear"/>
+            <w:tcMar>
+              <w:top w:type="dxa" w:w="40"/>
+              <w:left w:type="dxa" w:w="70"/>
+              <w:bottom w:type="dxa" w:w="40"/>
+              <w:right w:type="dxa" w:w="70"/>
+            </w:tcMar>
+          </w:tcPr>
+          <w:p>
+            <w:pPr>
+              <w:spacing w:after="18" w:line="236"/>
+            </w:pPr>
+            <w:r>
+              <w:rPr>
+                <w:rFonts w:ascii="Arial" w:cs="Arial" w:eastAsia="Arial" w:hAnsi="Arial"/>
+                <w:b/>
+                <w:bCs/>
+                <w:sz w:val="19"/>
+                <w:szCs w:val="19"/>
+              </w:rPr>
+              <w:t xml:space="preserve">Flujos alternativos</w:t>
+            </w:r>
+          </w:p>
+        </w:tc>
+        <w:tc>
+          <w:tcPr>
+            <w:tcW w:type="dxa" w:w="7060"/>
+            <w:tcMar>
+              <w:top w:type="dxa" w:w="40"/>
+              <w:left w:type="dxa" w:w="70"/>
+              <w:bottom w:type="dxa" w:w="40"/>
+              <w:right w:type="dxa" w:w="70"/>
+            </w:tcMar>
+          </w:tcPr>
+          <w:p>
+            <w:pPr>
+              <w:spacing w:after="18" w:line="236"/>
+            </w:pPr>
+            <w:r>
+              <w:rPr>
+                <w:rFonts w:ascii="Arial" w:cs="Arial" w:eastAsia="Arial" w:hAnsi="Arial"/>
+                <w:sz w:val="19"/>
+                <w:szCs w:val="19"/>
+              </w:rPr>
+              <w:t xml:space="preserve">2a. Comparar las existencias entre sedes en una vista consolidada.</w:t>
+            </w:r>
+          </w:p>
+        </w:tc>
+      </w:tr>
+      <w:tr>
+        <w:tc>
+          <w:tcPr>
+            <w:tcW w:type="dxa" w:w="2300"/>
+            <w:shd w:fill="EAF0F8" w:val="clear"/>
+            <w:tcMar>
+              <w:top w:type="dxa" w:w="40"/>
+              <w:left w:type="dxa" w:w="70"/>
+              <w:bottom w:type="dxa" w:w="40"/>
+              <w:right w:type="dxa" w:w="70"/>
+            </w:tcMar>
+          </w:tcPr>
+          <w:p>
+            <w:pPr>
+              <w:spacing w:after="18" w:line="236"/>
+            </w:pPr>
+            <w:r>
+              <w:rPr>
+                <w:rFonts w:ascii="Arial" w:cs="Arial" w:eastAsia="Arial" w:hAnsi="Arial"/>
+                <w:b/>
+                <w:bCs/>
+                <w:sz w:val="19"/>
+                <w:szCs w:val="19"/>
+              </w:rPr>
+              <w:t xml:space="preserve">Excepciones</w:t>
+            </w:r>
+          </w:p>
+        </w:tc>
+        <w:tc>
+          <w:tcPr>
+            <w:tcW w:type="dxa" w:w="7060"/>
+            <w:tcMar>
+              <w:top w:type="dxa" w:w="40"/>
+              <w:left w:type="dxa" w:w="70"/>
+              <w:bottom w:type="dxa" w:w="40"/>
+              <w:right w:type="dxa" w:w="70"/>
+            </w:tcMar>
+          </w:tcPr>
+          <w:p>
+            <w:pPr>
+              <w:spacing w:after="18" w:line="236"/>
+            </w:pPr>
+            <w:r>
+              <w:rPr>
+                <w:rFonts w:ascii="Arial" w:cs="Arial" w:eastAsia="Arial" w:hAnsi="Arial"/>
+                <w:sz w:val="19"/>
+                <w:szCs w:val="19"/>
+              </w:rPr>
+              <w:t xml:space="preserve">*. Sede sin inventario: el sistema muestra las existencias en cero.</w:t>
+            </w:r>
+          </w:p>
+        </w:tc>
+      </w:tr>
+      <w:tr>
+        <w:tc>
+          <w:tcPr>
+            <w:tcW w:type="dxa" w:w="2300"/>
+            <w:shd w:fill="EAF0F8" w:val="clear"/>
+            <w:tcMar>
+              <w:top w:type="dxa" w:w="40"/>
+              <w:left w:type="dxa" w:w="70"/>
+              <w:bottom w:type="dxa" w:w="40"/>
+              <w:right w:type="dxa" w:w="70"/>
+            </w:tcMar>
+          </w:tcPr>
+          <w:p>
+            <w:pPr>
+              <w:spacing w:after="18" w:line="236"/>
+            </w:pPr>
+            <w:r>
+              <w:rPr>
+                <w:rFonts w:ascii="Arial" w:cs="Arial" w:eastAsia="Arial" w:hAnsi="Arial"/>
+                <w:b/>
+                <w:bCs/>
+                <w:sz w:val="19"/>
+                <w:szCs w:val="19"/>
+              </w:rPr>
+              <w:t xml:space="preserve">Reglas y validaciones</w:t>
+            </w:r>
+          </w:p>
+        </w:tc>
+        <w:tc>
+          <w:tcPr>
+            <w:tcW w:type="dxa" w:w="7060"/>
+            <w:tcMar>
+              <w:top w:type="dxa" w:w="40"/>
+              <w:left w:type="dxa" w:w="70"/>
+              <w:bottom w:type="dxa" w:w="40"/>
+              <w:right w:type="dxa" w:w="70"/>
+            </w:tcMar>
+          </w:tcPr>
+          <w:p>
+            <w:pPr>
+              <w:spacing w:after="18" w:line="236"/>
+            </w:pPr>
+            <w:r>
+              <w:rPr>
+                <w:rFonts w:ascii="Arial" w:cs="Arial" w:eastAsia="Arial" w:hAnsi="Arial"/>
+                <w:sz w:val="19"/>
+                <w:szCs w:val="19"/>
+              </w:rPr>
+              <w:t xml:space="preserve">El inventario es independiente por sede (lotes y saldos propios); el vendedor solo ve su sede.</w:t>
+            </w:r>
+          </w:p>
+        </w:tc>
+      </w:tr>
+      <w:tr>
+        <w:tc>
+          <w:tcPr>
+            <w:tcW w:type="dxa" w:w="2300"/>
+            <w:shd w:fill="EAF0F8" w:val="clear"/>
+            <w:tcMar>
+              <w:top w:type="dxa" w:w="40"/>
+              <w:left w:type="dxa" w:w="70"/>
+              <w:bottom w:type="dxa" w:w="40"/>
+              <w:right w:type="dxa" w:w="70"/>
+            </w:tcMar>
+          </w:tcPr>
+          <w:p>
+            <w:pPr>
+              <w:spacing w:after="18" w:line="236"/>
+            </w:pPr>
+            <w:r>
+              <w:rPr>
+                <w:rFonts w:ascii="Arial" w:cs="Arial" w:eastAsia="Arial" w:hAnsi="Arial"/>
+                <w:b/>
+                <w:bCs/>
+                <w:sz w:val="19"/>
+                <w:szCs w:val="19"/>
+              </w:rPr>
+              <w:t xml:space="preserve">Postcondiciones</w:t>
+            </w:r>
+          </w:p>
+        </w:tc>
+        <w:tc>
+          <w:tcPr>
+            <w:tcW w:type="dxa" w:w="7060"/>
+            <w:tcMar>
+              <w:top w:type="dxa" w:w="40"/>
+              <w:left w:type="dxa" w:w="70"/>
+              <w:bottom w:type="dxa" w:w="40"/>
+              <w:right w:type="dxa" w:w="70"/>
+            </w:tcMar>
+          </w:tcPr>
+          <w:p>
+            <w:pPr>
+              <w:spacing w:after="18" w:line="236"/>
+            </w:pPr>
+            <w:r>
+              <w:rPr>
+                <w:rFonts w:ascii="Arial" w:cs="Arial" w:eastAsia="Arial" w:hAnsi="Arial"/>
+                <w:sz w:val="19"/>
+                <w:szCs w:val="19"/>
+              </w:rPr>
+              <w:t xml:space="preserve">El usuario visualiza el inventario de la sede.</w:t>
+            </w:r>
+          </w:p>
+        </w:tc>
+      </w:tr>
+      <w:tr>
+        <w:tc>
+          <w:tcPr>
+            <w:tcW w:type="dxa" w:w="2300"/>
+            <w:shd w:fill="EAF0F8" w:val="clear"/>
+            <w:tcMar>
+              <w:top w:type="dxa" w:w="40"/>
+              <w:left w:type="dxa" w:w="70"/>
+              <w:bottom w:type="dxa" w:w="40"/>
+              <w:right w:type="dxa" w:w="70"/>
+            </w:tcMar>
+          </w:tcPr>
+          <w:p>
+            <w:pPr>
+              <w:spacing w:after="18" w:line="236"/>
+            </w:pPr>
+            <w:r>
+              <w:rPr>
+                <w:rFonts w:ascii="Arial" w:cs="Arial" w:eastAsia="Arial" w:hAnsi="Arial"/>
+                <w:b/>
+                <w:bCs/>
+                <w:sz w:val="19"/>
+                <w:szCs w:val="19"/>
+              </w:rPr>
+              <w:t xml:space="preserve">Prioridad</w:t>
+            </w:r>
+          </w:p>
+        </w:tc>
+        <w:tc>
+          <w:tcPr>
+            <w:tcW w:type="dxa" w:w="7060"/>
+            <w:tcMar>
+              <w:top w:type="dxa" w:w="40"/>
+              <w:left w:type="dxa" w:w="70"/>
+              <w:bottom w:type="dxa" w:w="40"/>
+              <w:right w:type="dxa" w:w="70"/>
+            </w:tcMar>
+          </w:tcPr>
+          <w:p>
+            <w:pPr>
+              <w:spacing w:after="18" w:line="236"/>
+            </w:pPr>
+            <w:r>
+              <w:rPr>
+                <w:rFonts w:ascii="Arial" w:cs="Arial" w:eastAsia="Arial" w:hAnsi="Arial"/>
+                <w:sz w:val="19"/>
+                <w:szCs w:val="19"/>
+              </w:rPr>
+              <w:t xml:space="preserve">Media</w:t>
+            </w:r>
+          </w:p>
+        </w:tc>
+      </w:tr>
+    </w:tbl>
+    <w:p>
+      <w:pPr>
+        <w:spacing w:after="140"/>
+      </w:pPr>
+    </w:p>
+    <w:tbl>
+      <w:tblPr>
+        <w:tblW w:type="dxa" w:w="9360"/>
+        <w:tblBorders>
+          <w:top w:val="single" w:color="9CA3AF" w:sz="6"/>
+          <w:left w:val="single" w:color="9CA3AF" w:sz="6"/>
+          <w:bottom w:val="single" w:color="9CA3AF" w:sz="6"/>
+          <w:right w:val="single" w:color="9CA3AF" w:sz="6"/>
+          <w:insideH w:val="single" w:color="9CA3AF" w:sz="6"/>
+          <w:insideV w:val="single" w:color="9CA3AF" w:sz="6"/>
+        </w:tblBorders>
+        <w:tblLayout w:type="fixed"/>
+      </w:tblPr>
+      <w:tblGrid>
+        <w:gridCol w:w="2300"/>
+        <w:gridCol w:w="7060"/>
+      </w:tblGrid>
+      <w:tr>
+        <w:tc>
+          <w:tcPr>
+            <w:tcW w:type="dxa" w:w="9360"/>
+            <w:gridSpan w:val="2"/>
+            <w:shd w:fill="1F3864" w:val="clear"/>
+            <w:tcMar>
+              <w:top w:type="dxa" w:w="40"/>
+              <w:left w:type="dxa" w:w="70"/>
+              <w:bottom w:type="dxa" w:w="40"/>
+              <w:right w:type="dxa" w:w="70"/>
+            </w:tcMar>
+          </w:tcPr>
+          <w:p>
+            <w:pPr>
+              <w:spacing w:after="18" w:line="236"/>
+            </w:pPr>
+            <w:r>
+              <w:rPr>
+                <w:rFonts w:ascii="Arial" w:cs="Arial" w:eastAsia="Arial" w:hAnsi="Arial"/>
+                <w:b/>
+                <w:bCs/>
+                <w:color w:val="FFFFFF"/>
+                <w:sz w:val="19"/>
+                <w:szCs w:val="19"/>
+              </w:rPr>
+              <w:t xml:space="preserve">CU-SED-05 — Trasladar mercancía</w:t>
+            </w:r>
+          </w:p>
+        </w:tc>
+      </w:tr>
+      <w:tr>
+        <w:tc>
+          <w:tcPr>
+            <w:tcW w:type="dxa" w:w="2300"/>
+            <w:shd w:fill="EAF0F8" w:val="clear"/>
+            <w:tcMar>
+              <w:top w:type="dxa" w:w="40"/>
+              <w:left w:type="dxa" w:w="70"/>
+              <w:bottom w:type="dxa" w:w="40"/>
+              <w:right w:type="dxa" w:w="70"/>
+            </w:tcMar>
+          </w:tcPr>
+          <w:p>
+            <w:pPr>
+              <w:spacing w:after="18" w:line="236"/>
+            </w:pPr>
+            <w:r>
+              <w:rPr>
+                <w:rFonts w:ascii="Arial" w:cs="Arial" w:eastAsia="Arial" w:hAnsi="Arial"/>
+                <w:b/>
+                <w:bCs/>
+                <w:sz w:val="19"/>
+                <w:szCs w:val="19"/>
+              </w:rPr>
+              <w:t xml:space="preserve">Actor(es)</w:t>
+            </w:r>
+          </w:p>
+        </w:tc>
+        <w:tc>
+          <w:tcPr>
+            <w:tcW w:type="dxa" w:w="7060"/>
+            <w:tcMar>
+              <w:top w:type="dxa" w:w="40"/>
+              <w:left w:type="dxa" w:w="70"/>
+              <w:bottom w:type="dxa" w:w="40"/>
+              <w:right w:type="dxa" w:w="70"/>
+            </w:tcMar>
+          </w:tcPr>
+          <w:p>
+            <w:pPr>
+              <w:spacing w:after="18" w:line="236"/>
+            </w:pPr>
+            <w:r>
+              <w:rPr>
+                <w:rFonts w:ascii="Arial" w:cs="Arial" w:eastAsia="Arial" w:hAnsi="Arial"/>
+                <w:sz w:val="19"/>
+                <w:szCs w:val="19"/>
+              </w:rPr>
+              <w:t xml:space="preserve">Administrador</w:t>
+            </w:r>
+          </w:p>
+        </w:tc>
+      </w:tr>
+      <w:tr>
+        <w:tc>
+          <w:tcPr>
+            <w:tcW w:type="dxa" w:w="2300"/>
+            <w:shd w:fill="EAF0F8" w:val="clear"/>
+            <w:tcMar>
+              <w:top w:type="dxa" w:w="40"/>
+              <w:left w:type="dxa" w:w="70"/>
+              <w:bottom w:type="dxa" w:w="40"/>
+              <w:right w:type="dxa" w:w="70"/>
+            </w:tcMar>
+          </w:tcPr>
+          <w:p>
+            <w:pPr>
+              <w:spacing w:after="18" w:line="236"/>
+            </w:pPr>
+            <w:r>
+              <w:rPr>
+                <w:rFonts w:ascii="Arial" w:cs="Arial" w:eastAsia="Arial" w:hAnsi="Arial"/>
+                <w:b/>
+                <w:bCs/>
+                <w:sz w:val="19"/>
+                <w:szCs w:val="19"/>
+              </w:rPr>
+              <w:t xml:space="preserve">Requisito</w:t>
+            </w:r>
+          </w:p>
+        </w:tc>
+        <w:tc>
+          <w:tcPr>
+            <w:tcW w:type="dxa" w:w="7060"/>
+            <w:tcMar>
+              <w:top w:type="dxa" w:w="40"/>
+              <w:left w:type="dxa" w:w="70"/>
+              <w:bottom w:type="dxa" w:w="40"/>
+              <w:right w:type="dxa" w:w="70"/>
+            </w:tcMar>
+          </w:tcPr>
+          <w:p>
+            <w:pPr>
+              <w:spacing w:after="18" w:line="236"/>
+            </w:pPr>
+            <w:r>
+              <w:rPr>
+                <w:rFonts w:ascii="Arial" w:cs="Arial" w:eastAsia="Arial" w:hAnsi="Arial"/>
+                <w:sz w:val="19"/>
+                <w:szCs w:val="19"/>
+              </w:rPr>
+              <w:t xml:space="preserve">RF-SED-05</w:t>
+            </w:r>
+          </w:p>
+        </w:tc>
+      </w:tr>
+      <w:tr>
+        <w:tc>
+          <w:tcPr>
+            <w:tcW w:type="dxa" w:w="2300"/>
+            <w:shd w:fill="EAF0F8" w:val="clear"/>
+            <w:tcMar>
+              <w:top w:type="dxa" w:w="40"/>
+              <w:left w:type="dxa" w:w="70"/>
+              <w:bottom w:type="dxa" w:w="40"/>
+              <w:right w:type="dxa" w:w="70"/>
+            </w:tcMar>
+          </w:tcPr>
+          <w:p>
+            <w:pPr>
+              <w:spacing w:after="18" w:line="236"/>
+            </w:pPr>
+            <w:r>
+              <w:rPr>
+                <w:rFonts w:ascii="Arial" w:cs="Arial" w:eastAsia="Arial" w:hAnsi="Arial"/>
+                <w:b/>
+                <w:bCs/>
+                <w:sz w:val="19"/>
+                <w:szCs w:val="19"/>
+              </w:rPr>
+              <w:t xml:space="preserve">Descripción</w:t>
+            </w:r>
+          </w:p>
+        </w:tc>
+        <w:tc>
+          <w:tcPr>
+            <w:tcW w:type="dxa" w:w="7060"/>
+            <w:tcMar>
+              <w:top w:type="dxa" w:w="40"/>
+              <w:left w:type="dxa" w:w="70"/>
+              <w:bottom w:type="dxa" w:w="40"/>
+              <w:right w:type="dxa" w:w="70"/>
+            </w:tcMar>
+          </w:tcPr>
+          <w:p>
+            <w:pPr>
+              <w:spacing w:after="18" w:line="236"/>
+            </w:pPr>
+            <w:r>
+              <w:rPr>
+                <w:rFonts w:ascii="Arial" w:cs="Arial" w:eastAsia="Arial" w:hAnsi="Arial"/>
+                <w:sz w:val="19"/>
+                <w:szCs w:val="19"/>
+              </w:rPr>
+              <w:t xml:space="preserve">El administrador traslada existencias de una sede a otra.</w:t>
+            </w:r>
+          </w:p>
+        </w:tc>
+      </w:tr>
+      <w:tr>
+        <w:tc>
+          <w:tcPr>
+            <w:tcW w:type="dxa" w:w="2300"/>
+            <w:shd w:fill="EAF0F8" w:val="clear"/>
+            <w:tcMar>
+              <w:top w:type="dxa" w:w="40"/>
+              <w:left w:type="dxa" w:w="70"/>
+              <w:bottom w:type="dxa" w:w="40"/>
+              <w:right w:type="dxa" w:w="70"/>
+            </w:tcMar>
+          </w:tcPr>
+          <w:p>
+            <w:pPr>
+              <w:spacing w:after="18" w:line="236"/>
+            </w:pPr>
+            <w:r>
+              <w:rPr>
+                <w:rFonts w:ascii="Arial" w:cs="Arial" w:eastAsia="Arial" w:hAnsi="Arial"/>
+                <w:b/>
+                <w:bCs/>
+                <w:sz w:val="19"/>
+                <w:szCs w:val="19"/>
+              </w:rPr>
+              <w:t xml:space="preserve">Precondiciones</w:t>
+            </w:r>
+          </w:p>
+        </w:tc>
+        <w:tc>
+          <w:tcPr>
+            <w:tcW w:type="dxa" w:w="7060"/>
+            <w:tcMar>
+              <w:top w:type="dxa" w:w="40"/>
+              <w:left w:type="dxa" w:w="70"/>
+              <w:bottom w:type="dxa" w:w="40"/>
+              <w:right w:type="dxa" w:w="70"/>
+            </w:tcMar>
+          </w:tcPr>
+          <w:p>
+            <w:pPr>
+              <w:spacing w:after="18" w:line="236"/>
+            </w:pPr>
+            <w:r>
+              <w:rPr>
+                <w:rFonts w:ascii="Arial" w:cs="Arial" w:eastAsia="Arial" w:hAnsi="Arial"/>
+                <w:sz w:val="19"/>
+                <w:szCs w:val="19"/>
+              </w:rPr>
+              <w:t xml:space="preserve">Existen al menos dos sedes con inventario; la suscripción incluye multisede.</w:t>
+            </w:r>
+          </w:p>
+        </w:tc>
+      </w:tr>
+      <w:tr>
+        <w:tc>
+          <w:tcPr>
+            <w:tcW w:type="dxa" w:w="2300"/>
+            <w:shd w:fill="EAF0F8" w:val="clear"/>
+            <w:tcMar>
+              <w:top w:type="dxa" w:w="40"/>
+              <w:left w:type="dxa" w:w="70"/>
+              <w:bottom w:type="dxa" w:w="40"/>
+              <w:right w:type="dxa" w:w="70"/>
+            </w:tcMar>
+          </w:tcPr>
+          <w:p>
+            <w:pPr>
+              <w:spacing w:after="18" w:line="236"/>
+            </w:pPr>
+            <w:r>
+              <w:rPr>
+                <w:rFonts w:ascii="Arial" w:cs="Arial" w:eastAsia="Arial" w:hAnsi="Arial"/>
+                <w:b/>
+                <w:bCs/>
+                <w:sz w:val="19"/>
+                <w:szCs w:val="19"/>
+              </w:rPr>
+              <w:t xml:space="preserve">Flujo principal</w:t>
+            </w:r>
+          </w:p>
+        </w:tc>
+        <w:tc>
+          <w:tcPr>
+            <w:tcW w:type="dxa" w:w="7060"/>
+            <w:tcMar>
+              <w:top w:type="dxa" w:w="40"/>
+              <w:left w:type="dxa" w:w="70"/>
+              <w:bottom w:type="dxa" w:w="40"/>
+              <w:right w:type="dxa" w:w="70"/>
+            </w:tcMar>
+          </w:tcPr>
+          <w:p>
+            <w:pPr>
+              <w:spacing w:after="18" w:line="236"/>
+            </w:pPr>
+            <w:r>
+              <w:rPr>
+                <w:rFonts w:ascii="Arial" w:cs="Arial" w:eastAsia="Arial" w:hAnsi="Arial"/>
+                <w:sz w:val="19"/>
+                <w:szCs w:val="19"/>
+              </w:rPr>
+              <w:t xml:space="preserve">1. Elige «Trasladar mercancía» y selecciona la sede de origen y la de destino.</w:t>
+            </w:r>
+          </w:p>
+          <w:p>
+            <w:pPr>
+              <w:spacing w:after="18" w:line="236"/>
+            </w:pPr>
+            <w:r>
+              <w:rPr>
+                <w:rFonts w:ascii="Arial" w:cs="Arial" w:eastAsia="Arial" w:hAnsi="Arial"/>
+                <w:sz w:val="19"/>
+                <w:szCs w:val="19"/>
+              </w:rPr>
+              <w:t xml:space="preserve">2. Selecciona los productos y las cantidades.</w:t>
+            </w:r>
+          </w:p>
+          <w:p>
+            <w:pPr>
+              <w:spacing w:after="18" w:line="236"/>
+            </w:pPr>
+            <w:r>
+              <w:rPr>
+                <w:rFonts w:ascii="Arial" w:cs="Arial" w:eastAsia="Arial" w:hAnsi="Arial"/>
+                <w:sz w:val="19"/>
+                <w:szCs w:val="19"/>
+              </w:rPr>
+              <w:t xml:space="preserve">3. El sistema valida que la sede de origen tenga existencias suficientes.</w:t>
+            </w:r>
+          </w:p>
+          <w:p>
+            <w:pPr>
+              <w:spacing w:after="18" w:line="236"/>
+            </w:pPr>
+            <w:r>
+              <w:rPr>
+                <w:rFonts w:ascii="Arial" w:cs="Arial" w:eastAsia="Arial" w:hAnsi="Arial"/>
+                <w:sz w:val="19"/>
+                <w:szCs w:val="19"/>
+              </w:rPr>
+              <w:t xml:space="preserve">4. El sistema descuenta de la sede de origen y aumenta en la de destino, conservando el costo de los lotes (PEPS).</w:t>
+            </w:r>
+          </w:p>
+          <w:p>
+            <w:pPr>
+              <w:spacing w:after="18" w:line="236"/>
+            </w:pPr>
+            <w:r>
+              <w:rPr>
+                <w:rFonts w:ascii="Arial" w:cs="Arial" w:eastAsia="Arial" w:hAnsi="Arial"/>
+                <w:sz w:val="19"/>
+                <w:szCs w:val="19"/>
+              </w:rPr>
+              <w:t xml:space="preserve">5. Registra el movimiento de traslado en el kardex de ambas sedes.</w:t>
+            </w:r>
+          </w:p>
+        </w:tc>
+      </w:tr>
+      <w:tr>
+        <w:tc>
+          <w:tcPr>
+            <w:tcW w:type="dxa" w:w="2300"/>
+            <w:shd w:fill="EAF0F8" w:val="clear"/>
+            <w:tcMar>
+              <w:top w:type="dxa" w:w="40"/>
+              <w:left w:type="dxa" w:w="70"/>
+              <w:bottom w:type="dxa" w:w="40"/>
+              <w:right w:type="dxa" w:w="70"/>
+            </w:tcMar>
+          </w:tcPr>
+          <w:p>
+            <w:pPr>
+              <w:spacing w:after="18" w:line="236"/>
+            </w:pPr>
+            <w:r>
+              <w:rPr>
+                <w:rFonts w:ascii="Arial" w:cs="Arial" w:eastAsia="Arial" w:hAnsi="Arial"/>
+                <w:b/>
+                <w:bCs/>
+                <w:sz w:val="19"/>
+                <w:szCs w:val="19"/>
+              </w:rPr>
+              <w:t xml:space="preserve">Flujos alternativos</w:t>
+            </w:r>
+          </w:p>
+        </w:tc>
+        <w:tc>
+          <w:tcPr>
+            <w:tcW w:type="dxa" w:w="7060"/>
+            <w:tcMar>
+              <w:top w:type="dxa" w:w="40"/>
+              <w:left w:type="dxa" w:w="70"/>
+              <w:bottom w:type="dxa" w:w="40"/>
+              <w:right w:type="dxa" w:w="70"/>
+            </w:tcMar>
+          </w:tcPr>
+          <w:p>
+            <w:pPr>
+              <w:spacing w:after="18" w:line="236"/>
+            </w:pPr>
+            <w:r>
+              <w:rPr>
+                <w:rFonts w:ascii="Arial" w:cs="Arial" w:eastAsia="Arial" w:hAnsi="Arial"/>
+                <w:sz w:val="19"/>
+                <w:szCs w:val="19"/>
+              </w:rPr>
+              <w:t xml:space="preserve">—</w:t>
+            </w:r>
+          </w:p>
+        </w:tc>
+      </w:tr>
+      <w:tr>
+        <w:tc>
+          <w:tcPr>
+            <w:tcW w:type="dxa" w:w="2300"/>
+            <w:shd w:fill="EAF0F8" w:val="clear"/>
+            <w:tcMar>
+              <w:top w:type="dxa" w:w="40"/>
+              <w:left w:type="dxa" w:w="70"/>
+              <w:bottom w:type="dxa" w:w="40"/>
+              <w:right w:type="dxa" w:w="70"/>
+            </w:tcMar>
+          </w:tcPr>
+          <w:p>
+            <w:pPr>
+              <w:spacing w:after="18" w:line="236"/>
+            </w:pPr>
+            <w:r>
+              <w:rPr>
+                <w:rFonts w:ascii="Arial" w:cs="Arial" w:eastAsia="Arial" w:hAnsi="Arial"/>
+                <w:b/>
+                <w:bCs/>
+                <w:sz w:val="19"/>
+                <w:szCs w:val="19"/>
+              </w:rPr>
+              <w:t xml:space="preserve">Excepciones</w:t>
+            </w:r>
+          </w:p>
+        </w:tc>
+        <w:tc>
+          <w:tcPr>
+            <w:tcW w:type="dxa" w:w="7060"/>
+            <w:tcMar>
+              <w:top w:type="dxa" w:w="40"/>
+              <w:left w:type="dxa" w:w="70"/>
+              <w:bottom w:type="dxa" w:w="40"/>
+              <w:right w:type="dxa" w:w="70"/>
+            </w:tcMar>
+          </w:tcPr>
+          <w:p>
+            <w:pPr>
+              <w:spacing w:after="18" w:line="236"/>
+            </w:pPr>
+            <w:r>
+              <w:rPr>
+                <w:rFonts w:ascii="Arial" w:cs="Arial" w:eastAsia="Arial" w:hAnsi="Arial"/>
+                <w:sz w:val="19"/>
+                <w:szCs w:val="19"/>
+              </w:rPr>
+              <w:t xml:space="preserve">3a. Existencias insuficientes en el origen: el sistema lo impide e informa.</w:t>
+            </w:r>
+          </w:p>
+        </w:tc>
+      </w:tr>
+      <w:tr>
+        <w:tc>
+          <w:tcPr>
+            <w:tcW w:type="dxa" w:w="2300"/>
+            <w:shd w:fill="EAF0F8" w:val="clear"/>
+            <w:tcMar>
+              <w:top w:type="dxa" w:w="40"/>
+              <w:left w:type="dxa" w:w="70"/>
+              <w:bottom w:type="dxa" w:w="40"/>
+              <w:right w:type="dxa" w:w="70"/>
+            </w:tcMar>
+          </w:tcPr>
+          <w:p>
+            <w:pPr>
+              <w:spacing w:after="18" w:line="236"/>
+            </w:pPr>
+            <w:r>
+              <w:rPr>
+                <w:rFonts w:ascii="Arial" w:cs="Arial" w:eastAsia="Arial" w:hAnsi="Arial"/>
+                <w:b/>
+                <w:bCs/>
+                <w:sz w:val="19"/>
+                <w:szCs w:val="19"/>
+              </w:rPr>
+              <w:t xml:space="preserve">Reglas y validaciones</w:t>
+            </w:r>
+          </w:p>
+        </w:tc>
+        <w:tc>
+          <w:tcPr>
+            <w:tcW w:type="dxa" w:w="7060"/>
+            <w:tcMar>
+              <w:top w:type="dxa" w:w="40"/>
+              <w:left w:type="dxa" w:w="70"/>
+              <w:bottom w:type="dxa" w:w="40"/>
+              <w:right w:type="dxa" w:w="70"/>
+            </w:tcMar>
+          </w:tcPr>
+          <w:p>
+            <w:pPr>
+              <w:spacing w:after="18" w:line="236"/>
+            </w:pPr>
+            <w:r>
+              <w:rPr>
+                <w:rFonts w:ascii="Arial" w:cs="Arial" w:eastAsia="Arial" w:hAnsi="Arial"/>
+                <w:sz w:val="19"/>
+                <w:szCs w:val="19"/>
+              </w:rPr>
+              <w:t xml:space="preserve">El traslado mueve los lotes con su costo real (no genera utilidad ni pérdida) y queda registrado en el kardex de origen y de destino.</w:t>
+            </w:r>
+          </w:p>
+        </w:tc>
+      </w:tr>
+      <w:tr>
+        <w:tc>
+          <w:tcPr>
+            <w:tcW w:type="dxa" w:w="2300"/>
+            <w:shd w:fill="EAF0F8" w:val="clear"/>
+            <w:tcMar>
+              <w:top w:type="dxa" w:w="40"/>
+              <w:left w:type="dxa" w:w="70"/>
+              <w:bottom w:type="dxa" w:w="40"/>
+              <w:right w:type="dxa" w:w="70"/>
+            </w:tcMar>
+          </w:tcPr>
+          <w:p>
+            <w:pPr>
+              <w:spacing w:after="18" w:line="236"/>
+            </w:pPr>
+            <w:r>
+              <w:rPr>
+                <w:rFonts w:ascii="Arial" w:cs="Arial" w:eastAsia="Arial" w:hAnsi="Arial"/>
+                <w:b/>
+                <w:bCs/>
+                <w:sz w:val="19"/>
+                <w:szCs w:val="19"/>
+              </w:rPr>
+              <w:t xml:space="preserve">Postcondiciones</w:t>
+            </w:r>
+          </w:p>
+        </w:tc>
+        <w:tc>
+          <w:tcPr>
+            <w:tcW w:type="dxa" w:w="7060"/>
+            <w:tcMar>
+              <w:top w:type="dxa" w:w="40"/>
+              <w:left w:type="dxa" w:w="70"/>
+              <w:bottom w:type="dxa" w:w="40"/>
+              <w:right w:type="dxa" w:w="70"/>
+            </w:tcMar>
+          </w:tcPr>
+          <w:p>
+            <w:pPr>
+              <w:spacing w:after="18" w:line="236"/>
+            </w:pPr>
+            <w:r>
+              <w:rPr>
+                <w:rFonts w:ascii="Arial" w:cs="Arial" w:eastAsia="Arial" w:hAnsi="Arial"/>
+                <w:sz w:val="19"/>
+                <w:szCs w:val="19"/>
+              </w:rPr>
+              <w:t xml:space="preserve">La mercancía queda trasladada y el kardex de ambas sedes actualizado.</w:t>
+            </w:r>
+          </w:p>
+        </w:tc>
+      </w:tr>
+      <w:tr>
+        <w:tc>
+          <w:tcPr>
+            <w:tcW w:type="dxa" w:w="2300"/>
+            <w:shd w:fill="EAF0F8" w:val="clear"/>
+            <w:tcMar>
+              <w:top w:type="dxa" w:w="40"/>
+              <w:left w:type="dxa" w:w="70"/>
+              <w:bottom w:type="dxa" w:w="40"/>
+              <w:right w:type="dxa" w:w="70"/>
+            </w:tcMar>
+          </w:tcPr>
+          <w:p>
+            <w:pPr>
+              <w:spacing w:after="18" w:line="236"/>
+            </w:pPr>
+            <w:r>
+              <w:rPr>
+                <w:rFonts w:ascii="Arial" w:cs="Arial" w:eastAsia="Arial" w:hAnsi="Arial"/>
+                <w:b/>
+                <w:bCs/>
+                <w:sz w:val="19"/>
+                <w:szCs w:val="19"/>
+              </w:rPr>
+              <w:t xml:space="preserve">Prioridad</w:t>
+            </w:r>
+          </w:p>
+        </w:tc>
+        <w:tc>
+          <w:tcPr>
+            <w:tcW w:type="dxa" w:w="7060"/>
+            <w:tcMar>
+              <w:top w:type="dxa" w:w="40"/>
+              <w:left w:type="dxa" w:w="70"/>
+              <w:bottom w:type="dxa" w:w="40"/>
+              <w:right w:type="dxa" w:w="70"/>
+            </w:tcMar>
+          </w:tcPr>
+          <w:p>
+            <w:pPr>
+              <w:spacing w:after="18" w:line="236"/>
+            </w:pPr>
+            <w:r>
+              <w:rPr>
+                <w:rFonts w:ascii="Arial" w:cs="Arial" w:eastAsia="Arial" w:hAnsi="Arial"/>
+                <w:sz w:val="19"/>
+                <w:szCs w:val="19"/>
+              </w:rPr>
+              <w:t xml:space="preserve">Media</w:t>
+            </w:r>
+          </w:p>
+        </w:tc>
+      </w:tr>
+    </w:tbl>
+    <w:p>
+      <w:pPr>
+        <w:spacing w:after="140"/>
+      </w:pPr>
+    </w:p>
     <w:sectPr>
       <w:footerReference w:type="default" r:id="rId7"/>
       <w:pgSz w:w="12240" w:h="15840" w:orient="portrait"/>

</xml_diff>

<commit_message>
Agrego los casos de uso extendidos del módulo de facturación electrónica
</commit_message>
<xml_diff>
--- a/docs/diseno/INVENTRA_Analisis_Diseno_UML.docx
+++ b/docs/diseno/INVENTRA_Analisis_Diseno_UML.docx
@@ -1436,6 +1436,41 @@
       <w:r>
         <w:fldChar w:fldCharType="begin" w:dirty="true"/>
         <w:instrText xml:space="preserve">PAGEREF bm47</w:instrText>
+        <w:fldChar w:fldCharType="end"/>
+      </w:r>
+    </w:p>
+    <w:p>
+      <w:pPr>
+        <w:tabs>
+          <w:tab w:val="right" w:pos="9200" w:leader="dot"/>
+        </w:tabs>
+        <w:spacing w:after="40" w:line="252"/>
+        <w:ind w:left="360"/>
+      </w:pPr>
+      <w:hyperlink w:history="1" w:anchor="bm48">
+        <w:r>
+          <w:rPr>
+            <w:rFonts w:ascii="Arial" w:cs="Arial" w:eastAsia="Arial" w:hAnsi="Arial"/>
+            <w:b w:val="false"/>
+            <w:bCs w:val="false"/>
+            <w:color w:val="1F3864"/>
+            <w:sz w:val="20"/>
+            <w:szCs w:val="20"/>
+          </w:rPr>
+          <w:t xml:space="preserve">9.7 Módulo FAC — Facturación electrónica</w:t>
+        </w:r>
+      </w:hyperlink>
+      <w:r>
+        <w:rPr>
+          <w:rFonts w:ascii="Arial" w:cs="Arial" w:eastAsia="Arial" w:hAnsi="Arial"/>
+          <w:sz w:val="20"/>
+          <w:szCs w:val="20"/>
+        </w:rPr>
+        <w:t xml:space="preserve">	</w:t>
+      </w:r>
+      <w:r>
+        <w:fldChar w:fldCharType="begin" w:dirty="true"/>
+        <w:instrText xml:space="preserve">PAGEREF bm48</w:instrText>
         <w:fldChar w:fldCharType="end"/>
       </w:r>
     </w:p>
@@ -33658,6 +33693,2569 @@
         <w:spacing w:after="140"/>
       </w:pPr>
     </w:p>
+    <w:p>
+      <w:pPr>
+        <w:pStyle w:val="Heading2"/>
+        <w:spacing w:after="80" w:before="150"/>
+      </w:pPr>
+      <w:bookmarkStart w:name="bm48" w:id="48"/>
+      <w:r>
+        <w:rPr>
+          <w:rFonts w:ascii="Arial" w:cs="Arial" w:eastAsia="Arial" w:hAnsi="Arial"/>
+          <w:b/>
+          <w:bCs/>
+          <w:color w:val="2E5496"/>
+          <w:sz w:val="23"/>
+          <w:szCs w:val="23"/>
+        </w:rPr>
+        <w:t xml:space="preserve">9.7 Módulo FAC — Facturación electrónica</w:t>
+      </w:r>
+      <w:bookmarkEnd w:id="48"/>
+    </w:p>
+    <w:tbl>
+      <w:tblPr>
+        <w:tblW w:type="dxa" w:w="9360"/>
+        <w:tblBorders>
+          <w:top w:val="single" w:color="9CA3AF" w:sz="6"/>
+          <w:left w:val="single" w:color="9CA3AF" w:sz="6"/>
+          <w:bottom w:val="single" w:color="9CA3AF" w:sz="6"/>
+          <w:right w:val="single" w:color="9CA3AF" w:sz="6"/>
+          <w:insideH w:val="single" w:color="9CA3AF" w:sz="6"/>
+          <w:insideV w:val="single" w:color="9CA3AF" w:sz="6"/>
+        </w:tblBorders>
+        <w:tblLayout w:type="fixed"/>
+      </w:tblPr>
+      <w:tblGrid>
+        <w:gridCol w:w="2300"/>
+        <w:gridCol w:w="7060"/>
+      </w:tblGrid>
+      <w:tr>
+        <w:tc>
+          <w:tcPr>
+            <w:tcW w:type="dxa" w:w="9360"/>
+            <w:gridSpan w:val="2"/>
+            <w:shd w:fill="1F3864" w:val="clear"/>
+            <w:tcMar>
+              <w:top w:type="dxa" w:w="40"/>
+              <w:left w:type="dxa" w:w="70"/>
+              <w:bottom w:type="dxa" w:w="40"/>
+              <w:right w:type="dxa" w:w="70"/>
+            </w:tcMar>
+          </w:tcPr>
+          <w:p>
+            <w:pPr>
+              <w:spacing w:after="18" w:line="236"/>
+            </w:pPr>
+            <w:r>
+              <w:rPr>
+                <w:rFonts w:ascii="Arial" w:cs="Arial" w:eastAsia="Arial" w:hAnsi="Arial"/>
+                <w:b/>
+                <w:bCs/>
+                <w:color w:val="FFFFFF"/>
+                <w:sz w:val="19"/>
+                <w:szCs w:val="19"/>
+              </w:rPr>
+              <w:t xml:space="preserve">CU-FAC-01 — Configurar datos fiscales</w:t>
+            </w:r>
+          </w:p>
+        </w:tc>
+      </w:tr>
+      <w:tr>
+        <w:tc>
+          <w:tcPr>
+            <w:tcW w:type="dxa" w:w="2300"/>
+            <w:shd w:fill="EAF0F8" w:val="clear"/>
+            <w:tcMar>
+              <w:top w:type="dxa" w:w="40"/>
+              <w:left w:type="dxa" w:w="70"/>
+              <w:bottom w:type="dxa" w:w="40"/>
+              <w:right w:type="dxa" w:w="70"/>
+            </w:tcMar>
+          </w:tcPr>
+          <w:p>
+            <w:pPr>
+              <w:spacing w:after="18" w:line="236"/>
+            </w:pPr>
+            <w:r>
+              <w:rPr>
+                <w:rFonts w:ascii="Arial" w:cs="Arial" w:eastAsia="Arial" w:hAnsi="Arial"/>
+                <w:b/>
+                <w:bCs/>
+                <w:sz w:val="19"/>
+                <w:szCs w:val="19"/>
+              </w:rPr>
+              <w:t xml:space="preserve">Actor(es)</w:t>
+            </w:r>
+          </w:p>
+        </w:tc>
+        <w:tc>
+          <w:tcPr>
+            <w:tcW w:type="dxa" w:w="7060"/>
+            <w:tcMar>
+              <w:top w:type="dxa" w:w="40"/>
+              <w:left w:type="dxa" w:w="70"/>
+              <w:bottom w:type="dxa" w:w="40"/>
+              <w:right w:type="dxa" w:w="70"/>
+            </w:tcMar>
+          </w:tcPr>
+          <w:p>
+            <w:pPr>
+              <w:spacing w:after="18" w:line="236"/>
+            </w:pPr>
+            <w:r>
+              <w:rPr>
+                <w:rFonts w:ascii="Arial" w:cs="Arial" w:eastAsia="Arial" w:hAnsi="Arial"/>
+                <w:sz w:val="19"/>
+                <w:szCs w:val="19"/>
+              </w:rPr>
+              <w:t xml:space="preserve">Administrador</w:t>
+            </w:r>
+          </w:p>
+        </w:tc>
+      </w:tr>
+      <w:tr>
+        <w:tc>
+          <w:tcPr>
+            <w:tcW w:type="dxa" w:w="2300"/>
+            <w:shd w:fill="EAF0F8" w:val="clear"/>
+            <w:tcMar>
+              <w:top w:type="dxa" w:w="40"/>
+              <w:left w:type="dxa" w:w="70"/>
+              <w:bottom w:type="dxa" w:w="40"/>
+              <w:right w:type="dxa" w:w="70"/>
+            </w:tcMar>
+          </w:tcPr>
+          <w:p>
+            <w:pPr>
+              <w:spacing w:after="18" w:line="236"/>
+            </w:pPr>
+            <w:r>
+              <w:rPr>
+                <w:rFonts w:ascii="Arial" w:cs="Arial" w:eastAsia="Arial" w:hAnsi="Arial"/>
+                <w:b/>
+                <w:bCs/>
+                <w:sz w:val="19"/>
+                <w:szCs w:val="19"/>
+              </w:rPr>
+              <w:t xml:space="preserve">Requisito</w:t>
+            </w:r>
+          </w:p>
+        </w:tc>
+        <w:tc>
+          <w:tcPr>
+            <w:tcW w:type="dxa" w:w="7060"/>
+            <w:tcMar>
+              <w:top w:type="dxa" w:w="40"/>
+              <w:left w:type="dxa" w:w="70"/>
+              <w:bottom w:type="dxa" w:w="40"/>
+              <w:right w:type="dxa" w:w="70"/>
+            </w:tcMar>
+          </w:tcPr>
+          <w:p>
+            <w:pPr>
+              <w:spacing w:after="18" w:line="236"/>
+            </w:pPr>
+            <w:r>
+              <w:rPr>
+                <w:rFonts w:ascii="Arial" w:cs="Arial" w:eastAsia="Arial" w:hAnsi="Arial"/>
+                <w:sz w:val="19"/>
+                <w:szCs w:val="19"/>
+              </w:rPr>
+              <w:t xml:space="preserve">RF-FAC-01</w:t>
+            </w:r>
+          </w:p>
+        </w:tc>
+      </w:tr>
+      <w:tr>
+        <w:tc>
+          <w:tcPr>
+            <w:tcW w:type="dxa" w:w="2300"/>
+            <w:shd w:fill="EAF0F8" w:val="clear"/>
+            <w:tcMar>
+              <w:top w:type="dxa" w:w="40"/>
+              <w:left w:type="dxa" w:w="70"/>
+              <w:bottom w:type="dxa" w:w="40"/>
+              <w:right w:type="dxa" w:w="70"/>
+            </w:tcMar>
+          </w:tcPr>
+          <w:p>
+            <w:pPr>
+              <w:spacing w:after="18" w:line="236"/>
+            </w:pPr>
+            <w:r>
+              <w:rPr>
+                <w:rFonts w:ascii="Arial" w:cs="Arial" w:eastAsia="Arial" w:hAnsi="Arial"/>
+                <w:b/>
+                <w:bCs/>
+                <w:sz w:val="19"/>
+                <w:szCs w:val="19"/>
+              </w:rPr>
+              <w:t xml:space="preserve">Descripción</w:t>
+            </w:r>
+          </w:p>
+        </w:tc>
+        <w:tc>
+          <w:tcPr>
+            <w:tcW w:type="dxa" w:w="7060"/>
+            <w:tcMar>
+              <w:top w:type="dxa" w:w="40"/>
+              <w:left w:type="dxa" w:w="70"/>
+              <w:bottom w:type="dxa" w:w="40"/>
+              <w:right w:type="dxa" w:w="70"/>
+            </w:tcMar>
+          </w:tcPr>
+          <w:p>
+            <w:pPr>
+              <w:spacing w:after="18" w:line="236"/>
+            </w:pPr>
+            <w:r>
+              <w:rPr>
+                <w:rFonts w:ascii="Arial" w:cs="Arial" w:eastAsia="Arial" w:hAnsi="Arial"/>
+                <w:sz w:val="19"/>
+                <w:szCs w:val="19"/>
+              </w:rPr>
+              <w:t xml:space="preserve">El administrador configura los datos fiscales de la licorera necesarios para facturar.</w:t>
+            </w:r>
+          </w:p>
+        </w:tc>
+      </w:tr>
+      <w:tr>
+        <w:tc>
+          <w:tcPr>
+            <w:tcW w:type="dxa" w:w="2300"/>
+            <w:shd w:fill="EAF0F8" w:val="clear"/>
+            <w:tcMar>
+              <w:top w:type="dxa" w:w="40"/>
+              <w:left w:type="dxa" w:w="70"/>
+              <w:bottom w:type="dxa" w:w="40"/>
+              <w:right w:type="dxa" w:w="70"/>
+            </w:tcMar>
+          </w:tcPr>
+          <w:p>
+            <w:pPr>
+              <w:spacing w:after="18" w:line="236"/>
+            </w:pPr>
+            <w:r>
+              <w:rPr>
+                <w:rFonts w:ascii="Arial" w:cs="Arial" w:eastAsia="Arial" w:hAnsi="Arial"/>
+                <w:b/>
+                <w:bCs/>
+                <w:sz w:val="19"/>
+                <w:szCs w:val="19"/>
+              </w:rPr>
+              <w:t xml:space="preserve">Precondiciones</w:t>
+            </w:r>
+          </w:p>
+        </w:tc>
+        <w:tc>
+          <w:tcPr>
+            <w:tcW w:type="dxa" w:w="7060"/>
+            <w:tcMar>
+              <w:top w:type="dxa" w:w="40"/>
+              <w:left w:type="dxa" w:w="70"/>
+              <w:bottom w:type="dxa" w:w="40"/>
+              <w:right w:type="dxa" w:w="70"/>
+            </w:tcMar>
+          </w:tcPr>
+          <w:p>
+            <w:pPr>
+              <w:spacing w:after="18" w:line="236"/>
+            </w:pPr>
+            <w:r>
+              <w:rPr>
+                <w:rFonts w:ascii="Arial" w:cs="Arial" w:eastAsia="Arial" w:hAnsi="Arial"/>
+                <w:sz w:val="19"/>
+                <w:szCs w:val="19"/>
+              </w:rPr>
+              <w:t xml:space="preserve">El administrador está autenticado y la suscripción incluye facturación electrónica (plan Pro).</w:t>
+            </w:r>
+          </w:p>
+        </w:tc>
+      </w:tr>
+      <w:tr>
+        <w:tc>
+          <w:tcPr>
+            <w:tcW w:type="dxa" w:w="2300"/>
+            <w:shd w:fill="EAF0F8" w:val="clear"/>
+            <w:tcMar>
+              <w:top w:type="dxa" w:w="40"/>
+              <w:left w:type="dxa" w:w="70"/>
+              <w:bottom w:type="dxa" w:w="40"/>
+              <w:right w:type="dxa" w:w="70"/>
+            </w:tcMar>
+          </w:tcPr>
+          <w:p>
+            <w:pPr>
+              <w:spacing w:after="18" w:line="236"/>
+            </w:pPr>
+            <w:r>
+              <w:rPr>
+                <w:rFonts w:ascii="Arial" w:cs="Arial" w:eastAsia="Arial" w:hAnsi="Arial"/>
+                <w:b/>
+                <w:bCs/>
+                <w:sz w:val="19"/>
+                <w:szCs w:val="19"/>
+              </w:rPr>
+              <w:t xml:space="preserve">Flujo principal</w:t>
+            </w:r>
+          </w:p>
+        </w:tc>
+        <w:tc>
+          <w:tcPr>
+            <w:tcW w:type="dxa" w:w="7060"/>
+            <w:tcMar>
+              <w:top w:type="dxa" w:w="40"/>
+              <w:left w:type="dxa" w:w="70"/>
+              <w:bottom w:type="dxa" w:w="40"/>
+              <w:right w:type="dxa" w:w="70"/>
+            </w:tcMar>
+          </w:tcPr>
+          <w:p>
+            <w:pPr>
+              <w:spacing w:after="18" w:line="236"/>
+            </w:pPr>
+            <w:r>
+              <w:rPr>
+                <w:rFonts w:ascii="Arial" w:cs="Arial" w:eastAsia="Arial" w:hAnsi="Arial"/>
+                <w:sz w:val="19"/>
+                <w:szCs w:val="19"/>
+              </w:rPr>
+              <w:t xml:space="preserve">1. Abre la configuración de facturación electrónica.</w:t>
+            </w:r>
+          </w:p>
+          <w:p>
+            <w:pPr>
+              <w:spacing w:after="18" w:line="236"/>
+            </w:pPr>
+            <w:r>
+              <w:rPr>
+                <w:rFonts w:ascii="Arial" w:cs="Arial" w:eastAsia="Arial" w:hAnsi="Arial"/>
+                <w:sz w:val="19"/>
+                <w:szCs w:val="19"/>
+              </w:rPr>
+              <w:t xml:space="preserve">2. Ingresa los datos fiscales (identificación, régimen, resolución de la DIAN y numeración autorizada).</w:t>
+            </w:r>
+          </w:p>
+          <w:p>
+            <w:pPr>
+              <w:spacing w:after="18" w:line="236"/>
+            </w:pPr>
+            <w:r>
+              <w:rPr>
+                <w:rFonts w:ascii="Arial" w:cs="Arial" w:eastAsia="Arial" w:hAnsi="Arial"/>
+                <w:sz w:val="19"/>
+                <w:szCs w:val="19"/>
+              </w:rPr>
+              <w:t xml:space="preserve">3. El sistema valida los datos.</w:t>
+            </w:r>
+          </w:p>
+          <w:p>
+            <w:pPr>
+              <w:spacing w:after="18" w:line="236"/>
+            </w:pPr>
+            <w:r>
+              <w:rPr>
+                <w:rFonts w:ascii="Arial" w:cs="Arial" w:eastAsia="Arial" w:hAnsi="Arial"/>
+                <w:sz w:val="19"/>
+                <w:szCs w:val="19"/>
+              </w:rPr>
+              <w:t xml:space="preserve">4. El sistema guarda la configuración y la deja lista para emitir.</w:t>
+            </w:r>
+          </w:p>
+        </w:tc>
+      </w:tr>
+      <w:tr>
+        <w:tc>
+          <w:tcPr>
+            <w:tcW w:type="dxa" w:w="2300"/>
+            <w:shd w:fill="EAF0F8" w:val="clear"/>
+            <w:tcMar>
+              <w:top w:type="dxa" w:w="40"/>
+              <w:left w:type="dxa" w:w="70"/>
+              <w:bottom w:type="dxa" w:w="40"/>
+              <w:right w:type="dxa" w:w="70"/>
+            </w:tcMar>
+          </w:tcPr>
+          <w:p>
+            <w:pPr>
+              <w:spacing w:after="18" w:line="236"/>
+            </w:pPr>
+            <w:r>
+              <w:rPr>
+                <w:rFonts w:ascii="Arial" w:cs="Arial" w:eastAsia="Arial" w:hAnsi="Arial"/>
+                <w:b/>
+                <w:bCs/>
+                <w:sz w:val="19"/>
+                <w:szCs w:val="19"/>
+              </w:rPr>
+              <w:t xml:space="preserve">Flujos alternativos</w:t>
+            </w:r>
+          </w:p>
+        </w:tc>
+        <w:tc>
+          <w:tcPr>
+            <w:tcW w:type="dxa" w:w="7060"/>
+            <w:tcMar>
+              <w:top w:type="dxa" w:w="40"/>
+              <w:left w:type="dxa" w:w="70"/>
+              <w:bottom w:type="dxa" w:w="40"/>
+              <w:right w:type="dxa" w:w="70"/>
+            </w:tcMar>
+          </w:tcPr>
+          <w:p>
+            <w:pPr>
+              <w:spacing w:after="18" w:line="236"/>
+            </w:pPr>
+            <w:r>
+              <w:rPr>
+                <w:rFonts w:ascii="Arial" w:cs="Arial" w:eastAsia="Arial" w:hAnsi="Arial"/>
+                <w:sz w:val="19"/>
+                <w:szCs w:val="19"/>
+              </w:rPr>
+              <w:t xml:space="preserve">2a. Actualizar la resolución cuando cambie o se venza.</w:t>
+            </w:r>
+          </w:p>
+        </w:tc>
+      </w:tr>
+      <w:tr>
+        <w:tc>
+          <w:tcPr>
+            <w:tcW w:type="dxa" w:w="2300"/>
+            <w:shd w:fill="EAF0F8" w:val="clear"/>
+            <w:tcMar>
+              <w:top w:type="dxa" w:w="40"/>
+              <w:left w:type="dxa" w:w="70"/>
+              <w:bottom w:type="dxa" w:w="40"/>
+              <w:right w:type="dxa" w:w="70"/>
+            </w:tcMar>
+          </w:tcPr>
+          <w:p>
+            <w:pPr>
+              <w:spacing w:after="18" w:line="236"/>
+            </w:pPr>
+            <w:r>
+              <w:rPr>
+                <w:rFonts w:ascii="Arial" w:cs="Arial" w:eastAsia="Arial" w:hAnsi="Arial"/>
+                <w:b/>
+                <w:bCs/>
+                <w:sz w:val="19"/>
+                <w:szCs w:val="19"/>
+              </w:rPr>
+              <w:t xml:space="preserve">Excepciones</w:t>
+            </w:r>
+          </w:p>
+        </w:tc>
+        <w:tc>
+          <w:tcPr>
+            <w:tcW w:type="dxa" w:w="7060"/>
+            <w:tcMar>
+              <w:top w:type="dxa" w:w="40"/>
+              <w:left w:type="dxa" w:w="70"/>
+              <w:bottom w:type="dxa" w:w="40"/>
+              <w:right w:type="dxa" w:w="70"/>
+            </w:tcMar>
+          </w:tcPr>
+          <w:p>
+            <w:pPr>
+              <w:spacing w:after="18" w:line="236"/>
+            </w:pPr>
+            <w:r>
+              <w:rPr>
+                <w:rFonts w:ascii="Arial" w:cs="Arial" w:eastAsia="Arial" w:hAnsi="Arial"/>
+                <w:sz w:val="19"/>
+                <w:szCs w:val="19"/>
+              </w:rPr>
+              <w:t xml:space="preserve">3a. Datos incompletos o inválidos: el sistema informa y no guarda.</w:t>
+            </w:r>
+          </w:p>
+          <w:p>
+            <w:pPr>
+              <w:spacing w:after="18" w:line="236"/>
+            </w:pPr>
+            <w:r>
+              <w:rPr>
+                <w:rFonts w:ascii="Arial" w:cs="Arial" w:eastAsia="Arial" w:hAnsi="Arial"/>
+                <w:sz w:val="19"/>
+                <w:szCs w:val="19"/>
+              </w:rPr>
+              <w:t xml:space="preserve">*. El plan no incluye facturación electrónica: el sistema restringe la función (CU-SUS-04).</w:t>
+            </w:r>
+          </w:p>
+        </w:tc>
+      </w:tr>
+      <w:tr>
+        <w:tc>
+          <w:tcPr>
+            <w:tcW w:type="dxa" w:w="2300"/>
+            <w:shd w:fill="EAF0F8" w:val="clear"/>
+            <w:tcMar>
+              <w:top w:type="dxa" w:w="40"/>
+              <w:left w:type="dxa" w:w="70"/>
+              <w:bottom w:type="dxa" w:w="40"/>
+              <w:right w:type="dxa" w:w="70"/>
+            </w:tcMar>
+          </w:tcPr>
+          <w:p>
+            <w:pPr>
+              <w:spacing w:after="18" w:line="236"/>
+            </w:pPr>
+            <w:r>
+              <w:rPr>
+                <w:rFonts w:ascii="Arial" w:cs="Arial" w:eastAsia="Arial" w:hAnsi="Arial"/>
+                <w:b/>
+                <w:bCs/>
+                <w:sz w:val="19"/>
+                <w:szCs w:val="19"/>
+              </w:rPr>
+              <w:t xml:space="preserve">Reglas y validaciones</w:t>
+            </w:r>
+          </w:p>
+        </w:tc>
+        <w:tc>
+          <w:tcPr>
+            <w:tcW w:type="dxa" w:w="7060"/>
+            <w:tcMar>
+              <w:top w:type="dxa" w:w="40"/>
+              <w:left w:type="dxa" w:w="70"/>
+              <w:bottom w:type="dxa" w:w="40"/>
+              <w:right w:type="dxa" w:w="70"/>
+            </w:tcMar>
+          </w:tcPr>
+          <w:p>
+            <w:pPr>
+              <w:spacing w:after="18" w:line="236"/>
+            </w:pPr>
+            <w:r>
+              <w:rPr>
+                <w:rFonts w:ascii="Arial" w:cs="Arial" w:eastAsia="Arial" w:hAnsi="Arial"/>
+                <w:sz w:val="19"/>
+                <w:szCs w:val="19"/>
+              </w:rPr>
+              <w:t xml:space="preserve">La facturación electrónica pertenece al plan Pro y opera en modo de pruebas (sandbox) de la DIAN; sin datos fiscales configurados no se puede emitir.</w:t>
+            </w:r>
+          </w:p>
+        </w:tc>
+      </w:tr>
+      <w:tr>
+        <w:tc>
+          <w:tcPr>
+            <w:tcW w:type="dxa" w:w="2300"/>
+            <w:shd w:fill="EAF0F8" w:val="clear"/>
+            <w:tcMar>
+              <w:top w:type="dxa" w:w="40"/>
+              <w:left w:type="dxa" w:w="70"/>
+              <w:bottom w:type="dxa" w:w="40"/>
+              <w:right w:type="dxa" w:w="70"/>
+            </w:tcMar>
+          </w:tcPr>
+          <w:p>
+            <w:pPr>
+              <w:spacing w:after="18" w:line="236"/>
+            </w:pPr>
+            <w:r>
+              <w:rPr>
+                <w:rFonts w:ascii="Arial" w:cs="Arial" w:eastAsia="Arial" w:hAnsi="Arial"/>
+                <w:b/>
+                <w:bCs/>
+                <w:sz w:val="19"/>
+                <w:szCs w:val="19"/>
+              </w:rPr>
+              <w:t xml:space="preserve">Postcondiciones</w:t>
+            </w:r>
+          </w:p>
+        </w:tc>
+        <w:tc>
+          <w:tcPr>
+            <w:tcW w:type="dxa" w:w="7060"/>
+            <w:tcMar>
+              <w:top w:type="dxa" w:w="40"/>
+              <w:left w:type="dxa" w:w="70"/>
+              <w:bottom w:type="dxa" w:w="40"/>
+              <w:right w:type="dxa" w:w="70"/>
+            </w:tcMar>
+          </w:tcPr>
+          <w:p>
+            <w:pPr>
+              <w:spacing w:after="18" w:line="236"/>
+            </w:pPr>
+            <w:r>
+              <w:rPr>
+                <w:rFonts w:ascii="Arial" w:cs="Arial" w:eastAsia="Arial" w:hAnsi="Arial"/>
+                <w:sz w:val="19"/>
+                <w:szCs w:val="19"/>
+              </w:rPr>
+              <w:t xml:space="preserve">Los datos fiscales quedan configurados.</w:t>
+            </w:r>
+          </w:p>
+        </w:tc>
+      </w:tr>
+      <w:tr>
+        <w:tc>
+          <w:tcPr>
+            <w:tcW w:type="dxa" w:w="2300"/>
+            <w:shd w:fill="EAF0F8" w:val="clear"/>
+            <w:tcMar>
+              <w:top w:type="dxa" w:w="40"/>
+              <w:left w:type="dxa" w:w="70"/>
+              <w:bottom w:type="dxa" w:w="40"/>
+              <w:right w:type="dxa" w:w="70"/>
+            </w:tcMar>
+          </w:tcPr>
+          <w:p>
+            <w:pPr>
+              <w:spacing w:after="18" w:line="236"/>
+            </w:pPr>
+            <w:r>
+              <w:rPr>
+                <w:rFonts w:ascii="Arial" w:cs="Arial" w:eastAsia="Arial" w:hAnsi="Arial"/>
+                <w:b/>
+                <w:bCs/>
+                <w:sz w:val="19"/>
+                <w:szCs w:val="19"/>
+              </w:rPr>
+              <w:t xml:space="preserve">Prioridad</w:t>
+            </w:r>
+          </w:p>
+        </w:tc>
+        <w:tc>
+          <w:tcPr>
+            <w:tcW w:type="dxa" w:w="7060"/>
+            <w:tcMar>
+              <w:top w:type="dxa" w:w="40"/>
+              <w:left w:type="dxa" w:w="70"/>
+              <w:bottom w:type="dxa" w:w="40"/>
+              <w:right w:type="dxa" w:w="70"/>
+            </w:tcMar>
+          </w:tcPr>
+          <w:p>
+            <w:pPr>
+              <w:spacing w:after="18" w:line="236"/>
+            </w:pPr>
+            <w:r>
+              <w:rPr>
+                <w:rFonts w:ascii="Arial" w:cs="Arial" w:eastAsia="Arial" w:hAnsi="Arial"/>
+                <w:sz w:val="19"/>
+                <w:szCs w:val="19"/>
+              </w:rPr>
+              <w:t xml:space="preserve">Alta</w:t>
+            </w:r>
+          </w:p>
+        </w:tc>
+      </w:tr>
+    </w:tbl>
+    <w:p>
+      <w:pPr>
+        <w:spacing w:after="140"/>
+      </w:pPr>
+    </w:p>
+    <w:tbl>
+      <w:tblPr>
+        <w:tblW w:type="dxa" w:w="9360"/>
+        <w:tblBorders>
+          <w:top w:val="single" w:color="9CA3AF" w:sz="6"/>
+          <w:left w:val="single" w:color="9CA3AF" w:sz="6"/>
+          <w:bottom w:val="single" w:color="9CA3AF" w:sz="6"/>
+          <w:right w:val="single" w:color="9CA3AF" w:sz="6"/>
+          <w:insideH w:val="single" w:color="9CA3AF" w:sz="6"/>
+          <w:insideV w:val="single" w:color="9CA3AF" w:sz="6"/>
+        </w:tblBorders>
+        <w:tblLayout w:type="fixed"/>
+      </w:tblPr>
+      <w:tblGrid>
+        <w:gridCol w:w="2300"/>
+        <w:gridCol w:w="7060"/>
+      </w:tblGrid>
+      <w:tr>
+        <w:tc>
+          <w:tcPr>
+            <w:tcW w:type="dxa" w:w="9360"/>
+            <w:gridSpan w:val="2"/>
+            <w:shd w:fill="1F3864" w:val="clear"/>
+            <w:tcMar>
+              <w:top w:type="dxa" w:w="40"/>
+              <w:left w:type="dxa" w:w="70"/>
+              <w:bottom w:type="dxa" w:w="40"/>
+              <w:right w:type="dxa" w:w="70"/>
+            </w:tcMar>
+          </w:tcPr>
+          <w:p>
+            <w:pPr>
+              <w:spacing w:after="18" w:line="236"/>
+            </w:pPr>
+            <w:r>
+              <w:rPr>
+                <w:rFonts w:ascii="Arial" w:cs="Arial" w:eastAsia="Arial" w:hAnsi="Arial"/>
+                <w:b/>
+                <w:bCs/>
+                <w:color w:val="FFFFFF"/>
+                <w:sz w:val="19"/>
+                <w:szCs w:val="19"/>
+              </w:rPr>
+              <w:t xml:space="preserve">CU-FAC-02 — Emitir factura electrónica</w:t>
+            </w:r>
+          </w:p>
+        </w:tc>
+      </w:tr>
+      <w:tr>
+        <w:tc>
+          <w:tcPr>
+            <w:tcW w:type="dxa" w:w="2300"/>
+            <w:shd w:fill="EAF0F8" w:val="clear"/>
+            <w:tcMar>
+              <w:top w:type="dxa" w:w="40"/>
+              <w:left w:type="dxa" w:w="70"/>
+              <w:bottom w:type="dxa" w:w="40"/>
+              <w:right w:type="dxa" w:w="70"/>
+            </w:tcMar>
+          </w:tcPr>
+          <w:p>
+            <w:pPr>
+              <w:spacing w:after="18" w:line="236"/>
+            </w:pPr>
+            <w:r>
+              <w:rPr>
+                <w:rFonts w:ascii="Arial" w:cs="Arial" w:eastAsia="Arial" w:hAnsi="Arial"/>
+                <w:b/>
+                <w:bCs/>
+                <w:sz w:val="19"/>
+                <w:szCs w:val="19"/>
+              </w:rPr>
+              <w:t xml:space="preserve">Actor(es)</w:t>
+            </w:r>
+          </w:p>
+        </w:tc>
+        <w:tc>
+          <w:tcPr>
+            <w:tcW w:type="dxa" w:w="7060"/>
+            <w:tcMar>
+              <w:top w:type="dxa" w:w="40"/>
+              <w:left w:type="dxa" w:w="70"/>
+              <w:bottom w:type="dxa" w:w="40"/>
+              <w:right w:type="dxa" w:w="70"/>
+            </w:tcMar>
+          </w:tcPr>
+          <w:p>
+            <w:pPr>
+              <w:spacing w:after="18" w:line="236"/>
+            </w:pPr>
+            <w:r>
+              <w:rPr>
+                <w:rFonts w:ascii="Arial" w:cs="Arial" w:eastAsia="Arial" w:hAnsi="Arial"/>
+                <w:sz w:val="19"/>
+                <w:szCs w:val="19"/>
+              </w:rPr>
+              <w:t xml:space="preserve">Administrador; Servicio DIAN</w:t>
+            </w:r>
+          </w:p>
+        </w:tc>
+      </w:tr>
+      <w:tr>
+        <w:tc>
+          <w:tcPr>
+            <w:tcW w:type="dxa" w:w="2300"/>
+            <w:shd w:fill="EAF0F8" w:val="clear"/>
+            <w:tcMar>
+              <w:top w:type="dxa" w:w="40"/>
+              <w:left w:type="dxa" w:w="70"/>
+              <w:bottom w:type="dxa" w:w="40"/>
+              <w:right w:type="dxa" w:w="70"/>
+            </w:tcMar>
+          </w:tcPr>
+          <w:p>
+            <w:pPr>
+              <w:spacing w:after="18" w:line="236"/>
+            </w:pPr>
+            <w:r>
+              <w:rPr>
+                <w:rFonts w:ascii="Arial" w:cs="Arial" w:eastAsia="Arial" w:hAnsi="Arial"/>
+                <w:b/>
+                <w:bCs/>
+                <w:sz w:val="19"/>
+                <w:szCs w:val="19"/>
+              </w:rPr>
+              <w:t xml:space="preserve">Requisito</w:t>
+            </w:r>
+          </w:p>
+        </w:tc>
+        <w:tc>
+          <w:tcPr>
+            <w:tcW w:type="dxa" w:w="7060"/>
+            <w:tcMar>
+              <w:top w:type="dxa" w:w="40"/>
+              <w:left w:type="dxa" w:w="70"/>
+              <w:bottom w:type="dxa" w:w="40"/>
+              <w:right w:type="dxa" w:w="70"/>
+            </w:tcMar>
+          </w:tcPr>
+          <w:p>
+            <w:pPr>
+              <w:spacing w:after="18" w:line="236"/>
+            </w:pPr>
+            <w:r>
+              <w:rPr>
+                <w:rFonts w:ascii="Arial" w:cs="Arial" w:eastAsia="Arial" w:hAnsi="Arial"/>
+                <w:sz w:val="19"/>
+                <w:szCs w:val="19"/>
+              </w:rPr>
+              <w:t xml:space="preserve">RF-FAC-02</w:t>
+            </w:r>
+          </w:p>
+        </w:tc>
+      </w:tr>
+      <w:tr>
+        <w:tc>
+          <w:tcPr>
+            <w:tcW w:type="dxa" w:w="2300"/>
+            <w:shd w:fill="EAF0F8" w:val="clear"/>
+            <w:tcMar>
+              <w:top w:type="dxa" w:w="40"/>
+              <w:left w:type="dxa" w:w="70"/>
+              <w:bottom w:type="dxa" w:w="40"/>
+              <w:right w:type="dxa" w:w="70"/>
+            </w:tcMar>
+          </w:tcPr>
+          <w:p>
+            <w:pPr>
+              <w:spacing w:after="18" w:line="236"/>
+            </w:pPr>
+            <w:r>
+              <w:rPr>
+                <w:rFonts w:ascii="Arial" w:cs="Arial" w:eastAsia="Arial" w:hAnsi="Arial"/>
+                <w:b/>
+                <w:bCs/>
+                <w:sz w:val="19"/>
+                <w:szCs w:val="19"/>
+              </w:rPr>
+              <w:t xml:space="preserve">Descripción</w:t>
+            </w:r>
+          </w:p>
+        </w:tc>
+        <w:tc>
+          <w:tcPr>
+            <w:tcW w:type="dxa" w:w="7060"/>
+            <w:tcMar>
+              <w:top w:type="dxa" w:w="40"/>
+              <w:left w:type="dxa" w:w="70"/>
+              <w:bottom w:type="dxa" w:w="40"/>
+              <w:right w:type="dxa" w:w="70"/>
+            </w:tcMar>
+          </w:tcPr>
+          <w:p>
+            <w:pPr>
+              <w:spacing w:after="18" w:line="236"/>
+            </w:pPr>
+            <w:r>
+              <w:rPr>
+                <w:rFonts w:ascii="Arial" w:cs="Arial" w:eastAsia="Arial" w:hAnsi="Arial"/>
+                <w:sz w:val="19"/>
+                <w:szCs w:val="19"/>
+              </w:rPr>
+              <w:t xml:space="preserve">El sistema emite la factura electrónica de una venta y la envía a la DIAN. Se invoca desde el registro de venta.</w:t>
+            </w:r>
+          </w:p>
+        </w:tc>
+      </w:tr>
+      <w:tr>
+        <w:tc>
+          <w:tcPr>
+            <w:tcW w:type="dxa" w:w="2300"/>
+            <w:shd w:fill="EAF0F8" w:val="clear"/>
+            <w:tcMar>
+              <w:top w:type="dxa" w:w="40"/>
+              <w:left w:type="dxa" w:w="70"/>
+              <w:bottom w:type="dxa" w:w="40"/>
+              <w:right w:type="dxa" w:w="70"/>
+            </w:tcMar>
+          </w:tcPr>
+          <w:p>
+            <w:pPr>
+              <w:spacing w:after="18" w:line="236"/>
+            </w:pPr>
+            <w:r>
+              <w:rPr>
+                <w:rFonts w:ascii="Arial" w:cs="Arial" w:eastAsia="Arial" w:hAnsi="Arial"/>
+                <w:b/>
+                <w:bCs/>
+                <w:sz w:val="19"/>
+                <w:szCs w:val="19"/>
+              </w:rPr>
+              <w:t xml:space="preserve">Precondiciones</w:t>
+            </w:r>
+          </w:p>
+        </w:tc>
+        <w:tc>
+          <w:tcPr>
+            <w:tcW w:type="dxa" w:w="7060"/>
+            <w:tcMar>
+              <w:top w:type="dxa" w:w="40"/>
+              <w:left w:type="dxa" w:w="70"/>
+              <w:bottom w:type="dxa" w:w="40"/>
+              <w:right w:type="dxa" w:w="70"/>
+            </w:tcMar>
+          </w:tcPr>
+          <w:p>
+            <w:pPr>
+              <w:spacing w:after="18" w:line="236"/>
+            </w:pPr>
+            <w:r>
+              <w:rPr>
+                <w:rFonts w:ascii="Arial" w:cs="Arial" w:eastAsia="Arial" w:hAnsi="Arial"/>
+                <w:sz w:val="19"/>
+                <w:szCs w:val="19"/>
+              </w:rPr>
+              <w:t xml:space="preserve">Los datos fiscales están configurados y existe la venta.</w:t>
+            </w:r>
+          </w:p>
+        </w:tc>
+      </w:tr>
+      <w:tr>
+        <w:tc>
+          <w:tcPr>
+            <w:tcW w:type="dxa" w:w="2300"/>
+            <w:shd w:fill="EAF0F8" w:val="clear"/>
+            <w:tcMar>
+              <w:top w:type="dxa" w:w="40"/>
+              <w:left w:type="dxa" w:w="70"/>
+              <w:bottom w:type="dxa" w:w="40"/>
+              <w:right w:type="dxa" w:w="70"/>
+            </w:tcMar>
+          </w:tcPr>
+          <w:p>
+            <w:pPr>
+              <w:spacing w:after="18" w:line="236"/>
+            </w:pPr>
+            <w:r>
+              <w:rPr>
+                <w:rFonts w:ascii="Arial" w:cs="Arial" w:eastAsia="Arial" w:hAnsi="Arial"/>
+                <w:b/>
+                <w:bCs/>
+                <w:sz w:val="19"/>
+                <w:szCs w:val="19"/>
+              </w:rPr>
+              <w:t xml:space="preserve">Flujo principal</w:t>
+            </w:r>
+          </w:p>
+        </w:tc>
+        <w:tc>
+          <w:tcPr>
+            <w:tcW w:type="dxa" w:w="7060"/>
+            <w:tcMar>
+              <w:top w:type="dxa" w:w="40"/>
+              <w:left w:type="dxa" w:w="70"/>
+              <w:bottom w:type="dxa" w:w="40"/>
+              <w:right w:type="dxa" w:w="70"/>
+            </w:tcMar>
+          </w:tcPr>
+          <w:p>
+            <w:pPr>
+              <w:spacing w:after="18" w:line="236"/>
+            </w:pPr>
+            <w:r>
+              <w:rPr>
+                <w:rFonts w:ascii="Arial" w:cs="Arial" w:eastAsia="Arial" w:hAnsi="Arial"/>
+                <w:sz w:val="19"/>
+                <w:szCs w:val="19"/>
+              </w:rPr>
+              <w:t xml:space="preserve">1. El sistema toma los datos de la venta y del adquiriente.</w:t>
+            </w:r>
+          </w:p>
+          <w:p>
+            <w:pPr>
+              <w:spacing w:after="18" w:line="236"/>
+            </w:pPr>
+            <w:r>
+              <w:rPr>
+                <w:rFonts w:ascii="Arial" w:cs="Arial" w:eastAsia="Arial" w:hAnsi="Arial"/>
+                <w:sz w:val="19"/>
+                <w:szCs w:val="19"/>
+              </w:rPr>
+              <w:t xml:space="preserve">2. Valida los datos fiscales y del adquiriente.</w:t>
+            </w:r>
+          </w:p>
+          <w:p>
+            <w:pPr>
+              <w:spacing w:after="18" w:line="236"/>
+            </w:pPr>
+            <w:r>
+              <w:rPr>
+                <w:rFonts w:ascii="Arial" w:cs="Arial" w:eastAsia="Arial" w:hAnsi="Arial"/>
+                <w:sz w:val="19"/>
+                <w:szCs w:val="19"/>
+              </w:rPr>
+              <w:t xml:space="preserve">3. Construye y firma la factura (XML) y genera el CUFE.</w:t>
+            </w:r>
+          </w:p>
+          <w:p>
+            <w:pPr>
+              <w:spacing w:after="18" w:line="236"/>
+            </w:pPr>
+            <w:r>
+              <w:rPr>
+                <w:rFonts w:ascii="Arial" w:cs="Arial" w:eastAsia="Arial" w:hAnsi="Arial"/>
+                <w:sz w:val="19"/>
+                <w:szCs w:val="19"/>
+              </w:rPr>
+              <w:t xml:space="preserve">4. Envía la factura al Servicio DIAN (sandbox).</w:t>
+            </w:r>
+          </w:p>
+          <w:p>
+            <w:pPr>
+              <w:spacing w:after="18" w:line="236"/>
+            </w:pPr>
+            <w:r>
+              <w:rPr>
+                <w:rFonts w:ascii="Arial" w:cs="Arial" w:eastAsia="Arial" w:hAnsi="Arial"/>
+                <w:sz w:val="19"/>
+                <w:szCs w:val="19"/>
+              </w:rPr>
+              <w:t xml:space="preserve">5. La DIAN acepta y el sistema guarda la factura con su CUFE y entrega la representación.</w:t>
+            </w:r>
+          </w:p>
+        </w:tc>
+      </w:tr>
+      <w:tr>
+        <w:tc>
+          <w:tcPr>
+            <w:tcW w:type="dxa" w:w="2300"/>
+            <w:shd w:fill="EAF0F8" w:val="clear"/>
+            <w:tcMar>
+              <w:top w:type="dxa" w:w="40"/>
+              <w:left w:type="dxa" w:w="70"/>
+              <w:bottom w:type="dxa" w:w="40"/>
+              <w:right w:type="dxa" w:w="70"/>
+            </w:tcMar>
+          </w:tcPr>
+          <w:p>
+            <w:pPr>
+              <w:spacing w:after="18" w:line="236"/>
+            </w:pPr>
+            <w:r>
+              <w:rPr>
+                <w:rFonts w:ascii="Arial" w:cs="Arial" w:eastAsia="Arial" w:hAnsi="Arial"/>
+                <w:b/>
+                <w:bCs/>
+                <w:sz w:val="19"/>
+                <w:szCs w:val="19"/>
+              </w:rPr>
+              <w:t xml:space="preserve">Flujos alternativos</w:t>
+            </w:r>
+          </w:p>
+        </w:tc>
+        <w:tc>
+          <w:tcPr>
+            <w:tcW w:type="dxa" w:w="7060"/>
+            <w:tcMar>
+              <w:top w:type="dxa" w:w="40"/>
+              <w:left w:type="dxa" w:w="70"/>
+              <w:bottom w:type="dxa" w:w="40"/>
+              <w:right w:type="dxa" w:w="70"/>
+            </w:tcMar>
+          </w:tcPr>
+          <w:p>
+            <w:pPr>
+              <w:spacing w:after="18" w:line="236"/>
+            </w:pPr>
+            <w:r>
+              <w:rPr>
+                <w:rFonts w:ascii="Arial" w:cs="Arial" w:eastAsia="Arial" w:hAnsi="Arial"/>
+                <w:sz w:val="19"/>
+                <w:szCs w:val="19"/>
+              </w:rPr>
+              <w:t xml:space="preserve">1a. Solicitar y registrar los datos del adquiriente si la venta no los tiene.</w:t>
+            </w:r>
+          </w:p>
+        </w:tc>
+      </w:tr>
+      <w:tr>
+        <w:tc>
+          <w:tcPr>
+            <w:tcW w:type="dxa" w:w="2300"/>
+            <w:shd w:fill="EAF0F8" w:val="clear"/>
+            <w:tcMar>
+              <w:top w:type="dxa" w:w="40"/>
+              <w:left w:type="dxa" w:w="70"/>
+              <w:bottom w:type="dxa" w:w="40"/>
+              <w:right w:type="dxa" w:w="70"/>
+            </w:tcMar>
+          </w:tcPr>
+          <w:p>
+            <w:pPr>
+              <w:spacing w:after="18" w:line="236"/>
+            </w:pPr>
+            <w:r>
+              <w:rPr>
+                <w:rFonts w:ascii="Arial" w:cs="Arial" w:eastAsia="Arial" w:hAnsi="Arial"/>
+                <w:b/>
+                <w:bCs/>
+                <w:sz w:val="19"/>
+                <w:szCs w:val="19"/>
+              </w:rPr>
+              <w:t xml:space="preserve">Excepciones</w:t>
+            </w:r>
+          </w:p>
+        </w:tc>
+        <w:tc>
+          <w:tcPr>
+            <w:tcW w:type="dxa" w:w="7060"/>
+            <w:tcMar>
+              <w:top w:type="dxa" w:w="40"/>
+              <w:left w:type="dxa" w:w="70"/>
+              <w:bottom w:type="dxa" w:w="40"/>
+              <w:right w:type="dxa" w:w="70"/>
+            </w:tcMar>
+          </w:tcPr>
+          <w:p>
+            <w:pPr>
+              <w:spacing w:after="18" w:line="236"/>
+            </w:pPr>
+            <w:r>
+              <w:rPr>
+                <w:rFonts w:ascii="Arial" w:cs="Arial" w:eastAsia="Arial" w:hAnsi="Arial"/>
+                <w:sz w:val="19"/>
+                <w:szCs w:val="19"/>
+              </w:rPr>
+              <w:t xml:space="preserve">2a. Datos faltantes: el sistema informa y no emite.</w:t>
+            </w:r>
+          </w:p>
+          <w:p>
+            <w:pPr>
+              <w:spacing w:after="18" w:line="236"/>
+            </w:pPr>
+            <w:r>
+              <w:rPr>
+                <w:rFonts w:ascii="Arial" w:cs="Arial" w:eastAsia="Arial" w:hAnsi="Arial"/>
+                <w:sz w:val="19"/>
+                <w:szCs w:val="19"/>
+              </w:rPr>
+              <w:t xml:space="preserve">5a. La DIAN rechaza: el sistema registra el rechazo y su motivo, permite corregir y reintentar; si no, marca la factura como fallida.</w:t>
+            </w:r>
+          </w:p>
+        </w:tc>
+      </w:tr>
+      <w:tr>
+        <w:tc>
+          <w:tcPr>
+            <w:tcW w:type="dxa" w:w="2300"/>
+            <w:shd w:fill="EAF0F8" w:val="clear"/>
+            <w:tcMar>
+              <w:top w:type="dxa" w:w="40"/>
+              <w:left w:type="dxa" w:w="70"/>
+              <w:bottom w:type="dxa" w:w="40"/>
+              <w:right w:type="dxa" w:w="70"/>
+            </w:tcMar>
+          </w:tcPr>
+          <w:p>
+            <w:pPr>
+              <w:spacing w:after="18" w:line="236"/>
+            </w:pPr>
+            <w:r>
+              <w:rPr>
+                <w:rFonts w:ascii="Arial" w:cs="Arial" w:eastAsia="Arial" w:hAnsi="Arial"/>
+                <w:b/>
+                <w:bCs/>
+                <w:sz w:val="19"/>
+                <w:szCs w:val="19"/>
+              </w:rPr>
+              <w:t xml:space="preserve">Reglas y validaciones</w:t>
+            </w:r>
+          </w:p>
+        </w:tc>
+        <w:tc>
+          <w:tcPr>
+            <w:tcW w:type="dxa" w:w="7060"/>
+            <w:tcMar>
+              <w:top w:type="dxa" w:w="40"/>
+              <w:left w:type="dxa" w:w="70"/>
+              <w:bottom w:type="dxa" w:w="40"/>
+              <w:right w:type="dxa" w:w="70"/>
+            </w:tcMar>
+          </w:tcPr>
+          <w:p>
+            <w:pPr>
+              <w:spacing w:after="18" w:line="236"/>
+            </w:pPr>
+            <w:r>
+              <w:rPr>
+                <w:rFonts w:ascii="Arial" w:cs="Arial" w:eastAsia="Arial" w:hAnsi="Arial"/>
+                <w:sz w:val="19"/>
+                <w:szCs w:val="19"/>
+              </w:rPr>
+              <w:t xml:space="preserve">Opera en el sandbox de la DIAN; cada factura tiene su CUFE y su numeración según la resolución; es coherente con la venta (CU-VEN-01).</w:t>
+            </w:r>
+          </w:p>
+        </w:tc>
+      </w:tr>
+      <w:tr>
+        <w:tc>
+          <w:tcPr>
+            <w:tcW w:type="dxa" w:w="2300"/>
+            <w:shd w:fill="EAF0F8" w:val="clear"/>
+            <w:tcMar>
+              <w:top w:type="dxa" w:w="40"/>
+              <w:left w:type="dxa" w:w="70"/>
+              <w:bottom w:type="dxa" w:w="40"/>
+              <w:right w:type="dxa" w:w="70"/>
+            </w:tcMar>
+          </w:tcPr>
+          <w:p>
+            <w:pPr>
+              <w:spacing w:after="18" w:line="236"/>
+            </w:pPr>
+            <w:r>
+              <w:rPr>
+                <w:rFonts w:ascii="Arial" w:cs="Arial" w:eastAsia="Arial" w:hAnsi="Arial"/>
+                <w:b/>
+                <w:bCs/>
+                <w:sz w:val="19"/>
+                <w:szCs w:val="19"/>
+              </w:rPr>
+              <w:t xml:space="preserve">Postcondiciones</w:t>
+            </w:r>
+          </w:p>
+        </w:tc>
+        <w:tc>
+          <w:tcPr>
+            <w:tcW w:type="dxa" w:w="7060"/>
+            <w:tcMar>
+              <w:top w:type="dxa" w:w="40"/>
+              <w:left w:type="dxa" w:w="70"/>
+              <w:bottom w:type="dxa" w:w="40"/>
+              <w:right w:type="dxa" w:w="70"/>
+            </w:tcMar>
+          </w:tcPr>
+          <w:p>
+            <w:pPr>
+              <w:spacing w:after="18" w:line="236"/>
+            </w:pPr>
+            <w:r>
+              <w:rPr>
+                <w:rFonts w:ascii="Arial" w:cs="Arial" w:eastAsia="Arial" w:hAnsi="Arial"/>
+                <w:sz w:val="19"/>
+                <w:szCs w:val="19"/>
+              </w:rPr>
+              <w:t xml:space="preserve">La factura queda emitida y aceptada, con su CUFE.</w:t>
+            </w:r>
+          </w:p>
+        </w:tc>
+      </w:tr>
+      <w:tr>
+        <w:tc>
+          <w:tcPr>
+            <w:tcW w:type="dxa" w:w="2300"/>
+            <w:shd w:fill="EAF0F8" w:val="clear"/>
+            <w:tcMar>
+              <w:top w:type="dxa" w:w="40"/>
+              <w:left w:type="dxa" w:w="70"/>
+              <w:bottom w:type="dxa" w:w="40"/>
+              <w:right w:type="dxa" w:w="70"/>
+            </w:tcMar>
+          </w:tcPr>
+          <w:p>
+            <w:pPr>
+              <w:spacing w:after="18" w:line="236"/>
+            </w:pPr>
+            <w:r>
+              <w:rPr>
+                <w:rFonts w:ascii="Arial" w:cs="Arial" w:eastAsia="Arial" w:hAnsi="Arial"/>
+                <w:b/>
+                <w:bCs/>
+                <w:sz w:val="19"/>
+                <w:szCs w:val="19"/>
+              </w:rPr>
+              <w:t xml:space="preserve">Prioridad</w:t>
+            </w:r>
+          </w:p>
+        </w:tc>
+        <w:tc>
+          <w:tcPr>
+            <w:tcW w:type="dxa" w:w="7060"/>
+            <w:tcMar>
+              <w:top w:type="dxa" w:w="40"/>
+              <w:left w:type="dxa" w:w="70"/>
+              <w:bottom w:type="dxa" w:w="40"/>
+              <w:right w:type="dxa" w:w="70"/>
+            </w:tcMar>
+          </w:tcPr>
+          <w:p>
+            <w:pPr>
+              <w:spacing w:after="18" w:line="236"/>
+            </w:pPr>
+            <w:r>
+              <w:rPr>
+                <w:rFonts w:ascii="Arial" w:cs="Arial" w:eastAsia="Arial" w:hAnsi="Arial"/>
+                <w:sz w:val="19"/>
+                <w:szCs w:val="19"/>
+              </w:rPr>
+              <w:t xml:space="preserve">Alta</w:t>
+            </w:r>
+          </w:p>
+        </w:tc>
+      </w:tr>
+    </w:tbl>
+    <w:p>
+      <w:pPr>
+        <w:spacing w:after="140"/>
+      </w:pPr>
+    </w:p>
+    <w:tbl>
+      <w:tblPr>
+        <w:tblW w:type="dxa" w:w="9360"/>
+        <w:tblBorders>
+          <w:top w:val="single" w:color="9CA3AF" w:sz="6"/>
+          <w:left w:val="single" w:color="9CA3AF" w:sz="6"/>
+          <w:bottom w:val="single" w:color="9CA3AF" w:sz="6"/>
+          <w:right w:val="single" w:color="9CA3AF" w:sz="6"/>
+          <w:insideH w:val="single" w:color="9CA3AF" w:sz="6"/>
+          <w:insideV w:val="single" w:color="9CA3AF" w:sz="6"/>
+        </w:tblBorders>
+        <w:tblLayout w:type="fixed"/>
+      </w:tblPr>
+      <w:tblGrid>
+        <w:gridCol w:w="2300"/>
+        <w:gridCol w:w="7060"/>
+      </w:tblGrid>
+      <w:tr>
+        <w:tc>
+          <w:tcPr>
+            <w:tcW w:type="dxa" w:w="9360"/>
+            <w:gridSpan w:val="2"/>
+            <w:shd w:fill="1F3864" w:val="clear"/>
+            <w:tcMar>
+              <w:top w:type="dxa" w:w="40"/>
+              <w:left w:type="dxa" w:w="70"/>
+              <w:bottom w:type="dxa" w:w="40"/>
+              <w:right w:type="dxa" w:w="70"/>
+            </w:tcMar>
+          </w:tcPr>
+          <w:p>
+            <w:pPr>
+              <w:spacing w:after="18" w:line="236"/>
+            </w:pPr>
+            <w:r>
+              <w:rPr>
+                <w:rFonts w:ascii="Arial" w:cs="Arial" w:eastAsia="Arial" w:hAnsi="Arial"/>
+                <w:b/>
+                <w:bCs/>
+                <w:color w:val="FFFFFF"/>
+                <w:sz w:val="19"/>
+                <w:szCs w:val="19"/>
+              </w:rPr>
+              <w:t xml:space="preserve">CU-FAC-03 — Consultar y reenviar facturas</w:t>
+            </w:r>
+          </w:p>
+        </w:tc>
+      </w:tr>
+      <w:tr>
+        <w:tc>
+          <w:tcPr>
+            <w:tcW w:type="dxa" w:w="2300"/>
+            <w:shd w:fill="EAF0F8" w:val="clear"/>
+            <w:tcMar>
+              <w:top w:type="dxa" w:w="40"/>
+              <w:left w:type="dxa" w:w="70"/>
+              <w:bottom w:type="dxa" w:w="40"/>
+              <w:right w:type="dxa" w:w="70"/>
+            </w:tcMar>
+          </w:tcPr>
+          <w:p>
+            <w:pPr>
+              <w:spacing w:after="18" w:line="236"/>
+            </w:pPr>
+            <w:r>
+              <w:rPr>
+                <w:rFonts w:ascii="Arial" w:cs="Arial" w:eastAsia="Arial" w:hAnsi="Arial"/>
+                <w:b/>
+                <w:bCs/>
+                <w:sz w:val="19"/>
+                <w:szCs w:val="19"/>
+              </w:rPr>
+              <w:t xml:space="preserve">Actor(es)</w:t>
+            </w:r>
+          </w:p>
+        </w:tc>
+        <w:tc>
+          <w:tcPr>
+            <w:tcW w:type="dxa" w:w="7060"/>
+            <w:tcMar>
+              <w:top w:type="dxa" w:w="40"/>
+              <w:left w:type="dxa" w:w="70"/>
+              <w:bottom w:type="dxa" w:w="40"/>
+              <w:right w:type="dxa" w:w="70"/>
+            </w:tcMar>
+          </w:tcPr>
+          <w:p>
+            <w:pPr>
+              <w:spacing w:after="18" w:line="236"/>
+            </w:pPr>
+            <w:r>
+              <w:rPr>
+                <w:rFonts w:ascii="Arial" w:cs="Arial" w:eastAsia="Arial" w:hAnsi="Arial"/>
+                <w:sz w:val="19"/>
+                <w:szCs w:val="19"/>
+              </w:rPr>
+              <w:t xml:space="preserve">Administrador</w:t>
+            </w:r>
+          </w:p>
+        </w:tc>
+      </w:tr>
+      <w:tr>
+        <w:tc>
+          <w:tcPr>
+            <w:tcW w:type="dxa" w:w="2300"/>
+            <w:shd w:fill="EAF0F8" w:val="clear"/>
+            <w:tcMar>
+              <w:top w:type="dxa" w:w="40"/>
+              <w:left w:type="dxa" w:w="70"/>
+              <w:bottom w:type="dxa" w:w="40"/>
+              <w:right w:type="dxa" w:w="70"/>
+            </w:tcMar>
+          </w:tcPr>
+          <w:p>
+            <w:pPr>
+              <w:spacing w:after="18" w:line="236"/>
+            </w:pPr>
+            <w:r>
+              <w:rPr>
+                <w:rFonts w:ascii="Arial" w:cs="Arial" w:eastAsia="Arial" w:hAnsi="Arial"/>
+                <w:b/>
+                <w:bCs/>
+                <w:sz w:val="19"/>
+                <w:szCs w:val="19"/>
+              </w:rPr>
+              <w:t xml:space="preserve">Requisito</w:t>
+            </w:r>
+          </w:p>
+        </w:tc>
+        <w:tc>
+          <w:tcPr>
+            <w:tcW w:type="dxa" w:w="7060"/>
+            <w:tcMar>
+              <w:top w:type="dxa" w:w="40"/>
+              <w:left w:type="dxa" w:w="70"/>
+              <w:bottom w:type="dxa" w:w="40"/>
+              <w:right w:type="dxa" w:w="70"/>
+            </w:tcMar>
+          </w:tcPr>
+          <w:p>
+            <w:pPr>
+              <w:spacing w:after="18" w:line="236"/>
+            </w:pPr>
+            <w:r>
+              <w:rPr>
+                <w:rFonts w:ascii="Arial" w:cs="Arial" w:eastAsia="Arial" w:hAnsi="Arial"/>
+                <w:sz w:val="19"/>
+                <w:szCs w:val="19"/>
+              </w:rPr>
+              <w:t xml:space="preserve">RF-FAC-03</w:t>
+            </w:r>
+          </w:p>
+        </w:tc>
+      </w:tr>
+      <w:tr>
+        <w:tc>
+          <w:tcPr>
+            <w:tcW w:type="dxa" w:w="2300"/>
+            <w:shd w:fill="EAF0F8" w:val="clear"/>
+            <w:tcMar>
+              <w:top w:type="dxa" w:w="40"/>
+              <w:left w:type="dxa" w:w="70"/>
+              <w:bottom w:type="dxa" w:w="40"/>
+              <w:right w:type="dxa" w:w="70"/>
+            </w:tcMar>
+          </w:tcPr>
+          <w:p>
+            <w:pPr>
+              <w:spacing w:after="18" w:line="236"/>
+            </w:pPr>
+            <w:r>
+              <w:rPr>
+                <w:rFonts w:ascii="Arial" w:cs="Arial" w:eastAsia="Arial" w:hAnsi="Arial"/>
+                <w:b/>
+                <w:bCs/>
+                <w:sz w:val="19"/>
+                <w:szCs w:val="19"/>
+              </w:rPr>
+              <w:t xml:space="preserve">Descripción</w:t>
+            </w:r>
+          </w:p>
+        </w:tc>
+        <w:tc>
+          <w:tcPr>
+            <w:tcW w:type="dxa" w:w="7060"/>
+            <w:tcMar>
+              <w:top w:type="dxa" w:w="40"/>
+              <w:left w:type="dxa" w:w="70"/>
+              <w:bottom w:type="dxa" w:w="40"/>
+              <w:right w:type="dxa" w:w="70"/>
+            </w:tcMar>
+          </w:tcPr>
+          <w:p>
+            <w:pPr>
+              <w:spacing w:after="18" w:line="236"/>
+            </w:pPr>
+            <w:r>
+              <w:rPr>
+                <w:rFonts w:ascii="Arial" w:cs="Arial" w:eastAsia="Arial" w:hAnsi="Arial"/>
+                <w:sz w:val="19"/>
+                <w:szCs w:val="19"/>
+              </w:rPr>
+              <w:t xml:space="preserve">El administrador consulta las facturas emitidas y las reenvía al cliente o a la DIAN cuando es necesario.</w:t>
+            </w:r>
+          </w:p>
+        </w:tc>
+      </w:tr>
+      <w:tr>
+        <w:tc>
+          <w:tcPr>
+            <w:tcW w:type="dxa" w:w="2300"/>
+            <w:shd w:fill="EAF0F8" w:val="clear"/>
+            <w:tcMar>
+              <w:top w:type="dxa" w:w="40"/>
+              <w:left w:type="dxa" w:w="70"/>
+              <w:bottom w:type="dxa" w:w="40"/>
+              <w:right w:type="dxa" w:w="70"/>
+            </w:tcMar>
+          </w:tcPr>
+          <w:p>
+            <w:pPr>
+              <w:spacing w:after="18" w:line="236"/>
+            </w:pPr>
+            <w:r>
+              <w:rPr>
+                <w:rFonts w:ascii="Arial" w:cs="Arial" w:eastAsia="Arial" w:hAnsi="Arial"/>
+                <w:b/>
+                <w:bCs/>
+                <w:sz w:val="19"/>
+                <w:szCs w:val="19"/>
+              </w:rPr>
+              <w:t xml:space="preserve">Precondiciones</w:t>
+            </w:r>
+          </w:p>
+        </w:tc>
+        <w:tc>
+          <w:tcPr>
+            <w:tcW w:type="dxa" w:w="7060"/>
+            <w:tcMar>
+              <w:top w:type="dxa" w:w="40"/>
+              <w:left w:type="dxa" w:w="70"/>
+              <w:bottom w:type="dxa" w:w="40"/>
+              <w:right w:type="dxa" w:w="70"/>
+            </w:tcMar>
+          </w:tcPr>
+          <w:p>
+            <w:pPr>
+              <w:spacing w:after="18" w:line="236"/>
+            </w:pPr>
+            <w:r>
+              <w:rPr>
+                <w:rFonts w:ascii="Arial" w:cs="Arial" w:eastAsia="Arial" w:hAnsi="Arial"/>
+                <w:sz w:val="19"/>
+                <w:szCs w:val="19"/>
+              </w:rPr>
+              <w:t xml:space="preserve">Existen facturas emitidas.</w:t>
+            </w:r>
+          </w:p>
+        </w:tc>
+      </w:tr>
+      <w:tr>
+        <w:tc>
+          <w:tcPr>
+            <w:tcW w:type="dxa" w:w="2300"/>
+            <w:shd w:fill="EAF0F8" w:val="clear"/>
+            <w:tcMar>
+              <w:top w:type="dxa" w:w="40"/>
+              <w:left w:type="dxa" w:w="70"/>
+              <w:bottom w:type="dxa" w:w="40"/>
+              <w:right w:type="dxa" w:w="70"/>
+            </w:tcMar>
+          </w:tcPr>
+          <w:p>
+            <w:pPr>
+              <w:spacing w:after="18" w:line="236"/>
+            </w:pPr>
+            <w:r>
+              <w:rPr>
+                <w:rFonts w:ascii="Arial" w:cs="Arial" w:eastAsia="Arial" w:hAnsi="Arial"/>
+                <w:b/>
+                <w:bCs/>
+                <w:sz w:val="19"/>
+                <w:szCs w:val="19"/>
+              </w:rPr>
+              <w:t xml:space="preserve">Flujo principal</w:t>
+            </w:r>
+          </w:p>
+        </w:tc>
+        <w:tc>
+          <w:tcPr>
+            <w:tcW w:type="dxa" w:w="7060"/>
+            <w:tcMar>
+              <w:top w:type="dxa" w:w="40"/>
+              <w:left w:type="dxa" w:w="70"/>
+              <w:bottom w:type="dxa" w:w="40"/>
+              <w:right w:type="dxa" w:w="70"/>
+            </w:tcMar>
+          </w:tcPr>
+          <w:p>
+            <w:pPr>
+              <w:spacing w:after="18" w:line="236"/>
+            </w:pPr>
+            <w:r>
+              <w:rPr>
+                <w:rFonts w:ascii="Arial" w:cs="Arial" w:eastAsia="Arial" w:hAnsi="Arial"/>
+                <w:sz w:val="19"/>
+                <w:szCs w:val="19"/>
+              </w:rPr>
+              <w:t xml:space="preserve">1. Abre el listado de facturas.</w:t>
+            </w:r>
+          </w:p>
+          <w:p>
+            <w:pPr>
+              <w:spacing w:after="18" w:line="236"/>
+            </w:pPr>
+            <w:r>
+              <w:rPr>
+                <w:rFonts w:ascii="Arial" w:cs="Arial" w:eastAsia="Arial" w:hAnsi="Arial"/>
+                <w:sz w:val="19"/>
+                <w:szCs w:val="19"/>
+              </w:rPr>
+              <w:t xml:space="preserve">2. El sistema muestra las facturas con su estado (aceptada, rechazada o fallida) y su CUFE.</w:t>
+            </w:r>
+          </w:p>
+          <w:p>
+            <w:pPr>
+              <w:spacing w:after="18" w:line="236"/>
+            </w:pPr>
+            <w:r>
+              <w:rPr>
+                <w:rFonts w:ascii="Arial" w:cs="Arial" w:eastAsia="Arial" w:hAnsi="Arial"/>
+                <w:sz w:val="19"/>
+                <w:szCs w:val="19"/>
+              </w:rPr>
+              <w:t xml:space="preserve">3. Selecciona una factura y consulta su detalle.</w:t>
+            </w:r>
+          </w:p>
+          <w:p>
+            <w:pPr>
+              <w:spacing w:after="18" w:line="236"/>
+            </w:pPr>
+            <w:r>
+              <w:rPr>
+                <w:rFonts w:ascii="Arial" w:cs="Arial" w:eastAsia="Arial" w:hAnsi="Arial"/>
+                <w:sz w:val="19"/>
+                <w:szCs w:val="19"/>
+              </w:rPr>
+              <w:t xml:space="preserve">4. Reenvía la representación al cliente o reintenta el envío a la DIAN.</w:t>
+            </w:r>
+          </w:p>
+        </w:tc>
+      </w:tr>
+      <w:tr>
+        <w:tc>
+          <w:tcPr>
+            <w:tcW w:type="dxa" w:w="2300"/>
+            <w:shd w:fill="EAF0F8" w:val="clear"/>
+            <w:tcMar>
+              <w:top w:type="dxa" w:w="40"/>
+              <w:left w:type="dxa" w:w="70"/>
+              <w:bottom w:type="dxa" w:w="40"/>
+              <w:right w:type="dxa" w:w="70"/>
+            </w:tcMar>
+          </w:tcPr>
+          <w:p>
+            <w:pPr>
+              <w:spacing w:after="18" w:line="236"/>
+            </w:pPr>
+            <w:r>
+              <w:rPr>
+                <w:rFonts w:ascii="Arial" w:cs="Arial" w:eastAsia="Arial" w:hAnsi="Arial"/>
+                <w:b/>
+                <w:bCs/>
+                <w:sz w:val="19"/>
+                <w:szCs w:val="19"/>
+              </w:rPr>
+              <w:t xml:space="preserve">Flujos alternativos</w:t>
+            </w:r>
+          </w:p>
+        </w:tc>
+        <w:tc>
+          <w:tcPr>
+            <w:tcW w:type="dxa" w:w="7060"/>
+            <w:tcMar>
+              <w:top w:type="dxa" w:w="40"/>
+              <w:left w:type="dxa" w:w="70"/>
+              <w:bottom w:type="dxa" w:w="40"/>
+              <w:right w:type="dxa" w:w="70"/>
+            </w:tcMar>
+          </w:tcPr>
+          <w:p>
+            <w:pPr>
+              <w:spacing w:after="18" w:line="236"/>
+            </w:pPr>
+            <w:r>
+              <w:rPr>
+                <w:rFonts w:ascii="Arial" w:cs="Arial" w:eastAsia="Arial" w:hAnsi="Arial"/>
+                <w:sz w:val="19"/>
+                <w:szCs w:val="19"/>
+              </w:rPr>
+              <w:t xml:space="preserve">3a. Filtrar por fecha, estado o cliente.</w:t>
+            </w:r>
+          </w:p>
+        </w:tc>
+      </w:tr>
+      <w:tr>
+        <w:tc>
+          <w:tcPr>
+            <w:tcW w:type="dxa" w:w="2300"/>
+            <w:shd w:fill="EAF0F8" w:val="clear"/>
+            <w:tcMar>
+              <w:top w:type="dxa" w:w="40"/>
+              <w:left w:type="dxa" w:w="70"/>
+              <w:bottom w:type="dxa" w:w="40"/>
+              <w:right w:type="dxa" w:w="70"/>
+            </w:tcMar>
+          </w:tcPr>
+          <w:p>
+            <w:pPr>
+              <w:spacing w:after="18" w:line="236"/>
+            </w:pPr>
+            <w:r>
+              <w:rPr>
+                <w:rFonts w:ascii="Arial" w:cs="Arial" w:eastAsia="Arial" w:hAnsi="Arial"/>
+                <w:b/>
+                <w:bCs/>
+                <w:sz w:val="19"/>
+                <w:szCs w:val="19"/>
+              </w:rPr>
+              <w:t xml:space="preserve">Excepciones</w:t>
+            </w:r>
+          </w:p>
+        </w:tc>
+        <w:tc>
+          <w:tcPr>
+            <w:tcW w:type="dxa" w:w="7060"/>
+            <w:tcMar>
+              <w:top w:type="dxa" w:w="40"/>
+              <w:left w:type="dxa" w:w="70"/>
+              <w:bottom w:type="dxa" w:w="40"/>
+              <w:right w:type="dxa" w:w="70"/>
+            </w:tcMar>
+          </w:tcPr>
+          <w:p>
+            <w:pPr>
+              <w:spacing w:after="18" w:line="236"/>
+            </w:pPr>
+            <w:r>
+              <w:rPr>
+                <w:rFonts w:ascii="Arial" w:cs="Arial" w:eastAsia="Arial" w:hAnsi="Arial"/>
+                <w:sz w:val="19"/>
+                <w:szCs w:val="19"/>
+              </w:rPr>
+              <w:t xml:space="preserve">*. Sin facturas: el sistema muestra el listado vacío.</w:t>
+            </w:r>
+          </w:p>
+        </w:tc>
+      </w:tr>
+      <w:tr>
+        <w:tc>
+          <w:tcPr>
+            <w:tcW w:type="dxa" w:w="2300"/>
+            <w:shd w:fill="EAF0F8" w:val="clear"/>
+            <w:tcMar>
+              <w:top w:type="dxa" w:w="40"/>
+              <w:left w:type="dxa" w:w="70"/>
+              <w:bottom w:type="dxa" w:w="40"/>
+              <w:right w:type="dxa" w:w="70"/>
+            </w:tcMar>
+          </w:tcPr>
+          <w:p>
+            <w:pPr>
+              <w:spacing w:after="18" w:line="236"/>
+            </w:pPr>
+            <w:r>
+              <w:rPr>
+                <w:rFonts w:ascii="Arial" w:cs="Arial" w:eastAsia="Arial" w:hAnsi="Arial"/>
+                <w:b/>
+                <w:bCs/>
+                <w:sz w:val="19"/>
+                <w:szCs w:val="19"/>
+              </w:rPr>
+              <w:t xml:space="preserve">Reglas y validaciones</w:t>
+            </w:r>
+          </w:p>
+        </w:tc>
+        <w:tc>
+          <w:tcPr>
+            <w:tcW w:type="dxa" w:w="7060"/>
+            <w:tcMar>
+              <w:top w:type="dxa" w:w="40"/>
+              <w:left w:type="dxa" w:w="70"/>
+              <w:bottom w:type="dxa" w:w="40"/>
+              <w:right w:type="dxa" w:w="70"/>
+            </w:tcMar>
+          </w:tcPr>
+          <w:p>
+            <w:pPr>
+              <w:spacing w:after="18" w:line="236"/>
+            </w:pPr>
+            <w:r>
+              <w:rPr>
+                <w:rFonts w:ascii="Arial" w:cs="Arial" w:eastAsia="Arial" w:hAnsi="Arial"/>
+                <w:sz w:val="19"/>
+                <w:szCs w:val="19"/>
+              </w:rPr>
+              <w:t xml:space="preserve">La consulta refleja el estado real ante la DIAN; el reenvío no altera la factura ni su CUFE.</w:t>
+            </w:r>
+          </w:p>
+        </w:tc>
+      </w:tr>
+      <w:tr>
+        <w:tc>
+          <w:tcPr>
+            <w:tcW w:type="dxa" w:w="2300"/>
+            <w:shd w:fill="EAF0F8" w:val="clear"/>
+            <w:tcMar>
+              <w:top w:type="dxa" w:w="40"/>
+              <w:left w:type="dxa" w:w="70"/>
+              <w:bottom w:type="dxa" w:w="40"/>
+              <w:right w:type="dxa" w:w="70"/>
+            </w:tcMar>
+          </w:tcPr>
+          <w:p>
+            <w:pPr>
+              <w:spacing w:after="18" w:line="236"/>
+            </w:pPr>
+            <w:r>
+              <w:rPr>
+                <w:rFonts w:ascii="Arial" w:cs="Arial" w:eastAsia="Arial" w:hAnsi="Arial"/>
+                <w:b/>
+                <w:bCs/>
+                <w:sz w:val="19"/>
+                <w:szCs w:val="19"/>
+              </w:rPr>
+              <w:t xml:space="preserve">Postcondiciones</w:t>
+            </w:r>
+          </w:p>
+        </w:tc>
+        <w:tc>
+          <w:tcPr>
+            <w:tcW w:type="dxa" w:w="7060"/>
+            <w:tcMar>
+              <w:top w:type="dxa" w:w="40"/>
+              <w:left w:type="dxa" w:w="70"/>
+              <w:bottom w:type="dxa" w:w="40"/>
+              <w:right w:type="dxa" w:w="70"/>
+            </w:tcMar>
+          </w:tcPr>
+          <w:p>
+            <w:pPr>
+              <w:spacing w:after="18" w:line="236"/>
+            </w:pPr>
+            <w:r>
+              <w:rPr>
+                <w:rFonts w:ascii="Arial" w:cs="Arial" w:eastAsia="Arial" w:hAnsi="Arial"/>
+                <w:sz w:val="19"/>
+                <w:szCs w:val="19"/>
+              </w:rPr>
+              <w:t xml:space="preserve">El administrador consulta o reenvía la factura.</w:t>
+            </w:r>
+          </w:p>
+        </w:tc>
+      </w:tr>
+      <w:tr>
+        <w:tc>
+          <w:tcPr>
+            <w:tcW w:type="dxa" w:w="2300"/>
+            <w:shd w:fill="EAF0F8" w:val="clear"/>
+            <w:tcMar>
+              <w:top w:type="dxa" w:w="40"/>
+              <w:left w:type="dxa" w:w="70"/>
+              <w:bottom w:type="dxa" w:w="40"/>
+              <w:right w:type="dxa" w:w="70"/>
+            </w:tcMar>
+          </w:tcPr>
+          <w:p>
+            <w:pPr>
+              <w:spacing w:after="18" w:line="236"/>
+            </w:pPr>
+            <w:r>
+              <w:rPr>
+                <w:rFonts w:ascii="Arial" w:cs="Arial" w:eastAsia="Arial" w:hAnsi="Arial"/>
+                <w:b/>
+                <w:bCs/>
+                <w:sz w:val="19"/>
+                <w:szCs w:val="19"/>
+              </w:rPr>
+              <w:t xml:space="preserve">Prioridad</w:t>
+            </w:r>
+          </w:p>
+        </w:tc>
+        <w:tc>
+          <w:tcPr>
+            <w:tcW w:type="dxa" w:w="7060"/>
+            <w:tcMar>
+              <w:top w:type="dxa" w:w="40"/>
+              <w:left w:type="dxa" w:w="70"/>
+              <w:bottom w:type="dxa" w:w="40"/>
+              <w:right w:type="dxa" w:w="70"/>
+            </w:tcMar>
+          </w:tcPr>
+          <w:p>
+            <w:pPr>
+              <w:spacing w:after="18" w:line="236"/>
+            </w:pPr>
+            <w:r>
+              <w:rPr>
+                <w:rFonts w:ascii="Arial" w:cs="Arial" w:eastAsia="Arial" w:hAnsi="Arial"/>
+                <w:sz w:val="19"/>
+                <w:szCs w:val="19"/>
+              </w:rPr>
+              <w:t xml:space="preserve">Media</w:t>
+            </w:r>
+          </w:p>
+        </w:tc>
+      </w:tr>
+    </w:tbl>
+    <w:p>
+      <w:pPr>
+        <w:spacing w:after="140"/>
+      </w:pPr>
+    </w:p>
+    <w:tbl>
+      <w:tblPr>
+        <w:tblW w:type="dxa" w:w="9360"/>
+        <w:tblBorders>
+          <w:top w:val="single" w:color="9CA3AF" w:sz="6"/>
+          <w:left w:val="single" w:color="9CA3AF" w:sz="6"/>
+          <w:bottom w:val="single" w:color="9CA3AF" w:sz="6"/>
+          <w:right w:val="single" w:color="9CA3AF" w:sz="6"/>
+          <w:insideH w:val="single" w:color="9CA3AF" w:sz="6"/>
+          <w:insideV w:val="single" w:color="9CA3AF" w:sz="6"/>
+        </w:tblBorders>
+        <w:tblLayout w:type="fixed"/>
+      </w:tblPr>
+      <w:tblGrid>
+        <w:gridCol w:w="2300"/>
+        <w:gridCol w:w="7060"/>
+      </w:tblGrid>
+      <w:tr>
+        <w:tc>
+          <w:tcPr>
+            <w:tcW w:type="dxa" w:w="9360"/>
+            <w:gridSpan w:val="2"/>
+            <w:shd w:fill="1F3864" w:val="clear"/>
+            <w:tcMar>
+              <w:top w:type="dxa" w:w="40"/>
+              <w:left w:type="dxa" w:w="70"/>
+              <w:bottom w:type="dxa" w:w="40"/>
+              <w:right w:type="dxa" w:w="70"/>
+            </w:tcMar>
+          </w:tcPr>
+          <w:p>
+            <w:pPr>
+              <w:spacing w:after="18" w:line="236"/>
+            </w:pPr>
+            <w:r>
+              <w:rPr>
+                <w:rFonts w:ascii="Arial" w:cs="Arial" w:eastAsia="Arial" w:hAnsi="Arial"/>
+                <w:b/>
+                <w:bCs/>
+                <w:color w:val="FFFFFF"/>
+                <w:sz w:val="19"/>
+                <w:szCs w:val="19"/>
+              </w:rPr>
+              <w:t xml:space="preserve">CU-FAC-04 — Emitir nota crédito</w:t>
+            </w:r>
+          </w:p>
+        </w:tc>
+      </w:tr>
+      <w:tr>
+        <w:tc>
+          <w:tcPr>
+            <w:tcW w:type="dxa" w:w="2300"/>
+            <w:shd w:fill="EAF0F8" w:val="clear"/>
+            <w:tcMar>
+              <w:top w:type="dxa" w:w="40"/>
+              <w:left w:type="dxa" w:w="70"/>
+              <w:bottom w:type="dxa" w:w="40"/>
+              <w:right w:type="dxa" w:w="70"/>
+            </w:tcMar>
+          </w:tcPr>
+          <w:p>
+            <w:pPr>
+              <w:spacing w:after="18" w:line="236"/>
+            </w:pPr>
+            <w:r>
+              <w:rPr>
+                <w:rFonts w:ascii="Arial" w:cs="Arial" w:eastAsia="Arial" w:hAnsi="Arial"/>
+                <w:b/>
+                <w:bCs/>
+                <w:sz w:val="19"/>
+                <w:szCs w:val="19"/>
+              </w:rPr>
+              <w:t xml:space="preserve">Actor(es)</w:t>
+            </w:r>
+          </w:p>
+        </w:tc>
+        <w:tc>
+          <w:tcPr>
+            <w:tcW w:type="dxa" w:w="7060"/>
+            <w:tcMar>
+              <w:top w:type="dxa" w:w="40"/>
+              <w:left w:type="dxa" w:w="70"/>
+              <w:bottom w:type="dxa" w:w="40"/>
+              <w:right w:type="dxa" w:w="70"/>
+            </w:tcMar>
+          </w:tcPr>
+          <w:p>
+            <w:pPr>
+              <w:spacing w:after="18" w:line="236"/>
+            </w:pPr>
+            <w:r>
+              <w:rPr>
+                <w:rFonts w:ascii="Arial" w:cs="Arial" w:eastAsia="Arial" w:hAnsi="Arial"/>
+                <w:sz w:val="19"/>
+                <w:szCs w:val="19"/>
+              </w:rPr>
+              <w:t xml:space="preserve">Administrador; Servicio DIAN</w:t>
+            </w:r>
+          </w:p>
+        </w:tc>
+      </w:tr>
+      <w:tr>
+        <w:tc>
+          <w:tcPr>
+            <w:tcW w:type="dxa" w:w="2300"/>
+            <w:shd w:fill="EAF0F8" w:val="clear"/>
+            <w:tcMar>
+              <w:top w:type="dxa" w:w="40"/>
+              <w:left w:type="dxa" w:w="70"/>
+              <w:bottom w:type="dxa" w:w="40"/>
+              <w:right w:type="dxa" w:w="70"/>
+            </w:tcMar>
+          </w:tcPr>
+          <w:p>
+            <w:pPr>
+              <w:spacing w:after="18" w:line="236"/>
+            </w:pPr>
+            <w:r>
+              <w:rPr>
+                <w:rFonts w:ascii="Arial" w:cs="Arial" w:eastAsia="Arial" w:hAnsi="Arial"/>
+                <w:b/>
+                <w:bCs/>
+                <w:sz w:val="19"/>
+                <w:szCs w:val="19"/>
+              </w:rPr>
+              <w:t xml:space="preserve">Requisito</w:t>
+            </w:r>
+          </w:p>
+        </w:tc>
+        <w:tc>
+          <w:tcPr>
+            <w:tcW w:type="dxa" w:w="7060"/>
+            <w:tcMar>
+              <w:top w:type="dxa" w:w="40"/>
+              <w:left w:type="dxa" w:w="70"/>
+              <w:bottom w:type="dxa" w:w="40"/>
+              <w:right w:type="dxa" w:w="70"/>
+            </w:tcMar>
+          </w:tcPr>
+          <w:p>
+            <w:pPr>
+              <w:spacing w:after="18" w:line="236"/>
+            </w:pPr>
+            <w:r>
+              <w:rPr>
+                <w:rFonts w:ascii="Arial" w:cs="Arial" w:eastAsia="Arial" w:hAnsi="Arial"/>
+                <w:sz w:val="19"/>
+                <w:szCs w:val="19"/>
+              </w:rPr>
+              <w:t xml:space="preserve">RF-FAC-04</w:t>
+            </w:r>
+          </w:p>
+        </w:tc>
+      </w:tr>
+      <w:tr>
+        <w:tc>
+          <w:tcPr>
+            <w:tcW w:type="dxa" w:w="2300"/>
+            <w:shd w:fill="EAF0F8" w:val="clear"/>
+            <w:tcMar>
+              <w:top w:type="dxa" w:w="40"/>
+              <w:left w:type="dxa" w:w="70"/>
+              <w:bottom w:type="dxa" w:w="40"/>
+              <w:right w:type="dxa" w:w="70"/>
+            </w:tcMar>
+          </w:tcPr>
+          <w:p>
+            <w:pPr>
+              <w:spacing w:after="18" w:line="236"/>
+            </w:pPr>
+            <w:r>
+              <w:rPr>
+                <w:rFonts w:ascii="Arial" w:cs="Arial" w:eastAsia="Arial" w:hAnsi="Arial"/>
+                <w:b/>
+                <w:bCs/>
+                <w:sz w:val="19"/>
+                <w:szCs w:val="19"/>
+              </w:rPr>
+              <w:t xml:space="preserve">Descripción</w:t>
+            </w:r>
+          </w:p>
+        </w:tc>
+        <w:tc>
+          <w:tcPr>
+            <w:tcW w:type="dxa" w:w="7060"/>
+            <w:tcMar>
+              <w:top w:type="dxa" w:w="40"/>
+              <w:left w:type="dxa" w:w="70"/>
+              <w:bottom w:type="dxa" w:w="40"/>
+              <w:right w:type="dxa" w:w="70"/>
+            </w:tcMar>
+          </w:tcPr>
+          <w:p>
+            <w:pPr>
+              <w:spacing w:after="18" w:line="236"/>
+            </w:pPr>
+            <w:r>
+              <w:rPr>
+                <w:rFonts w:ascii="Arial" w:cs="Arial" w:eastAsia="Arial" w:hAnsi="Arial"/>
+                <w:sz w:val="19"/>
+                <w:szCs w:val="19"/>
+              </w:rPr>
+              <w:t xml:space="preserve">El administrador emite una nota crédito para anular o corregir una factura. Extiende a la emisión de factura.</w:t>
+            </w:r>
+          </w:p>
+        </w:tc>
+      </w:tr>
+      <w:tr>
+        <w:tc>
+          <w:tcPr>
+            <w:tcW w:type="dxa" w:w="2300"/>
+            <w:shd w:fill="EAF0F8" w:val="clear"/>
+            <w:tcMar>
+              <w:top w:type="dxa" w:w="40"/>
+              <w:left w:type="dxa" w:w="70"/>
+              <w:bottom w:type="dxa" w:w="40"/>
+              <w:right w:type="dxa" w:w="70"/>
+            </w:tcMar>
+          </w:tcPr>
+          <w:p>
+            <w:pPr>
+              <w:spacing w:after="18" w:line="236"/>
+            </w:pPr>
+            <w:r>
+              <w:rPr>
+                <w:rFonts w:ascii="Arial" w:cs="Arial" w:eastAsia="Arial" w:hAnsi="Arial"/>
+                <w:b/>
+                <w:bCs/>
+                <w:sz w:val="19"/>
+                <w:szCs w:val="19"/>
+              </w:rPr>
+              <w:t xml:space="preserve">Precondiciones</w:t>
+            </w:r>
+          </w:p>
+        </w:tc>
+        <w:tc>
+          <w:tcPr>
+            <w:tcW w:type="dxa" w:w="7060"/>
+            <w:tcMar>
+              <w:top w:type="dxa" w:w="40"/>
+              <w:left w:type="dxa" w:w="70"/>
+              <w:bottom w:type="dxa" w:w="40"/>
+              <w:right w:type="dxa" w:w="70"/>
+            </w:tcMar>
+          </w:tcPr>
+          <w:p>
+            <w:pPr>
+              <w:spacing w:after="18" w:line="236"/>
+            </w:pPr>
+            <w:r>
+              <w:rPr>
+                <w:rFonts w:ascii="Arial" w:cs="Arial" w:eastAsia="Arial" w:hAnsi="Arial"/>
+                <w:sz w:val="19"/>
+                <w:szCs w:val="19"/>
+              </w:rPr>
+              <w:t xml:space="preserve">Existe una factura aceptada.</w:t>
+            </w:r>
+          </w:p>
+        </w:tc>
+      </w:tr>
+      <w:tr>
+        <w:tc>
+          <w:tcPr>
+            <w:tcW w:type="dxa" w:w="2300"/>
+            <w:shd w:fill="EAF0F8" w:val="clear"/>
+            <w:tcMar>
+              <w:top w:type="dxa" w:w="40"/>
+              <w:left w:type="dxa" w:w="70"/>
+              <w:bottom w:type="dxa" w:w="40"/>
+              <w:right w:type="dxa" w:w="70"/>
+            </w:tcMar>
+          </w:tcPr>
+          <w:p>
+            <w:pPr>
+              <w:spacing w:after="18" w:line="236"/>
+            </w:pPr>
+            <w:r>
+              <w:rPr>
+                <w:rFonts w:ascii="Arial" w:cs="Arial" w:eastAsia="Arial" w:hAnsi="Arial"/>
+                <w:b/>
+                <w:bCs/>
+                <w:sz w:val="19"/>
+                <w:szCs w:val="19"/>
+              </w:rPr>
+              <w:t xml:space="preserve">Flujo principal</w:t>
+            </w:r>
+          </w:p>
+        </w:tc>
+        <w:tc>
+          <w:tcPr>
+            <w:tcW w:type="dxa" w:w="7060"/>
+            <w:tcMar>
+              <w:top w:type="dxa" w:w="40"/>
+              <w:left w:type="dxa" w:w="70"/>
+              <w:bottom w:type="dxa" w:w="40"/>
+              <w:right w:type="dxa" w:w="70"/>
+            </w:tcMar>
+          </w:tcPr>
+          <w:p>
+            <w:pPr>
+              <w:spacing w:after="18" w:line="236"/>
+            </w:pPr>
+            <w:r>
+              <w:rPr>
+                <w:rFonts w:ascii="Arial" w:cs="Arial" w:eastAsia="Arial" w:hAnsi="Arial"/>
+                <w:sz w:val="19"/>
+                <w:szCs w:val="19"/>
+              </w:rPr>
+              <w:t xml:space="preserve">1. Selecciona la factura y elige «Emitir nota crédito».</w:t>
+            </w:r>
+          </w:p>
+          <w:p>
+            <w:pPr>
+              <w:spacing w:after="18" w:line="236"/>
+            </w:pPr>
+            <w:r>
+              <w:rPr>
+                <w:rFonts w:ascii="Arial" w:cs="Arial" w:eastAsia="Arial" w:hAnsi="Arial"/>
+                <w:sz w:val="19"/>
+                <w:szCs w:val="19"/>
+              </w:rPr>
+              <w:t xml:space="preserve">2. Indica el motivo y los ítems o valores a acreditar.</w:t>
+            </w:r>
+          </w:p>
+          <w:p>
+            <w:pPr>
+              <w:spacing w:after="18" w:line="236"/>
+            </w:pPr>
+            <w:r>
+              <w:rPr>
+                <w:rFonts w:ascii="Arial" w:cs="Arial" w:eastAsia="Arial" w:hAnsi="Arial"/>
+                <w:sz w:val="19"/>
+                <w:szCs w:val="19"/>
+              </w:rPr>
+              <w:t xml:space="preserve">3. El sistema construye y firma la nota crédito y genera su CUFE.</w:t>
+            </w:r>
+          </w:p>
+          <w:p>
+            <w:pPr>
+              <w:spacing w:after="18" w:line="236"/>
+            </w:pPr>
+            <w:r>
+              <w:rPr>
+                <w:rFonts w:ascii="Arial" w:cs="Arial" w:eastAsia="Arial" w:hAnsi="Arial"/>
+                <w:sz w:val="19"/>
+                <w:szCs w:val="19"/>
+              </w:rPr>
+              <w:t xml:space="preserve">4. La envía al Servicio DIAN (sandbox).</w:t>
+            </w:r>
+          </w:p>
+          <w:p>
+            <w:pPr>
+              <w:spacing w:after="18" w:line="236"/>
+            </w:pPr>
+            <w:r>
+              <w:rPr>
+                <w:rFonts w:ascii="Arial" w:cs="Arial" w:eastAsia="Arial" w:hAnsi="Arial"/>
+                <w:sz w:val="19"/>
+                <w:szCs w:val="19"/>
+              </w:rPr>
+              <w:t xml:space="preserve">5. La DIAN acepta y el sistema guarda la nota crédito asociada a la factura.</w:t>
+            </w:r>
+          </w:p>
+        </w:tc>
+      </w:tr>
+      <w:tr>
+        <w:tc>
+          <w:tcPr>
+            <w:tcW w:type="dxa" w:w="2300"/>
+            <w:shd w:fill="EAF0F8" w:val="clear"/>
+            <w:tcMar>
+              <w:top w:type="dxa" w:w="40"/>
+              <w:left w:type="dxa" w:w="70"/>
+              <w:bottom w:type="dxa" w:w="40"/>
+              <w:right w:type="dxa" w:w="70"/>
+            </w:tcMar>
+          </w:tcPr>
+          <w:p>
+            <w:pPr>
+              <w:spacing w:after="18" w:line="236"/>
+            </w:pPr>
+            <w:r>
+              <w:rPr>
+                <w:rFonts w:ascii="Arial" w:cs="Arial" w:eastAsia="Arial" w:hAnsi="Arial"/>
+                <w:b/>
+                <w:bCs/>
+                <w:sz w:val="19"/>
+                <w:szCs w:val="19"/>
+              </w:rPr>
+              <w:t xml:space="preserve">Flujos alternativos</w:t>
+            </w:r>
+          </w:p>
+        </w:tc>
+        <w:tc>
+          <w:tcPr>
+            <w:tcW w:type="dxa" w:w="7060"/>
+            <w:tcMar>
+              <w:top w:type="dxa" w:w="40"/>
+              <w:left w:type="dxa" w:w="70"/>
+              <w:bottom w:type="dxa" w:w="40"/>
+              <w:right w:type="dxa" w:w="70"/>
+            </w:tcMar>
+          </w:tcPr>
+          <w:p>
+            <w:pPr>
+              <w:spacing w:after="18" w:line="236"/>
+            </w:pPr>
+            <w:r>
+              <w:rPr>
+                <w:rFonts w:ascii="Arial" w:cs="Arial" w:eastAsia="Arial" w:hAnsi="Arial"/>
+                <w:sz w:val="19"/>
+                <w:szCs w:val="19"/>
+              </w:rPr>
+              <w:t xml:space="preserve">2a. Nota crédito total (por anulación de venta, CU-VEN-04) o parcial.</w:t>
+            </w:r>
+          </w:p>
+        </w:tc>
+      </w:tr>
+      <w:tr>
+        <w:tc>
+          <w:tcPr>
+            <w:tcW w:type="dxa" w:w="2300"/>
+            <w:shd w:fill="EAF0F8" w:val="clear"/>
+            <w:tcMar>
+              <w:top w:type="dxa" w:w="40"/>
+              <w:left w:type="dxa" w:w="70"/>
+              <w:bottom w:type="dxa" w:w="40"/>
+              <w:right w:type="dxa" w:w="70"/>
+            </w:tcMar>
+          </w:tcPr>
+          <w:p>
+            <w:pPr>
+              <w:spacing w:after="18" w:line="236"/>
+            </w:pPr>
+            <w:r>
+              <w:rPr>
+                <w:rFonts w:ascii="Arial" w:cs="Arial" w:eastAsia="Arial" w:hAnsi="Arial"/>
+                <w:b/>
+                <w:bCs/>
+                <w:sz w:val="19"/>
+                <w:szCs w:val="19"/>
+              </w:rPr>
+              <w:t xml:space="preserve">Excepciones</w:t>
+            </w:r>
+          </w:p>
+        </w:tc>
+        <w:tc>
+          <w:tcPr>
+            <w:tcW w:type="dxa" w:w="7060"/>
+            <w:tcMar>
+              <w:top w:type="dxa" w:w="40"/>
+              <w:left w:type="dxa" w:w="70"/>
+              <w:bottom w:type="dxa" w:w="40"/>
+              <w:right w:type="dxa" w:w="70"/>
+            </w:tcMar>
+          </w:tcPr>
+          <w:p>
+            <w:pPr>
+              <w:spacing w:after="18" w:line="236"/>
+            </w:pPr>
+            <w:r>
+              <w:rPr>
+                <w:rFonts w:ascii="Arial" w:cs="Arial" w:eastAsia="Arial" w:hAnsi="Arial"/>
+                <w:sz w:val="19"/>
+                <w:szCs w:val="19"/>
+              </w:rPr>
+              <w:t xml:space="preserve">5a. La DIAN rechaza: el sistema registra el rechazo y permite corregir y reintentar.</w:t>
+            </w:r>
+          </w:p>
+        </w:tc>
+      </w:tr>
+      <w:tr>
+        <w:tc>
+          <w:tcPr>
+            <w:tcW w:type="dxa" w:w="2300"/>
+            <w:shd w:fill="EAF0F8" w:val="clear"/>
+            <w:tcMar>
+              <w:top w:type="dxa" w:w="40"/>
+              <w:left w:type="dxa" w:w="70"/>
+              <w:bottom w:type="dxa" w:w="40"/>
+              <w:right w:type="dxa" w:w="70"/>
+            </w:tcMar>
+          </w:tcPr>
+          <w:p>
+            <w:pPr>
+              <w:spacing w:after="18" w:line="236"/>
+            </w:pPr>
+            <w:r>
+              <w:rPr>
+                <w:rFonts w:ascii="Arial" w:cs="Arial" w:eastAsia="Arial" w:hAnsi="Arial"/>
+                <w:b/>
+                <w:bCs/>
+                <w:sz w:val="19"/>
+                <w:szCs w:val="19"/>
+              </w:rPr>
+              <w:t xml:space="preserve">Reglas y validaciones</w:t>
+            </w:r>
+          </w:p>
+        </w:tc>
+        <w:tc>
+          <w:tcPr>
+            <w:tcW w:type="dxa" w:w="7060"/>
+            <w:tcMar>
+              <w:top w:type="dxa" w:w="40"/>
+              <w:left w:type="dxa" w:w="70"/>
+              <w:bottom w:type="dxa" w:w="40"/>
+              <w:right w:type="dxa" w:w="70"/>
+            </w:tcMar>
+          </w:tcPr>
+          <w:p>
+            <w:pPr>
+              <w:spacing w:after="18" w:line="236"/>
+            </w:pPr>
+            <w:r>
+              <w:rPr>
+                <w:rFonts w:ascii="Arial" w:cs="Arial" w:eastAsia="Arial" w:hAnsi="Arial"/>
+                <w:sz w:val="19"/>
+                <w:szCs w:val="19"/>
+              </w:rPr>
+              <w:t xml:space="preserve">La nota crédito referencia la factura original; se usa al anular una venta facturada; opera en el sandbox de la DIAN.</w:t>
+            </w:r>
+          </w:p>
+        </w:tc>
+      </w:tr>
+      <w:tr>
+        <w:tc>
+          <w:tcPr>
+            <w:tcW w:type="dxa" w:w="2300"/>
+            <w:shd w:fill="EAF0F8" w:val="clear"/>
+            <w:tcMar>
+              <w:top w:type="dxa" w:w="40"/>
+              <w:left w:type="dxa" w:w="70"/>
+              <w:bottom w:type="dxa" w:w="40"/>
+              <w:right w:type="dxa" w:w="70"/>
+            </w:tcMar>
+          </w:tcPr>
+          <w:p>
+            <w:pPr>
+              <w:spacing w:after="18" w:line="236"/>
+            </w:pPr>
+            <w:r>
+              <w:rPr>
+                <w:rFonts w:ascii="Arial" w:cs="Arial" w:eastAsia="Arial" w:hAnsi="Arial"/>
+                <w:b/>
+                <w:bCs/>
+                <w:sz w:val="19"/>
+                <w:szCs w:val="19"/>
+              </w:rPr>
+              <w:t xml:space="preserve">Postcondiciones</w:t>
+            </w:r>
+          </w:p>
+        </w:tc>
+        <w:tc>
+          <w:tcPr>
+            <w:tcW w:type="dxa" w:w="7060"/>
+            <w:tcMar>
+              <w:top w:type="dxa" w:w="40"/>
+              <w:left w:type="dxa" w:w="70"/>
+              <w:bottom w:type="dxa" w:w="40"/>
+              <w:right w:type="dxa" w:w="70"/>
+            </w:tcMar>
+          </w:tcPr>
+          <w:p>
+            <w:pPr>
+              <w:spacing w:after="18" w:line="236"/>
+            </w:pPr>
+            <w:r>
+              <w:rPr>
+                <w:rFonts w:ascii="Arial" w:cs="Arial" w:eastAsia="Arial" w:hAnsi="Arial"/>
+                <w:sz w:val="19"/>
+                <w:szCs w:val="19"/>
+              </w:rPr>
+              <w:t xml:space="preserve">La nota crédito queda emitida y asociada a la factura.</w:t>
+            </w:r>
+          </w:p>
+        </w:tc>
+      </w:tr>
+      <w:tr>
+        <w:tc>
+          <w:tcPr>
+            <w:tcW w:type="dxa" w:w="2300"/>
+            <w:shd w:fill="EAF0F8" w:val="clear"/>
+            <w:tcMar>
+              <w:top w:type="dxa" w:w="40"/>
+              <w:left w:type="dxa" w:w="70"/>
+              <w:bottom w:type="dxa" w:w="40"/>
+              <w:right w:type="dxa" w:w="70"/>
+            </w:tcMar>
+          </w:tcPr>
+          <w:p>
+            <w:pPr>
+              <w:spacing w:after="18" w:line="236"/>
+            </w:pPr>
+            <w:r>
+              <w:rPr>
+                <w:rFonts w:ascii="Arial" w:cs="Arial" w:eastAsia="Arial" w:hAnsi="Arial"/>
+                <w:b/>
+                <w:bCs/>
+                <w:sz w:val="19"/>
+                <w:szCs w:val="19"/>
+              </w:rPr>
+              <w:t xml:space="preserve">Prioridad</w:t>
+            </w:r>
+          </w:p>
+        </w:tc>
+        <w:tc>
+          <w:tcPr>
+            <w:tcW w:type="dxa" w:w="7060"/>
+            <w:tcMar>
+              <w:top w:type="dxa" w:w="40"/>
+              <w:left w:type="dxa" w:w="70"/>
+              <w:bottom w:type="dxa" w:w="40"/>
+              <w:right w:type="dxa" w:w="70"/>
+            </w:tcMar>
+          </w:tcPr>
+          <w:p>
+            <w:pPr>
+              <w:spacing w:after="18" w:line="236"/>
+            </w:pPr>
+            <w:r>
+              <w:rPr>
+                <w:rFonts w:ascii="Arial" w:cs="Arial" w:eastAsia="Arial" w:hAnsi="Arial"/>
+                <w:sz w:val="19"/>
+                <w:szCs w:val="19"/>
+              </w:rPr>
+              <w:t xml:space="preserve">Media</w:t>
+            </w:r>
+          </w:p>
+        </w:tc>
+      </w:tr>
+    </w:tbl>
+    <w:p>
+      <w:pPr>
+        <w:spacing w:after="140"/>
+      </w:pPr>
+    </w:p>
     <w:sectPr>
       <w:footerReference w:type="default" r:id="rId7"/>
       <w:pgSz w:w="12240" w:h="15840" w:orient="portrait"/>

</xml_diff>

<commit_message>
Agrego los casos de uso de auditoría y el cierre del documento (glosario y referencias)
</commit_message>
<xml_diff>
--- a/docs/diseno/INVENTRA_Analisis_Diseno_UML.docx
+++ b/docs/diseno/INVENTRA_Analisis_Diseno_UML.docx
@@ -1471,6 +1471,143 @@
       <w:r>
         <w:fldChar w:fldCharType="begin" w:dirty="true"/>
         <w:instrText xml:space="preserve">PAGEREF bm48</w:instrText>
+        <w:fldChar w:fldCharType="end"/>
+      </w:r>
+    </w:p>
+    <w:p>
+      <w:pPr>
+        <w:tabs>
+          <w:tab w:val="right" w:pos="9200" w:leader="dot"/>
+        </w:tabs>
+        <w:spacing w:after="40" w:line="252"/>
+        <w:ind w:left="360"/>
+      </w:pPr>
+      <w:hyperlink w:history="1" w:anchor="bm49">
+        <w:r>
+          <w:rPr>
+            <w:rFonts w:ascii="Arial" w:cs="Arial" w:eastAsia="Arial" w:hAnsi="Arial"/>
+            <w:b w:val="false"/>
+            <w:bCs w:val="false"/>
+            <w:color w:val="1F3864"/>
+            <w:sz w:val="20"/>
+            <w:szCs w:val="20"/>
+          </w:rPr>
+          <w:t xml:space="preserve">9.8 Módulo AUD — Auditoría y respaldo</w:t>
+        </w:r>
+      </w:hyperlink>
+      <w:r>
+        <w:rPr>
+          <w:rFonts w:ascii="Arial" w:cs="Arial" w:eastAsia="Arial" w:hAnsi="Arial"/>
+          <w:sz w:val="20"/>
+          <w:szCs w:val="20"/>
+        </w:rPr>
+        <w:t xml:space="preserve">	</w:t>
+      </w:r>
+      <w:r>
+        <w:fldChar w:fldCharType="begin" w:dirty="true"/>
+        <w:instrText xml:space="preserve">PAGEREF bm49</w:instrText>
+        <w:fldChar w:fldCharType="end"/>
+      </w:r>
+    </w:p>
+    <w:p>
+      <w:pPr>
+        <w:tabs>
+          <w:tab w:val="right" w:pos="9200" w:leader="dot"/>
+        </w:tabs>
+        <w:spacing w:after="40" w:line="252"/>
+      </w:pPr>
+      <w:hyperlink w:history="1" w:anchor="bm50">
+        <w:r>
+          <w:rPr>
+            <w:rFonts w:ascii="Arial" w:cs="Arial" w:eastAsia="Arial" w:hAnsi="Arial"/>
+            <w:b/>
+            <w:bCs/>
+            <w:color w:val="1F3864"/>
+            <w:sz w:val="21"/>
+            <w:szCs w:val="21"/>
+          </w:rPr>
+          <w:t xml:space="preserve">10. Conclusión</w:t>
+        </w:r>
+      </w:hyperlink>
+      <w:r>
+        <w:rPr>
+          <w:rFonts w:ascii="Arial" w:cs="Arial" w:eastAsia="Arial" w:hAnsi="Arial"/>
+          <w:sz w:val="20"/>
+          <w:szCs w:val="20"/>
+        </w:rPr>
+        <w:t xml:space="preserve">	</w:t>
+      </w:r>
+      <w:r>
+        <w:fldChar w:fldCharType="begin" w:dirty="true"/>
+        <w:instrText xml:space="preserve">PAGEREF bm50</w:instrText>
+        <w:fldChar w:fldCharType="end"/>
+      </w:r>
+    </w:p>
+    <w:p>
+      <w:pPr>
+        <w:tabs>
+          <w:tab w:val="right" w:pos="9200" w:leader="dot"/>
+        </w:tabs>
+        <w:spacing w:after="40" w:line="252"/>
+      </w:pPr>
+      <w:hyperlink w:history="1" w:anchor="bm51">
+        <w:r>
+          <w:rPr>
+            <w:rFonts w:ascii="Arial" w:cs="Arial" w:eastAsia="Arial" w:hAnsi="Arial"/>
+            <w:b/>
+            <w:bCs/>
+            <w:color w:val="1F3864"/>
+            <w:sz w:val="21"/>
+            <w:szCs w:val="21"/>
+          </w:rPr>
+          <w:t xml:space="preserve">11. Glosario</w:t>
+        </w:r>
+      </w:hyperlink>
+      <w:r>
+        <w:rPr>
+          <w:rFonts w:ascii="Arial" w:cs="Arial" w:eastAsia="Arial" w:hAnsi="Arial"/>
+          <w:sz w:val="20"/>
+          <w:szCs w:val="20"/>
+        </w:rPr>
+        <w:t xml:space="preserve">	</w:t>
+      </w:r>
+      <w:r>
+        <w:fldChar w:fldCharType="begin" w:dirty="true"/>
+        <w:instrText xml:space="preserve">PAGEREF bm51</w:instrText>
+        <w:fldChar w:fldCharType="end"/>
+      </w:r>
+    </w:p>
+    <w:p>
+      <w:pPr>
+        <w:tabs>
+          <w:tab w:val="right" w:pos="9200" w:leader="dot"/>
+        </w:tabs>
+        <w:spacing w:after="40" w:line="252"/>
+      </w:pPr>
+      <w:hyperlink w:history="1" w:anchor="bm52">
+        <w:r>
+          <w:rPr>
+            <w:rFonts w:ascii="Arial" w:cs="Arial" w:eastAsia="Arial" w:hAnsi="Arial"/>
+            <w:b/>
+            <w:bCs/>
+            <w:color w:val="1F3864"/>
+            <w:sz w:val="21"/>
+            <w:szCs w:val="21"/>
+          </w:rPr>
+          <w:t xml:space="preserve">12. Referencias</w:t>
+        </w:r>
+      </w:hyperlink>
+      <w:r>
+        <w:rPr>
+          <w:rFonts w:ascii="Arial" w:cs="Arial" w:eastAsia="Arial" w:hAnsi="Arial"/>
+          <w:sz w:val="20"/>
+          <w:szCs w:val="20"/>
+        </w:rPr>
+        <w:t xml:space="preserve">	</w:t>
+      </w:r>
+      <w:r>
+        <w:fldChar w:fldCharType="begin" w:dirty="true"/>
+        <w:instrText xml:space="preserve">PAGEREF bm52</w:instrText>
         <w:fldChar w:fldCharType="end"/>
       </w:r>
     </w:p>
@@ -36256,6 +36393,3664 @@
         <w:spacing w:after="140"/>
       </w:pPr>
     </w:p>
+    <w:p>
+      <w:pPr>
+        <w:pStyle w:val="Heading2"/>
+        <w:spacing w:after="80" w:before="150"/>
+      </w:pPr>
+      <w:bookmarkStart w:name="bm49" w:id="49"/>
+      <w:r>
+        <w:rPr>
+          <w:rFonts w:ascii="Arial" w:cs="Arial" w:eastAsia="Arial" w:hAnsi="Arial"/>
+          <w:b/>
+          <w:bCs/>
+          <w:color w:val="2E5496"/>
+          <w:sz w:val="23"/>
+          <w:szCs w:val="23"/>
+        </w:rPr>
+        <w:t xml:space="preserve">9.8 Módulo AUD — Auditoría y respaldo</w:t>
+      </w:r>
+      <w:bookmarkEnd w:id="49"/>
+    </w:p>
+    <w:tbl>
+      <w:tblPr>
+        <w:tblW w:type="dxa" w:w="9360"/>
+        <w:tblBorders>
+          <w:top w:val="single" w:color="9CA3AF" w:sz="6"/>
+          <w:left w:val="single" w:color="9CA3AF" w:sz="6"/>
+          <w:bottom w:val="single" w:color="9CA3AF" w:sz="6"/>
+          <w:right w:val="single" w:color="9CA3AF" w:sz="6"/>
+          <w:insideH w:val="single" w:color="9CA3AF" w:sz="6"/>
+          <w:insideV w:val="single" w:color="9CA3AF" w:sz="6"/>
+        </w:tblBorders>
+        <w:tblLayout w:type="fixed"/>
+      </w:tblPr>
+      <w:tblGrid>
+        <w:gridCol w:w="2300"/>
+        <w:gridCol w:w="7060"/>
+      </w:tblGrid>
+      <w:tr>
+        <w:tc>
+          <w:tcPr>
+            <w:tcW w:type="dxa" w:w="9360"/>
+            <w:gridSpan w:val="2"/>
+            <w:shd w:fill="1F3864" w:val="clear"/>
+            <w:tcMar>
+              <w:top w:type="dxa" w:w="40"/>
+              <w:left w:type="dxa" w:w="70"/>
+              <w:bottom w:type="dxa" w:w="40"/>
+              <w:right w:type="dxa" w:w="70"/>
+            </w:tcMar>
+          </w:tcPr>
+          <w:p>
+            <w:pPr>
+              <w:spacing w:after="18" w:line="236"/>
+            </w:pPr>
+            <w:r>
+              <w:rPr>
+                <w:rFonts w:ascii="Arial" w:cs="Arial" w:eastAsia="Arial" w:hAnsi="Arial"/>
+                <w:b/>
+                <w:bCs/>
+                <w:color w:val="FFFFFF"/>
+                <w:sz w:val="19"/>
+                <w:szCs w:val="19"/>
+              </w:rPr>
+              <w:t xml:space="preserve">CU-AUD-01 — Registrar log de acciones</w:t>
+            </w:r>
+          </w:p>
+        </w:tc>
+      </w:tr>
+      <w:tr>
+        <w:tc>
+          <w:tcPr>
+            <w:tcW w:type="dxa" w:w="2300"/>
+            <w:shd w:fill="EAF0F8" w:val="clear"/>
+            <w:tcMar>
+              <w:top w:type="dxa" w:w="40"/>
+              <w:left w:type="dxa" w:w="70"/>
+              <w:bottom w:type="dxa" w:w="40"/>
+              <w:right w:type="dxa" w:w="70"/>
+            </w:tcMar>
+          </w:tcPr>
+          <w:p>
+            <w:pPr>
+              <w:spacing w:after="18" w:line="236"/>
+            </w:pPr>
+            <w:r>
+              <w:rPr>
+                <w:rFonts w:ascii="Arial" w:cs="Arial" w:eastAsia="Arial" w:hAnsi="Arial"/>
+                <w:b/>
+                <w:bCs/>
+                <w:sz w:val="19"/>
+                <w:szCs w:val="19"/>
+              </w:rPr>
+              <w:t xml:space="preserve">Actor(es)</w:t>
+            </w:r>
+          </w:p>
+        </w:tc>
+        <w:tc>
+          <w:tcPr>
+            <w:tcW w:type="dxa" w:w="7060"/>
+            <w:tcMar>
+              <w:top w:type="dxa" w:w="40"/>
+              <w:left w:type="dxa" w:w="70"/>
+              <w:bottom w:type="dxa" w:w="40"/>
+              <w:right w:type="dxa" w:w="70"/>
+            </w:tcMar>
+          </w:tcPr>
+          <w:p>
+            <w:pPr>
+              <w:spacing w:after="18" w:line="236"/>
+            </w:pPr>
+            <w:r>
+              <w:rPr>
+                <w:rFonts w:ascii="Arial" w:cs="Arial" w:eastAsia="Arial" w:hAnsi="Arial"/>
+                <w:sz w:val="19"/>
+                <w:szCs w:val="19"/>
+              </w:rPr>
+              <w:t xml:space="preserve">Sistema</w:t>
+            </w:r>
+          </w:p>
+        </w:tc>
+      </w:tr>
+      <w:tr>
+        <w:tc>
+          <w:tcPr>
+            <w:tcW w:type="dxa" w:w="2300"/>
+            <w:shd w:fill="EAF0F8" w:val="clear"/>
+            <w:tcMar>
+              <w:top w:type="dxa" w:w="40"/>
+              <w:left w:type="dxa" w:w="70"/>
+              <w:bottom w:type="dxa" w:w="40"/>
+              <w:right w:type="dxa" w:w="70"/>
+            </w:tcMar>
+          </w:tcPr>
+          <w:p>
+            <w:pPr>
+              <w:spacing w:after="18" w:line="236"/>
+            </w:pPr>
+            <w:r>
+              <w:rPr>
+                <w:rFonts w:ascii="Arial" w:cs="Arial" w:eastAsia="Arial" w:hAnsi="Arial"/>
+                <w:b/>
+                <w:bCs/>
+                <w:sz w:val="19"/>
+                <w:szCs w:val="19"/>
+              </w:rPr>
+              <w:t xml:space="preserve">Requisito</w:t>
+            </w:r>
+          </w:p>
+        </w:tc>
+        <w:tc>
+          <w:tcPr>
+            <w:tcW w:type="dxa" w:w="7060"/>
+            <w:tcMar>
+              <w:top w:type="dxa" w:w="40"/>
+              <w:left w:type="dxa" w:w="70"/>
+              <w:bottom w:type="dxa" w:w="40"/>
+              <w:right w:type="dxa" w:w="70"/>
+            </w:tcMar>
+          </w:tcPr>
+          <w:p>
+            <w:pPr>
+              <w:spacing w:after="18" w:line="236"/>
+            </w:pPr>
+            <w:r>
+              <w:rPr>
+                <w:rFonts w:ascii="Arial" w:cs="Arial" w:eastAsia="Arial" w:hAnsi="Arial"/>
+                <w:sz w:val="19"/>
+                <w:szCs w:val="19"/>
+              </w:rPr>
+              <w:t xml:space="preserve">RF-AUD-01</w:t>
+            </w:r>
+          </w:p>
+        </w:tc>
+      </w:tr>
+      <w:tr>
+        <w:tc>
+          <w:tcPr>
+            <w:tcW w:type="dxa" w:w="2300"/>
+            <w:shd w:fill="EAF0F8" w:val="clear"/>
+            <w:tcMar>
+              <w:top w:type="dxa" w:w="40"/>
+              <w:left w:type="dxa" w:w="70"/>
+              <w:bottom w:type="dxa" w:w="40"/>
+              <w:right w:type="dxa" w:w="70"/>
+            </w:tcMar>
+          </w:tcPr>
+          <w:p>
+            <w:pPr>
+              <w:spacing w:after="18" w:line="236"/>
+            </w:pPr>
+            <w:r>
+              <w:rPr>
+                <w:rFonts w:ascii="Arial" w:cs="Arial" w:eastAsia="Arial" w:hAnsi="Arial"/>
+                <w:b/>
+                <w:bCs/>
+                <w:sz w:val="19"/>
+                <w:szCs w:val="19"/>
+              </w:rPr>
+              <w:t xml:space="preserve">Descripción</w:t>
+            </w:r>
+          </w:p>
+        </w:tc>
+        <w:tc>
+          <w:tcPr>
+            <w:tcW w:type="dxa" w:w="7060"/>
+            <w:tcMar>
+              <w:top w:type="dxa" w:w="40"/>
+              <w:left w:type="dxa" w:w="70"/>
+              <w:bottom w:type="dxa" w:w="40"/>
+              <w:right w:type="dxa" w:w="70"/>
+            </w:tcMar>
+          </w:tcPr>
+          <w:p>
+            <w:pPr>
+              <w:spacing w:after="18" w:line="236"/>
+            </w:pPr>
+            <w:r>
+              <w:rPr>
+                <w:rFonts w:ascii="Arial" w:cs="Arial" w:eastAsia="Arial" w:hAnsi="Arial"/>
+                <w:sz w:val="19"/>
+                <w:szCs w:val="19"/>
+              </w:rPr>
+              <w:t xml:space="preserve">El sistema registra automáticamente las acciones relevantes de los usuarios (quién, qué y cuándo).</w:t>
+            </w:r>
+          </w:p>
+        </w:tc>
+      </w:tr>
+      <w:tr>
+        <w:tc>
+          <w:tcPr>
+            <w:tcW w:type="dxa" w:w="2300"/>
+            <w:shd w:fill="EAF0F8" w:val="clear"/>
+            <w:tcMar>
+              <w:top w:type="dxa" w:w="40"/>
+              <w:left w:type="dxa" w:w="70"/>
+              <w:bottom w:type="dxa" w:w="40"/>
+              <w:right w:type="dxa" w:w="70"/>
+            </w:tcMar>
+          </w:tcPr>
+          <w:p>
+            <w:pPr>
+              <w:spacing w:after="18" w:line="236"/>
+            </w:pPr>
+            <w:r>
+              <w:rPr>
+                <w:rFonts w:ascii="Arial" w:cs="Arial" w:eastAsia="Arial" w:hAnsi="Arial"/>
+                <w:b/>
+                <w:bCs/>
+                <w:sz w:val="19"/>
+                <w:szCs w:val="19"/>
+              </w:rPr>
+              <w:t xml:space="preserve">Precondiciones</w:t>
+            </w:r>
+          </w:p>
+        </w:tc>
+        <w:tc>
+          <w:tcPr>
+            <w:tcW w:type="dxa" w:w="7060"/>
+            <w:tcMar>
+              <w:top w:type="dxa" w:w="40"/>
+              <w:left w:type="dxa" w:w="70"/>
+              <w:bottom w:type="dxa" w:w="40"/>
+              <w:right w:type="dxa" w:w="70"/>
+            </w:tcMar>
+          </w:tcPr>
+          <w:p>
+            <w:pPr>
+              <w:spacing w:after="18" w:line="236"/>
+            </w:pPr>
+            <w:r>
+              <w:rPr>
+                <w:rFonts w:ascii="Arial" w:cs="Arial" w:eastAsia="Arial" w:hAnsi="Arial"/>
+                <w:sz w:val="19"/>
+                <w:szCs w:val="19"/>
+              </w:rPr>
+              <w:t xml:space="preserve">Hay usuarios operando en el sistema.</w:t>
+            </w:r>
+          </w:p>
+        </w:tc>
+      </w:tr>
+      <w:tr>
+        <w:tc>
+          <w:tcPr>
+            <w:tcW w:type="dxa" w:w="2300"/>
+            <w:shd w:fill="EAF0F8" w:val="clear"/>
+            <w:tcMar>
+              <w:top w:type="dxa" w:w="40"/>
+              <w:left w:type="dxa" w:w="70"/>
+              <w:bottom w:type="dxa" w:w="40"/>
+              <w:right w:type="dxa" w:w="70"/>
+            </w:tcMar>
+          </w:tcPr>
+          <w:p>
+            <w:pPr>
+              <w:spacing w:after="18" w:line="236"/>
+            </w:pPr>
+            <w:r>
+              <w:rPr>
+                <w:rFonts w:ascii="Arial" w:cs="Arial" w:eastAsia="Arial" w:hAnsi="Arial"/>
+                <w:b/>
+                <w:bCs/>
+                <w:sz w:val="19"/>
+                <w:szCs w:val="19"/>
+              </w:rPr>
+              <w:t xml:space="preserve">Flujo principal</w:t>
+            </w:r>
+          </w:p>
+        </w:tc>
+        <w:tc>
+          <w:tcPr>
+            <w:tcW w:type="dxa" w:w="7060"/>
+            <w:tcMar>
+              <w:top w:type="dxa" w:w="40"/>
+              <w:left w:type="dxa" w:w="70"/>
+              <w:bottom w:type="dxa" w:w="40"/>
+              <w:right w:type="dxa" w:w="70"/>
+            </w:tcMar>
+          </w:tcPr>
+          <w:p>
+            <w:pPr>
+              <w:spacing w:after="18" w:line="236"/>
+            </w:pPr>
+            <w:r>
+              <w:rPr>
+                <w:rFonts w:ascii="Arial" w:cs="Arial" w:eastAsia="Arial" w:hAnsi="Arial"/>
+                <w:sz w:val="19"/>
+                <w:szCs w:val="19"/>
+              </w:rPr>
+              <w:t xml:space="preserve">1. Un usuario ejecuta una acción relevante (inicio de sesión, crear, editar o eliminar, venta, ajuste o cambio de configuración).</w:t>
+            </w:r>
+          </w:p>
+          <w:p>
+            <w:pPr>
+              <w:spacing w:after="18" w:line="236"/>
+            </w:pPr>
+            <w:r>
+              <w:rPr>
+                <w:rFonts w:ascii="Arial" w:cs="Arial" w:eastAsia="Arial" w:hAnsi="Arial"/>
+                <w:sz w:val="19"/>
+                <w:szCs w:val="19"/>
+              </w:rPr>
+              <w:t xml:space="preserve">2. El sistema registra el evento con el usuario, la acción, la fecha y hora, y el dato afectado.</w:t>
+            </w:r>
+          </w:p>
+          <w:p>
+            <w:pPr>
+              <w:spacing w:after="18" w:line="236"/>
+            </w:pPr>
+            <w:r>
+              <w:rPr>
+                <w:rFonts w:ascii="Arial" w:cs="Arial" w:eastAsia="Arial" w:hAnsi="Arial"/>
+                <w:sz w:val="19"/>
+                <w:szCs w:val="19"/>
+              </w:rPr>
+              <w:t xml:space="preserve">3. El registro queda almacenado de forma inmutable.</w:t>
+            </w:r>
+          </w:p>
+        </w:tc>
+      </w:tr>
+      <w:tr>
+        <w:tc>
+          <w:tcPr>
+            <w:tcW w:type="dxa" w:w="2300"/>
+            <w:shd w:fill="EAF0F8" w:val="clear"/>
+            <w:tcMar>
+              <w:top w:type="dxa" w:w="40"/>
+              <w:left w:type="dxa" w:w="70"/>
+              <w:bottom w:type="dxa" w:w="40"/>
+              <w:right w:type="dxa" w:w="70"/>
+            </w:tcMar>
+          </w:tcPr>
+          <w:p>
+            <w:pPr>
+              <w:spacing w:after="18" w:line="236"/>
+            </w:pPr>
+            <w:r>
+              <w:rPr>
+                <w:rFonts w:ascii="Arial" w:cs="Arial" w:eastAsia="Arial" w:hAnsi="Arial"/>
+                <w:b/>
+                <w:bCs/>
+                <w:sz w:val="19"/>
+                <w:szCs w:val="19"/>
+              </w:rPr>
+              <w:t xml:space="preserve">Flujos alternativos</w:t>
+            </w:r>
+          </w:p>
+        </w:tc>
+        <w:tc>
+          <w:tcPr>
+            <w:tcW w:type="dxa" w:w="7060"/>
+            <w:tcMar>
+              <w:top w:type="dxa" w:w="40"/>
+              <w:left w:type="dxa" w:w="70"/>
+              <w:bottom w:type="dxa" w:w="40"/>
+              <w:right w:type="dxa" w:w="70"/>
+            </w:tcMar>
+          </w:tcPr>
+          <w:p>
+            <w:pPr>
+              <w:spacing w:after="18" w:line="236"/>
+            </w:pPr>
+            <w:r>
+              <w:rPr>
+                <w:rFonts w:ascii="Arial" w:cs="Arial" w:eastAsia="Arial" w:hAnsi="Arial"/>
+                <w:sz w:val="19"/>
+                <w:szCs w:val="19"/>
+              </w:rPr>
+              <w:t xml:space="preserve">—</w:t>
+            </w:r>
+          </w:p>
+        </w:tc>
+      </w:tr>
+      <w:tr>
+        <w:tc>
+          <w:tcPr>
+            <w:tcW w:type="dxa" w:w="2300"/>
+            <w:shd w:fill="EAF0F8" w:val="clear"/>
+            <w:tcMar>
+              <w:top w:type="dxa" w:w="40"/>
+              <w:left w:type="dxa" w:w="70"/>
+              <w:bottom w:type="dxa" w:w="40"/>
+              <w:right w:type="dxa" w:w="70"/>
+            </w:tcMar>
+          </w:tcPr>
+          <w:p>
+            <w:pPr>
+              <w:spacing w:after="18" w:line="236"/>
+            </w:pPr>
+            <w:r>
+              <w:rPr>
+                <w:rFonts w:ascii="Arial" w:cs="Arial" w:eastAsia="Arial" w:hAnsi="Arial"/>
+                <w:b/>
+                <w:bCs/>
+                <w:sz w:val="19"/>
+                <w:szCs w:val="19"/>
+              </w:rPr>
+              <w:t xml:space="preserve">Excepciones</w:t>
+            </w:r>
+          </w:p>
+        </w:tc>
+        <w:tc>
+          <w:tcPr>
+            <w:tcW w:type="dxa" w:w="7060"/>
+            <w:tcMar>
+              <w:top w:type="dxa" w:w="40"/>
+              <w:left w:type="dxa" w:w="70"/>
+              <w:bottom w:type="dxa" w:w="40"/>
+              <w:right w:type="dxa" w:w="70"/>
+            </w:tcMar>
+          </w:tcPr>
+          <w:p>
+            <w:pPr>
+              <w:spacing w:after="18" w:line="236"/>
+            </w:pPr>
+            <w:r>
+              <w:rPr>
+                <w:rFonts w:ascii="Arial" w:cs="Arial" w:eastAsia="Arial" w:hAnsi="Arial"/>
+                <w:sz w:val="19"/>
+                <w:szCs w:val="19"/>
+              </w:rPr>
+              <w:t xml:space="preserve">*. Fallo al registrar: el sistema reintenta y deja constancia del error.</w:t>
+            </w:r>
+          </w:p>
+        </w:tc>
+      </w:tr>
+      <w:tr>
+        <w:tc>
+          <w:tcPr>
+            <w:tcW w:type="dxa" w:w="2300"/>
+            <w:shd w:fill="EAF0F8" w:val="clear"/>
+            <w:tcMar>
+              <w:top w:type="dxa" w:w="40"/>
+              <w:left w:type="dxa" w:w="70"/>
+              <w:bottom w:type="dxa" w:w="40"/>
+              <w:right w:type="dxa" w:w="70"/>
+            </w:tcMar>
+          </w:tcPr>
+          <w:p>
+            <w:pPr>
+              <w:spacing w:after="18" w:line="236"/>
+            </w:pPr>
+            <w:r>
+              <w:rPr>
+                <w:rFonts w:ascii="Arial" w:cs="Arial" w:eastAsia="Arial" w:hAnsi="Arial"/>
+                <w:b/>
+                <w:bCs/>
+                <w:sz w:val="19"/>
+                <w:szCs w:val="19"/>
+              </w:rPr>
+              <w:t xml:space="preserve">Reglas y validaciones</w:t>
+            </w:r>
+          </w:p>
+        </w:tc>
+        <w:tc>
+          <w:tcPr>
+            <w:tcW w:type="dxa" w:w="7060"/>
+            <w:tcMar>
+              <w:top w:type="dxa" w:w="40"/>
+              <w:left w:type="dxa" w:w="70"/>
+              <w:bottom w:type="dxa" w:w="40"/>
+              <w:right w:type="dxa" w:w="70"/>
+            </w:tcMar>
+          </w:tcPr>
+          <w:p>
+            <w:pPr>
+              <w:spacing w:after="18" w:line="236"/>
+            </w:pPr>
+            <w:r>
+              <w:rPr>
+                <w:rFonts w:ascii="Arial" w:cs="Arial" w:eastAsia="Arial" w:hAnsi="Arial"/>
+                <w:sz w:val="19"/>
+                <w:szCs w:val="19"/>
+              </w:rPr>
+              <w:t xml:space="preserve">El registro es automático (actor Sistema) e inmutable (no se edita ni se borra); incluye la licorera para aislar los datos (multitenant).</w:t>
+            </w:r>
+          </w:p>
+        </w:tc>
+      </w:tr>
+      <w:tr>
+        <w:tc>
+          <w:tcPr>
+            <w:tcW w:type="dxa" w:w="2300"/>
+            <w:shd w:fill="EAF0F8" w:val="clear"/>
+            <w:tcMar>
+              <w:top w:type="dxa" w:w="40"/>
+              <w:left w:type="dxa" w:w="70"/>
+              <w:bottom w:type="dxa" w:w="40"/>
+              <w:right w:type="dxa" w:w="70"/>
+            </w:tcMar>
+          </w:tcPr>
+          <w:p>
+            <w:pPr>
+              <w:spacing w:after="18" w:line="236"/>
+            </w:pPr>
+            <w:r>
+              <w:rPr>
+                <w:rFonts w:ascii="Arial" w:cs="Arial" w:eastAsia="Arial" w:hAnsi="Arial"/>
+                <w:b/>
+                <w:bCs/>
+                <w:sz w:val="19"/>
+                <w:szCs w:val="19"/>
+              </w:rPr>
+              <w:t xml:space="preserve">Postcondiciones</w:t>
+            </w:r>
+          </w:p>
+        </w:tc>
+        <w:tc>
+          <w:tcPr>
+            <w:tcW w:type="dxa" w:w="7060"/>
+            <w:tcMar>
+              <w:top w:type="dxa" w:w="40"/>
+              <w:left w:type="dxa" w:w="70"/>
+              <w:bottom w:type="dxa" w:w="40"/>
+              <w:right w:type="dxa" w:w="70"/>
+            </w:tcMar>
+          </w:tcPr>
+          <w:p>
+            <w:pPr>
+              <w:spacing w:after="18" w:line="236"/>
+            </w:pPr>
+            <w:r>
+              <w:rPr>
+                <w:rFonts w:ascii="Arial" w:cs="Arial" w:eastAsia="Arial" w:hAnsi="Arial"/>
+                <w:sz w:val="19"/>
+                <w:szCs w:val="19"/>
+              </w:rPr>
+              <w:t xml:space="preserve">La acción queda registrada en la bitácora de auditoría.</w:t>
+            </w:r>
+          </w:p>
+        </w:tc>
+      </w:tr>
+      <w:tr>
+        <w:tc>
+          <w:tcPr>
+            <w:tcW w:type="dxa" w:w="2300"/>
+            <w:shd w:fill="EAF0F8" w:val="clear"/>
+            <w:tcMar>
+              <w:top w:type="dxa" w:w="40"/>
+              <w:left w:type="dxa" w:w="70"/>
+              <w:bottom w:type="dxa" w:w="40"/>
+              <w:right w:type="dxa" w:w="70"/>
+            </w:tcMar>
+          </w:tcPr>
+          <w:p>
+            <w:pPr>
+              <w:spacing w:after="18" w:line="236"/>
+            </w:pPr>
+            <w:r>
+              <w:rPr>
+                <w:rFonts w:ascii="Arial" w:cs="Arial" w:eastAsia="Arial" w:hAnsi="Arial"/>
+                <w:b/>
+                <w:bCs/>
+                <w:sz w:val="19"/>
+                <w:szCs w:val="19"/>
+              </w:rPr>
+              <w:t xml:space="preserve">Prioridad</w:t>
+            </w:r>
+          </w:p>
+        </w:tc>
+        <w:tc>
+          <w:tcPr>
+            <w:tcW w:type="dxa" w:w="7060"/>
+            <w:tcMar>
+              <w:top w:type="dxa" w:w="40"/>
+              <w:left w:type="dxa" w:w="70"/>
+              <w:bottom w:type="dxa" w:w="40"/>
+              <w:right w:type="dxa" w:w="70"/>
+            </w:tcMar>
+          </w:tcPr>
+          <w:p>
+            <w:pPr>
+              <w:spacing w:after="18" w:line="236"/>
+            </w:pPr>
+            <w:r>
+              <w:rPr>
+                <w:rFonts w:ascii="Arial" w:cs="Arial" w:eastAsia="Arial" w:hAnsi="Arial"/>
+                <w:sz w:val="19"/>
+                <w:szCs w:val="19"/>
+              </w:rPr>
+              <w:t xml:space="preserve">Alta</w:t>
+            </w:r>
+          </w:p>
+        </w:tc>
+      </w:tr>
+    </w:tbl>
+    <w:p>
+      <w:pPr>
+        <w:spacing w:after="140"/>
+      </w:pPr>
+    </w:p>
+    <w:tbl>
+      <w:tblPr>
+        <w:tblW w:type="dxa" w:w="9360"/>
+        <w:tblBorders>
+          <w:top w:val="single" w:color="9CA3AF" w:sz="6"/>
+          <w:left w:val="single" w:color="9CA3AF" w:sz="6"/>
+          <w:bottom w:val="single" w:color="9CA3AF" w:sz="6"/>
+          <w:right w:val="single" w:color="9CA3AF" w:sz="6"/>
+          <w:insideH w:val="single" w:color="9CA3AF" w:sz="6"/>
+          <w:insideV w:val="single" w:color="9CA3AF" w:sz="6"/>
+        </w:tblBorders>
+        <w:tblLayout w:type="fixed"/>
+      </w:tblPr>
+      <w:tblGrid>
+        <w:gridCol w:w="2300"/>
+        <w:gridCol w:w="7060"/>
+      </w:tblGrid>
+      <w:tr>
+        <w:tc>
+          <w:tcPr>
+            <w:tcW w:type="dxa" w:w="9360"/>
+            <w:gridSpan w:val="2"/>
+            <w:shd w:fill="1F3864" w:val="clear"/>
+            <w:tcMar>
+              <w:top w:type="dxa" w:w="40"/>
+              <w:left w:type="dxa" w:w="70"/>
+              <w:bottom w:type="dxa" w:w="40"/>
+              <w:right w:type="dxa" w:w="70"/>
+            </w:tcMar>
+          </w:tcPr>
+          <w:p>
+            <w:pPr>
+              <w:spacing w:after="18" w:line="236"/>
+            </w:pPr>
+            <w:r>
+              <w:rPr>
+                <w:rFonts w:ascii="Arial" w:cs="Arial" w:eastAsia="Arial" w:hAnsi="Arial"/>
+                <w:b/>
+                <w:bCs/>
+                <w:color w:val="FFFFFF"/>
+                <w:sz w:val="19"/>
+                <w:szCs w:val="19"/>
+              </w:rPr>
+              <w:t xml:space="preserve">CU-AUD-02 — Consultar auditoría</w:t>
+            </w:r>
+          </w:p>
+        </w:tc>
+      </w:tr>
+      <w:tr>
+        <w:tc>
+          <w:tcPr>
+            <w:tcW w:type="dxa" w:w="2300"/>
+            <w:shd w:fill="EAF0F8" w:val="clear"/>
+            <w:tcMar>
+              <w:top w:type="dxa" w:w="40"/>
+              <w:left w:type="dxa" w:w="70"/>
+              <w:bottom w:type="dxa" w:w="40"/>
+              <w:right w:type="dxa" w:w="70"/>
+            </w:tcMar>
+          </w:tcPr>
+          <w:p>
+            <w:pPr>
+              <w:spacing w:after="18" w:line="236"/>
+            </w:pPr>
+            <w:r>
+              <w:rPr>
+                <w:rFonts w:ascii="Arial" w:cs="Arial" w:eastAsia="Arial" w:hAnsi="Arial"/>
+                <w:b/>
+                <w:bCs/>
+                <w:sz w:val="19"/>
+                <w:szCs w:val="19"/>
+              </w:rPr>
+              <w:t xml:space="preserve">Actor(es)</w:t>
+            </w:r>
+          </w:p>
+        </w:tc>
+        <w:tc>
+          <w:tcPr>
+            <w:tcW w:type="dxa" w:w="7060"/>
+            <w:tcMar>
+              <w:top w:type="dxa" w:w="40"/>
+              <w:left w:type="dxa" w:w="70"/>
+              <w:bottom w:type="dxa" w:w="40"/>
+              <w:right w:type="dxa" w:w="70"/>
+            </w:tcMar>
+          </w:tcPr>
+          <w:p>
+            <w:pPr>
+              <w:spacing w:after="18" w:line="236"/>
+            </w:pPr>
+            <w:r>
+              <w:rPr>
+                <w:rFonts w:ascii="Arial" w:cs="Arial" w:eastAsia="Arial" w:hAnsi="Arial"/>
+                <w:sz w:val="19"/>
+                <w:szCs w:val="19"/>
+              </w:rPr>
+              <w:t xml:space="preserve">Administrador</w:t>
+            </w:r>
+          </w:p>
+        </w:tc>
+      </w:tr>
+      <w:tr>
+        <w:tc>
+          <w:tcPr>
+            <w:tcW w:type="dxa" w:w="2300"/>
+            <w:shd w:fill="EAF0F8" w:val="clear"/>
+            <w:tcMar>
+              <w:top w:type="dxa" w:w="40"/>
+              <w:left w:type="dxa" w:w="70"/>
+              <w:bottom w:type="dxa" w:w="40"/>
+              <w:right w:type="dxa" w:w="70"/>
+            </w:tcMar>
+          </w:tcPr>
+          <w:p>
+            <w:pPr>
+              <w:spacing w:after="18" w:line="236"/>
+            </w:pPr>
+            <w:r>
+              <w:rPr>
+                <w:rFonts w:ascii="Arial" w:cs="Arial" w:eastAsia="Arial" w:hAnsi="Arial"/>
+                <w:b/>
+                <w:bCs/>
+                <w:sz w:val="19"/>
+                <w:szCs w:val="19"/>
+              </w:rPr>
+              <w:t xml:space="preserve">Requisito</w:t>
+            </w:r>
+          </w:p>
+        </w:tc>
+        <w:tc>
+          <w:tcPr>
+            <w:tcW w:type="dxa" w:w="7060"/>
+            <w:tcMar>
+              <w:top w:type="dxa" w:w="40"/>
+              <w:left w:type="dxa" w:w="70"/>
+              <w:bottom w:type="dxa" w:w="40"/>
+              <w:right w:type="dxa" w:w="70"/>
+            </w:tcMar>
+          </w:tcPr>
+          <w:p>
+            <w:pPr>
+              <w:spacing w:after="18" w:line="236"/>
+            </w:pPr>
+            <w:r>
+              <w:rPr>
+                <w:rFonts w:ascii="Arial" w:cs="Arial" w:eastAsia="Arial" w:hAnsi="Arial"/>
+                <w:sz w:val="19"/>
+                <w:szCs w:val="19"/>
+              </w:rPr>
+              <w:t xml:space="preserve">RF-AUD-02</w:t>
+            </w:r>
+          </w:p>
+        </w:tc>
+      </w:tr>
+      <w:tr>
+        <w:tc>
+          <w:tcPr>
+            <w:tcW w:type="dxa" w:w="2300"/>
+            <w:shd w:fill="EAF0F8" w:val="clear"/>
+            <w:tcMar>
+              <w:top w:type="dxa" w:w="40"/>
+              <w:left w:type="dxa" w:w="70"/>
+              <w:bottom w:type="dxa" w:w="40"/>
+              <w:right w:type="dxa" w:w="70"/>
+            </w:tcMar>
+          </w:tcPr>
+          <w:p>
+            <w:pPr>
+              <w:spacing w:after="18" w:line="236"/>
+            </w:pPr>
+            <w:r>
+              <w:rPr>
+                <w:rFonts w:ascii="Arial" w:cs="Arial" w:eastAsia="Arial" w:hAnsi="Arial"/>
+                <w:b/>
+                <w:bCs/>
+                <w:sz w:val="19"/>
+                <w:szCs w:val="19"/>
+              </w:rPr>
+              <w:t xml:space="preserve">Descripción</w:t>
+            </w:r>
+          </w:p>
+        </w:tc>
+        <w:tc>
+          <w:tcPr>
+            <w:tcW w:type="dxa" w:w="7060"/>
+            <w:tcMar>
+              <w:top w:type="dxa" w:w="40"/>
+              <w:left w:type="dxa" w:w="70"/>
+              <w:bottom w:type="dxa" w:w="40"/>
+              <w:right w:type="dxa" w:w="70"/>
+            </w:tcMar>
+          </w:tcPr>
+          <w:p>
+            <w:pPr>
+              <w:spacing w:after="18" w:line="236"/>
+            </w:pPr>
+            <w:r>
+              <w:rPr>
+                <w:rFonts w:ascii="Arial" w:cs="Arial" w:eastAsia="Arial" w:hAnsi="Arial"/>
+                <w:sz w:val="19"/>
+                <w:szCs w:val="19"/>
+              </w:rPr>
+              <w:t xml:space="preserve">El administrador consulta la bitácora de acciones para revisar la actividad del sistema.</w:t>
+            </w:r>
+          </w:p>
+        </w:tc>
+      </w:tr>
+      <w:tr>
+        <w:tc>
+          <w:tcPr>
+            <w:tcW w:type="dxa" w:w="2300"/>
+            <w:shd w:fill="EAF0F8" w:val="clear"/>
+            <w:tcMar>
+              <w:top w:type="dxa" w:w="40"/>
+              <w:left w:type="dxa" w:w="70"/>
+              <w:bottom w:type="dxa" w:w="40"/>
+              <w:right w:type="dxa" w:w="70"/>
+            </w:tcMar>
+          </w:tcPr>
+          <w:p>
+            <w:pPr>
+              <w:spacing w:after="18" w:line="236"/>
+            </w:pPr>
+            <w:r>
+              <w:rPr>
+                <w:rFonts w:ascii="Arial" w:cs="Arial" w:eastAsia="Arial" w:hAnsi="Arial"/>
+                <w:b/>
+                <w:bCs/>
+                <w:sz w:val="19"/>
+                <w:szCs w:val="19"/>
+              </w:rPr>
+              <w:t xml:space="preserve">Precondiciones</w:t>
+            </w:r>
+          </w:p>
+        </w:tc>
+        <w:tc>
+          <w:tcPr>
+            <w:tcW w:type="dxa" w:w="7060"/>
+            <w:tcMar>
+              <w:top w:type="dxa" w:w="40"/>
+              <w:left w:type="dxa" w:w="70"/>
+              <w:bottom w:type="dxa" w:w="40"/>
+              <w:right w:type="dxa" w:w="70"/>
+            </w:tcMar>
+          </w:tcPr>
+          <w:p>
+            <w:pPr>
+              <w:spacing w:after="18" w:line="236"/>
+            </w:pPr>
+            <w:r>
+              <w:rPr>
+                <w:rFonts w:ascii="Arial" w:cs="Arial" w:eastAsia="Arial" w:hAnsi="Arial"/>
+                <w:sz w:val="19"/>
+                <w:szCs w:val="19"/>
+              </w:rPr>
+              <w:t xml:space="preserve">Existen registros de auditoría y el administrador tiene permiso.</w:t>
+            </w:r>
+          </w:p>
+        </w:tc>
+      </w:tr>
+      <w:tr>
+        <w:tc>
+          <w:tcPr>
+            <w:tcW w:type="dxa" w:w="2300"/>
+            <w:shd w:fill="EAF0F8" w:val="clear"/>
+            <w:tcMar>
+              <w:top w:type="dxa" w:w="40"/>
+              <w:left w:type="dxa" w:w="70"/>
+              <w:bottom w:type="dxa" w:w="40"/>
+              <w:right w:type="dxa" w:w="70"/>
+            </w:tcMar>
+          </w:tcPr>
+          <w:p>
+            <w:pPr>
+              <w:spacing w:after="18" w:line="236"/>
+            </w:pPr>
+            <w:r>
+              <w:rPr>
+                <w:rFonts w:ascii="Arial" w:cs="Arial" w:eastAsia="Arial" w:hAnsi="Arial"/>
+                <w:b/>
+                <w:bCs/>
+                <w:sz w:val="19"/>
+                <w:szCs w:val="19"/>
+              </w:rPr>
+              <w:t xml:space="preserve">Flujo principal</w:t>
+            </w:r>
+          </w:p>
+        </w:tc>
+        <w:tc>
+          <w:tcPr>
+            <w:tcW w:type="dxa" w:w="7060"/>
+            <w:tcMar>
+              <w:top w:type="dxa" w:w="40"/>
+              <w:left w:type="dxa" w:w="70"/>
+              <w:bottom w:type="dxa" w:w="40"/>
+              <w:right w:type="dxa" w:w="70"/>
+            </w:tcMar>
+          </w:tcPr>
+          <w:p>
+            <w:pPr>
+              <w:spacing w:after="18" w:line="236"/>
+            </w:pPr>
+            <w:r>
+              <w:rPr>
+                <w:rFonts w:ascii="Arial" w:cs="Arial" w:eastAsia="Arial" w:hAnsi="Arial"/>
+                <w:sz w:val="19"/>
+                <w:szCs w:val="19"/>
+              </w:rPr>
+              <w:t xml:space="preserve">1. Abre la auditoría.</w:t>
+            </w:r>
+          </w:p>
+          <w:p>
+            <w:pPr>
+              <w:spacing w:after="18" w:line="236"/>
+            </w:pPr>
+            <w:r>
+              <w:rPr>
+                <w:rFonts w:ascii="Arial" w:cs="Arial" w:eastAsia="Arial" w:hAnsi="Arial"/>
+                <w:sz w:val="19"/>
+                <w:szCs w:val="19"/>
+              </w:rPr>
+              <w:t xml:space="preserve">2. El sistema muestra los eventos con usuario, acción, fecha y dato afectado.</w:t>
+            </w:r>
+          </w:p>
+          <w:p>
+            <w:pPr>
+              <w:spacing w:after="18" w:line="236"/>
+            </w:pPr>
+            <w:r>
+              <w:rPr>
+                <w:rFonts w:ascii="Arial" w:cs="Arial" w:eastAsia="Arial" w:hAnsi="Arial"/>
+                <w:sz w:val="19"/>
+                <w:szCs w:val="19"/>
+              </w:rPr>
+              <w:t xml:space="preserve">3. El administrador filtra por usuario, fecha, tipo de acción o módulo.</w:t>
+            </w:r>
+          </w:p>
+        </w:tc>
+      </w:tr>
+      <w:tr>
+        <w:tc>
+          <w:tcPr>
+            <w:tcW w:type="dxa" w:w="2300"/>
+            <w:shd w:fill="EAF0F8" w:val="clear"/>
+            <w:tcMar>
+              <w:top w:type="dxa" w:w="40"/>
+              <w:left w:type="dxa" w:w="70"/>
+              <w:bottom w:type="dxa" w:w="40"/>
+              <w:right w:type="dxa" w:w="70"/>
+            </w:tcMar>
+          </w:tcPr>
+          <w:p>
+            <w:pPr>
+              <w:spacing w:after="18" w:line="236"/>
+            </w:pPr>
+            <w:r>
+              <w:rPr>
+                <w:rFonts w:ascii="Arial" w:cs="Arial" w:eastAsia="Arial" w:hAnsi="Arial"/>
+                <w:b/>
+                <w:bCs/>
+                <w:sz w:val="19"/>
+                <w:szCs w:val="19"/>
+              </w:rPr>
+              <w:t xml:space="preserve">Flujos alternativos</w:t>
+            </w:r>
+          </w:p>
+        </w:tc>
+        <w:tc>
+          <w:tcPr>
+            <w:tcW w:type="dxa" w:w="7060"/>
+            <w:tcMar>
+              <w:top w:type="dxa" w:w="40"/>
+              <w:left w:type="dxa" w:w="70"/>
+              <w:bottom w:type="dxa" w:w="40"/>
+              <w:right w:type="dxa" w:w="70"/>
+            </w:tcMar>
+          </w:tcPr>
+          <w:p>
+            <w:pPr>
+              <w:spacing w:after="18" w:line="236"/>
+            </w:pPr>
+            <w:r>
+              <w:rPr>
+                <w:rFonts w:ascii="Arial" w:cs="Arial" w:eastAsia="Arial" w:hAnsi="Arial"/>
+                <w:sz w:val="19"/>
+                <w:szCs w:val="19"/>
+              </w:rPr>
+              <w:t xml:space="preserve">2a. Ver el detalle de un evento.</w:t>
+            </w:r>
+          </w:p>
+          <w:p>
+            <w:pPr>
+              <w:spacing w:after="18" w:line="236"/>
+            </w:pPr>
+            <w:r>
+              <w:rPr>
+                <w:rFonts w:ascii="Arial" w:cs="Arial" w:eastAsia="Arial" w:hAnsi="Arial"/>
+                <w:sz w:val="19"/>
+                <w:szCs w:val="19"/>
+              </w:rPr>
+              <w:t xml:space="preserve">2b. Exportar la bitácora desde el módulo de reportes.</w:t>
+            </w:r>
+          </w:p>
+        </w:tc>
+      </w:tr>
+      <w:tr>
+        <w:tc>
+          <w:tcPr>
+            <w:tcW w:type="dxa" w:w="2300"/>
+            <w:shd w:fill="EAF0F8" w:val="clear"/>
+            <w:tcMar>
+              <w:top w:type="dxa" w:w="40"/>
+              <w:left w:type="dxa" w:w="70"/>
+              <w:bottom w:type="dxa" w:w="40"/>
+              <w:right w:type="dxa" w:w="70"/>
+            </w:tcMar>
+          </w:tcPr>
+          <w:p>
+            <w:pPr>
+              <w:spacing w:after="18" w:line="236"/>
+            </w:pPr>
+            <w:r>
+              <w:rPr>
+                <w:rFonts w:ascii="Arial" w:cs="Arial" w:eastAsia="Arial" w:hAnsi="Arial"/>
+                <w:b/>
+                <w:bCs/>
+                <w:sz w:val="19"/>
+                <w:szCs w:val="19"/>
+              </w:rPr>
+              <w:t xml:space="preserve">Excepciones</w:t>
+            </w:r>
+          </w:p>
+        </w:tc>
+        <w:tc>
+          <w:tcPr>
+            <w:tcW w:type="dxa" w:w="7060"/>
+            <w:tcMar>
+              <w:top w:type="dxa" w:w="40"/>
+              <w:left w:type="dxa" w:w="70"/>
+              <w:bottom w:type="dxa" w:w="40"/>
+              <w:right w:type="dxa" w:w="70"/>
+            </w:tcMar>
+          </w:tcPr>
+          <w:p>
+            <w:pPr>
+              <w:spacing w:after="18" w:line="236"/>
+            </w:pPr>
+            <w:r>
+              <w:rPr>
+                <w:rFonts w:ascii="Arial" w:cs="Arial" w:eastAsia="Arial" w:hAnsi="Arial"/>
+                <w:sz w:val="19"/>
+                <w:szCs w:val="19"/>
+              </w:rPr>
+              <w:t xml:space="preserve">*. Sin eventos para el filtro elegido: el sistema muestra la bitácora vacía.</w:t>
+            </w:r>
+          </w:p>
+        </w:tc>
+      </w:tr>
+      <w:tr>
+        <w:tc>
+          <w:tcPr>
+            <w:tcW w:type="dxa" w:w="2300"/>
+            <w:shd w:fill="EAF0F8" w:val="clear"/>
+            <w:tcMar>
+              <w:top w:type="dxa" w:w="40"/>
+              <w:left w:type="dxa" w:w="70"/>
+              <w:bottom w:type="dxa" w:w="40"/>
+              <w:right w:type="dxa" w:w="70"/>
+            </w:tcMar>
+          </w:tcPr>
+          <w:p>
+            <w:pPr>
+              <w:spacing w:after="18" w:line="236"/>
+            </w:pPr>
+            <w:r>
+              <w:rPr>
+                <w:rFonts w:ascii="Arial" w:cs="Arial" w:eastAsia="Arial" w:hAnsi="Arial"/>
+                <w:b/>
+                <w:bCs/>
+                <w:sz w:val="19"/>
+                <w:szCs w:val="19"/>
+              </w:rPr>
+              <w:t xml:space="preserve">Reglas y validaciones</w:t>
+            </w:r>
+          </w:p>
+        </w:tc>
+        <w:tc>
+          <w:tcPr>
+            <w:tcW w:type="dxa" w:w="7060"/>
+            <w:tcMar>
+              <w:top w:type="dxa" w:w="40"/>
+              <w:left w:type="dxa" w:w="70"/>
+              <w:bottom w:type="dxa" w:w="40"/>
+              <w:right w:type="dxa" w:w="70"/>
+            </w:tcMar>
+          </w:tcPr>
+          <w:p>
+            <w:pPr>
+              <w:spacing w:after="18" w:line="236"/>
+            </w:pPr>
+            <w:r>
+              <w:rPr>
+                <w:rFonts w:ascii="Arial" w:cs="Arial" w:eastAsia="Arial" w:hAnsi="Arial"/>
+                <w:sz w:val="19"/>
+                <w:szCs w:val="19"/>
+              </w:rPr>
+              <w:t xml:space="preserve">Es solo de consulta (no se edita); el administrador ve la auditoría de su licorera; apoya la trazabilidad y el control.</w:t>
+            </w:r>
+          </w:p>
+        </w:tc>
+      </w:tr>
+      <w:tr>
+        <w:tc>
+          <w:tcPr>
+            <w:tcW w:type="dxa" w:w="2300"/>
+            <w:shd w:fill="EAF0F8" w:val="clear"/>
+            <w:tcMar>
+              <w:top w:type="dxa" w:w="40"/>
+              <w:left w:type="dxa" w:w="70"/>
+              <w:bottom w:type="dxa" w:w="40"/>
+              <w:right w:type="dxa" w:w="70"/>
+            </w:tcMar>
+          </w:tcPr>
+          <w:p>
+            <w:pPr>
+              <w:spacing w:after="18" w:line="236"/>
+            </w:pPr>
+            <w:r>
+              <w:rPr>
+                <w:rFonts w:ascii="Arial" w:cs="Arial" w:eastAsia="Arial" w:hAnsi="Arial"/>
+                <w:b/>
+                <w:bCs/>
+                <w:sz w:val="19"/>
+                <w:szCs w:val="19"/>
+              </w:rPr>
+              <w:t xml:space="preserve">Postcondiciones</w:t>
+            </w:r>
+          </w:p>
+        </w:tc>
+        <w:tc>
+          <w:tcPr>
+            <w:tcW w:type="dxa" w:w="7060"/>
+            <w:tcMar>
+              <w:top w:type="dxa" w:w="40"/>
+              <w:left w:type="dxa" w:w="70"/>
+              <w:bottom w:type="dxa" w:w="40"/>
+              <w:right w:type="dxa" w:w="70"/>
+            </w:tcMar>
+          </w:tcPr>
+          <w:p>
+            <w:pPr>
+              <w:spacing w:after="18" w:line="236"/>
+            </w:pPr>
+            <w:r>
+              <w:rPr>
+                <w:rFonts w:ascii="Arial" w:cs="Arial" w:eastAsia="Arial" w:hAnsi="Arial"/>
+                <w:sz w:val="19"/>
+                <w:szCs w:val="19"/>
+              </w:rPr>
+              <w:t xml:space="preserve">El administrador visualiza la actividad registrada.</w:t>
+            </w:r>
+          </w:p>
+        </w:tc>
+      </w:tr>
+      <w:tr>
+        <w:tc>
+          <w:tcPr>
+            <w:tcW w:type="dxa" w:w="2300"/>
+            <w:shd w:fill="EAF0F8" w:val="clear"/>
+            <w:tcMar>
+              <w:top w:type="dxa" w:w="40"/>
+              <w:left w:type="dxa" w:w="70"/>
+              <w:bottom w:type="dxa" w:w="40"/>
+              <w:right w:type="dxa" w:w="70"/>
+            </w:tcMar>
+          </w:tcPr>
+          <w:p>
+            <w:pPr>
+              <w:spacing w:after="18" w:line="236"/>
+            </w:pPr>
+            <w:r>
+              <w:rPr>
+                <w:rFonts w:ascii="Arial" w:cs="Arial" w:eastAsia="Arial" w:hAnsi="Arial"/>
+                <w:b/>
+                <w:bCs/>
+                <w:sz w:val="19"/>
+                <w:szCs w:val="19"/>
+              </w:rPr>
+              <w:t xml:space="preserve">Prioridad</w:t>
+            </w:r>
+          </w:p>
+        </w:tc>
+        <w:tc>
+          <w:tcPr>
+            <w:tcW w:type="dxa" w:w="7060"/>
+            <w:tcMar>
+              <w:top w:type="dxa" w:w="40"/>
+              <w:left w:type="dxa" w:w="70"/>
+              <w:bottom w:type="dxa" w:w="40"/>
+              <w:right w:type="dxa" w:w="70"/>
+            </w:tcMar>
+          </w:tcPr>
+          <w:p>
+            <w:pPr>
+              <w:spacing w:after="18" w:line="236"/>
+            </w:pPr>
+            <w:r>
+              <w:rPr>
+                <w:rFonts w:ascii="Arial" w:cs="Arial" w:eastAsia="Arial" w:hAnsi="Arial"/>
+                <w:sz w:val="19"/>
+                <w:szCs w:val="19"/>
+              </w:rPr>
+              <w:t xml:space="preserve">Media</w:t>
+            </w:r>
+          </w:p>
+        </w:tc>
+      </w:tr>
+    </w:tbl>
+    <w:p>
+      <w:pPr>
+        <w:spacing w:after="140"/>
+      </w:pPr>
+    </w:p>
+    <w:tbl>
+      <w:tblPr>
+        <w:tblW w:type="dxa" w:w="9360"/>
+        <w:tblBorders>
+          <w:top w:val="single" w:color="9CA3AF" w:sz="6"/>
+          <w:left w:val="single" w:color="9CA3AF" w:sz="6"/>
+          <w:bottom w:val="single" w:color="9CA3AF" w:sz="6"/>
+          <w:right w:val="single" w:color="9CA3AF" w:sz="6"/>
+          <w:insideH w:val="single" w:color="9CA3AF" w:sz="6"/>
+          <w:insideV w:val="single" w:color="9CA3AF" w:sz="6"/>
+        </w:tblBorders>
+        <w:tblLayout w:type="fixed"/>
+      </w:tblPr>
+      <w:tblGrid>
+        <w:gridCol w:w="2300"/>
+        <w:gridCol w:w="7060"/>
+      </w:tblGrid>
+      <w:tr>
+        <w:tc>
+          <w:tcPr>
+            <w:tcW w:type="dxa" w:w="9360"/>
+            <w:gridSpan w:val="2"/>
+            <w:shd w:fill="1F3864" w:val="clear"/>
+            <w:tcMar>
+              <w:top w:type="dxa" w:w="40"/>
+              <w:left w:type="dxa" w:w="70"/>
+              <w:bottom w:type="dxa" w:w="40"/>
+              <w:right w:type="dxa" w:w="70"/>
+            </w:tcMar>
+          </w:tcPr>
+          <w:p>
+            <w:pPr>
+              <w:spacing w:after="18" w:line="236"/>
+            </w:pPr>
+            <w:r>
+              <w:rPr>
+                <w:rFonts w:ascii="Arial" w:cs="Arial" w:eastAsia="Arial" w:hAnsi="Arial"/>
+                <w:b/>
+                <w:bCs/>
+                <w:color w:val="FFFFFF"/>
+                <w:sz w:val="19"/>
+                <w:szCs w:val="19"/>
+              </w:rPr>
+              <w:t xml:space="preserve">CU-AUD-03 — Generar copia de seguridad</w:t>
+            </w:r>
+          </w:p>
+        </w:tc>
+      </w:tr>
+      <w:tr>
+        <w:tc>
+          <w:tcPr>
+            <w:tcW w:type="dxa" w:w="2300"/>
+            <w:shd w:fill="EAF0F8" w:val="clear"/>
+            <w:tcMar>
+              <w:top w:type="dxa" w:w="40"/>
+              <w:left w:type="dxa" w:w="70"/>
+              <w:bottom w:type="dxa" w:w="40"/>
+              <w:right w:type="dxa" w:w="70"/>
+            </w:tcMar>
+          </w:tcPr>
+          <w:p>
+            <w:pPr>
+              <w:spacing w:after="18" w:line="236"/>
+            </w:pPr>
+            <w:r>
+              <w:rPr>
+                <w:rFonts w:ascii="Arial" w:cs="Arial" w:eastAsia="Arial" w:hAnsi="Arial"/>
+                <w:b/>
+                <w:bCs/>
+                <w:sz w:val="19"/>
+                <w:szCs w:val="19"/>
+              </w:rPr>
+              <w:t xml:space="preserve">Actor(es)</w:t>
+            </w:r>
+          </w:p>
+        </w:tc>
+        <w:tc>
+          <w:tcPr>
+            <w:tcW w:type="dxa" w:w="7060"/>
+            <w:tcMar>
+              <w:top w:type="dxa" w:w="40"/>
+              <w:left w:type="dxa" w:w="70"/>
+              <w:bottom w:type="dxa" w:w="40"/>
+              <w:right w:type="dxa" w:w="70"/>
+            </w:tcMar>
+          </w:tcPr>
+          <w:p>
+            <w:pPr>
+              <w:spacing w:after="18" w:line="236"/>
+            </w:pPr>
+            <w:r>
+              <w:rPr>
+                <w:rFonts w:ascii="Arial" w:cs="Arial" w:eastAsia="Arial" w:hAnsi="Arial"/>
+                <w:sz w:val="19"/>
+                <w:szCs w:val="19"/>
+              </w:rPr>
+              <w:t xml:space="preserve">Administrador; Sistema</w:t>
+            </w:r>
+          </w:p>
+        </w:tc>
+      </w:tr>
+      <w:tr>
+        <w:tc>
+          <w:tcPr>
+            <w:tcW w:type="dxa" w:w="2300"/>
+            <w:shd w:fill="EAF0F8" w:val="clear"/>
+            <w:tcMar>
+              <w:top w:type="dxa" w:w="40"/>
+              <w:left w:type="dxa" w:w="70"/>
+              <w:bottom w:type="dxa" w:w="40"/>
+              <w:right w:type="dxa" w:w="70"/>
+            </w:tcMar>
+          </w:tcPr>
+          <w:p>
+            <w:pPr>
+              <w:spacing w:after="18" w:line="236"/>
+            </w:pPr>
+            <w:r>
+              <w:rPr>
+                <w:rFonts w:ascii="Arial" w:cs="Arial" w:eastAsia="Arial" w:hAnsi="Arial"/>
+                <w:b/>
+                <w:bCs/>
+                <w:sz w:val="19"/>
+                <w:szCs w:val="19"/>
+              </w:rPr>
+              <w:t xml:space="preserve">Requisito</w:t>
+            </w:r>
+          </w:p>
+        </w:tc>
+        <w:tc>
+          <w:tcPr>
+            <w:tcW w:type="dxa" w:w="7060"/>
+            <w:tcMar>
+              <w:top w:type="dxa" w:w="40"/>
+              <w:left w:type="dxa" w:w="70"/>
+              <w:bottom w:type="dxa" w:w="40"/>
+              <w:right w:type="dxa" w:w="70"/>
+            </w:tcMar>
+          </w:tcPr>
+          <w:p>
+            <w:pPr>
+              <w:spacing w:after="18" w:line="236"/>
+            </w:pPr>
+            <w:r>
+              <w:rPr>
+                <w:rFonts w:ascii="Arial" w:cs="Arial" w:eastAsia="Arial" w:hAnsi="Arial"/>
+                <w:sz w:val="19"/>
+                <w:szCs w:val="19"/>
+              </w:rPr>
+              <w:t xml:space="preserve">RF-AUD-03</w:t>
+            </w:r>
+          </w:p>
+        </w:tc>
+      </w:tr>
+      <w:tr>
+        <w:tc>
+          <w:tcPr>
+            <w:tcW w:type="dxa" w:w="2300"/>
+            <w:shd w:fill="EAF0F8" w:val="clear"/>
+            <w:tcMar>
+              <w:top w:type="dxa" w:w="40"/>
+              <w:left w:type="dxa" w:w="70"/>
+              <w:bottom w:type="dxa" w:w="40"/>
+              <w:right w:type="dxa" w:w="70"/>
+            </w:tcMar>
+          </w:tcPr>
+          <w:p>
+            <w:pPr>
+              <w:spacing w:after="18" w:line="236"/>
+            </w:pPr>
+            <w:r>
+              <w:rPr>
+                <w:rFonts w:ascii="Arial" w:cs="Arial" w:eastAsia="Arial" w:hAnsi="Arial"/>
+                <w:b/>
+                <w:bCs/>
+                <w:sz w:val="19"/>
+                <w:szCs w:val="19"/>
+              </w:rPr>
+              <w:t xml:space="preserve">Descripción</w:t>
+            </w:r>
+          </w:p>
+        </w:tc>
+        <w:tc>
+          <w:tcPr>
+            <w:tcW w:type="dxa" w:w="7060"/>
+            <w:tcMar>
+              <w:top w:type="dxa" w:w="40"/>
+              <w:left w:type="dxa" w:w="70"/>
+              <w:bottom w:type="dxa" w:w="40"/>
+              <w:right w:type="dxa" w:w="70"/>
+            </w:tcMar>
+          </w:tcPr>
+          <w:p>
+            <w:pPr>
+              <w:spacing w:after="18" w:line="236"/>
+            </w:pPr>
+            <w:r>
+              <w:rPr>
+                <w:rFonts w:ascii="Arial" w:cs="Arial" w:eastAsia="Arial" w:hAnsi="Arial"/>
+                <w:sz w:val="19"/>
+                <w:szCs w:val="19"/>
+              </w:rPr>
+              <w:t xml:space="preserve">Se genera una copia de seguridad de los datos de la licorera, de forma manual o programada.</w:t>
+            </w:r>
+          </w:p>
+        </w:tc>
+      </w:tr>
+      <w:tr>
+        <w:tc>
+          <w:tcPr>
+            <w:tcW w:type="dxa" w:w="2300"/>
+            <w:shd w:fill="EAF0F8" w:val="clear"/>
+            <w:tcMar>
+              <w:top w:type="dxa" w:w="40"/>
+              <w:left w:type="dxa" w:w="70"/>
+              <w:bottom w:type="dxa" w:w="40"/>
+              <w:right w:type="dxa" w:w="70"/>
+            </w:tcMar>
+          </w:tcPr>
+          <w:p>
+            <w:pPr>
+              <w:spacing w:after="18" w:line="236"/>
+            </w:pPr>
+            <w:r>
+              <w:rPr>
+                <w:rFonts w:ascii="Arial" w:cs="Arial" w:eastAsia="Arial" w:hAnsi="Arial"/>
+                <w:b/>
+                <w:bCs/>
+                <w:sz w:val="19"/>
+                <w:szCs w:val="19"/>
+              </w:rPr>
+              <w:t xml:space="preserve">Precondiciones</w:t>
+            </w:r>
+          </w:p>
+        </w:tc>
+        <w:tc>
+          <w:tcPr>
+            <w:tcW w:type="dxa" w:w="7060"/>
+            <w:tcMar>
+              <w:top w:type="dxa" w:w="40"/>
+              <w:left w:type="dxa" w:w="70"/>
+              <w:bottom w:type="dxa" w:w="40"/>
+              <w:right w:type="dxa" w:w="70"/>
+            </w:tcMar>
+          </w:tcPr>
+          <w:p>
+            <w:pPr>
+              <w:spacing w:after="18" w:line="236"/>
+            </w:pPr>
+            <w:r>
+              <w:rPr>
+                <w:rFonts w:ascii="Arial" w:cs="Arial" w:eastAsia="Arial" w:hAnsi="Arial"/>
+                <w:sz w:val="19"/>
+                <w:szCs w:val="19"/>
+              </w:rPr>
+              <w:t xml:space="preserve">Existen datos que respaldar.</w:t>
+            </w:r>
+          </w:p>
+        </w:tc>
+      </w:tr>
+      <w:tr>
+        <w:tc>
+          <w:tcPr>
+            <w:tcW w:type="dxa" w:w="2300"/>
+            <w:shd w:fill="EAF0F8" w:val="clear"/>
+            <w:tcMar>
+              <w:top w:type="dxa" w:w="40"/>
+              <w:left w:type="dxa" w:w="70"/>
+              <w:bottom w:type="dxa" w:w="40"/>
+              <w:right w:type="dxa" w:w="70"/>
+            </w:tcMar>
+          </w:tcPr>
+          <w:p>
+            <w:pPr>
+              <w:spacing w:after="18" w:line="236"/>
+            </w:pPr>
+            <w:r>
+              <w:rPr>
+                <w:rFonts w:ascii="Arial" w:cs="Arial" w:eastAsia="Arial" w:hAnsi="Arial"/>
+                <w:b/>
+                <w:bCs/>
+                <w:sz w:val="19"/>
+                <w:szCs w:val="19"/>
+              </w:rPr>
+              <w:t xml:space="preserve">Flujo principal</w:t>
+            </w:r>
+          </w:p>
+        </w:tc>
+        <w:tc>
+          <w:tcPr>
+            <w:tcW w:type="dxa" w:w="7060"/>
+            <w:tcMar>
+              <w:top w:type="dxa" w:w="40"/>
+              <w:left w:type="dxa" w:w="70"/>
+              <w:bottom w:type="dxa" w:w="40"/>
+              <w:right w:type="dxa" w:w="70"/>
+            </w:tcMar>
+          </w:tcPr>
+          <w:p>
+            <w:pPr>
+              <w:spacing w:after="18" w:line="236"/>
+            </w:pPr>
+            <w:r>
+              <w:rPr>
+                <w:rFonts w:ascii="Arial" w:cs="Arial" w:eastAsia="Arial" w:hAnsi="Arial"/>
+                <w:sz w:val="19"/>
+                <w:szCs w:val="19"/>
+              </w:rPr>
+              <w:t xml:space="preserve">1. El administrador elige «Generar copia» o el sistema la ejecuta según la programación.</w:t>
+            </w:r>
+          </w:p>
+          <w:p>
+            <w:pPr>
+              <w:spacing w:after="18" w:line="236"/>
+            </w:pPr>
+            <w:r>
+              <w:rPr>
+                <w:rFonts w:ascii="Arial" w:cs="Arial" w:eastAsia="Arial" w:hAnsi="Arial"/>
+                <w:sz w:val="19"/>
+                <w:szCs w:val="19"/>
+              </w:rPr>
+              <w:t xml:space="preserve">2. El sistema recopila los datos y genera la copia.</w:t>
+            </w:r>
+          </w:p>
+          <w:p>
+            <w:pPr>
+              <w:spacing w:after="18" w:line="236"/>
+            </w:pPr>
+            <w:r>
+              <w:rPr>
+                <w:rFonts w:ascii="Arial" w:cs="Arial" w:eastAsia="Arial" w:hAnsi="Arial"/>
+                <w:sz w:val="19"/>
+                <w:szCs w:val="19"/>
+              </w:rPr>
+              <w:t xml:space="preserve">3. Guarda la copia con su fecha e identificación.</w:t>
+            </w:r>
+          </w:p>
+          <w:p>
+            <w:pPr>
+              <w:spacing w:after="18" w:line="236"/>
+            </w:pPr>
+            <w:r>
+              <w:rPr>
+                <w:rFonts w:ascii="Arial" w:cs="Arial" w:eastAsia="Arial" w:hAnsi="Arial"/>
+                <w:sz w:val="19"/>
+                <w:szCs w:val="19"/>
+              </w:rPr>
+              <w:t xml:space="preserve">4. Confirma el resultado.</w:t>
+            </w:r>
+          </w:p>
+        </w:tc>
+      </w:tr>
+      <w:tr>
+        <w:tc>
+          <w:tcPr>
+            <w:tcW w:type="dxa" w:w="2300"/>
+            <w:shd w:fill="EAF0F8" w:val="clear"/>
+            <w:tcMar>
+              <w:top w:type="dxa" w:w="40"/>
+              <w:left w:type="dxa" w:w="70"/>
+              <w:bottom w:type="dxa" w:w="40"/>
+              <w:right w:type="dxa" w:w="70"/>
+            </w:tcMar>
+          </w:tcPr>
+          <w:p>
+            <w:pPr>
+              <w:spacing w:after="18" w:line="236"/>
+            </w:pPr>
+            <w:r>
+              <w:rPr>
+                <w:rFonts w:ascii="Arial" w:cs="Arial" w:eastAsia="Arial" w:hAnsi="Arial"/>
+                <w:b/>
+                <w:bCs/>
+                <w:sz w:val="19"/>
+                <w:szCs w:val="19"/>
+              </w:rPr>
+              <w:t xml:space="preserve">Flujos alternativos</w:t>
+            </w:r>
+          </w:p>
+        </w:tc>
+        <w:tc>
+          <w:tcPr>
+            <w:tcW w:type="dxa" w:w="7060"/>
+            <w:tcMar>
+              <w:top w:type="dxa" w:w="40"/>
+              <w:left w:type="dxa" w:w="70"/>
+              <w:bottom w:type="dxa" w:w="40"/>
+              <w:right w:type="dxa" w:w="70"/>
+            </w:tcMar>
+          </w:tcPr>
+          <w:p>
+            <w:pPr>
+              <w:spacing w:after="18" w:line="236"/>
+            </w:pPr>
+            <w:r>
+              <w:rPr>
+                <w:rFonts w:ascii="Arial" w:cs="Arial" w:eastAsia="Arial" w:hAnsi="Arial"/>
+                <w:sz w:val="19"/>
+                <w:szCs w:val="19"/>
+              </w:rPr>
+              <w:t xml:space="preserve">1a. Programar copias automáticas periódicas, que ejecuta el actor Sistema.</w:t>
+            </w:r>
+          </w:p>
+        </w:tc>
+      </w:tr>
+      <w:tr>
+        <w:tc>
+          <w:tcPr>
+            <w:tcW w:type="dxa" w:w="2300"/>
+            <w:shd w:fill="EAF0F8" w:val="clear"/>
+            <w:tcMar>
+              <w:top w:type="dxa" w:w="40"/>
+              <w:left w:type="dxa" w:w="70"/>
+              <w:bottom w:type="dxa" w:w="40"/>
+              <w:right w:type="dxa" w:w="70"/>
+            </w:tcMar>
+          </w:tcPr>
+          <w:p>
+            <w:pPr>
+              <w:spacing w:after="18" w:line="236"/>
+            </w:pPr>
+            <w:r>
+              <w:rPr>
+                <w:rFonts w:ascii="Arial" w:cs="Arial" w:eastAsia="Arial" w:hAnsi="Arial"/>
+                <w:b/>
+                <w:bCs/>
+                <w:sz w:val="19"/>
+                <w:szCs w:val="19"/>
+              </w:rPr>
+              <w:t xml:space="preserve">Excepciones</w:t>
+            </w:r>
+          </w:p>
+        </w:tc>
+        <w:tc>
+          <w:tcPr>
+            <w:tcW w:type="dxa" w:w="7060"/>
+            <w:tcMar>
+              <w:top w:type="dxa" w:w="40"/>
+              <w:left w:type="dxa" w:w="70"/>
+              <w:bottom w:type="dxa" w:w="40"/>
+              <w:right w:type="dxa" w:w="70"/>
+            </w:tcMar>
+          </w:tcPr>
+          <w:p>
+            <w:pPr>
+              <w:spacing w:after="18" w:line="236"/>
+            </w:pPr>
+            <w:r>
+              <w:rPr>
+                <w:rFonts w:ascii="Arial" w:cs="Arial" w:eastAsia="Arial" w:hAnsi="Arial"/>
+                <w:sz w:val="19"/>
+                <w:szCs w:val="19"/>
+              </w:rPr>
+              <w:t xml:space="preserve">2a. Error durante la copia: el sistema informa, deja registro y no la marca como válida.</w:t>
+            </w:r>
+          </w:p>
+        </w:tc>
+      </w:tr>
+      <w:tr>
+        <w:tc>
+          <w:tcPr>
+            <w:tcW w:type="dxa" w:w="2300"/>
+            <w:shd w:fill="EAF0F8" w:val="clear"/>
+            <w:tcMar>
+              <w:top w:type="dxa" w:w="40"/>
+              <w:left w:type="dxa" w:w="70"/>
+              <w:bottom w:type="dxa" w:w="40"/>
+              <w:right w:type="dxa" w:w="70"/>
+            </w:tcMar>
+          </w:tcPr>
+          <w:p>
+            <w:pPr>
+              <w:spacing w:after="18" w:line="236"/>
+            </w:pPr>
+            <w:r>
+              <w:rPr>
+                <w:rFonts w:ascii="Arial" w:cs="Arial" w:eastAsia="Arial" w:hAnsi="Arial"/>
+                <w:b/>
+                <w:bCs/>
+                <w:sz w:val="19"/>
+                <w:szCs w:val="19"/>
+              </w:rPr>
+              <w:t xml:space="preserve">Reglas y validaciones</w:t>
+            </w:r>
+          </w:p>
+        </w:tc>
+        <w:tc>
+          <w:tcPr>
+            <w:tcW w:type="dxa" w:w="7060"/>
+            <w:tcMar>
+              <w:top w:type="dxa" w:w="40"/>
+              <w:left w:type="dxa" w:w="70"/>
+              <w:bottom w:type="dxa" w:w="40"/>
+              <w:right w:type="dxa" w:w="70"/>
+            </w:tcMar>
+          </w:tcPr>
+          <w:p>
+            <w:pPr>
+              <w:spacing w:after="18" w:line="236"/>
+            </w:pPr>
+            <w:r>
+              <w:rPr>
+                <w:rFonts w:ascii="Arial" w:cs="Arial" w:eastAsia="Arial" w:hAnsi="Arial"/>
+                <w:sz w:val="19"/>
+                <w:szCs w:val="19"/>
+              </w:rPr>
+              <w:t xml:space="preserve">La copia puede ser manual o automática; se conserva un historial de copias; es la base para la restauración.</w:t>
+            </w:r>
+          </w:p>
+        </w:tc>
+      </w:tr>
+      <w:tr>
+        <w:tc>
+          <w:tcPr>
+            <w:tcW w:type="dxa" w:w="2300"/>
+            <w:shd w:fill="EAF0F8" w:val="clear"/>
+            <w:tcMar>
+              <w:top w:type="dxa" w:w="40"/>
+              <w:left w:type="dxa" w:w="70"/>
+              <w:bottom w:type="dxa" w:w="40"/>
+              <w:right w:type="dxa" w:w="70"/>
+            </w:tcMar>
+          </w:tcPr>
+          <w:p>
+            <w:pPr>
+              <w:spacing w:after="18" w:line="236"/>
+            </w:pPr>
+            <w:r>
+              <w:rPr>
+                <w:rFonts w:ascii="Arial" w:cs="Arial" w:eastAsia="Arial" w:hAnsi="Arial"/>
+                <w:b/>
+                <w:bCs/>
+                <w:sz w:val="19"/>
+                <w:szCs w:val="19"/>
+              </w:rPr>
+              <w:t xml:space="preserve">Postcondiciones</w:t>
+            </w:r>
+          </w:p>
+        </w:tc>
+        <w:tc>
+          <w:tcPr>
+            <w:tcW w:type="dxa" w:w="7060"/>
+            <w:tcMar>
+              <w:top w:type="dxa" w:w="40"/>
+              <w:left w:type="dxa" w:w="70"/>
+              <w:bottom w:type="dxa" w:w="40"/>
+              <w:right w:type="dxa" w:w="70"/>
+            </w:tcMar>
+          </w:tcPr>
+          <w:p>
+            <w:pPr>
+              <w:spacing w:after="18" w:line="236"/>
+            </w:pPr>
+            <w:r>
+              <w:rPr>
+                <w:rFonts w:ascii="Arial" w:cs="Arial" w:eastAsia="Arial" w:hAnsi="Arial"/>
+                <w:sz w:val="19"/>
+                <w:szCs w:val="19"/>
+              </w:rPr>
+              <w:t xml:space="preserve">Queda disponible una copia de seguridad válida.</w:t>
+            </w:r>
+          </w:p>
+        </w:tc>
+      </w:tr>
+      <w:tr>
+        <w:tc>
+          <w:tcPr>
+            <w:tcW w:type="dxa" w:w="2300"/>
+            <w:shd w:fill="EAF0F8" w:val="clear"/>
+            <w:tcMar>
+              <w:top w:type="dxa" w:w="40"/>
+              <w:left w:type="dxa" w:w="70"/>
+              <w:bottom w:type="dxa" w:w="40"/>
+              <w:right w:type="dxa" w:w="70"/>
+            </w:tcMar>
+          </w:tcPr>
+          <w:p>
+            <w:pPr>
+              <w:spacing w:after="18" w:line="236"/>
+            </w:pPr>
+            <w:r>
+              <w:rPr>
+                <w:rFonts w:ascii="Arial" w:cs="Arial" w:eastAsia="Arial" w:hAnsi="Arial"/>
+                <w:b/>
+                <w:bCs/>
+                <w:sz w:val="19"/>
+                <w:szCs w:val="19"/>
+              </w:rPr>
+              <w:t xml:space="preserve">Prioridad</w:t>
+            </w:r>
+          </w:p>
+        </w:tc>
+        <w:tc>
+          <w:tcPr>
+            <w:tcW w:type="dxa" w:w="7060"/>
+            <w:tcMar>
+              <w:top w:type="dxa" w:w="40"/>
+              <w:left w:type="dxa" w:w="70"/>
+              <w:bottom w:type="dxa" w:w="40"/>
+              <w:right w:type="dxa" w:w="70"/>
+            </w:tcMar>
+          </w:tcPr>
+          <w:p>
+            <w:pPr>
+              <w:spacing w:after="18" w:line="236"/>
+            </w:pPr>
+            <w:r>
+              <w:rPr>
+                <w:rFonts w:ascii="Arial" w:cs="Arial" w:eastAsia="Arial" w:hAnsi="Arial"/>
+                <w:sz w:val="19"/>
+                <w:szCs w:val="19"/>
+              </w:rPr>
+              <w:t xml:space="preserve">Alta</w:t>
+            </w:r>
+          </w:p>
+        </w:tc>
+      </w:tr>
+    </w:tbl>
+    <w:p>
+      <w:pPr>
+        <w:spacing w:after="140"/>
+      </w:pPr>
+    </w:p>
+    <w:tbl>
+      <w:tblPr>
+        <w:tblW w:type="dxa" w:w="9360"/>
+        <w:tblBorders>
+          <w:top w:val="single" w:color="9CA3AF" w:sz="6"/>
+          <w:left w:val="single" w:color="9CA3AF" w:sz="6"/>
+          <w:bottom w:val="single" w:color="9CA3AF" w:sz="6"/>
+          <w:right w:val="single" w:color="9CA3AF" w:sz="6"/>
+          <w:insideH w:val="single" w:color="9CA3AF" w:sz="6"/>
+          <w:insideV w:val="single" w:color="9CA3AF" w:sz="6"/>
+        </w:tblBorders>
+        <w:tblLayout w:type="fixed"/>
+      </w:tblPr>
+      <w:tblGrid>
+        <w:gridCol w:w="2300"/>
+        <w:gridCol w:w="7060"/>
+      </w:tblGrid>
+      <w:tr>
+        <w:tc>
+          <w:tcPr>
+            <w:tcW w:type="dxa" w:w="9360"/>
+            <w:gridSpan w:val="2"/>
+            <w:shd w:fill="1F3864" w:val="clear"/>
+            <w:tcMar>
+              <w:top w:type="dxa" w:w="40"/>
+              <w:left w:type="dxa" w:w="70"/>
+              <w:bottom w:type="dxa" w:w="40"/>
+              <w:right w:type="dxa" w:w="70"/>
+            </w:tcMar>
+          </w:tcPr>
+          <w:p>
+            <w:pPr>
+              <w:spacing w:after="18" w:line="236"/>
+            </w:pPr>
+            <w:r>
+              <w:rPr>
+                <w:rFonts w:ascii="Arial" w:cs="Arial" w:eastAsia="Arial" w:hAnsi="Arial"/>
+                <w:b/>
+                <w:bCs/>
+                <w:color w:val="FFFFFF"/>
+                <w:sz w:val="19"/>
+                <w:szCs w:val="19"/>
+              </w:rPr>
+              <w:t xml:space="preserve">CU-AUD-04 — Restaurar copia de seguridad</w:t>
+            </w:r>
+          </w:p>
+        </w:tc>
+      </w:tr>
+      <w:tr>
+        <w:tc>
+          <w:tcPr>
+            <w:tcW w:type="dxa" w:w="2300"/>
+            <w:shd w:fill="EAF0F8" w:val="clear"/>
+            <w:tcMar>
+              <w:top w:type="dxa" w:w="40"/>
+              <w:left w:type="dxa" w:w="70"/>
+              <w:bottom w:type="dxa" w:w="40"/>
+              <w:right w:type="dxa" w:w="70"/>
+            </w:tcMar>
+          </w:tcPr>
+          <w:p>
+            <w:pPr>
+              <w:spacing w:after="18" w:line="236"/>
+            </w:pPr>
+            <w:r>
+              <w:rPr>
+                <w:rFonts w:ascii="Arial" w:cs="Arial" w:eastAsia="Arial" w:hAnsi="Arial"/>
+                <w:b/>
+                <w:bCs/>
+                <w:sz w:val="19"/>
+                <w:szCs w:val="19"/>
+              </w:rPr>
+              <w:t xml:space="preserve">Actor(es)</w:t>
+            </w:r>
+          </w:p>
+        </w:tc>
+        <w:tc>
+          <w:tcPr>
+            <w:tcW w:type="dxa" w:w="7060"/>
+            <w:tcMar>
+              <w:top w:type="dxa" w:w="40"/>
+              <w:left w:type="dxa" w:w="70"/>
+              <w:bottom w:type="dxa" w:w="40"/>
+              <w:right w:type="dxa" w:w="70"/>
+            </w:tcMar>
+          </w:tcPr>
+          <w:p>
+            <w:pPr>
+              <w:spacing w:after="18" w:line="236"/>
+            </w:pPr>
+            <w:r>
+              <w:rPr>
+                <w:rFonts w:ascii="Arial" w:cs="Arial" w:eastAsia="Arial" w:hAnsi="Arial"/>
+                <w:sz w:val="19"/>
+                <w:szCs w:val="19"/>
+              </w:rPr>
+              <w:t xml:space="preserve">Administrador</w:t>
+            </w:r>
+          </w:p>
+        </w:tc>
+      </w:tr>
+      <w:tr>
+        <w:tc>
+          <w:tcPr>
+            <w:tcW w:type="dxa" w:w="2300"/>
+            <w:shd w:fill="EAF0F8" w:val="clear"/>
+            <w:tcMar>
+              <w:top w:type="dxa" w:w="40"/>
+              <w:left w:type="dxa" w:w="70"/>
+              <w:bottom w:type="dxa" w:w="40"/>
+              <w:right w:type="dxa" w:w="70"/>
+            </w:tcMar>
+          </w:tcPr>
+          <w:p>
+            <w:pPr>
+              <w:spacing w:after="18" w:line="236"/>
+            </w:pPr>
+            <w:r>
+              <w:rPr>
+                <w:rFonts w:ascii="Arial" w:cs="Arial" w:eastAsia="Arial" w:hAnsi="Arial"/>
+                <w:b/>
+                <w:bCs/>
+                <w:sz w:val="19"/>
+                <w:szCs w:val="19"/>
+              </w:rPr>
+              <w:t xml:space="preserve">Requisito</w:t>
+            </w:r>
+          </w:p>
+        </w:tc>
+        <w:tc>
+          <w:tcPr>
+            <w:tcW w:type="dxa" w:w="7060"/>
+            <w:tcMar>
+              <w:top w:type="dxa" w:w="40"/>
+              <w:left w:type="dxa" w:w="70"/>
+              <w:bottom w:type="dxa" w:w="40"/>
+              <w:right w:type="dxa" w:w="70"/>
+            </w:tcMar>
+          </w:tcPr>
+          <w:p>
+            <w:pPr>
+              <w:spacing w:after="18" w:line="236"/>
+            </w:pPr>
+            <w:r>
+              <w:rPr>
+                <w:rFonts w:ascii="Arial" w:cs="Arial" w:eastAsia="Arial" w:hAnsi="Arial"/>
+                <w:sz w:val="19"/>
+                <w:szCs w:val="19"/>
+              </w:rPr>
+              <w:t xml:space="preserve">RF-AUD-04</w:t>
+            </w:r>
+          </w:p>
+        </w:tc>
+      </w:tr>
+      <w:tr>
+        <w:tc>
+          <w:tcPr>
+            <w:tcW w:type="dxa" w:w="2300"/>
+            <w:shd w:fill="EAF0F8" w:val="clear"/>
+            <w:tcMar>
+              <w:top w:type="dxa" w:w="40"/>
+              <w:left w:type="dxa" w:w="70"/>
+              <w:bottom w:type="dxa" w:w="40"/>
+              <w:right w:type="dxa" w:w="70"/>
+            </w:tcMar>
+          </w:tcPr>
+          <w:p>
+            <w:pPr>
+              <w:spacing w:after="18" w:line="236"/>
+            </w:pPr>
+            <w:r>
+              <w:rPr>
+                <w:rFonts w:ascii="Arial" w:cs="Arial" w:eastAsia="Arial" w:hAnsi="Arial"/>
+                <w:b/>
+                <w:bCs/>
+                <w:sz w:val="19"/>
+                <w:szCs w:val="19"/>
+              </w:rPr>
+              <w:t xml:space="preserve">Descripción</w:t>
+            </w:r>
+          </w:p>
+        </w:tc>
+        <w:tc>
+          <w:tcPr>
+            <w:tcW w:type="dxa" w:w="7060"/>
+            <w:tcMar>
+              <w:top w:type="dxa" w:w="40"/>
+              <w:left w:type="dxa" w:w="70"/>
+              <w:bottom w:type="dxa" w:w="40"/>
+              <w:right w:type="dxa" w:w="70"/>
+            </w:tcMar>
+          </w:tcPr>
+          <w:p>
+            <w:pPr>
+              <w:spacing w:after="18" w:line="236"/>
+            </w:pPr>
+            <w:r>
+              <w:rPr>
+                <w:rFonts w:ascii="Arial" w:cs="Arial" w:eastAsia="Arial" w:hAnsi="Arial"/>
+                <w:sz w:val="19"/>
+                <w:szCs w:val="19"/>
+              </w:rPr>
+              <w:t xml:space="preserve">El administrador restaura los datos a partir de una copia de seguridad.</w:t>
+            </w:r>
+          </w:p>
+        </w:tc>
+      </w:tr>
+      <w:tr>
+        <w:tc>
+          <w:tcPr>
+            <w:tcW w:type="dxa" w:w="2300"/>
+            <w:shd w:fill="EAF0F8" w:val="clear"/>
+            <w:tcMar>
+              <w:top w:type="dxa" w:w="40"/>
+              <w:left w:type="dxa" w:w="70"/>
+              <w:bottom w:type="dxa" w:w="40"/>
+              <w:right w:type="dxa" w:w="70"/>
+            </w:tcMar>
+          </w:tcPr>
+          <w:p>
+            <w:pPr>
+              <w:spacing w:after="18" w:line="236"/>
+            </w:pPr>
+            <w:r>
+              <w:rPr>
+                <w:rFonts w:ascii="Arial" w:cs="Arial" w:eastAsia="Arial" w:hAnsi="Arial"/>
+                <w:b/>
+                <w:bCs/>
+                <w:sz w:val="19"/>
+                <w:szCs w:val="19"/>
+              </w:rPr>
+              <w:t xml:space="preserve">Precondiciones</w:t>
+            </w:r>
+          </w:p>
+        </w:tc>
+        <w:tc>
+          <w:tcPr>
+            <w:tcW w:type="dxa" w:w="7060"/>
+            <w:tcMar>
+              <w:top w:type="dxa" w:w="40"/>
+              <w:left w:type="dxa" w:w="70"/>
+              <w:bottom w:type="dxa" w:w="40"/>
+              <w:right w:type="dxa" w:w="70"/>
+            </w:tcMar>
+          </w:tcPr>
+          <w:p>
+            <w:pPr>
+              <w:spacing w:after="18" w:line="236"/>
+            </w:pPr>
+            <w:r>
+              <w:rPr>
+                <w:rFonts w:ascii="Arial" w:cs="Arial" w:eastAsia="Arial" w:hAnsi="Arial"/>
+                <w:sz w:val="19"/>
+                <w:szCs w:val="19"/>
+              </w:rPr>
+              <w:t xml:space="preserve">Existe al menos una copia válida y el administrador tiene permiso.</w:t>
+            </w:r>
+          </w:p>
+        </w:tc>
+      </w:tr>
+      <w:tr>
+        <w:tc>
+          <w:tcPr>
+            <w:tcW w:type="dxa" w:w="2300"/>
+            <w:shd w:fill="EAF0F8" w:val="clear"/>
+            <w:tcMar>
+              <w:top w:type="dxa" w:w="40"/>
+              <w:left w:type="dxa" w:w="70"/>
+              <w:bottom w:type="dxa" w:w="40"/>
+              <w:right w:type="dxa" w:w="70"/>
+            </w:tcMar>
+          </w:tcPr>
+          <w:p>
+            <w:pPr>
+              <w:spacing w:after="18" w:line="236"/>
+            </w:pPr>
+            <w:r>
+              <w:rPr>
+                <w:rFonts w:ascii="Arial" w:cs="Arial" w:eastAsia="Arial" w:hAnsi="Arial"/>
+                <w:b/>
+                <w:bCs/>
+                <w:sz w:val="19"/>
+                <w:szCs w:val="19"/>
+              </w:rPr>
+              <w:t xml:space="preserve">Flujo principal</w:t>
+            </w:r>
+          </w:p>
+        </w:tc>
+        <w:tc>
+          <w:tcPr>
+            <w:tcW w:type="dxa" w:w="7060"/>
+            <w:tcMar>
+              <w:top w:type="dxa" w:w="40"/>
+              <w:left w:type="dxa" w:w="70"/>
+              <w:bottom w:type="dxa" w:w="40"/>
+              <w:right w:type="dxa" w:w="70"/>
+            </w:tcMar>
+          </w:tcPr>
+          <w:p>
+            <w:pPr>
+              <w:spacing w:after="18" w:line="236"/>
+            </w:pPr>
+            <w:r>
+              <w:rPr>
+                <w:rFonts w:ascii="Arial" w:cs="Arial" w:eastAsia="Arial" w:hAnsi="Arial"/>
+                <w:sz w:val="19"/>
+                <w:szCs w:val="19"/>
+              </w:rPr>
+              <w:t xml:space="preserve">1. Elige «Restaurar» y selecciona la copia.</w:t>
+            </w:r>
+          </w:p>
+          <w:p>
+            <w:pPr>
+              <w:spacing w:after="18" w:line="236"/>
+            </w:pPr>
+            <w:r>
+              <w:rPr>
+                <w:rFonts w:ascii="Arial" w:cs="Arial" w:eastAsia="Arial" w:hAnsi="Arial"/>
+                <w:sz w:val="19"/>
+                <w:szCs w:val="19"/>
+              </w:rPr>
+              <w:t xml:space="preserve">2. El sistema solicita confirmación y advierte que se reemplazan los datos actuales.</w:t>
+            </w:r>
+          </w:p>
+          <w:p>
+            <w:pPr>
+              <w:spacing w:after="18" w:line="236"/>
+            </w:pPr>
+            <w:r>
+              <w:rPr>
+                <w:rFonts w:ascii="Arial" w:cs="Arial" w:eastAsia="Arial" w:hAnsi="Arial"/>
+                <w:sz w:val="19"/>
+                <w:szCs w:val="19"/>
+              </w:rPr>
+              <w:t xml:space="preserve">3. El sistema restaura los datos desde la copia.</w:t>
+            </w:r>
+          </w:p>
+          <w:p>
+            <w:pPr>
+              <w:spacing w:after="18" w:line="236"/>
+            </w:pPr>
+            <w:r>
+              <w:rPr>
+                <w:rFonts w:ascii="Arial" w:cs="Arial" w:eastAsia="Arial" w:hAnsi="Arial"/>
+                <w:sz w:val="19"/>
+                <w:szCs w:val="19"/>
+              </w:rPr>
+              <w:t xml:space="preserve">4. Confirma el resultado y registra la restauración en la auditoría.</w:t>
+            </w:r>
+          </w:p>
+        </w:tc>
+      </w:tr>
+      <w:tr>
+        <w:tc>
+          <w:tcPr>
+            <w:tcW w:type="dxa" w:w="2300"/>
+            <w:shd w:fill="EAF0F8" w:val="clear"/>
+            <w:tcMar>
+              <w:top w:type="dxa" w:w="40"/>
+              <w:left w:type="dxa" w:w="70"/>
+              <w:bottom w:type="dxa" w:w="40"/>
+              <w:right w:type="dxa" w:w="70"/>
+            </w:tcMar>
+          </w:tcPr>
+          <w:p>
+            <w:pPr>
+              <w:spacing w:after="18" w:line="236"/>
+            </w:pPr>
+            <w:r>
+              <w:rPr>
+                <w:rFonts w:ascii="Arial" w:cs="Arial" w:eastAsia="Arial" w:hAnsi="Arial"/>
+                <w:b/>
+                <w:bCs/>
+                <w:sz w:val="19"/>
+                <w:szCs w:val="19"/>
+              </w:rPr>
+              <w:t xml:space="preserve">Flujos alternativos</w:t>
+            </w:r>
+          </w:p>
+        </w:tc>
+        <w:tc>
+          <w:tcPr>
+            <w:tcW w:type="dxa" w:w="7060"/>
+            <w:tcMar>
+              <w:top w:type="dxa" w:w="40"/>
+              <w:left w:type="dxa" w:w="70"/>
+              <w:bottom w:type="dxa" w:w="40"/>
+              <w:right w:type="dxa" w:w="70"/>
+            </w:tcMar>
+          </w:tcPr>
+          <w:p>
+            <w:pPr>
+              <w:spacing w:after="18" w:line="236"/>
+            </w:pPr>
+            <w:r>
+              <w:rPr>
+                <w:rFonts w:ascii="Arial" w:cs="Arial" w:eastAsia="Arial" w:hAnsi="Arial"/>
+                <w:sz w:val="19"/>
+                <w:szCs w:val="19"/>
+              </w:rPr>
+              <w:t xml:space="preserve">—</w:t>
+            </w:r>
+          </w:p>
+        </w:tc>
+      </w:tr>
+      <w:tr>
+        <w:tc>
+          <w:tcPr>
+            <w:tcW w:type="dxa" w:w="2300"/>
+            <w:shd w:fill="EAF0F8" w:val="clear"/>
+            <w:tcMar>
+              <w:top w:type="dxa" w:w="40"/>
+              <w:left w:type="dxa" w:w="70"/>
+              <w:bottom w:type="dxa" w:w="40"/>
+              <w:right w:type="dxa" w:w="70"/>
+            </w:tcMar>
+          </w:tcPr>
+          <w:p>
+            <w:pPr>
+              <w:spacing w:after="18" w:line="236"/>
+            </w:pPr>
+            <w:r>
+              <w:rPr>
+                <w:rFonts w:ascii="Arial" w:cs="Arial" w:eastAsia="Arial" w:hAnsi="Arial"/>
+                <w:b/>
+                <w:bCs/>
+                <w:sz w:val="19"/>
+                <w:szCs w:val="19"/>
+              </w:rPr>
+              <w:t xml:space="preserve">Excepciones</w:t>
+            </w:r>
+          </w:p>
+        </w:tc>
+        <w:tc>
+          <w:tcPr>
+            <w:tcW w:type="dxa" w:w="7060"/>
+            <w:tcMar>
+              <w:top w:type="dxa" w:w="40"/>
+              <w:left w:type="dxa" w:w="70"/>
+              <w:bottom w:type="dxa" w:w="40"/>
+              <w:right w:type="dxa" w:w="70"/>
+            </w:tcMar>
+          </w:tcPr>
+          <w:p>
+            <w:pPr>
+              <w:spacing w:after="18" w:line="236"/>
+            </w:pPr>
+            <w:r>
+              <w:rPr>
+                <w:rFonts w:ascii="Arial" w:cs="Arial" w:eastAsia="Arial" w:hAnsi="Arial"/>
+                <w:sz w:val="19"/>
+                <w:szCs w:val="19"/>
+              </w:rPr>
+              <w:t xml:space="preserve">3a. Copia dañada o incompatible: el sistema aborta y conserva los datos actuales.</w:t>
+            </w:r>
+          </w:p>
+        </w:tc>
+      </w:tr>
+      <w:tr>
+        <w:tc>
+          <w:tcPr>
+            <w:tcW w:type="dxa" w:w="2300"/>
+            <w:shd w:fill="EAF0F8" w:val="clear"/>
+            <w:tcMar>
+              <w:top w:type="dxa" w:w="40"/>
+              <w:left w:type="dxa" w:w="70"/>
+              <w:bottom w:type="dxa" w:w="40"/>
+              <w:right w:type="dxa" w:w="70"/>
+            </w:tcMar>
+          </w:tcPr>
+          <w:p>
+            <w:pPr>
+              <w:spacing w:after="18" w:line="236"/>
+            </w:pPr>
+            <w:r>
+              <w:rPr>
+                <w:rFonts w:ascii="Arial" w:cs="Arial" w:eastAsia="Arial" w:hAnsi="Arial"/>
+                <w:b/>
+                <w:bCs/>
+                <w:sz w:val="19"/>
+                <w:szCs w:val="19"/>
+              </w:rPr>
+              <w:t xml:space="preserve">Reglas y validaciones</w:t>
+            </w:r>
+          </w:p>
+        </w:tc>
+        <w:tc>
+          <w:tcPr>
+            <w:tcW w:type="dxa" w:w="7060"/>
+            <w:tcMar>
+              <w:top w:type="dxa" w:w="40"/>
+              <w:left w:type="dxa" w:w="70"/>
+              <w:bottom w:type="dxa" w:w="40"/>
+              <w:right w:type="dxa" w:w="70"/>
+            </w:tcMar>
+          </w:tcPr>
+          <w:p>
+            <w:pPr>
+              <w:spacing w:after="18" w:line="236"/>
+            </w:pPr>
+            <w:r>
+              <w:rPr>
+                <w:rFonts w:ascii="Arial" w:cs="Arial" w:eastAsia="Arial" w:hAnsi="Arial"/>
+                <w:sz w:val="19"/>
+                <w:szCs w:val="19"/>
+              </w:rPr>
+              <w:t xml:space="preserve">La restauración reemplaza los datos actuales (operación sensible que requiere confirmación); queda registrada en la auditoría y se limita a la licorera correspondiente.</w:t>
+            </w:r>
+          </w:p>
+        </w:tc>
+      </w:tr>
+      <w:tr>
+        <w:tc>
+          <w:tcPr>
+            <w:tcW w:type="dxa" w:w="2300"/>
+            <w:shd w:fill="EAF0F8" w:val="clear"/>
+            <w:tcMar>
+              <w:top w:type="dxa" w:w="40"/>
+              <w:left w:type="dxa" w:w="70"/>
+              <w:bottom w:type="dxa" w:w="40"/>
+              <w:right w:type="dxa" w:w="70"/>
+            </w:tcMar>
+          </w:tcPr>
+          <w:p>
+            <w:pPr>
+              <w:spacing w:after="18" w:line="236"/>
+            </w:pPr>
+            <w:r>
+              <w:rPr>
+                <w:rFonts w:ascii="Arial" w:cs="Arial" w:eastAsia="Arial" w:hAnsi="Arial"/>
+                <w:b/>
+                <w:bCs/>
+                <w:sz w:val="19"/>
+                <w:szCs w:val="19"/>
+              </w:rPr>
+              <w:t xml:space="preserve">Postcondiciones</w:t>
+            </w:r>
+          </w:p>
+        </w:tc>
+        <w:tc>
+          <w:tcPr>
+            <w:tcW w:type="dxa" w:w="7060"/>
+            <w:tcMar>
+              <w:top w:type="dxa" w:w="40"/>
+              <w:left w:type="dxa" w:w="70"/>
+              <w:bottom w:type="dxa" w:w="40"/>
+              <w:right w:type="dxa" w:w="70"/>
+            </w:tcMar>
+          </w:tcPr>
+          <w:p>
+            <w:pPr>
+              <w:spacing w:after="18" w:line="236"/>
+            </w:pPr>
+            <w:r>
+              <w:rPr>
+                <w:rFonts w:ascii="Arial" w:cs="Arial" w:eastAsia="Arial" w:hAnsi="Arial"/>
+                <w:sz w:val="19"/>
+                <w:szCs w:val="19"/>
+              </w:rPr>
+              <w:t xml:space="preserve">Los datos quedan restaurados al estado de la copia.</w:t>
+            </w:r>
+          </w:p>
+        </w:tc>
+      </w:tr>
+      <w:tr>
+        <w:tc>
+          <w:tcPr>
+            <w:tcW w:type="dxa" w:w="2300"/>
+            <w:shd w:fill="EAF0F8" w:val="clear"/>
+            <w:tcMar>
+              <w:top w:type="dxa" w:w="40"/>
+              <w:left w:type="dxa" w:w="70"/>
+              <w:bottom w:type="dxa" w:w="40"/>
+              <w:right w:type="dxa" w:w="70"/>
+            </w:tcMar>
+          </w:tcPr>
+          <w:p>
+            <w:pPr>
+              <w:spacing w:after="18" w:line="236"/>
+            </w:pPr>
+            <w:r>
+              <w:rPr>
+                <w:rFonts w:ascii="Arial" w:cs="Arial" w:eastAsia="Arial" w:hAnsi="Arial"/>
+                <w:b/>
+                <w:bCs/>
+                <w:sz w:val="19"/>
+                <w:szCs w:val="19"/>
+              </w:rPr>
+              <w:t xml:space="preserve">Prioridad</w:t>
+            </w:r>
+          </w:p>
+        </w:tc>
+        <w:tc>
+          <w:tcPr>
+            <w:tcW w:type="dxa" w:w="7060"/>
+            <w:tcMar>
+              <w:top w:type="dxa" w:w="40"/>
+              <w:left w:type="dxa" w:w="70"/>
+              <w:bottom w:type="dxa" w:w="40"/>
+              <w:right w:type="dxa" w:w="70"/>
+            </w:tcMar>
+          </w:tcPr>
+          <w:p>
+            <w:pPr>
+              <w:spacing w:after="18" w:line="236"/>
+            </w:pPr>
+            <w:r>
+              <w:rPr>
+                <w:rFonts w:ascii="Arial" w:cs="Arial" w:eastAsia="Arial" w:hAnsi="Arial"/>
+                <w:sz w:val="19"/>
+                <w:szCs w:val="19"/>
+              </w:rPr>
+              <w:t xml:space="preserve">Media</w:t>
+            </w:r>
+          </w:p>
+        </w:tc>
+      </w:tr>
+    </w:tbl>
+    <w:p>
+      <w:pPr>
+        <w:spacing w:after="140"/>
+      </w:pPr>
+    </w:p>
+    <w:p>
+      <w:pPr>
+        <w:pStyle w:val="Heading1"/>
+        <w:pageBreakBefore/>
+        <w:spacing w:after="110" w:before="220"/>
+      </w:pPr>
+      <w:bookmarkStart w:name="bm50" w:id="50"/>
+      <w:r>
+        <w:rPr>
+          <w:rFonts w:ascii="Arial" w:cs="Arial" w:eastAsia="Arial" w:hAnsi="Arial"/>
+          <w:b/>
+          <w:bCs/>
+          <w:color w:val="1F3864"/>
+          <w:sz w:val="27"/>
+          <w:szCs w:val="27"/>
+        </w:rPr>
+        <w:t xml:space="preserve">10. Conclusión</w:t>
+      </w:r>
+      <w:bookmarkEnd w:id="50"/>
+    </w:p>
+    <w:p>
+      <w:pPr>
+        <w:spacing w:after="110" w:line="262"/>
+        <w:jc w:val="both"/>
+      </w:pPr>
+      <w:r>
+        <w:rPr>
+          <w:rFonts w:ascii="Arial" w:cs="Arial" w:eastAsia="Arial" w:hAnsi="Arial"/>
+          <w:sz w:val="22"/>
+          <w:szCs w:val="22"/>
+        </w:rPr>
+        <w:t xml:space="preserve">Este documento consolidó el análisis y el diseño de INVENTRA en notación UML, en coherencia con la especificación de requisitos (IEEE 830) y con el diseño de la base de datos (MER y diccionario de datos). Se definieron los actores del sistema, el modelo de dominio, la arquitectura en capas —componentes y despliegue—, los flujos de los procesos con mayor lógica de decisión mediante diagramas de actividades, y la especificación de los cuarenta y ocho casos de uso de los ocho módulos, con su trazabilidad uno a uno con los requisitos funcionales. Con esta base, el proyecto queda preparado para la etapa de construcción del software.</w:t>
+      </w:r>
+    </w:p>
+    <w:p>
+      <w:pPr>
+        <w:pStyle w:val="Heading1"/>
+        <w:pageBreakBefore/>
+        <w:spacing w:after="110" w:before="220"/>
+      </w:pPr>
+      <w:bookmarkStart w:name="bm51" w:id="51"/>
+      <w:r>
+        <w:rPr>
+          <w:rFonts w:ascii="Arial" w:cs="Arial" w:eastAsia="Arial" w:hAnsi="Arial"/>
+          <w:b/>
+          <w:bCs/>
+          <w:color w:val="1F3864"/>
+          <w:sz w:val="27"/>
+          <w:szCs w:val="27"/>
+        </w:rPr>
+        <w:t xml:space="preserve">11. Glosario</w:t>
+      </w:r>
+      <w:bookmarkEnd w:id="51"/>
+    </w:p>
+    <w:p>
+      <w:pPr>
+        <w:spacing w:after="110" w:line="262"/>
+        <w:jc w:val="both"/>
+      </w:pPr>
+      <w:r>
+        <w:rPr>
+          <w:rFonts w:ascii="Arial" w:cs="Arial" w:eastAsia="Arial" w:hAnsi="Arial"/>
+          <w:sz w:val="22"/>
+          <w:szCs w:val="22"/>
+        </w:rPr>
+        <w:t xml:space="preserve">Definición de los términos técnicos y de notación empleados en este documento.</w:t>
+      </w:r>
+    </w:p>
+    <w:tbl>
+      <w:tblPr>
+        <w:tblW w:type="dxa" w:w="9360"/>
+        <w:tblBorders>
+          <w:top w:val="single" w:color="9CA3AF" w:sz="6"/>
+          <w:left w:val="single" w:color="9CA3AF" w:sz="6"/>
+          <w:bottom w:val="single" w:color="9CA3AF" w:sz="6"/>
+          <w:right w:val="single" w:color="9CA3AF" w:sz="6"/>
+          <w:insideH w:val="single" w:color="9CA3AF" w:sz="6"/>
+          <w:insideV w:val="single" w:color="9CA3AF" w:sz="6"/>
+        </w:tblBorders>
+        <w:tblLayout w:type="fixed"/>
+      </w:tblPr>
+      <w:tblGrid>
+        <w:gridCol w:w="2900"/>
+        <w:gridCol w:w="6460"/>
+      </w:tblGrid>
+      <w:tr>
+        <w:trPr>
+          <w:tblHeader/>
+        </w:trPr>
+        <w:tc>
+          <w:tcPr>
+            <w:tcW w:type="dxa" w:w="2900"/>
+            <w:shd w:fill="1F3864" w:val="clear"/>
+            <w:tcMar>
+              <w:top w:type="dxa" w:w="40"/>
+              <w:left w:type="dxa" w:w="70"/>
+              <w:bottom w:type="dxa" w:w="40"/>
+              <w:right w:type="dxa" w:w="70"/>
+            </w:tcMar>
+          </w:tcPr>
+          <w:p>
+            <w:pPr>
+              <w:spacing w:after="0" w:line="236"/>
+            </w:pPr>
+            <w:r>
+              <w:rPr>
+                <w:rFonts w:ascii="Arial" w:cs="Arial" w:eastAsia="Arial" w:hAnsi="Arial"/>
+                <w:b/>
+                <w:bCs/>
+                <w:color w:val="FFFFFF"/>
+                <w:sz w:val="19"/>
+                <w:szCs w:val="19"/>
+              </w:rPr>
+              <w:t xml:space="preserve">Término</w:t>
+            </w:r>
+          </w:p>
+        </w:tc>
+        <w:tc>
+          <w:tcPr>
+            <w:tcW w:type="dxa" w:w="6460"/>
+            <w:shd w:fill="1F3864" w:val="clear"/>
+            <w:tcMar>
+              <w:top w:type="dxa" w:w="40"/>
+              <w:left w:type="dxa" w:w="70"/>
+              <w:bottom w:type="dxa" w:w="40"/>
+              <w:right w:type="dxa" w:w="70"/>
+            </w:tcMar>
+          </w:tcPr>
+          <w:p>
+            <w:pPr>
+              <w:spacing w:after="0" w:line="236"/>
+            </w:pPr>
+            <w:r>
+              <w:rPr>
+                <w:rFonts w:ascii="Arial" w:cs="Arial" w:eastAsia="Arial" w:hAnsi="Arial"/>
+                <w:b/>
+                <w:bCs/>
+                <w:color w:val="FFFFFF"/>
+                <w:sz w:val="19"/>
+                <w:szCs w:val="19"/>
+              </w:rPr>
+              <w:t xml:space="preserve">Definición</w:t>
+            </w:r>
+          </w:p>
+        </w:tc>
+      </w:tr>
+      <w:tr>
+        <w:trPr>
+          <w:tblHeader w:val="false"/>
+        </w:trPr>
+        <w:tc>
+          <w:tcPr>
+            <w:tcW w:type="dxa" w:w="2900"/>
+            <w:shd w:fill="FFFFFF" w:val="clear"/>
+            <w:tcMar>
+              <w:top w:type="dxa" w:w="40"/>
+              <w:left w:type="dxa" w:w="70"/>
+              <w:bottom w:type="dxa" w:w="40"/>
+              <w:right w:type="dxa" w:w="70"/>
+            </w:tcMar>
+          </w:tcPr>
+          <w:p>
+            <w:pPr>
+              <w:spacing w:after="0" w:line="236"/>
+            </w:pPr>
+            <w:r>
+              <w:rPr>
+                <w:rFonts w:ascii="Arial" w:cs="Arial" w:eastAsia="Arial" w:hAnsi="Arial"/>
+                <w:sz w:val="19"/>
+                <w:szCs w:val="19"/>
+              </w:rPr>
+              <w:t xml:space="preserve">Actor</w:t>
+            </w:r>
+          </w:p>
+        </w:tc>
+        <w:tc>
+          <w:tcPr>
+            <w:tcW w:type="dxa" w:w="6460"/>
+            <w:shd w:fill="FFFFFF" w:val="clear"/>
+            <w:tcMar>
+              <w:top w:type="dxa" w:w="40"/>
+              <w:left w:type="dxa" w:w="70"/>
+              <w:bottom w:type="dxa" w:w="40"/>
+              <w:right w:type="dxa" w:w="70"/>
+            </w:tcMar>
+          </w:tcPr>
+          <w:p>
+            <w:pPr>
+              <w:spacing w:after="0" w:line="236"/>
+            </w:pPr>
+            <w:r>
+              <w:rPr>
+                <w:rFonts w:ascii="Arial" w:cs="Arial" w:eastAsia="Arial" w:hAnsi="Arial"/>
+                <w:sz w:val="19"/>
+                <w:szCs w:val="19"/>
+              </w:rPr>
+              <w:t xml:space="preserve">Entidad, persona o sistema, que interactúa con el sistema para cumplir un objetivo.</w:t>
+            </w:r>
+          </w:p>
+        </w:tc>
+      </w:tr>
+      <w:tr>
+        <w:trPr>
+          <w:tblHeader w:val="false"/>
+        </w:trPr>
+        <w:tc>
+          <w:tcPr>
+            <w:tcW w:type="dxa" w:w="2900"/>
+            <w:shd w:fill="F2F2F2" w:val="clear"/>
+            <w:tcMar>
+              <w:top w:type="dxa" w:w="40"/>
+              <w:left w:type="dxa" w:w="70"/>
+              <w:bottom w:type="dxa" w:w="40"/>
+              <w:right w:type="dxa" w:w="70"/>
+            </w:tcMar>
+          </w:tcPr>
+          <w:p>
+            <w:pPr>
+              <w:spacing w:after="0" w:line="236"/>
+            </w:pPr>
+            <w:r>
+              <w:rPr>
+                <w:rFonts w:ascii="Arial" w:cs="Arial" w:eastAsia="Arial" w:hAnsi="Arial"/>
+                <w:sz w:val="19"/>
+                <w:szCs w:val="19"/>
+              </w:rPr>
+              <w:t xml:space="preserve">Caso de uso</w:t>
+            </w:r>
+          </w:p>
+        </w:tc>
+        <w:tc>
+          <w:tcPr>
+            <w:tcW w:type="dxa" w:w="6460"/>
+            <w:shd w:fill="F2F2F2" w:val="clear"/>
+            <w:tcMar>
+              <w:top w:type="dxa" w:w="40"/>
+              <w:left w:type="dxa" w:w="70"/>
+              <w:bottom w:type="dxa" w:w="40"/>
+              <w:right w:type="dxa" w:w="70"/>
+            </w:tcMar>
+          </w:tcPr>
+          <w:p>
+            <w:pPr>
+              <w:spacing w:after="0" w:line="236"/>
+            </w:pPr>
+            <w:r>
+              <w:rPr>
+                <w:rFonts w:ascii="Arial" w:cs="Arial" w:eastAsia="Arial" w:hAnsi="Arial"/>
+                <w:sz w:val="19"/>
+                <w:szCs w:val="19"/>
+              </w:rPr>
+              <w:t xml:space="preserve">Descripción de una funcionalidad del sistema desde la perspectiva de un actor.</w:t>
+            </w:r>
+          </w:p>
+        </w:tc>
+      </w:tr>
+      <w:tr>
+        <w:trPr>
+          <w:tblHeader w:val="false"/>
+        </w:trPr>
+        <w:tc>
+          <w:tcPr>
+            <w:tcW w:type="dxa" w:w="2900"/>
+            <w:shd w:fill="FFFFFF" w:val="clear"/>
+            <w:tcMar>
+              <w:top w:type="dxa" w:w="40"/>
+              <w:left w:type="dxa" w:w="70"/>
+              <w:bottom w:type="dxa" w:w="40"/>
+              <w:right w:type="dxa" w:w="70"/>
+            </w:tcMar>
+          </w:tcPr>
+          <w:p>
+            <w:pPr>
+              <w:spacing w:after="0" w:line="236"/>
+            </w:pPr>
+            <w:r>
+              <w:rPr>
+                <w:rFonts w:ascii="Arial" w:cs="Arial" w:eastAsia="Arial" w:hAnsi="Arial"/>
+                <w:sz w:val="19"/>
+                <w:szCs w:val="19"/>
+              </w:rPr>
+              <w:t xml:space="preserve">«include»</w:t>
+            </w:r>
+          </w:p>
+        </w:tc>
+        <w:tc>
+          <w:tcPr>
+            <w:tcW w:type="dxa" w:w="6460"/>
+            <w:shd w:fill="FFFFFF" w:val="clear"/>
+            <w:tcMar>
+              <w:top w:type="dxa" w:w="40"/>
+              <w:left w:type="dxa" w:w="70"/>
+              <w:bottom w:type="dxa" w:w="40"/>
+              <w:right w:type="dxa" w:w="70"/>
+            </w:tcMar>
+          </w:tcPr>
+          <w:p>
+            <w:pPr>
+              <w:spacing w:after="0" w:line="236"/>
+            </w:pPr>
+            <w:r>
+              <w:rPr>
+                <w:rFonts w:ascii="Arial" w:cs="Arial" w:eastAsia="Arial" w:hAnsi="Arial"/>
+                <w:sz w:val="19"/>
+                <w:szCs w:val="19"/>
+              </w:rPr>
+              <w:t xml:space="preserve">Relación en la que un caso de uso incorpora siempre el comportamiento de otro.</w:t>
+            </w:r>
+          </w:p>
+        </w:tc>
+      </w:tr>
+      <w:tr>
+        <w:trPr>
+          <w:tblHeader w:val="false"/>
+        </w:trPr>
+        <w:tc>
+          <w:tcPr>
+            <w:tcW w:type="dxa" w:w="2900"/>
+            <w:shd w:fill="F2F2F2" w:val="clear"/>
+            <w:tcMar>
+              <w:top w:type="dxa" w:w="40"/>
+              <w:left w:type="dxa" w:w="70"/>
+              <w:bottom w:type="dxa" w:w="40"/>
+              <w:right w:type="dxa" w:w="70"/>
+            </w:tcMar>
+          </w:tcPr>
+          <w:p>
+            <w:pPr>
+              <w:spacing w:after="0" w:line="236"/>
+            </w:pPr>
+            <w:r>
+              <w:rPr>
+                <w:rFonts w:ascii="Arial" w:cs="Arial" w:eastAsia="Arial" w:hAnsi="Arial"/>
+                <w:sz w:val="19"/>
+                <w:szCs w:val="19"/>
+              </w:rPr>
+              <w:t xml:space="preserve">«extend»</w:t>
+            </w:r>
+          </w:p>
+        </w:tc>
+        <w:tc>
+          <w:tcPr>
+            <w:tcW w:type="dxa" w:w="6460"/>
+            <w:shd w:fill="F2F2F2" w:val="clear"/>
+            <w:tcMar>
+              <w:top w:type="dxa" w:w="40"/>
+              <w:left w:type="dxa" w:w="70"/>
+              <w:bottom w:type="dxa" w:w="40"/>
+              <w:right w:type="dxa" w:w="70"/>
+            </w:tcMar>
+          </w:tcPr>
+          <w:p>
+            <w:pPr>
+              <w:spacing w:after="0" w:line="236"/>
+            </w:pPr>
+            <w:r>
+              <w:rPr>
+                <w:rFonts w:ascii="Arial" w:cs="Arial" w:eastAsia="Arial" w:hAnsi="Arial"/>
+                <w:sz w:val="19"/>
+                <w:szCs w:val="19"/>
+              </w:rPr>
+              <w:t xml:space="preserve">Relación en la que un caso de uso añade un comportamiento opcional a otro.</w:t>
+            </w:r>
+          </w:p>
+        </w:tc>
+      </w:tr>
+      <w:tr>
+        <w:trPr>
+          <w:tblHeader w:val="false"/>
+        </w:trPr>
+        <w:tc>
+          <w:tcPr>
+            <w:tcW w:type="dxa" w:w="2900"/>
+            <w:shd w:fill="FFFFFF" w:val="clear"/>
+            <w:tcMar>
+              <w:top w:type="dxa" w:w="40"/>
+              <w:left w:type="dxa" w:w="70"/>
+              <w:bottom w:type="dxa" w:w="40"/>
+              <w:right w:type="dxa" w:w="70"/>
+            </w:tcMar>
+          </w:tcPr>
+          <w:p>
+            <w:pPr>
+              <w:spacing w:after="0" w:line="236"/>
+            </w:pPr>
+            <w:r>
+              <w:rPr>
+                <w:rFonts w:ascii="Arial" w:cs="Arial" w:eastAsia="Arial" w:hAnsi="Arial"/>
+                <w:sz w:val="19"/>
+                <w:szCs w:val="19"/>
+              </w:rPr>
+              <w:t xml:space="preserve">Generalización</w:t>
+            </w:r>
+          </w:p>
+        </w:tc>
+        <w:tc>
+          <w:tcPr>
+            <w:tcW w:type="dxa" w:w="6460"/>
+            <w:shd w:fill="FFFFFF" w:val="clear"/>
+            <w:tcMar>
+              <w:top w:type="dxa" w:w="40"/>
+              <w:left w:type="dxa" w:w="70"/>
+              <w:bottom w:type="dxa" w:w="40"/>
+              <w:right w:type="dxa" w:w="70"/>
+            </w:tcMar>
+          </w:tcPr>
+          <w:p>
+            <w:pPr>
+              <w:spacing w:after="0" w:line="236"/>
+            </w:pPr>
+            <w:r>
+              <w:rPr>
+                <w:rFonts w:ascii="Arial" w:cs="Arial" w:eastAsia="Arial" w:hAnsi="Arial"/>
+                <w:sz w:val="19"/>
+                <w:szCs w:val="19"/>
+              </w:rPr>
+              <w:t xml:space="preserve">Relación en la que un actor o un caso de uso hereda las características de otro más general.</w:t>
+            </w:r>
+          </w:p>
+        </w:tc>
+      </w:tr>
+      <w:tr>
+        <w:trPr>
+          <w:tblHeader w:val="false"/>
+        </w:trPr>
+        <w:tc>
+          <w:tcPr>
+            <w:tcW w:type="dxa" w:w="2900"/>
+            <w:shd w:fill="F2F2F2" w:val="clear"/>
+            <w:tcMar>
+              <w:top w:type="dxa" w:w="40"/>
+              <w:left w:type="dxa" w:w="70"/>
+              <w:bottom w:type="dxa" w:w="40"/>
+              <w:right w:type="dxa" w:w="70"/>
+            </w:tcMar>
+          </w:tcPr>
+          <w:p>
+            <w:pPr>
+              <w:spacing w:after="0" w:line="236"/>
+            </w:pPr>
+            <w:r>
+              <w:rPr>
+                <w:rFonts w:ascii="Arial" w:cs="Arial" w:eastAsia="Arial" w:hAnsi="Arial"/>
+                <w:sz w:val="19"/>
+                <w:szCs w:val="19"/>
+              </w:rPr>
+              <w:t xml:space="preserve">Agregado y raíz de agregado</w:t>
+            </w:r>
+          </w:p>
+        </w:tc>
+        <w:tc>
+          <w:tcPr>
+            <w:tcW w:type="dxa" w:w="6460"/>
+            <w:shd w:fill="F2F2F2" w:val="clear"/>
+            <w:tcMar>
+              <w:top w:type="dxa" w:w="40"/>
+              <w:left w:type="dxa" w:w="70"/>
+              <w:bottom w:type="dxa" w:w="40"/>
+              <w:right w:type="dxa" w:w="70"/>
+            </w:tcMar>
+          </w:tcPr>
+          <w:p>
+            <w:pPr>
+              <w:spacing w:after="0" w:line="236"/>
+            </w:pPr>
+            <w:r>
+              <w:rPr>
+                <w:rFonts w:ascii="Arial" w:cs="Arial" w:eastAsia="Arial" w:hAnsi="Arial"/>
+                <w:sz w:val="19"/>
+                <w:szCs w:val="19"/>
+              </w:rPr>
+              <w:t xml:space="preserve">Conjunto de objetos del dominio tratado como una unidad de consistencia; la raíz controla el acceso al agregado (Domain-Driven Design).</w:t>
+            </w:r>
+          </w:p>
+        </w:tc>
+      </w:tr>
+      <w:tr>
+        <w:trPr>
+          <w:tblHeader w:val="false"/>
+        </w:trPr>
+        <w:tc>
+          <w:tcPr>
+            <w:tcW w:type="dxa" w:w="2900"/>
+            <w:shd w:fill="FFFFFF" w:val="clear"/>
+            <w:tcMar>
+              <w:top w:type="dxa" w:w="40"/>
+              <w:left w:type="dxa" w:w="70"/>
+              <w:bottom w:type="dxa" w:w="40"/>
+              <w:right w:type="dxa" w:w="70"/>
+            </w:tcMar>
+          </w:tcPr>
+          <w:p>
+            <w:pPr>
+              <w:spacing w:after="0" w:line="236"/>
+            </w:pPr>
+            <w:r>
+              <w:rPr>
+                <w:rFonts w:ascii="Arial" w:cs="Arial" w:eastAsia="Arial" w:hAnsi="Arial"/>
+                <w:sz w:val="19"/>
+                <w:szCs w:val="19"/>
+              </w:rPr>
+              <w:t xml:space="preserve">Inversión de dependencias</w:t>
+            </w:r>
+          </w:p>
+        </w:tc>
+        <w:tc>
+          <w:tcPr>
+            <w:tcW w:type="dxa" w:w="6460"/>
+            <w:shd w:fill="FFFFFF" w:val="clear"/>
+            <w:tcMar>
+              <w:top w:type="dxa" w:w="40"/>
+              <w:left w:type="dxa" w:w="70"/>
+              <w:bottom w:type="dxa" w:w="40"/>
+              <w:right w:type="dxa" w:w="70"/>
+            </w:tcMar>
+          </w:tcPr>
+          <w:p>
+            <w:pPr>
+              <w:spacing w:after="0" w:line="236"/>
+            </w:pPr>
+            <w:r>
+              <w:rPr>
+                <w:rFonts w:ascii="Arial" w:cs="Arial" w:eastAsia="Arial" w:hAnsi="Arial"/>
+                <w:sz w:val="19"/>
+                <w:szCs w:val="19"/>
+              </w:rPr>
+              <w:t xml:space="preserve">Principio por el cual el dominio define interfaces (puertos) que la infraestructura implementa, de modo que las dependencias apuntan hacia el dominio.</w:t>
+            </w:r>
+          </w:p>
+        </w:tc>
+      </w:tr>
+      <w:tr>
+        <w:trPr>
+          <w:tblHeader w:val="false"/>
+        </w:trPr>
+        <w:tc>
+          <w:tcPr>
+            <w:tcW w:type="dxa" w:w="2900"/>
+            <w:shd w:fill="F2F2F2" w:val="clear"/>
+            <w:tcMar>
+              <w:top w:type="dxa" w:w="40"/>
+              <w:left w:type="dxa" w:w="70"/>
+              <w:bottom w:type="dxa" w:w="40"/>
+              <w:right w:type="dxa" w:w="70"/>
+            </w:tcMar>
+          </w:tcPr>
+          <w:p>
+            <w:pPr>
+              <w:spacing w:after="0" w:line="236"/>
+            </w:pPr>
+            <w:r>
+              <w:rPr>
+                <w:rFonts w:ascii="Arial" w:cs="Arial" w:eastAsia="Arial" w:hAnsi="Arial"/>
+                <w:sz w:val="19"/>
+                <w:szCs w:val="19"/>
+              </w:rPr>
+              <w:t xml:space="preserve">PEPS</w:t>
+            </w:r>
+          </w:p>
+        </w:tc>
+        <w:tc>
+          <w:tcPr>
+            <w:tcW w:type="dxa" w:w="6460"/>
+            <w:shd w:fill="F2F2F2" w:val="clear"/>
+            <w:tcMar>
+              <w:top w:type="dxa" w:w="40"/>
+              <w:left w:type="dxa" w:w="70"/>
+              <w:bottom w:type="dxa" w:w="40"/>
+              <w:right w:type="dxa" w:w="70"/>
+            </w:tcMar>
+          </w:tcPr>
+          <w:p>
+            <w:pPr>
+              <w:spacing w:after="0" w:line="236"/>
+            </w:pPr>
+            <w:r>
+              <w:rPr>
+                <w:rFonts w:ascii="Arial" w:cs="Arial" w:eastAsia="Arial" w:hAnsi="Arial"/>
+                <w:sz w:val="19"/>
+                <w:szCs w:val="19"/>
+              </w:rPr>
+              <w:t xml:space="preserve">Método de valoración de inventario «primeras entradas, primeras salidas»: la venta consume los lotes más antiguos y registra su costo real.</w:t>
+            </w:r>
+          </w:p>
+        </w:tc>
+      </w:tr>
+      <w:tr>
+        <w:trPr>
+          <w:tblHeader w:val="false"/>
+        </w:trPr>
+        <w:tc>
+          <w:tcPr>
+            <w:tcW w:type="dxa" w:w="2900"/>
+            <w:shd w:fill="FFFFFF" w:val="clear"/>
+            <w:tcMar>
+              <w:top w:type="dxa" w:w="40"/>
+              <w:left w:type="dxa" w:w="70"/>
+              <w:bottom w:type="dxa" w:w="40"/>
+              <w:right w:type="dxa" w:w="70"/>
+            </w:tcMar>
+          </w:tcPr>
+          <w:p>
+            <w:pPr>
+              <w:spacing w:after="0" w:line="236"/>
+            </w:pPr>
+            <w:r>
+              <w:rPr>
+                <w:rFonts w:ascii="Arial" w:cs="Arial" w:eastAsia="Arial" w:hAnsi="Arial"/>
+                <w:sz w:val="19"/>
+                <w:szCs w:val="19"/>
+              </w:rPr>
+              <w:t xml:space="preserve">Lote</w:t>
+            </w:r>
+          </w:p>
+        </w:tc>
+        <w:tc>
+          <w:tcPr>
+            <w:tcW w:type="dxa" w:w="6460"/>
+            <w:shd w:fill="FFFFFF" w:val="clear"/>
+            <w:tcMar>
+              <w:top w:type="dxa" w:w="40"/>
+              <w:left w:type="dxa" w:w="70"/>
+              <w:bottom w:type="dxa" w:w="40"/>
+              <w:right w:type="dxa" w:w="70"/>
+            </w:tcMar>
+          </w:tcPr>
+          <w:p>
+            <w:pPr>
+              <w:spacing w:after="0" w:line="236"/>
+            </w:pPr>
+            <w:r>
+              <w:rPr>
+                <w:rFonts w:ascii="Arial" w:cs="Arial" w:eastAsia="Arial" w:hAnsi="Arial"/>
+                <w:sz w:val="19"/>
+                <w:szCs w:val="19"/>
+              </w:rPr>
+              <w:t xml:space="preserve">Cantidad de mercancía ingresada en una compra, con su costo unitario y su fecha.</w:t>
+            </w:r>
+          </w:p>
+        </w:tc>
+      </w:tr>
+      <w:tr>
+        <w:trPr>
+          <w:tblHeader w:val="false"/>
+        </w:trPr>
+        <w:tc>
+          <w:tcPr>
+            <w:tcW w:type="dxa" w:w="2900"/>
+            <w:shd w:fill="F2F2F2" w:val="clear"/>
+            <w:tcMar>
+              <w:top w:type="dxa" w:w="40"/>
+              <w:left w:type="dxa" w:w="70"/>
+              <w:bottom w:type="dxa" w:w="40"/>
+              <w:right w:type="dxa" w:w="70"/>
+            </w:tcMar>
+          </w:tcPr>
+          <w:p>
+            <w:pPr>
+              <w:spacing w:after="0" w:line="236"/>
+            </w:pPr>
+            <w:r>
+              <w:rPr>
+                <w:rFonts w:ascii="Arial" w:cs="Arial" w:eastAsia="Arial" w:hAnsi="Arial"/>
+                <w:sz w:val="19"/>
+                <w:szCs w:val="19"/>
+              </w:rPr>
+              <w:t xml:space="preserve">Kardex</w:t>
+            </w:r>
+          </w:p>
+        </w:tc>
+        <w:tc>
+          <w:tcPr>
+            <w:tcW w:type="dxa" w:w="6460"/>
+            <w:shd w:fill="F2F2F2" w:val="clear"/>
+            <w:tcMar>
+              <w:top w:type="dxa" w:w="40"/>
+              <w:left w:type="dxa" w:w="70"/>
+              <w:bottom w:type="dxa" w:w="40"/>
+              <w:right w:type="dxa" w:w="70"/>
+            </w:tcMar>
+          </w:tcPr>
+          <w:p>
+            <w:pPr>
+              <w:spacing w:after="0" w:line="236"/>
+            </w:pPr>
+            <w:r>
+              <w:rPr>
+                <w:rFonts w:ascii="Arial" w:cs="Arial" w:eastAsia="Arial" w:hAnsi="Arial"/>
+                <w:sz w:val="19"/>
+                <w:szCs w:val="19"/>
+              </w:rPr>
+              <w:t xml:space="preserve">Registro histórico e inmutable de los movimientos de inventario (entradas, salidas y ajustes) de un producto.</w:t>
+            </w:r>
+          </w:p>
+        </w:tc>
+      </w:tr>
+      <w:tr>
+        <w:trPr>
+          <w:tblHeader w:val="false"/>
+        </w:trPr>
+        <w:tc>
+          <w:tcPr>
+            <w:tcW w:type="dxa" w:w="2900"/>
+            <w:shd w:fill="FFFFFF" w:val="clear"/>
+            <w:tcMar>
+              <w:top w:type="dxa" w:w="40"/>
+              <w:left w:type="dxa" w:w="70"/>
+              <w:bottom w:type="dxa" w:w="40"/>
+              <w:right w:type="dxa" w:w="70"/>
+            </w:tcMar>
+          </w:tcPr>
+          <w:p>
+            <w:pPr>
+              <w:spacing w:after="0" w:line="236"/>
+            </w:pPr>
+            <w:r>
+              <w:rPr>
+                <w:rFonts w:ascii="Arial" w:cs="Arial" w:eastAsia="Arial" w:hAnsi="Arial"/>
+                <w:sz w:val="19"/>
+                <w:szCs w:val="19"/>
+              </w:rPr>
+              <w:t xml:space="preserve">CUFE</w:t>
+            </w:r>
+          </w:p>
+        </w:tc>
+        <w:tc>
+          <w:tcPr>
+            <w:tcW w:type="dxa" w:w="6460"/>
+            <w:shd w:fill="FFFFFF" w:val="clear"/>
+            <w:tcMar>
+              <w:top w:type="dxa" w:w="40"/>
+              <w:left w:type="dxa" w:w="70"/>
+              <w:bottom w:type="dxa" w:w="40"/>
+              <w:right w:type="dxa" w:w="70"/>
+            </w:tcMar>
+          </w:tcPr>
+          <w:p>
+            <w:pPr>
+              <w:spacing w:after="0" w:line="236"/>
+            </w:pPr>
+            <w:r>
+              <w:rPr>
+                <w:rFonts w:ascii="Arial" w:cs="Arial" w:eastAsia="Arial" w:hAnsi="Arial"/>
+                <w:sz w:val="19"/>
+                <w:szCs w:val="19"/>
+              </w:rPr>
+              <w:t xml:space="preserve">Código único de factura electrónica que identifica cada factura ante la DIAN.</w:t>
+            </w:r>
+          </w:p>
+        </w:tc>
+      </w:tr>
+      <w:tr>
+        <w:trPr>
+          <w:tblHeader w:val="false"/>
+        </w:trPr>
+        <w:tc>
+          <w:tcPr>
+            <w:tcW w:type="dxa" w:w="2900"/>
+            <w:shd w:fill="F2F2F2" w:val="clear"/>
+            <w:tcMar>
+              <w:top w:type="dxa" w:w="40"/>
+              <w:left w:type="dxa" w:w="70"/>
+              <w:bottom w:type="dxa" w:w="40"/>
+              <w:right w:type="dxa" w:w="70"/>
+            </w:tcMar>
+          </w:tcPr>
+          <w:p>
+            <w:pPr>
+              <w:spacing w:after="0" w:line="236"/>
+            </w:pPr>
+            <w:r>
+              <w:rPr>
+                <w:rFonts w:ascii="Arial" w:cs="Arial" w:eastAsia="Arial" w:hAnsi="Arial"/>
+                <w:sz w:val="19"/>
+                <w:szCs w:val="19"/>
+              </w:rPr>
+              <w:t xml:space="preserve">Tenant y multitenant</w:t>
+            </w:r>
+          </w:p>
+        </w:tc>
+        <w:tc>
+          <w:tcPr>
+            <w:tcW w:type="dxa" w:w="6460"/>
+            <w:shd w:fill="F2F2F2" w:val="clear"/>
+            <w:tcMar>
+              <w:top w:type="dxa" w:w="40"/>
+              <w:left w:type="dxa" w:w="70"/>
+              <w:bottom w:type="dxa" w:w="40"/>
+              <w:right w:type="dxa" w:w="70"/>
+            </w:tcMar>
+          </w:tcPr>
+          <w:p>
+            <w:pPr>
+              <w:spacing w:after="0" w:line="236"/>
+            </w:pPr>
+            <w:r>
+              <w:rPr>
+                <w:rFonts w:ascii="Arial" w:cs="Arial" w:eastAsia="Arial" w:hAnsi="Arial"/>
+                <w:sz w:val="19"/>
+                <w:szCs w:val="19"/>
+              </w:rPr>
+              <w:t xml:space="preserve">Modelo en el que cada licorera es un inquilino con sus datos aislados dentro de la misma plataforma.</w:t>
+            </w:r>
+          </w:p>
+        </w:tc>
+      </w:tr>
+      <w:tr>
+        <w:trPr>
+          <w:tblHeader w:val="false"/>
+        </w:trPr>
+        <w:tc>
+          <w:tcPr>
+            <w:tcW w:type="dxa" w:w="2900"/>
+            <w:shd w:fill="FFFFFF" w:val="clear"/>
+            <w:tcMar>
+              <w:top w:type="dxa" w:w="40"/>
+              <w:left w:type="dxa" w:w="70"/>
+              <w:bottom w:type="dxa" w:w="40"/>
+              <w:right w:type="dxa" w:w="70"/>
+            </w:tcMar>
+          </w:tcPr>
+          <w:p>
+            <w:pPr>
+              <w:spacing w:after="0" w:line="236"/>
+            </w:pPr>
+            <w:r>
+              <w:rPr>
+                <w:rFonts w:ascii="Arial" w:cs="Arial" w:eastAsia="Arial" w:hAnsi="Arial"/>
+                <w:sz w:val="19"/>
+                <w:szCs w:val="19"/>
+              </w:rPr>
+              <w:t xml:space="preserve">Sandbox</w:t>
+            </w:r>
+          </w:p>
+        </w:tc>
+        <w:tc>
+          <w:tcPr>
+            <w:tcW w:type="dxa" w:w="6460"/>
+            <w:shd w:fill="FFFFFF" w:val="clear"/>
+            <w:tcMar>
+              <w:top w:type="dxa" w:w="40"/>
+              <w:left w:type="dxa" w:w="70"/>
+              <w:bottom w:type="dxa" w:w="40"/>
+              <w:right w:type="dxa" w:w="70"/>
+            </w:tcMar>
+          </w:tcPr>
+          <w:p>
+            <w:pPr>
+              <w:spacing w:after="0" w:line="236"/>
+            </w:pPr>
+            <w:r>
+              <w:rPr>
+                <w:rFonts w:ascii="Arial" w:cs="Arial" w:eastAsia="Arial" w:hAnsi="Arial"/>
+                <w:sz w:val="19"/>
+                <w:szCs w:val="19"/>
+              </w:rPr>
+              <w:t xml:space="preserve">Ambiente de pruebas de un servicio externo (pasarela de pagos o DIAN) que simula la operación real sin efectos productivos.</w:t>
+            </w:r>
+          </w:p>
+        </w:tc>
+      </w:tr>
+      <w:tr>
+        <w:trPr>
+          <w:tblHeader w:val="false"/>
+        </w:trPr>
+        <w:tc>
+          <w:tcPr>
+            <w:tcW w:type="dxa" w:w="2900"/>
+            <w:shd w:fill="F2F2F2" w:val="clear"/>
+            <w:tcMar>
+              <w:top w:type="dxa" w:w="40"/>
+              <w:left w:type="dxa" w:w="70"/>
+              <w:bottom w:type="dxa" w:w="40"/>
+              <w:right w:type="dxa" w:w="70"/>
+            </w:tcMar>
+          </w:tcPr>
+          <w:p>
+            <w:pPr>
+              <w:spacing w:after="0" w:line="236"/>
+            </w:pPr>
+            <w:r>
+              <w:rPr>
+                <w:rFonts w:ascii="Arial" w:cs="Arial" w:eastAsia="Arial" w:hAnsi="Arial"/>
+                <w:sz w:val="19"/>
+                <w:szCs w:val="19"/>
+              </w:rPr>
+              <w:t xml:space="preserve">JWT</w:t>
+            </w:r>
+          </w:p>
+        </w:tc>
+        <w:tc>
+          <w:tcPr>
+            <w:tcW w:type="dxa" w:w="6460"/>
+            <w:shd w:fill="F2F2F2" w:val="clear"/>
+            <w:tcMar>
+              <w:top w:type="dxa" w:w="40"/>
+              <w:left w:type="dxa" w:w="70"/>
+              <w:bottom w:type="dxa" w:w="40"/>
+              <w:right w:type="dxa" w:w="70"/>
+            </w:tcMar>
+          </w:tcPr>
+          <w:p>
+            <w:pPr>
+              <w:spacing w:after="0" w:line="236"/>
+            </w:pPr>
+            <w:r>
+              <w:rPr>
+                <w:rFonts w:ascii="Arial" w:cs="Arial" w:eastAsia="Arial" w:hAnsi="Arial"/>
+                <w:sz w:val="19"/>
+                <w:szCs w:val="19"/>
+              </w:rPr>
+              <w:t xml:space="preserve">Token de sesión que acredita la identidad del usuario autenticado.</w:t>
+            </w:r>
+          </w:p>
+        </w:tc>
+      </w:tr>
+      <w:tr>
+        <w:trPr>
+          <w:tblHeader w:val="false"/>
+        </w:trPr>
+        <w:tc>
+          <w:tcPr>
+            <w:tcW w:type="dxa" w:w="2900"/>
+            <w:shd w:fill="FFFFFF" w:val="clear"/>
+            <w:tcMar>
+              <w:top w:type="dxa" w:w="40"/>
+              <w:left w:type="dxa" w:w="70"/>
+              <w:bottom w:type="dxa" w:w="40"/>
+              <w:right w:type="dxa" w:w="70"/>
+            </w:tcMar>
+          </w:tcPr>
+          <w:p>
+            <w:pPr>
+              <w:spacing w:after="0" w:line="236"/>
+            </w:pPr>
+            <w:r>
+              <w:rPr>
+                <w:rFonts w:ascii="Arial" w:cs="Arial" w:eastAsia="Arial" w:hAnsi="Arial"/>
+                <w:sz w:val="19"/>
+                <w:szCs w:val="19"/>
+              </w:rPr>
+              <w:t xml:space="preserve">API REST</w:t>
+            </w:r>
+          </w:p>
+        </w:tc>
+        <w:tc>
+          <w:tcPr>
+            <w:tcW w:type="dxa" w:w="6460"/>
+            <w:shd w:fill="FFFFFF" w:val="clear"/>
+            <w:tcMar>
+              <w:top w:type="dxa" w:w="40"/>
+              <w:left w:type="dxa" w:w="70"/>
+              <w:bottom w:type="dxa" w:w="40"/>
+              <w:right w:type="dxa" w:w="70"/>
+            </w:tcMar>
+          </w:tcPr>
+          <w:p>
+            <w:pPr>
+              <w:spacing w:after="0" w:line="236"/>
+            </w:pPr>
+            <w:r>
+              <w:rPr>
+                <w:rFonts w:ascii="Arial" w:cs="Arial" w:eastAsia="Arial" w:hAnsi="Arial"/>
+                <w:sz w:val="19"/>
+                <w:szCs w:val="19"/>
+              </w:rPr>
+              <w:t xml:space="preserve">Estilo de interfaz que comunica el frontend y el backend mediante HTTP y formato JSON.</w:t>
+            </w:r>
+          </w:p>
+        </w:tc>
+      </w:tr>
+    </w:tbl>
+    <w:p>
+      <w:pPr>
+        <w:pStyle w:val="Heading1"/>
+        <w:pageBreakBefore/>
+        <w:spacing w:after="110" w:before="220"/>
+      </w:pPr>
+      <w:bookmarkStart w:name="bm52" w:id="52"/>
+      <w:r>
+        <w:rPr>
+          <w:rFonts w:ascii="Arial" w:cs="Arial" w:eastAsia="Arial" w:hAnsi="Arial"/>
+          <w:b/>
+          <w:bCs/>
+          <w:color w:val="1F3864"/>
+          <w:sz w:val="27"/>
+          <w:szCs w:val="27"/>
+        </w:rPr>
+        <w:t xml:space="preserve">12. Referencias</w:t>
+      </w:r>
+      <w:bookmarkEnd w:id="52"/>
+    </w:p>
+    <w:p>
+      <w:pPr>
+        <w:spacing w:after="110" w:line="262"/>
+        <w:jc w:val="both"/>
+      </w:pPr>
+      <w:r>
+        <w:rPr>
+          <w:rFonts w:ascii="Arial" w:cs="Arial" w:eastAsia="Arial" w:hAnsi="Arial"/>
+          <w:b/>
+          <w:bCs/>
+          <w:sz w:val="22"/>
+          <w:szCs w:val="22"/>
+        </w:rPr>
+        <w:t xml:space="preserve">[1] </w:t>
+      </w:r>
+      <w:r>
+        <w:rPr>
+          <w:rFonts w:ascii="Arial" w:cs="Arial" w:eastAsia="Arial" w:hAnsi="Arial"/>
+          <w:sz w:val="22"/>
+          <w:szCs w:val="22"/>
+        </w:rPr>
+        <w:t xml:space="preserve">Especificación de Requisitos de Software (IEEE 830) de INVENTRA. Documento del proyecto.</w:t>
+      </w:r>
+    </w:p>
+    <w:p>
+      <w:pPr>
+        <w:spacing w:after="110" w:line="262"/>
+        <w:jc w:val="both"/>
+      </w:pPr>
+      <w:r>
+        <w:rPr>
+          <w:rFonts w:ascii="Arial" w:cs="Arial" w:eastAsia="Arial" w:hAnsi="Arial"/>
+          <w:b/>
+          <w:bCs/>
+          <w:sz w:val="22"/>
+          <w:szCs w:val="22"/>
+        </w:rPr>
+        <w:t xml:space="preserve">[2] </w:t>
+      </w:r>
+      <w:r>
+        <w:rPr>
+          <w:rFonts w:ascii="Arial" w:cs="Arial" w:eastAsia="Arial" w:hAnsi="Arial"/>
+          <w:sz w:val="22"/>
+          <w:szCs w:val="22"/>
+        </w:rPr>
+        <w:t xml:space="preserve">Diseño de la base de datos: MER, modelo relacional y diccionario de datos de INVENTRA. Documento del proyecto.</w:t>
+      </w:r>
+    </w:p>
+    <w:p>
+      <w:pPr>
+        <w:spacing w:after="110" w:line="262"/>
+        <w:jc w:val="both"/>
+      </w:pPr>
+      <w:r>
+        <w:rPr>
+          <w:rFonts w:ascii="Arial" w:cs="Arial" w:eastAsia="Arial" w:hAnsi="Arial"/>
+          <w:b/>
+          <w:bCs/>
+          <w:sz w:val="22"/>
+          <w:szCs w:val="22"/>
+        </w:rPr>
+        <w:t xml:space="preserve">[3] </w:t>
+      </w:r>
+      <w:r>
+        <w:rPr>
+          <w:rFonts w:ascii="Arial" w:cs="Arial" w:eastAsia="Arial" w:hAnsi="Arial"/>
+          <w:sz w:val="22"/>
+          <w:szCs w:val="22"/>
+        </w:rPr>
+        <w:t xml:space="preserve">Object Management Group (OMG). Unified Modeling Language (UML), versión 2.x.</w:t>
+      </w:r>
+    </w:p>
+    <w:p>
+      <w:pPr>
+        <w:spacing w:after="110" w:line="262"/>
+        <w:jc w:val="both"/>
+      </w:pPr>
+      <w:r>
+        <w:rPr>
+          <w:rFonts w:ascii="Arial" w:cs="Arial" w:eastAsia="Arial" w:hAnsi="Arial"/>
+          <w:b/>
+          <w:bCs/>
+          <w:sz w:val="22"/>
+          <w:szCs w:val="22"/>
+        </w:rPr>
+        <w:t xml:space="preserve">[4] </w:t>
+      </w:r>
+      <w:r>
+        <w:rPr>
+          <w:rFonts w:ascii="Arial" w:cs="Arial" w:eastAsia="Arial" w:hAnsi="Arial"/>
+          <w:sz w:val="22"/>
+          <w:szCs w:val="22"/>
+        </w:rPr>
+        <w:t xml:space="preserve">IEEE. IEEE Std 830, Recommended Practice for Software Requirements Specifications.</w:t>
+      </w:r>
+    </w:p>
+    <w:p>
+      <w:pPr>
+        <w:spacing w:after="110" w:line="262"/>
+        <w:jc w:val="both"/>
+      </w:pPr>
+      <w:r>
+        <w:rPr>
+          <w:rFonts w:ascii="Arial" w:cs="Arial" w:eastAsia="Arial" w:hAnsi="Arial"/>
+          <w:b/>
+          <w:bCs/>
+          <w:sz w:val="22"/>
+          <w:szCs w:val="22"/>
+        </w:rPr>
+        <w:t xml:space="preserve">[5] </w:t>
+      </w:r>
+      <w:r>
+        <w:rPr>
+          <w:rFonts w:ascii="Arial" w:cs="Arial" w:eastAsia="Arial" w:hAnsi="Arial"/>
+          <w:sz w:val="22"/>
+          <w:szCs w:val="22"/>
+        </w:rPr>
+        <w:t xml:space="preserve">Evans, E. Domain-Driven Design: Tackling Complexity in the Heart of Software. Addison-Wesley.</w:t>
+      </w:r>
+    </w:p>
+    <w:p>
+      <w:pPr>
+        <w:spacing w:after="110" w:line="262"/>
+        <w:jc w:val="both"/>
+      </w:pPr>
+      <w:r>
+        <w:rPr>
+          <w:rFonts w:ascii="Arial" w:cs="Arial" w:eastAsia="Arial" w:hAnsi="Arial"/>
+          <w:b/>
+          <w:bCs/>
+          <w:sz w:val="22"/>
+          <w:szCs w:val="22"/>
+        </w:rPr>
+        <w:t xml:space="preserve">[6] </w:t>
+      </w:r>
+      <w:r>
+        <w:rPr>
+          <w:rFonts w:ascii="Arial" w:cs="Arial" w:eastAsia="Arial" w:hAnsi="Arial"/>
+          <w:sz w:val="22"/>
+          <w:szCs w:val="22"/>
+        </w:rPr>
+        <w:t xml:space="preserve">Martin, R. C. Clean Architecture: A Craftsman's Guide to Software Structure and Design. Prentice Hall.</w:t>
+      </w:r>
+    </w:p>
+    <w:p>
+      <w:pPr>
+        <w:spacing w:after="110" w:line="262"/>
+        <w:jc w:val="both"/>
+      </w:pPr>
+      <w:r>
+        <w:rPr>
+          <w:rFonts w:ascii="Arial" w:cs="Arial" w:eastAsia="Arial" w:hAnsi="Arial"/>
+          <w:b/>
+          <w:bCs/>
+          <w:sz w:val="22"/>
+          <w:szCs w:val="22"/>
+        </w:rPr>
+        <w:t xml:space="preserve">[7] </w:t>
+      </w:r>
+      <w:r>
+        <w:rPr>
+          <w:rFonts w:ascii="Arial" w:cs="Arial" w:eastAsia="Arial" w:hAnsi="Arial"/>
+          <w:sz w:val="22"/>
+          <w:szCs w:val="22"/>
+        </w:rPr>
+        <w:t xml:space="preserve">Dirección de Impuestos y Aduanas Nacionales (DIAN). Documentación técnica de facturación electrónica.</w:t>
+      </w:r>
+    </w:p>
     <w:sectPr>
       <w:footerReference w:type="default" r:id="rId7"/>
       <w:pgSz w:w="12240" w:h="15840" w:orient="portrait"/>

</xml_diff>